<commit_message>
20260518 literature review v0.1 - intro draft
</commit_message>
<xml_diff>
--- a/literature.review/20260518 literature review v0.1.docx
+++ b/literature.review/20260518 literature review v0.1.docx
@@ -2,7 +2,88 @@
 <file path=word/document.xml><?xml version="1.0" encoding="utf-8"?>
 <w:document xmlns:wpc="http://schemas.microsoft.com/office/word/2010/wordprocessingCanvas" xmlns:cx="http://schemas.microsoft.com/office/drawing/2014/chartex" xmlns:cx1="http://schemas.microsoft.com/office/drawing/2015/9/8/chartex" xmlns:cx2="http://schemas.microsoft.com/office/drawing/2015/10/21/chartex" xmlns:cx3="http://schemas.microsoft.com/office/drawing/2016/5/9/chartex" xmlns:cx4="http://schemas.microsoft.com/office/drawing/2016/5/10/chartex" xmlns:cx5="http://schemas.microsoft.com/office/drawing/2016/5/11/chartex" xmlns:cx6="http://schemas.microsoft.com/office/drawing/2016/5/12/chartex" xmlns:cx7="http://schemas.microsoft.com/office/drawing/2016/5/13/chartex" xmlns:cx8="http://schemas.microsoft.com/office/drawing/2016/5/14/chartex" xmlns:mc="http://schemas.openxmlformats.org/markup-compatibility/2006" xmlns:aink="http://schemas.microsoft.com/office/drawing/2016/ink" xmlns:am3d="http://schemas.microsoft.com/office/drawing/2017/model3d" xmlns:o="urn:schemas-microsoft-com:office:office" xmlns:oel="http://schemas.microsoft.com/office/2019/extlst" xmlns:r="http://schemas.openxmlformats.org/officeDocument/2006/relationships" xmlns:m="http://schemas.openxmlformats.org/officeDocument/2006/math" xmlns:v="urn:schemas-microsoft-com:vml" xmlns:wp14="http://schemas.microsoft.com/office/word/2010/wordprocessingDrawing" xmlns:wp="http://schemas.openxmlformats.org/drawingml/2006/wordprocessingDrawing" xmlns:w10="urn:schemas-microsoft-com:office:word" xmlns:w="http://schemas.openxmlformats.org/wordprocessingml/2006/main" xmlns:w14="http://schemas.microsoft.com/office/word/2010/wordml" xmlns:w15="http://schemas.microsoft.com/office/word/2012/wordml" xmlns:w16cex="http://schemas.microsoft.com/office/word/2018/wordml/cex" xmlns:w16cid="http://schemas.microsoft.com/office/word/2016/wordml/cid" xmlns:w16="http://schemas.microsoft.com/office/word/2018/wordml" xmlns:w16du="http://schemas.microsoft.com/office/word/2023/wordml/word16du" xmlns:w16sdtdh="http://schemas.microsoft.com/office/word/2020/wordml/sdtdatahash" xmlns:w16sdtfl="http://schemas.microsoft.com/office/word/2024/wordml/sdtformatlock" xmlns:w16se="http://schemas.microsoft.com/office/word/2015/wordml/symex" xmlns:wpg="http://schemas.microsoft.com/office/word/2010/wordprocessingGroup" xmlns:wpi="http://schemas.microsoft.com/office/word/2010/wordprocessingInk" xmlns:wne="http://schemas.microsoft.com/office/word/2006/wordml" xmlns:wps="http://schemas.microsoft.com/office/word/2010/wordprocessingShape" mc:Ignorable="w14 w15 w16se w16cid w16 w16cex w16sdtdh w16sdtfl w16du wp14">
   <w:body>
+    <w:p>
+      <w:pPr>
+        <w:pStyle w:val="Heading2"/>
+      </w:pPr>
+      <w:r>
+        <w:t>Intro</w:t>
+      </w:r>
+    </w:p>
+    <w:p>
+      <w:r>
+        <w:t>Social media platforms have become major environments for the rapid spread of information, opinions, news, and public discussion. Trends can emerge within hours through interactions such as reposts, comments, likes, hashtags, and user discussions. Detecting these trends early is valuable in many domain</w:t>
+      </w:r>
+      <w:r>
+        <w:t>s</w:t>
+      </w:r>
+      <w:r>
+        <w:t>, including marketing, journalism, public opinion monitoring, and finance, because early awareness of rising topics can support faster decision-making and strategic responses.</w:t>
+      </w:r>
+      <w:r>
+        <w:tab/>
+      </w:r>
+    </w:p>
+    <w:p>
+      <w:r>
+        <w:t>In</w:t>
+      </w:r>
+      <w:r>
+        <w:t xml:space="preserve"> financial contexts especially, sudden increases in online discussion and sentiment may influence investor attention, public perception, and short-term market behavio</w:t>
+      </w:r>
+      <w:r>
+        <w:t>u</w:t>
+      </w:r>
+      <w:r>
+        <w:t>r.</w:t>
+      </w:r>
+    </w:p>
+    <w:p>
+      <w:r>
+        <w:t xml:space="preserve">Predicting social media trend emergence is a difficult problem because online activity is highly dynamic, noisy, and influenced by many interacting factors. A topic may receive temporary attention and quickly disappear, while another may grow rapidly into a large-scale discussion. This makes </w:t>
+      </w:r>
+      <w:r>
+        <w:t>it challenging to distinguish between ordinary fluctuations in activity and meaningful early signals of trend emergence. Previous research has therefore explored different approaches for modelling popularity growth, user engagement behaviour, textual sentiment, and information diffusion patterns across social networks.</w:t>
+      </w:r>
+    </w:p>
+    <w:p>
+      <w:r>
+        <w:t>Early studies focused primarily on temporal popularity patterns and showed that early user engagement can provide predictive information about future popularity. Szabo and Huberman (2010), for example, demonstrated that early measurements of online attention could strongly correlate with later popularity outcomes. Other work extended this idea by examining user interaction behaviour and collective attention dynamics in online systems. As research developed further, machine learning approaches began incorporating additional feature types, including textual content, metadata, sentiment signals, and network diffusion characteristics.</w:t>
+      </w:r>
+    </w:p>
+    <w:p>
+      <w:r>
+        <w:t>Research has also shown that social media text can contain predictive emotional and behavioural signals. Bollen et al. (2011) demonstrated that aggregated Twitter mood measurements could correlate with movements in the stock market, highlighting the broader predictive potential of sentiment analysis in social media environments. Meanwhile, diffusion-based studies such as Cheng et al. (2014) examined how information spreads through social networks and whether large information cascades can be predicted from early observations.</w:t>
+      </w:r>
+    </w:p>
+    <w:p>
+      <w:r>
+        <w:t xml:space="preserve">Although these studies provide important foundations, many existing approaches focus primarily on predicting overall popularity rather than detecting early-stage trend emergence. In addition, some approaches rely heavily on a single category of features, such as temporal engagement or network structure, while others require large-scale industrial datasets and computational resources that may be difficult to reproduce in </w:t>
+      </w:r>
+      <w:r>
+        <w:lastRenderedPageBreak/>
+        <w:t xml:space="preserve">smaller projects. There is therefore value in exploring a more practical predictive modelling approach that combines multiple feature categories while remaining achievable within a student project scope. </w:t>
+      </w:r>
+    </w:p>
+    <w:p>
+      <w:r>
+        <w:t>This literature review examines previous work related to early popularity prediction, machine learning and content-based prediction, sentiment analysis, and information diffusion in social media systems. The aim is not only to summarise prior studies, but also to critical evaluate their contributions, limitations, and relevance to the proposed project. Through this review, the project is positioned as an attempt to combine temporal, engagement, and sentiment-based features to support the early detection of trend emergence within the finance-related social media domain.</w:t>
+      </w:r>
+    </w:p>
     <w:p/>
+    <w:p>
+      <w:pPr>
+        <w:pStyle w:val="Heading2"/>
+      </w:pPr>
+      <w:r>
+        <w:t>Early Popularity Prediction Foundations</w:t>
+      </w:r>
+    </w:p>
+    <w:p>
+      <w:r>
+        <w:t>One of the earliest and most important areas of research related to social media trend prediction is early popularity prediction. The central idea of this research area is that the initial behaviour of users interacting with online content may contain predictive signals about whether that content will later become highly popular. This area is closely related to the current project because trend emergence detection also depends on identifying meaningful signals during the early stages of growth, before a topic becomes fully widespread.</w:t>
+      </w:r>
+    </w:p>
     <w:sectPr>
       <w:pgSz w:w="11906" w:h="16838"/>
       <w:pgMar w:top="1440" w:right="1440" w:bottom="1440" w:left="1440" w:header="708" w:footer="708" w:gutter="0"/>
@@ -11,6 +92,103 @@
     </w:sectPr>
   </w:body>
 </w:document>
+</file>
+
+<file path=word/numbering.xml><?xml version="1.0" encoding="utf-8"?>
+<w:numbering xmlns:wpc="http://schemas.microsoft.com/office/word/2010/wordprocessingCanvas" xmlns:cx="http://schemas.microsoft.com/office/drawing/2014/chartex" xmlns:cx1="http://schemas.microsoft.com/office/drawing/2015/9/8/chartex" xmlns:cx2="http://schemas.microsoft.com/office/drawing/2015/10/21/chartex" xmlns:cx3="http://schemas.microsoft.com/office/drawing/2016/5/9/chartex" xmlns:cx4="http://schemas.microsoft.com/office/drawing/2016/5/10/chartex" xmlns:cx5="http://schemas.microsoft.com/office/drawing/2016/5/11/chartex" xmlns:cx6="http://schemas.microsoft.com/office/drawing/2016/5/12/chartex" xmlns:cx7="http://schemas.microsoft.com/office/drawing/2016/5/13/chartex" xmlns:cx8="http://schemas.microsoft.com/office/drawing/2016/5/14/chartex" xmlns:mc="http://schemas.openxmlformats.org/markup-compatibility/2006" xmlns:aink="http://schemas.microsoft.com/office/drawing/2016/ink" xmlns:am3d="http://schemas.microsoft.com/office/drawing/2017/model3d" xmlns:o="urn:schemas-microsoft-com:office:office" xmlns:oel="http://schemas.microsoft.com/office/2019/extlst" xmlns:r="http://schemas.openxmlformats.org/officeDocument/2006/relationships" xmlns:m="http://schemas.openxmlformats.org/officeDocument/2006/math" xmlns:v="urn:schemas-microsoft-com:vml" xmlns:wp14="http://schemas.microsoft.com/office/word/2010/wordprocessingDrawing" xmlns:wp="http://schemas.openxmlformats.org/drawingml/2006/wordprocessingDrawing" xmlns:w10="urn:schemas-microsoft-com:office:word" xmlns:w="http://schemas.openxmlformats.org/wordprocessingml/2006/main" xmlns:w14="http://schemas.microsoft.com/office/word/2010/wordml" xmlns:w15="http://schemas.microsoft.com/office/word/2012/wordml" xmlns:w16cex="http://schemas.microsoft.com/office/word/2018/wordml/cex" xmlns:w16cid="http://schemas.microsoft.com/office/word/2016/wordml/cid" xmlns:w16="http://schemas.microsoft.com/office/word/2018/wordml" xmlns:w16du="http://schemas.microsoft.com/office/word/2023/wordml/word16du" xmlns:w16sdtdh="http://schemas.microsoft.com/office/word/2020/wordml/sdtdatahash" xmlns:w16sdtfl="http://schemas.microsoft.com/office/word/2024/wordml/sdtformatlock" xmlns:w16se="http://schemas.microsoft.com/office/word/2015/wordml/symex" xmlns:wpg="http://schemas.microsoft.com/office/word/2010/wordprocessingGroup" xmlns:wpi="http://schemas.microsoft.com/office/word/2010/wordprocessingInk" xmlns:wne="http://schemas.microsoft.com/office/word/2006/wordml" xmlns:wps="http://schemas.microsoft.com/office/word/2010/wordprocessingShape" mc:Ignorable="w14 w15 w16se w16cid w16 w16cex w16sdtdh w16sdtfl w16du wp14">
+  <w:abstractNum w:abstractNumId="0" w15:restartNumberingAfterBreak="0">
+    <w:nsid w:val="57C736B3"/>
+    <w:multiLevelType w:val="hybridMultilevel"/>
+    <w:tmpl w:val="59581112"/>
+    <w:lvl w:ilvl="0" w:tplc="2000000F">
+      <w:start w:val="1"/>
+      <w:numFmt w:val="decimal"/>
+      <w:lvlText w:val="%1."/>
+      <w:lvlJc w:val="left"/>
+      <w:pPr>
+        <w:ind w:left="720" w:hanging="360"/>
+      </w:pPr>
+      <w:rPr>
+        <w:rFonts w:hint="default"/>
+      </w:rPr>
+    </w:lvl>
+    <w:lvl w:ilvl="1" w:tplc="20000019" w:tentative="1">
+      <w:start w:val="1"/>
+      <w:numFmt w:val="lowerLetter"/>
+      <w:lvlText w:val="%2."/>
+      <w:lvlJc w:val="left"/>
+      <w:pPr>
+        <w:ind w:left="1440" w:hanging="360"/>
+      </w:pPr>
+    </w:lvl>
+    <w:lvl w:ilvl="2" w:tplc="2000001B" w:tentative="1">
+      <w:start w:val="1"/>
+      <w:numFmt w:val="lowerRoman"/>
+      <w:lvlText w:val="%3."/>
+      <w:lvlJc w:val="right"/>
+      <w:pPr>
+        <w:ind w:left="2160" w:hanging="180"/>
+      </w:pPr>
+    </w:lvl>
+    <w:lvl w:ilvl="3" w:tplc="2000000F" w:tentative="1">
+      <w:start w:val="1"/>
+      <w:numFmt w:val="decimal"/>
+      <w:lvlText w:val="%4."/>
+      <w:lvlJc w:val="left"/>
+      <w:pPr>
+        <w:ind w:left="2880" w:hanging="360"/>
+      </w:pPr>
+    </w:lvl>
+    <w:lvl w:ilvl="4" w:tplc="20000019" w:tentative="1">
+      <w:start w:val="1"/>
+      <w:numFmt w:val="lowerLetter"/>
+      <w:lvlText w:val="%5."/>
+      <w:lvlJc w:val="left"/>
+      <w:pPr>
+        <w:ind w:left="3600" w:hanging="360"/>
+      </w:pPr>
+    </w:lvl>
+    <w:lvl w:ilvl="5" w:tplc="2000001B" w:tentative="1">
+      <w:start w:val="1"/>
+      <w:numFmt w:val="lowerRoman"/>
+      <w:lvlText w:val="%6."/>
+      <w:lvlJc w:val="right"/>
+      <w:pPr>
+        <w:ind w:left="4320" w:hanging="180"/>
+      </w:pPr>
+    </w:lvl>
+    <w:lvl w:ilvl="6" w:tplc="2000000F" w:tentative="1">
+      <w:start w:val="1"/>
+      <w:numFmt w:val="decimal"/>
+      <w:lvlText w:val="%7."/>
+      <w:lvlJc w:val="left"/>
+      <w:pPr>
+        <w:ind w:left="5040" w:hanging="360"/>
+      </w:pPr>
+    </w:lvl>
+    <w:lvl w:ilvl="7" w:tplc="20000019" w:tentative="1">
+      <w:start w:val="1"/>
+      <w:numFmt w:val="lowerLetter"/>
+      <w:lvlText w:val="%8."/>
+      <w:lvlJc w:val="left"/>
+      <w:pPr>
+        <w:ind w:left="5760" w:hanging="360"/>
+      </w:pPr>
+    </w:lvl>
+    <w:lvl w:ilvl="8" w:tplc="2000001B" w:tentative="1">
+      <w:start w:val="1"/>
+      <w:numFmt w:val="lowerRoman"/>
+      <w:lvlText w:val="%9."/>
+      <w:lvlJc w:val="right"/>
+      <w:pPr>
+        <w:ind w:left="6480" w:hanging="180"/>
+      </w:pPr>
+    </w:lvl>
+  </w:abstractNum>
+  <w:num w:numId="1" w16cid:durableId="1187326629">
+    <w:abstractNumId w:val="0"/>
+  </w:num>
+</w:numbering>
 </file>
 
 <file path=word/styles.xml><?xml version="1.0" encoding="utf-8"?>
@@ -441,7 +619,6 @@
     <w:next w:val="Normal"/>
     <w:link w:val="Heading2Char"/>
     <w:uiPriority w:val="9"/>
-    <w:semiHidden/>
     <w:unhideWhenUsed/>
     <w:qFormat/>
     <w:rsid w:val="00AD6A97"/>
@@ -616,7 +793,6 @@
   <w:style w:type="character" w:default="1" w:styleId="DefaultParagraphFont">
     <w:name w:val="Default Paragraph Font"/>
     <w:uiPriority w:val="1"/>
-    <w:semiHidden/>
     <w:unhideWhenUsed/>
   </w:style>
   <w:style w:type="table" w:default="1" w:styleId="TableNormal">
@@ -658,7 +834,6 @@
     <w:basedOn w:val="DefaultParagraphFont"/>
     <w:link w:val="Heading2"/>
     <w:uiPriority w:val="9"/>
-    <w:semiHidden/>
     <w:rsid w:val="00AD6A97"/>
     <w:rPr>
       <w:rFonts w:asciiTheme="majorHAnsi" w:eastAsiaTheme="majorEastAsia" w:hAnsiTheme="majorHAnsi" w:cstheme="majorBidi"/>
@@ -929,6 +1104,16 @@
       <w:color w:val="0F4761" w:themeColor="accent1" w:themeShade="BF"/>
       <w:spacing w:val="5"/>
     </w:rPr>
+  </w:style>
+  <w:style w:type="paragraph" w:styleId="Revision">
+    <w:name w:val="Revision"/>
+    <w:hidden/>
+    <w:uiPriority w:val="99"/>
+    <w:semiHidden/>
+    <w:rsid w:val="003B7CD7"/>
+    <w:pPr>
+      <w:spacing w:after="0" w:line="240" w:lineRule="auto"/>
+    </w:pPr>
   </w:style>
 </w:styles>
 </file>

</xml_diff>

<commit_message>
20260518 literature review v0.1/edit section 1 intro/round 1
</commit_message>
<xml_diff>
--- a/literature.review/20260518 literature review v0.1.docx
+++ b/literature.review/20260518 literature review v0.1.docx
@@ -11,77 +11,222 @@
       </w:r>
     </w:p>
     <w:p>
-      <w:r>
-        <w:t>Social media platforms have become major environments for the rapid spread of information, opinions, news, and public discussion. Trends can emerge within hours through interactions such as reposts, comments, likes, hashtags, and user discussions. Detecting these trends early is valuable in many domain</w:t>
-      </w:r>
-      <w:r>
-        <w:t>s</w:t>
-      </w:r>
-      <w:r>
-        <w:t>, including marketing, journalism, public opinion monitoring, and finance, because early awareness of rising topics can support faster decision-making and strategic responses.</w:t>
-      </w:r>
-      <w:r>
-        <w:tab/>
+      <w:pPr>
+        <w:rPr>
+          <w:ins w:id="0" w:author="Hieu Nguyen" w:date="2026-05-18T14:46:00Z" w16du:dateUtc="2026-05-18T07:46:00Z"/>
+        </w:rPr>
+      </w:pPr>
+      <w:r>
+        <w:t xml:space="preserve">Social media platforms have become </w:t>
+      </w:r>
+      <w:r>
+        <w:t>important</w:t>
+      </w:r>
+      <w:r>
+        <w:t xml:space="preserve"> </w:t>
+      </w:r>
+      <w:r>
+        <w:t xml:space="preserve">environments for the rapid spread of information, opinion, and public discussion. </w:t>
+      </w:r>
+      <w:r>
+        <w:t xml:space="preserve">Topics can gain attention within hours through reposts, comments, likes, hashtags, and user interaction, making social media a major source of real-time signals about emerging public interest. </w:t>
+      </w:r>
+      <w:r>
+        <w:t>The early detection of such t</w:t>
+      </w:r>
+      <w:r>
+        <w:t xml:space="preserve">rends </w:t>
+      </w:r>
+      <w:r>
+        <w:t>has</w:t>
+      </w:r>
+      <w:r>
+        <w:t xml:space="preserve"> practical value across many </w:t>
+      </w:r>
+      <w:r>
+        <w:t>domains</w:t>
+      </w:r>
+      <w:r>
+        <w:t xml:space="preserve">, </w:t>
+      </w:r>
+      <w:r>
+        <w:t>including marketing</w:t>
+      </w:r>
+      <w:r>
+        <w:t xml:space="preserve">, journalism, public opinion </w:t>
+      </w:r>
+      <w:r>
+        <w:t>monitoring. In</w:t>
+      </w:r>
+      <w:r>
+        <w:t xml:space="preserve"> the finance domain in particular</w:t>
+      </w:r>
+      <w:r>
+        <w:t xml:space="preserve">, sudden increases in online discussion and sentiment may influence investor attention, </w:t>
+      </w:r>
+      <w:r>
+        <w:t xml:space="preserve">shape market sentiment, and affect short-term behaviour, making early identification of emerging trends especially </w:t>
+      </w:r>
+      <w:r>
+        <w:t>valuable.</w:t>
+      </w:r>
+      <w:r>
+        <w:t xml:space="preserve"> </w:t>
       </w:r>
     </w:p>
     <w:p>
-      <w:r>
-        <w:t>In</w:t>
-      </w:r>
-      <w:r>
-        <w:t xml:space="preserve"> financial contexts especially, sudden increases in online discussion and sentiment may influence investor attention, public perception, and short-term market behavio</w:t>
-      </w:r>
-      <w:r>
-        <w:t>u</w:t>
-      </w:r>
-      <w:r>
-        <w:t>r.</w:t>
-      </w:r>
+      <w:ins w:id="1" w:author="Hieu Nguyen" w:date="2026-05-18T14:46:00Z" w16du:dateUtc="2026-05-18T07:46:00Z">
+        <w:r>
+          <w:t>However, detecting trend emergence at an early stage is a difficult task. Social media activity is highly dynamic, noisy, and often short-lived. Some topics experience brief sp</w:t>
+        </w:r>
+      </w:ins>
+      <w:ins w:id="2" w:author="Hieu Nguyen" w:date="2026-05-18T14:47:00Z" w16du:dateUtc="2026-05-18T07:47:00Z">
+        <w:r>
+          <w:t xml:space="preserve">ikes in attention and quickly disappear, while others develop into sustained trends with wider influence. This creates an important research challenge: distinguishing between ordinary </w:t>
+        </w:r>
+      </w:ins>
+      <w:ins w:id="3" w:author="Hieu Nguyen" w:date="2026-05-18T14:48:00Z" w16du:dateUtc="2026-05-18T07:48:00Z">
+        <w:r>
+          <w:t>fluctuations in activity and meaningful early signals that indicate genuine trend formation.</w:t>
+        </w:r>
+      </w:ins>
     </w:p>
     <w:p>
-      <w:r>
-        <w:t xml:space="preserve">Predicting social media trend emergence is a difficult problem because online activity is highly dynamic, noisy, and influenced by many interacting factors. A topic may receive temporary attention and quickly disappear, while another may grow rapidly into a large-scale discussion. This makes </w:t>
-      </w:r>
-      <w:r>
-        <w:t>it challenging to distinguish between ordinary fluctuations in activity and meaningful early signals of trend emergence. Previous research has therefore explored different approaches for modelling popularity growth, user engagement behaviour, textual sentiment, and information diffusion patterns across social networks.</w:t>
+      <w:pPr>
+        <w:rPr>
+          <w:ins w:id="4" w:author="Hieu Nguyen" w:date="2026-05-18T14:41:00Z" w16du:dateUtc="2026-05-18T07:41:00Z"/>
+        </w:rPr>
+      </w:pPr>
+      <w:r>
+        <w:t>Previous research suggests that early prediction is possible, but it approaches the problem from different perspectives. Some studies emphasis temporal patterns, showing that early activity levels can be informative about future popularity. Other focus on engagement behaviour, such as reposts, comments, and interaction growth, as indicators of collective attention. More recent work has also examined sentiment and textual signals, arguing that the emotional tone and semantic content of discussions may provide additional predictive value. Alongside these approaches, diffusion-based research has explored how information spreads through social networks and whether early cascade behaviour can signal large future impact.</w:t>
       </w:r>
     </w:p>
     <w:p>
       <w:r>
-        <w:t>Early studies focused primarily on temporal popularity patterns and showed that early user engagement can provide predictive information about future popularity. Szabo and Huberman (2010), for example, demonstrated that early measurements of online attention could strongly correlate with later popularity outcomes. Other work extended this idea by examining user interaction behaviour and collective attention dynamics in online systems. As research developed further, machine learning approaches began incorporating additional feature types, including textual content, metadata, sentiment signals, and network diffusion characteristics.</w:t>
+        <w:t xml:space="preserve">Although these approaches provide valuable foundations, they also reveal important limitations. Much of the </w:t>
+      </w:r>
+      <w:r>
+        <w:t xml:space="preserve">literature focuses </w:t>
+      </w:r>
+      <w:r>
+        <w:t>on predicting eventual popularity rather than identifying trend emergence during its earliest stages. Many studies rely primarily on a single category of features, which can limit their ability to capture the multi-dimensional nature of social media behaviour. In addition, a substantial proportion of prior work is developed in broad or platform-general contexts rather than in specific practical domains such as finance, where both sentiment and timing may be especially important.</w:t>
+      </w:r>
+      <w:r>
+        <w:t xml:space="preserve"> </w:t>
       </w:r>
     </w:p>
     <w:p>
       <w:r>
-        <w:t>Research has also shown that social media text can contain predictive emotional and behavioural signals. Bollen et al. (2011) demonstrated that aggregated Twitter mood measurements could correlate with movements in the stock market, highlighting the broader predictive potential of sentiment analysis in social media environments. Meanwhile, diffusion-based studies such as Cheng et al. (2014) examined how information spreads through social networks and whether large information cascades can be predicted from early observations.</w:t>
+        <w:t xml:space="preserve">This literature review </w:t>
+      </w:r>
+      <w:r>
+        <w:t xml:space="preserve">therefore </w:t>
+      </w:r>
+      <w:r>
+        <w:t xml:space="preserve">examines </w:t>
+      </w:r>
+      <w:r>
+        <w:t xml:space="preserve">the field through a thematic and critical perspective rather than as a sequence of individual studies. It considers the methodological development of research on early prediction, engagement modelling, sentiment analysis, and diffusion, while evaluating the strengths and limitations of each approach. By doing so, the review builds the case for a project that combines temporal, </w:t>
+      </w:r>
+      <w:r>
+        <w:lastRenderedPageBreak/>
+        <w:t xml:space="preserve">engagement, and sentiment features to support the early detection of social media trend emergence in the finance domain, addressing gaps in early-stage prediction, multi-feature integration, and domain focused practical modelling. </w:t>
       </w:r>
     </w:p>
-    <w:p>
-      <w:r>
-        <w:t xml:space="preserve">Although these studies provide important foundations, many existing approaches focus primarily on predicting overall popularity rather than detecting early-stage trend emergence. In addition, some approaches rely heavily on a single category of features, such as temporal engagement or network structure, while others require large-scale industrial datasets and computational resources that may be difficult to reproduce in </w:t>
-      </w:r>
-      <w:r>
-        <w:lastRenderedPageBreak/>
-        <w:t xml:space="preserve">smaller projects. There is therefore value in exploring a more practical predictive modelling approach that combines multiple feature categories while remaining achievable within a student project scope. </w:t>
-      </w:r>
-    </w:p>
-    <w:p>
-      <w:r>
-        <w:t>This literature review examines previous work related to early popularity prediction, machine learning and content-based prediction, sentiment analysis, and information diffusion in social media systems. The aim is not only to summarise prior studies, but also to critical evaluate their contributions, limitations, and relevance to the proposed project. Through this review, the project is positioned as an attempt to combine temporal, engagement, and sentiment-based features to support the early detection of trend emergence within the finance-related social media domain.</w:t>
-      </w:r>
-    </w:p>
-    <w:p/>
     <w:p>
       <w:pPr>
         <w:pStyle w:val="Heading2"/>
       </w:pPr>
       <w:r>
-        <w:t>Early Popularity Prediction Foundations</w:t>
+        <w:t>The F</w:t>
+      </w:r>
+      <w:r>
+        <w:t>oundations</w:t>
       </w:r>
     </w:p>
     <w:p>
       <w:r>
         <w:t>One of the earliest and most important areas of research related to social media trend prediction is early popularity prediction. The central idea of this research area is that the initial behaviour of users interacting with online content may contain predictive signals about whether that content will later become highly popular. This area is closely related to the current project because trend emergence detection also depends on identifying meaningful signals during the early stages of growth, before a topic becomes fully widespread.</w:t>
+      </w:r>
+    </w:p>
+    <w:p>
+      <w:r>
+        <w:t>A foundational study in this area is “Predicting the Popularity of Online Content” by Szabo and Huberman (2010). The authors investigated whether early measurements of user attention could predict the future popularity of online content across platforms such as Youtube and Digg. Their work demonstrated a strong correlation between early and later popularity measurements, particularly when popularity values were transformed logarithmically. The study showed that a relatively small observation window after publication could already provide useful information about long-term popularity outcomes.</w:t>
+      </w:r>
+    </w:p>
+    <w:p>
+      <w:r>
+        <w:t>This paper is significant because it established an important principle for later research: online popularity growth is not entirely random, and early engagement behaviour can contain measurable predictive patterns. The approach was also relatively simple and interpretable compared to later machine learning models, making it influential as an early foundation for popularity prediction research. In addition, the study as early view counts or interactions can provide meaning</w:t>
+      </w:r>
+      <w:del w:id="5" w:author="Hieu Nguyen" w:date="2026-05-18T14:45:00Z" w16du:dateUtc="2026-05-18T07:45:00Z">
+        <w:r>
+          <w:delText xml:space="preserve"> </w:delText>
+        </w:r>
+      </w:del>
+      <w:r>
+        <w:t>ful</w:t>
+      </w:r>
+      <w:del w:id="6" w:author="Hieu Nguyen" w:date="2026-05-18T14:45:00Z" w16du:dateUtc="2026-05-18T07:45:00Z">
+        <w:r>
+          <w:delText>l</w:delText>
+        </w:r>
+      </w:del>
+      <w:r>
+        <w:t xml:space="preserve"> predictive value without requiring extremely complex modelling techniques.</w:t>
+      </w:r>
+    </w:p>
+    <w:p>
+      <w:r>
+        <w:t>However, the study also has several limitations when considered in relation to trend emergence prediction. First, the paper focuses primarily on predicting the final scale of popularity rather than identifying whether a trend is emerging during its early growth stage. Predicting eventual popularity is related to, but not identical to, detecting emerging trends. Second, the approach relies heavily on temporal engagement measurements while giving little attention to contextual factors such as sentiment, topic meaning, or user discussion patterns. As a result, the model captures growth behaviour but provides limited understanding of why the popularity develops. Finally, the work mainly analyses aggregate popularity behaviour and does not examine more complex diffusion structures or interactions between different feature categories.</w:t>
+      </w:r>
+    </w:p>
+    <w:p>
+      <w:r>
+        <w:t xml:space="preserve">Another influential contribution is Lerman’s (2010) work on early popularity prediction in social media systems. This research expanded the discussion by examining how user </w:t>
+      </w:r>
+      <w:r>
+        <w:lastRenderedPageBreak/>
+        <w:t>interaction behaviour and social dynamics influence popularity growth. Rather than focusing only on raw popularity counts, the study considered how users discover, share , and interact with content within online communities. This perspective is important because it highlights that popularity is influenced not only by content quality, but also by the behaviour of users and the structure of online attention.</w:t>
+      </w:r>
+    </w:p>
+    <w:p>
+      <w:r>
+        <w:t>A major strength of Lerman’s work is its emphasis on behavioural and social interaction patterns. This is highly relevant to trend emergence research because trends spread through collective user behaviour rather than through isolated interactions.</w:t>
+      </w:r>
+      <w:r>
+        <w:t xml:space="preserve"> The study therefore provides useful conceptual support for engagement-based features such as repost activity, interaction frequency, or user participation growth. These ideas align with the current project’s interest in using early engagement signals to identify emerging financial discussions on social media platforms.</w:t>
+      </w:r>
+    </w:p>
+    <w:p>
+      <w:r>
+        <w:t>Despite these contributions, the study also has limitations. Similar to Szabo and Huberman (2010), the work focuses mainly on popularity prediction rather than explicitly defining or modelling trend emergence. In addition, the findings are influenced by the characteristics of specific social media platforms, meaning that predictive behaviour observed</w:t>
+      </w:r>
+      <w:del w:id="7" w:author="Hieu Nguyen" w:date="2026-05-18T14:44:00Z" w16du:dateUtc="2026-05-18T07:44:00Z">
+        <w:r>
+          <w:delText xml:space="preserve"> in </w:delText>
+        </w:r>
+      </w:del>
+      <w:r>
+        <w:t xml:space="preserve">on </w:t>
+      </w:r>
+      <w:ins w:id="8" w:author="Hieu Nguyen" w:date="2026-05-18T14:44:00Z" w16du:dateUtc="2026-05-18T07:44:00Z">
+        <w:r>
+          <w:t xml:space="preserve">one </w:t>
+        </w:r>
+      </w:ins>
+      <w:r>
+        <w:t xml:space="preserve">platform may not generalise perfectly to others. The study also </w:t>
+      </w:r>
+      <w:r>
+        <w:t>gives</w:t>
+      </w:r>
+      <w:r>
+        <w:t xml:space="preserve"> limited attention to textual meaning or sentiment analysis, which later research identified as important sources of predictive information.</w:t>
+      </w:r>
+    </w:p>
+    <w:p>
+      <w:r>
+        <w:t>Taken together, these early studies established the foundation for later research in social media prediction by demonstrating that early engagement behaviour and temporal growth patterns contain valuable predictive signals. They also showed that popularity dynamics can be analysed systematically rather than treated as entirely unpredictable phenomena. However, these approaches rely heavily on temporal and engagement-based indicators while giving relatively limited attention to semantic understanding, sentiment, multidimensional feature integration. These limitations motivated later work that incorporated machine learning techniques, textual analysis, and more sophisticated modelling approaches to better understand how trends emerge and spread across social networks.</w:t>
       </w:r>
     </w:p>
     <w:sectPr>
@@ -189,6 +334,14 @@
     <w:abstractNumId w:val="0"/>
   </w:num>
 </w:numbering>
+</file>
+
+<file path=word/people.xml><?xml version="1.0" encoding="utf-8"?>
+<w15:people xmlns:wpc="http://schemas.microsoft.com/office/word/2010/wordprocessingCanvas" xmlns:cx="http://schemas.microsoft.com/office/drawing/2014/chartex" xmlns:cx1="http://schemas.microsoft.com/office/drawing/2015/9/8/chartex" xmlns:cx2="http://schemas.microsoft.com/office/drawing/2015/10/21/chartex" xmlns:cx3="http://schemas.microsoft.com/office/drawing/2016/5/9/chartex" xmlns:cx4="http://schemas.microsoft.com/office/drawing/2016/5/10/chartex" xmlns:cx5="http://schemas.microsoft.com/office/drawing/2016/5/11/chartex" xmlns:cx6="http://schemas.microsoft.com/office/drawing/2016/5/12/chartex" xmlns:cx7="http://schemas.microsoft.com/office/drawing/2016/5/13/chartex" xmlns:cx8="http://schemas.microsoft.com/office/drawing/2016/5/14/chartex" xmlns:mc="http://schemas.openxmlformats.org/markup-compatibility/2006" xmlns:aink="http://schemas.microsoft.com/office/drawing/2016/ink" xmlns:am3d="http://schemas.microsoft.com/office/drawing/2017/model3d" xmlns:o="urn:schemas-microsoft-com:office:office" xmlns:oel="http://schemas.microsoft.com/office/2019/extlst" xmlns:r="http://schemas.openxmlformats.org/officeDocument/2006/relationships" xmlns:m="http://schemas.openxmlformats.org/officeDocument/2006/math" xmlns:v="urn:schemas-microsoft-com:vml" xmlns:wp14="http://schemas.microsoft.com/office/word/2010/wordprocessingDrawing" xmlns:wp="http://schemas.openxmlformats.org/drawingml/2006/wordprocessingDrawing" xmlns:w10="urn:schemas-microsoft-com:office:word" xmlns:w="http://schemas.openxmlformats.org/wordprocessingml/2006/main" xmlns:w14="http://schemas.microsoft.com/office/word/2010/wordml" xmlns:w15="http://schemas.microsoft.com/office/word/2012/wordml" xmlns:w16cex="http://schemas.microsoft.com/office/word/2018/wordml/cex" xmlns:w16cid="http://schemas.microsoft.com/office/word/2016/wordml/cid" xmlns:w16="http://schemas.microsoft.com/office/word/2018/wordml" xmlns:w16du="http://schemas.microsoft.com/office/word/2023/wordml/word16du" xmlns:w16sdtdh="http://schemas.microsoft.com/office/word/2020/wordml/sdtdatahash" xmlns:w16sdtfl="http://schemas.microsoft.com/office/word/2024/wordml/sdtformatlock" xmlns:w16se="http://schemas.microsoft.com/office/word/2015/wordml/symex" xmlns:wpg="http://schemas.microsoft.com/office/word/2010/wordprocessingGroup" xmlns:wpi="http://schemas.microsoft.com/office/word/2010/wordprocessingInk" xmlns:wne="http://schemas.microsoft.com/office/word/2006/wordml" xmlns:wps="http://schemas.microsoft.com/office/word/2010/wordprocessingShape" mc:Ignorable="w14 w15 w16se w16cid w16 w16cex w16sdtdh w16sdtfl w16du wp14">
+  <w15:person w15:author="Hieu Nguyen">
+    <w15:presenceInfo w15:providerId="Windows Live" w15:userId="6ffae857f14ce83c"/>
+  </w15:person>
+</w15:people>
 </file>
 
 <file path=word/styles.xml><?xml version="1.0" encoding="utf-8"?>
@@ -793,6 +946,7 @@
   <w:style w:type="character" w:default="1" w:styleId="DefaultParagraphFont">
     <w:name w:val="Default Paragraph Font"/>
     <w:uiPriority w:val="1"/>
+    <w:semiHidden/>
     <w:unhideWhenUsed/>
   </w:style>
   <w:style w:type="table" w:default="1" w:styleId="TableNormal">

</xml_diff>

<commit_message>
20260518 literature review v0.1/edit section 2/round 1
</commit_message>
<xml_diff>
--- a/literature.review/20260518 literature review v0.1.docx
+++ b/literature.review/20260518 literature review v0.1.docx
@@ -11,11 +11,6 @@
       </w:r>
     </w:p>
     <w:p>
-      <w:pPr>
-        <w:rPr>
-          <w:ins w:id="0" w:author="Hieu Nguyen" w:date="2026-05-18T14:46:00Z" w16du:dateUtc="2026-05-18T07:46:00Z"/>
-        </w:rPr>
-      </w:pPr>
       <w:r>
         <w:t xml:space="preserve">Social media platforms have become </w:t>
       </w:r>
@@ -75,28 +70,11 @@
       </w:r>
     </w:p>
     <w:p>
-      <w:ins w:id="1" w:author="Hieu Nguyen" w:date="2026-05-18T14:46:00Z" w16du:dateUtc="2026-05-18T07:46:00Z">
-        <w:r>
-          <w:t>However, detecting trend emergence at an early stage is a difficult task. Social media activity is highly dynamic, noisy, and often short-lived. Some topics experience brief sp</w:t>
-        </w:r>
-      </w:ins>
-      <w:ins w:id="2" w:author="Hieu Nguyen" w:date="2026-05-18T14:47:00Z" w16du:dateUtc="2026-05-18T07:47:00Z">
-        <w:r>
-          <w:t xml:space="preserve">ikes in attention and quickly disappear, while others develop into sustained trends with wider influence. This creates an important research challenge: distinguishing between ordinary </w:t>
-        </w:r>
-      </w:ins>
-      <w:ins w:id="3" w:author="Hieu Nguyen" w:date="2026-05-18T14:48:00Z" w16du:dateUtc="2026-05-18T07:48:00Z">
-        <w:r>
-          <w:t>fluctuations in activity and meaningful early signals that indicate genuine trend formation.</w:t>
-        </w:r>
-      </w:ins>
+      <w:r>
+        <w:t>However, detecting trend emergence at an early stage is a difficult task. Social media activity is highly dynamic, noisy, and often short-lived. Some topics experience brief spikes in attention and quickly disappear, while others develop into sustained trends with wider influence. This creates an important research challenge: distinguishing between ordinary fluctuations in activity and meaningful early signals that indicate genuine trend formation.</w:t>
+      </w:r>
     </w:p>
     <w:p>
-      <w:pPr>
-        <w:rPr>
-          <w:ins w:id="4" w:author="Hieu Nguyen" w:date="2026-05-18T14:41:00Z" w16du:dateUtc="2026-05-18T07:41:00Z"/>
-        </w:rPr>
-      </w:pPr>
       <w:r>
         <w:t>Previous research suggests that early prediction is possible, but it approaches the problem from different perspectives. Some studies emphasis temporal patterns, showing that early activity levels can be informative about future popularity. Other focus on engagement behaviour, such as reposts, comments, and interaction growth, as indicators of collective attention. More recent work has also examined sentiment and textual signals, arguing that the emotional tone and semantic content of discussions may provide additional predictive value. Alongside these approaches, diffusion-based research has explored how information spreads through social networks and whether early cascade behaviour can signal large future impact.</w:t>
       </w:r>
@@ -146,87 +124,242 @@
     </w:p>
     <w:p>
       <w:r>
-        <w:t>One of the earliest and most important areas of research related to social media trend prediction is early popularity prediction. The central idea of this research area is that the initial behaviour of users interacting with online content may contain predictive signals about whether that content will later become highly popular. This area is closely related to the current project because trend emergence detection also depends on identifying meaningful signals during the early stages of growth, before a topic becomes fully widespread.</w:t>
+        <w:t xml:space="preserve">One of the earliest </w:t>
+      </w:r>
+      <w:r>
+        <w:t xml:space="preserve">foundations of research relevant to social media trend prediction is </w:t>
+      </w:r>
+      <w:r>
+        <w:t xml:space="preserve">early popularity prediction. </w:t>
+      </w:r>
+      <w:r>
+        <w:t>This body of work is important because it established the idea that the initial behaviour of users interacting with online content may contain signals about future outcomes.</w:t>
+      </w:r>
+      <w:r>
+        <w:t xml:space="preserve"> </w:t>
+      </w:r>
+      <w:r>
+        <w:t xml:space="preserve">Although early popularity prediction is not identical to trend emergence detection, it provides a useful starting point for understanding how early-stage online activity can be analysed to anticipate later growth. In this sense, foundation studies in popularity prediction support the broader argument that early trend prediction is possible. </w:t>
       </w:r>
     </w:p>
     <w:p>
       <w:r>
-        <w:t>A foundational study in this area is “Predicting the Popularity of Online Content” by Szabo and Huberman (2010). The authors investigated whether early measurements of user attention could predict the future popularity of online content across platforms such as Youtube and Digg. Their work demonstrated a strong correlation between early and later popularity measurements, particularly when popularity values were transformed logarithmically. The study showed that a relatively small observation window after publication could already provide useful information about long-term popularity outcomes.</w:t>
+        <w:t xml:space="preserve">A key theme in this early research is the predictive value of temporal attention patterns. Studies such as </w:t>
+      </w:r>
+      <w:r>
+        <w:rPr>
+          <w:b/>
+          <w:bCs/>
+        </w:rPr>
+        <w:t>Szabo and Huberman (2010)</w:t>
+      </w:r>
+      <w:r>
+        <w:t xml:space="preserve"> show that measurements taken shortly after content publication could already provide useful indications of later popularity</w:t>
+      </w:r>
+      <w:r>
+        <w:t xml:space="preserve">. Their work demonstrated a strong </w:t>
+      </w:r>
+      <w:r>
+        <w:t xml:space="preserve">relationship </w:t>
+      </w:r>
+      <w:r>
+        <w:t xml:space="preserve">between early and later </w:t>
+      </w:r>
+      <w:r>
+        <w:t>attention levels across platforms such as YouTube and Digg, suggesting that online popularity growth is not entirely random. This was an important contribution because it showed that relatively simple and interpretable measures, such as early views or interactions, could provide meaningful predictive value without requiring highly complex modelling techniques.</w:t>
+      </w:r>
+      <w:r>
+        <w:t xml:space="preserve"> </w:t>
       </w:r>
     </w:p>
     <w:p>
       <w:r>
-        <w:t>This paper is significant because it established an important principle for later research: online popularity growth is not entirely random, and early engagement behaviour can contain measurable predictive patterns. The approach was also relatively simple and interpretable compared to later machine learning models, making it influential as an early foundation for popularity prediction research. In addition, the study as early view counts or interactions can provide meaning</w:t>
-      </w:r>
-      <w:del w:id="5" w:author="Hieu Nguyen" w:date="2026-05-18T14:45:00Z" w16du:dateUtc="2026-05-18T07:45:00Z">
-        <w:r>
-          <w:delText xml:space="preserve"> </w:delText>
-        </w:r>
-      </w:del>
-      <w:r>
-        <w:t>ful</w:t>
-      </w:r>
-      <w:del w:id="6" w:author="Hieu Nguyen" w:date="2026-05-18T14:45:00Z" w16du:dateUtc="2026-05-18T07:45:00Z">
-        <w:r>
-          <w:delText>l</w:delText>
-        </w:r>
-      </w:del>
-      <w:r>
-        <w:t xml:space="preserve"> predictive value without requiring extremely complex modelling techniques.</w:t>
+        <w:t>This paper is significant because it established an important principle for later research: online popularity growth is not entirely random, and early engagement behaviour can contain measurable predictive patterns. The approach was also relatively simple and interpretable compared to later machine learning models, making it influential as an early foundation for popularity prediction research. In addition, the study as early view counts or interactions can provide meaningful predictive value without requiring extremely complex modelling techniques.</w:t>
       </w:r>
     </w:p>
     <w:p>
       <w:r>
-        <w:t>However, the study also has several limitations when considered in relation to trend emergence prediction. First, the paper focuses primarily on predicting the final scale of popularity rather than identifying whether a trend is emerging during its early growth stage. Predicting eventual popularity is related to, but not identical to, detecting emerging trends. Second, the approach relies heavily on temporal engagement measurements while giving little attention to contextual factors such as sentiment, topic meaning, or user discussion patterns. As a result, the model captures growth behaviour but provides limited understanding of why the popularity develops. Finally, the work mainly analyses aggregate popularity behaviour and does not examine more complex diffusion structures or interactions between different feature categories.</w:t>
+        <w:t xml:space="preserve">Alongside this temporal perspective, early research also highlighted the importance of </w:t>
+      </w:r>
+      <w:r>
+        <w:rPr>
+          <w:b/>
+          <w:bCs/>
+        </w:rPr>
+        <w:t>behavioural and social interaction dynamics</w:t>
+      </w:r>
+      <w:r>
+        <w:t xml:space="preserve">. </w:t>
+      </w:r>
+      <w:r>
+        <w:rPr>
+          <w:b/>
+          <w:bCs/>
+        </w:rPr>
+        <w:t>Lerman (2010)</w:t>
+      </w:r>
+      <w:r>
+        <w:t xml:space="preserve"> expanded the discussion by examining how users discover, share, and engage with content within online communities. This work suggested that popularity is shaped not only by </w:t>
+      </w:r>
+      <w:r>
+        <w:rPr>
+          <w:highlight w:val="yellow"/>
+        </w:rPr>
+        <w:t>the passage of time</w:t>
+      </w:r>
+      <w:r>
+        <w:t xml:space="preserve"> or by raw activity counts, but also by the ways in which users interact collectively. Such insights are particularly relevant to trend emergence research, where engagement behaviour often reflects whether a topic is beginning to attract wider attention. These studies therefore helped establish engagement-based indicators as an important component of later predictive models.</w:t>
       </w:r>
     </w:p>
     <w:p>
       <w:r>
-        <w:t xml:space="preserve">Another influential contribution is Lerman’s (2010) work on early popularity prediction in social media systems. This research expanded the discussion by examining how user </w:t>
-      </w:r>
-      <w:r>
         <w:lastRenderedPageBreak/>
-        <w:t>interaction behaviour and social dynamics influence popularity growth. Rather than focusing only on raw popularity counts, the study considered how users discover, share , and interact with content within online communities. This perspective is important because it highlights that popularity is influenced not only by content quality, but also by the behaviour of users and the structure of online attention.</w:t>
+        <w:t>Taken together, these foundational studies made two major contributions. First, they demonstrated that early online behaviour could contain measurable predictive signals. Second, they provided the methodological basis for later research by showing that social media growth patterns could be studied systematically rather than treated as entirely unpredictable phenomena. In this way, early popularity prediction research marked an important shift from descriptive observation toward predictive modelling.</w:t>
       </w:r>
     </w:p>
     <w:p>
       <w:r>
-        <w:t>A major strength of Lerman’s work is its emphasis on behavioural and social interaction patterns. This is highly relevant to trend emergence research because trends spread through collective user behaviour rather than through isolated interactions.</w:t>
-      </w:r>
-      <w:r>
-        <w:t xml:space="preserve"> The study therefore provides useful conceptual support for engagement-based features such as repost activity, interaction frequency, or user participation growth. These ideas align with the current project’s interest in using early engagement signals to identify emerging financial discussions on social media platforms.</w:t>
+        <w:t>However, the</w:t>
+      </w:r>
+      <w:r>
+        <w:t xml:space="preserve">se foundational approaches </w:t>
+      </w:r>
+      <w:r>
+        <w:t xml:space="preserve">also </w:t>
+      </w:r>
+      <w:r>
+        <w:t xml:space="preserve">reveal clear </w:t>
+      </w:r>
+      <w:r>
+        <w:t xml:space="preserve">limitations when considered in relation to </w:t>
+      </w:r>
+      <w:r>
+        <w:t>the current project</w:t>
+      </w:r>
+      <w:r>
+        <w:t xml:space="preserve">. </w:t>
+      </w:r>
+      <w:r>
+        <w:t>Most importantly</w:t>
+      </w:r>
+      <w:r>
+        <w:t xml:space="preserve">, </w:t>
+      </w:r>
+      <w:r>
+        <w:t xml:space="preserve">they </w:t>
+      </w:r>
+      <w:r>
+        <w:t>focus</w:t>
+      </w:r>
+      <w:r>
+        <w:t>ed</w:t>
+      </w:r>
+      <w:r>
+        <w:t xml:space="preserve"> on </w:t>
+      </w:r>
+      <w:r>
+        <w:rPr>
+          <w:b/>
+          <w:bCs/>
+        </w:rPr>
+        <w:t xml:space="preserve">predicting </w:t>
+      </w:r>
+      <w:r>
+        <w:rPr>
+          <w:b/>
+          <w:bCs/>
+        </w:rPr>
+        <w:t>eventual popularity</w:t>
+      </w:r>
+      <w:r>
+        <w:t xml:space="preserve"> </w:t>
+      </w:r>
+      <w:r>
+        <w:t xml:space="preserve">rather than </w:t>
+      </w:r>
+      <w:r>
+        <w:rPr>
+          <w:b/>
+          <w:bCs/>
+        </w:rPr>
+        <w:t>detecting trend during its earliest stages</w:t>
+      </w:r>
+      <w:r>
+        <w:t xml:space="preserve">. </w:t>
+      </w:r>
+      <w:r>
+        <w:t xml:space="preserve">There are related but distinct problems: predicting whether content will become large-scale popular is not the same as identifying, whether a meaningful trend is beginning to form. In addition, these studies relied mainly on </w:t>
+      </w:r>
+      <w:r>
+        <w:rPr>
+          <w:b/>
+          <w:bCs/>
+        </w:rPr>
+        <w:t>temporal and engagement-based indicators</w:t>
+      </w:r>
+      <w:r>
+        <w:t xml:space="preserve">, while giving limited attention to sentiment, semantic meaning, or the interaction between multiple feature categories. As a result, they were able to capture growth </w:t>
+      </w:r>
+      <w:r>
+        <w:t>behaviour but</w:t>
+      </w:r>
+      <w:r>
+        <w:t xml:space="preserve"> offered less insight into the contextual and emotional signals that may influence whether discussion develops into a sustained trend.</w:t>
       </w:r>
     </w:p>
     <w:p>
-      <w:r>
-        <w:t>Despite these contributions, the study also has limitations. Similar to Szabo and Huberman (2010), the work focuses mainly on popularity prediction rather than explicitly defining or modelling trend emergence. In addition, the findings are influenced by the characteristics of specific social media platforms, meaning that predictive behaviour observed</w:t>
-      </w:r>
-      <w:del w:id="7" w:author="Hieu Nguyen" w:date="2026-05-18T14:44:00Z" w16du:dateUtc="2026-05-18T07:44:00Z">
-        <w:r>
-          <w:delText xml:space="preserve"> in </w:delText>
-        </w:r>
-      </w:del>
-      <w:r>
-        <w:t xml:space="preserve">on </w:t>
-      </w:r>
-      <w:ins w:id="8" w:author="Hieu Nguyen" w:date="2026-05-18T14:44:00Z" w16du:dateUtc="2026-05-18T07:44:00Z">
-        <w:r>
-          <w:t xml:space="preserve">one </w:t>
-        </w:r>
-      </w:ins>
-      <w:r>
-        <w:t xml:space="preserve">platform may not generalise perfectly to others. The study also </w:t>
-      </w:r>
-      <w:r>
-        <w:t>gives</w:t>
-      </w:r>
-      <w:r>
-        <w:t xml:space="preserve"> limited attention to textual meaning or sentiment analysis, which later research identified as important sources of predictive information.</w:t>
+      <w:pPr>
+        <w:rPr>
+          <w:lang w:val="en-001"/>
+        </w:rPr>
+      </w:pPr>
+      <w:r>
+        <w:rPr>
+          <w:lang w:val="en-001"/>
+        </w:rPr>
+        <w:t xml:space="preserve">These limitations are especially important in a domain such as </w:t>
+      </w:r>
+      <w:r>
+        <w:rPr>
+          <w:b/>
+          <w:bCs/>
+          <w:lang w:val="en-001"/>
+        </w:rPr>
+        <w:t>finance</w:t>
+      </w:r>
+      <w:r>
+        <w:rPr>
+          <w:lang w:val="en-001"/>
+        </w:rPr>
+        <w:t xml:space="preserve">, where timing, public reaction, and emotional tone may all contribute to whether online discussion becomes practically significant. Foundational studies therefore support the feasibility of early prediction, but they do not fully address the challenges of </w:t>
+      </w:r>
+      <w:r>
+        <w:rPr>
+          <w:b/>
+          <w:bCs/>
+          <w:lang w:val="en-001"/>
+        </w:rPr>
+        <w:t>early-stage, domain-focused trend detection</w:t>
+      </w:r>
+      <w:r>
+        <w:rPr>
+          <w:lang w:val="en-001"/>
+        </w:rPr>
+        <w:t>. This creates the need for later approaches that integrate a broader set of predictive signals, including temporal, engagement, and sentiment features, which is the direction taken by the current project.</w:t>
       </w:r>
     </w:p>
     <w:p>
-      <w:r>
-        <w:t>Taken together, these early studies established the foundation for later research in social media prediction by demonstrating that early engagement behaviour and temporal growth patterns contain valuable predictive signals. They also showed that popularity dynamics can be analysed systematically rather than treated as entirely unpredictable phenomena. However, these approaches rely heavily on temporal and engagement-based indicators while giving relatively limited attention to semantic understanding, sentiment, multidimensional feature integration. These limitations motivated later work that incorporated machine learning techniques, textual analysis, and more sophisticated modelling approaches to better understand how trends emerge and spread across social networks.</w:t>
+      <w:pPr>
+        <w:tabs>
+          <w:tab w:val="left" w:pos="7128"/>
+          <w:tab w:val="right" w:pos="9026"/>
+        </w:tabs>
+      </w:pPr>
+      <w:r>
+        <w:tab/>
+      </w:r>
+      <w:r>
+        <w:tab/>
       </w:r>
     </w:p>
     <w:sectPr>
@@ -334,14 +467,6 @@
     <w:abstractNumId w:val="0"/>
   </w:num>
 </w:numbering>
-</file>
-
-<file path=word/people.xml><?xml version="1.0" encoding="utf-8"?>
-<w15:people xmlns:wpc="http://schemas.microsoft.com/office/word/2010/wordprocessingCanvas" xmlns:cx="http://schemas.microsoft.com/office/drawing/2014/chartex" xmlns:cx1="http://schemas.microsoft.com/office/drawing/2015/9/8/chartex" xmlns:cx2="http://schemas.microsoft.com/office/drawing/2015/10/21/chartex" xmlns:cx3="http://schemas.microsoft.com/office/drawing/2016/5/9/chartex" xmlns:cx4="http://schemas.microsoft.com/office/drawing/2016/5/10/chartex" xmlns:cx5="http://schemas.microsoft.com/office/drawing/2016/5/11/chartex" xmlns:cx6="http://schemas.microsoft.com/office/drawing/2016/5/12/chartex" xmlns:cx7="http://schemas.microsoft.com/office/drawing/2016/5/13/chartex" xmlns:cx8="http://schemas.microsoft.com/office/drawing/2016/5/14/chartex" xmlns:mc="http://schemas.openxmlformats.org/markup-compatibility/2006" xmlns:aink="http://schemas.microsoft.com/office/drawing/2016/ink" xmlns:am3d="http://schemas.microsoft.com/office/drawing/2017/model3d" xmlns:o="urn:schemas-microsoft-com:office:office" xmlns:oel="http://schemas.microsoft.com/office/2019/extlst" xmlns:r="http://schemas.openxmlformats.org/officeDocument/2006/relationships" xmlns:m="http://schemas.openxmlformats.org/officeDocument/2006/math" xmlns:v="urn:schemas-microsoft-com:vml" xmlns:wp14="http://schemas.microsoft.com/office/word/2010/wordprocessingDrawing" xmlns:wp="http://schemas.openxmlformats.org/drawingml/2006/wordprocessingDrawing" xmlns:w10="urn:schemas-microsoft-com:office:word" xmlns:w="http://schemas.openxmlformats.org/wordprocessingml/2006/main" xmlns:w14="http://schemas.microsoft.com/office/word/2010/wordml" xmlns:w15="http://schemas.microsoft.com/office/word/2012/wordml" xmlns:w16cex="http://schemas.microsoft.com/office/word/2018/wordml/cex" xmlns:w16cid="http://schemas.microsoft.com/office/word/2016/wordml/cid" xmlns:w16="http://schemas.microsoft.com/office/word/2018/wordml" xmlns:w16du="http://schemas.microsoft.com/office/word/2023/wordml/word16du" xmlns:w16sdtdh="http://schemas.microsoft.com/office/word/2020/wordml/sdtdatahash" xmlns:w16sdtfl="http://schemas.microsoft.com/office/word/2024/wordml/sdtformatlock" xmlns:w16se="http://schemas.microsoft.com/office/word/2015/wordml/symex" xmlns:wpg="http://schemas.microsoft.com/office/word/2010/wordprocessingGroup" xmlns:wpi="http://schemas.microsoft.com/office/word/2010/wordprocessingInk" xmlns:wne="http://schemas.microsoft.com/office/word/2006/wordml" xmlns:wps="http://schemas.microsoft.com/office/word/2010/wordprocessingShape" mc:Ignorable="w14 w15 w16se w16cid w16 w16cex w16sdtdh w16sdtfl w16du wp14">
-  <w15:person w15:author="Hieu Nguyen">
-    <w15:presenceInfo w15:providerId="Windows Live" w15:userId="6ffae857f14ce83c"/>
-  </w15:person>
-</w15:people>
 </file>
 
 <file path=word/styles.xml><?xml version="1.0" encoding="utf-8"?>
@@ -946,7 +1071,6 @@
   <w:style w:type="character" w:default="1" w:styleId="DefaultParagraphFont">
     <w:name w:val="Default Paragraph Font"/>
     <w:uiPriority w:val="1"/>
-    <w:semiHidden/>
     <w:unhideWhenUsed/>
   </w:style>
   <w:style w:type="table" w:default="1" w:styleId="TableNormal">
@@ -1585,4 +1709,16 @@
     </a:ext>
   </a:extLst>
 </a:theme>
+</file>
+
+<file path=customXml/item1.xml><?xml version="1.0" encoding="utf-8"?>
+<b:Sources xmlns:b="http://schemas.openxmlformats.org/officeDocument/2006/bibliography" xmlns="http://schemas.openxmlformats.org/officeDocument/2006/bibliography" SelectedStyle="\APASixthEditionOfficeOnline.xsl" StyleName="APA" Version="6"/>
+</file>
+
+<file path=customXml/itemProps1.xml><?xml version="1.0" encoding="utf-8"?>
+<ds:datastoreItem xmlns:ds="http://schemas.openxmlformats.org/officeDocument/2006/customXml" ds:itemID="{8414877A-2026-429C-94DD-31288D656DA9}">
+  <ds:schemaRefs>
+    <ds:schemaRef ds:uri="http://schemas.openxmlformats.org/officeDocument/2006/bibliography"/>
+  </ds:schemaRefs>
+</ds:datastoreItem>
 </file>
</xml_diff>

<commit_message>
20260518 literature review v0.1/add section 3
</commit_message>
<xml_diff>
--- a/literature.review/20260518 literature review v0.1.docx
+++ b/literature.review/20260518 literature review v0.1.docx
@@ -346,6 +346,381 @@
           <w:lang w:val="en-001"/>
         </w:rPr>
         <w:t>. This creates the need for later approaches that integrate a broader set of predictive signals, including temporal, engagement, and sentiment features, which is the direction taken by the current project.</w:t>
+      </w:r>
+    </w:p>
+    <w:p>
+      <w:pPr>
+        <w:pStyle w:val="Heading2"/>
+        <w:rPr>
+          <w:lang w:val="en-001"/>
+        </w:rPr>
+      </w:pPr>
+      <w:r>
+        <w:rPr>
+          <w:lang w:val="en-001"/>
+        </w:rPr>
+        <w:t>3. Machine Learning and Content-Based Prediction</w:t>
+      </w:r>
+    </w:p>
+    <w:p>
+      <w:pPr>
+        <w:rPr>
+          <w:lang w:val="en-001"/>
+        </w:rPr>
+      </w:pPr>
+      <w:r>
+        <w:rPr>
+          <w:lang w:val="en-001"/>
+        </w:rPr>
+        <w:t xml:space="preserve">As research in social media prediction developed, researchers began moving </w:t>
+      </w:r>
+      <w:r>
+        <w:rPr>
+          <w:highlight w:val="yellow"/>
+          <w:lang w:val="en-001"/>
+          <w:rPrChange w:id="0" w:author="Hieu Nguyen" w:date="2026-05-18T16:53:00Z" w16du:dateUtc="2026-05-18T09:53:00Z">
+            <w:rPr>
+              <w:lang w:val="en-001"/>
+            </w:rPr>
+          </w:rPrChange>
+        </w:rPr>
+        <w:t>beyond simple temporal popularity measurements</w:t>
+      </w:r>
+      <w:r>
+        <w:rPr>
+          <w:lang w:val="en-001"/>
+        </w:rPr>
+        <w:t xml:space="preserve"> toward </w:t>
+      </w:r>
+      <w:r>
+        <w:rPr>
+          <w:highlight w:val="yellow"/>
+          <w:lang w:val="en-001"/>
+          <w:rPrChange w:id="1" w:author="Hieu Nguyen" w:date="2026-05-18T16:53:00Z" w16du:dateUtc="2026-05-18T09:53:00Z">
+            <w:rPr>
+              <w:lang w:val="en-001"/>
+            </w:rPr>
+          </w:rPrChange>
+        </w:rPr>
+        <w:t>machine learning</w:t>
+      </w:r>
+      <w:r>
+        <w:rPr>
+          <w:lang w:val="en-001"/>
+        </w:rPr>
+        <w:t xml:space="preserve"> approaches that incorporated </w:t>
+      </w:r>
+      <w:r>
+        <w:rPr>
+          <w:highlight w:val="yellow"/>
+          <w:lang w:val="en-001"/>
+          <w:rPrChange w:id="2" w:author="Hieu Nguyen" w:date="2026-05-18T16:53:00Z" w16du:dateUtc="2026-05-18T09:53:00Z">
+            <w:rPr>
+              <w:lang w:val="en-001"/>
+            </w:rPr>
+          </w:rPrChange>
+        </w:rPr>
+        <w:t>multiple feature categories</w:t>
+      </w:r>
+      <w:r>
+        <w:rPr>
+          <w:lang w:val="en-001"/>
+        </w:rPr>
+        <w:t xml:space="preserve">. These approaches aimed to </w:t>
+      </w:r>
+      <w:r>
+        <w:rPr>
+          <w:highlight w:val="yellow"/>
+          <w:lang w:val="en-001"/>
+          <w:rPrChange w:id="3" w:author="Hieu Nguyen" w:date="2026-05-18T16:53:00Z" w16du:dateUtc="2026-05-18T09:53:00Z">
+            <w:rPr>
+              <w:lang w:val="en-001"/>
+            </w:rPr>
+          </w:rPrChange>
+        </w:rPr>
+        <w:t>improve predictive performance</w:t>
+      </w:r>
+      <w:r>
+        <w:rPr>
+          <w:lang w:val="en-001"/>
+        </w:rPr>
+        <w:t xml:space="preserve"> by analysing not only how users interact with content, but also the </w:t>
+      </w:r>
+      <w:r>
+        <w:rPr>
+          <w:highlight w:val="yellow"/>
+          <w:lang w:val="en-001"/>
+          <w:rPrChange w:id="4" w:author="Hieu Nguyen" w:date="2026-05-18T16:53:00Z" w16du:dateUtc="2026-05-18T09:53:00Z">
+            <w:rPr>
+              <w:lang w:val="en-001"/>
+            </w:rPr>
+          </w:rPrChange>
+        </w:rPr>
+        <w:t>characteristics of the content</w:t>
+      </w:r>
+      <w:r>
+        <w:rPr>
+          <w:lang w:val="en-001"/>
+        </w:rPr>
+        <w:t xml:space="preserve"> itself. This shift was important because popularity and trend emergence are influenced by a </w:t>
+      </w:r>
+      <w:r>
+        <w:rPr>
+          <w:highlight w:val="yellow"/>
+          <w:lang w:val="en-001"/>
+          <w:rPrChange w:id="5" w:author="Hieu Nguyen" w:date="2026-05-18T17:04:00Z" w16du:dateUtc="2026-05-18T10:04:00Z">
+            <w:rPr>
+              <w:lang w:val="en-001"/>
+            </w:rPr>
+          </w:rPrChange>
+        </w:rPr>
+        <w:t>combination of</w:t>
+      </w:r>
+      <w:r>
+        <w:rPr>
+          <w:lang w:val="en-001"/>
+        </w:rPr>
+        <w:t xml:space="preserve"> </w:t>
+      </w:r>
+      <w:r>
+        <w:rPr>
+          <w:highlight w:val="yellow"/>
+          <w:lang w:val="en-001"/>
+          <w:rPrChange w:id="6" w:author="Hieu Nguyen" w:date="2026-05-18T17:04:00Z" w16du:dateUtc="2026-05-18T10:04:00Z">
+            <w:rPr>
+              <w:lang w:val="en-001"/>
+            </w:rPr>
+          </w:rPrChange>
+        </w:rPr>
+        <w:t>temporal behaviour, textual information, source credibility, and audience engagement patterns</w:t>
+      </w:r>
+      <w:r>
+        <w:rPr>
+          <w:lang w:val="en-001"/>
+        </w:rPr>
+        <w:t xml:space="preserve"> rather than by a single factor alone.</w:t>
+      </w:r>
+    </w:p>
+    <w:p>
+      <w:pPr>
+        <w:rPr>
+          <w:lang w:val="en-001"/>
+        </w:rPr>
+      </w:pPr>
+      <w:r>
+        <w:rPr>
+          <w:lang w:val="en-001"/>
+        </w:rPr>
+        <w:t xml:space="preserve">An influential study in this area is </w:t>
+      </w:r>
+      <w:r>
+        <w:rPr>
+          <w:b/>
+          <w:bCs/>
+          <w:lang w:val="en-001"/>
+          <w:rPrChange w:id="7" w:author="Hieu Nguyen" w:date="2026-05-18T17:05:00Z" w16du:dateUtc="2026-05-18T10:05:00Z">
+            <w:rPr>
+              <w:lang w:val="en-001"/>
+            </w:rPr>
+          </w:rPrChange>
+        </w:rPr>
+        <w:t>Bandari et al. (2012)</w:t>
+      </w:r>
+      <w:r>
+        <w:rPr>
+          <w:lang w:val="en-001"/>
+        </w:rPr>
+        <w:t xml:space="preserve">, </w:t>
+      </w:r>
+      <w:ins w:id="8" w:author="Hieu Nguyen" w:date="2026-05-18T17:05:00Z" w16du:dateUtc="2026-05-18T10:05:00Z">
+        <w:r>
+          <w:rPr>
+            <w:lang w:val="en-001"/>
+          </w:rPr>
+          <w:t>“</w:t>
+        </w:r>
+      </w:ins>
+      <w:del w:id="9" w:author="Hieu Nguyen" w:date="2026-05-18T17:05:00Z" w16du:dateUtc="2026-05-18T10:05:00Z">
+        <w:r>
+          <w:rPr>
+            <w:lang w:val="en-001"/>
+          </w:rPr>
+          <w:delText>*</w:delText>
+        </w:r>
+      </w:del>
+      <w:r>
+        <w:rPr>
+          <w:lang w:val="en-001"/>
+        </w:rPr>
+        <w:t>Pulse of News in Social Media: Forecasting Popularity</w:t>
+      </w:r>
+      <w:ins w:id="10" w:author="Hieu Nguyen" w:date="2026-05-18T17:05:00Z" w16du:dateUtc="2026-05-18T10:05:00Z">
+        <w:r>
+          <w:rPr>
+            <w:lang w:val="en-001"/>
+          </w:rPr>
+          <w:t>”</w:t>
+        </w:r>
+      </w:ins>
+      <w:del w:id="11" w:author="Hieu Nguyen" w:date="2026-05-18T17:05:00Z" w16du:dateUtc="2026-05-18T10:05:00Z">
+        <w:r>
+          <w:rPr>
+            <w:lang w:val="en-001"/>
+          </w:rPr>
+          <w:delText>*</w:delText>
+        </w:r>
+      </w:del>
+      <w:r>
+        <w:rPr>
+          <w:lang w:val="en-001"/>
+        </w:rPr>
+        <w:t xml:space="preserve">. The authors investigated whether the popularity of news articles on social media platforms could be predicted before large-scale user interaction occurred. Instead of relying entirely on early popularity measurements, the study examined several content-related and metadata-based features, including headline structure, publication source, category information, and linguistic </w:t>
+      </w:r>
+      <w:r>
+        <w:rPr>
+          <w:lang w:val="en-001"/>
+        </w:rPr>
+        <w:lastRenderedPageBreak/>
+        <w:t xml:space="preserve">characteristics. Machine learning models were then used to </w:t>
+      </w:r>
+      <w:r>
+        <w:rPr>
+          <w:highlight w:val="yellow"/>
+          <w:lang w:val="en-001"/>
+          <w:rPrChange w:id="12" w:author="Hieu Nguyen" w:date="2026-05-18T17:10:00Z" w16du:dateUtc="2026-05-18T10:10:00Z">
+            <w:rPr>
+              <w:lang w:val="en-001"/>
+            </w:rPr>
+          </w:rPrChange>
+        </w:rPr>
+        <w:t>estimate the likelihood</w:t>
+      </w:r>
+      <w:r>
+        <w:rPr>
+          <w:lang w:val="en-001"/>
+        </w:rPr>
+        <w:t xml:space="preserve"> that a news story would become popular in social media environments.</w:t>
+      </w:r>
+    </w:p>
+    <w:p>
+      <w:pPr>
+        <w:rPr>
+          <w:lang w:val="en-001"/>
+        </w:rPr>
+      </w:pPr>
+      <w:r>
+        <w:rPr>
+          <w:lang w:val="en-001"/>
+        </w:rPr>
+        <w:t xml:space="preserve">This work is significant because it demonstrated that predictive modelling could benefit from </w:t>
+      </w:r>
+      <w:r>
+        <w:rPr>
+          <w:highlight w:val="yellow"/>
+          <w:lang w:val="en-001"/>
+          <w:rPrChange w:id="13" w:author="Hieu Nguyen" w:date="2026-05-18T17:11:00Z" w16du:dateUtc="2026-05-18T10:11:00Z">
+            <w:rPr>
+              <w:lang w:val="en-001"/>
+            </w:rPr>
+          </w:rPrChange>
+        </w:rPr>
+        <w:t>integrating multiple feature</w:t>
+      </w:r>
+      <w:r>
+        <w:rPr>
+          <w:lang w:val="en-001"/>
+        </w:rPr>
+        <w:t xml:space="preserve"> types rather than </w:t>
+      </w:r>
+      <w:r>
+        <w:rPr>
+          <w:highlight w:val="yellow"/>
+          <w:lang w:val="en-001"/>
+          <w:rPrChange w:id="14" w:author="Hieu Nguyen" w:date="2026-05-18T17:11:00Z" w16du:dateUtc="2026-05-18T10:11:00Z">
+            <w:rPr>
+              <w:lang w:val="en-001"/>
+            </w:rPr>
+          </w:rPrChange>
+        </w:rPr>
+        <w:t>relying solely on temporal popularity</w:t>
+      </w:r>
+      <w:r>
+        <w:rPr>
+          <w:lang w:val="en-001"/>
+        </w:rPr>
+        <w:t xml:space="preserve"> curves. In particular, the paper showed that content characteristics themselves may influence whether users decide to engage with or share information online. This represented an important development compared to earlier popularity prediction research, which focused more heavily on early engagement counts and temporal growth behaviour. By introducing feature engineering and machine learning classification approaches, the study helped establish a more flexible predictive modelling framework for social media analysis.</w:t>
+      </w:r>
+    </w:p>
+    <w:p>
+      <w:pPr>
+        <w:rPr>
+          <w:lang w:val="en-001"/>
+        </w:rPr>
+      </w:pPr>
+      <w:r>
+        <w:rPr>
+          <w:lang w:val="en-001"/>
+        </w:rPr>
+        <w:t>Another important contribution of the paper is its emphasis on structured feature extraction. The authors demonstrated that useful predictive information can be derived from textual and metadata attributes even before substantial user engagement occurs. This idea is highly relevant to the current project because trend emergence detection may also require identifying signals before trends become fully visible through large-scale interaction counts. The study therefore supports the use of multiple feature categories, including temporal, engagement, and content-based features, within a unified predictive framework.</w:t>
+      </w:r>
+    </w:p>
+    <w:p>
+      <w:pPr>
+        <w:rPr>
+          <w:lang w:val="en-001"/>
+        </w:rPr>
+      </w:pPr>
+      <w:r>
+        <w:rPr>
+          <w:lang w:val="en-001"/>
+        </w:rPr>
+        <w:t>However, the study also has several limitations. First, the machine learning techniques used were relatively simple compared to modern predictive approaches. The paper mainly focused on traditional machine learning models and manually engineered features, which may limit the ability to capture more complex temporal or contextual relationships within social media data. Second, while the study considered content characteristics, it gave relatively limited attention to sequential temporal dynamics and information diffusion behaviour. As a result, the approach provides useful feature-level insights but less understanding of how trends evolve over time.</w:t>
+      </w:r>
+    </w:p>
+    <w:p>
+      <w:pPr>
+        <w:rPr>
+          <w:lang w:val="en-001"/>
+        </w:rPr>
+      </w:pPr>
+      <w:r>
+        <w:rPr>
+          <w:lang w:val="en-001"/>
+        </w:rPr>
+        <w:t>Another limitation is that the research focused primarily on predicting news popularity rather than explicitly modelling trend emergence. Popularity prediction and trend emergence detection are related problems, but they are not identical. A piece of content may become moderately popular without triggering a broader trend, while some emerging trends are characterised more by rapid acceleration and diffusion patterns than by final popularity magnitude alone. This distinction is important for the current project, which focuses specifically on identifying early-stage trend emergence within financial discussions on social media.</w:t>
+      </w:r>
+    </w:p>
+    <w:p>
+      <w:pPr>
+        <w:rPr>
+          <w:lang w:val="en-001"/>
+        </w:rPr>
+      </w:pPr>
+      <w:r>
+        <w:rPr>
+          <w:lang w:val="en-001"/>
+        </w:rPr>
+        <w:t xml:space="preserve">Despite these limitations, Bandari et al. (2012) remains highly relevant because it demonstrates the value of combining different feature categories within a machine learning pipeline. The study provides strong justification for feature engineering </w:t>
+      </w:r>
+      <w:r>
+        <w:rPr>
+          <w:lang w:val="en-001"/>
+        </w:rPr>
+        <w:lastRenderedPageBreak/>
+        <w:t>approaches that integrate content characteristics alongside engagement and temporal signals. It also supports the broader idea that predictive performance can improve when models capture multiple dimensions of online behaviour rather than relying on a single predictive indicator.</w:t>
+      </w:r>
+    </w:p>
+    <w:p>
+      <w:pPr>
+        <w:rPr>
+          <w:lang w:val="en-001"/>
+        </w:rPr>
+      </w:pPr>
+      <w:r>
+        <w:rPr>
+          <w:lang w:val="en-001"/>
+        </w:rPr>
+        <w:t>Overall, this research represents an important transition from early popularity prediction studies toward more sophisticated predictive modelling approaches. While earlier work mainly demonstrated that early engagement patterns correlate with later popularity, machine learning approaches such as Bandari et al. (2012) introduced the idea that content structure, metadata, and linguistic information can also contribute valuable predictive signals. This development laid the groundwork for later research incorporating sentiment analysis, natural language processing, and more advanced multi-feature predictive models for understanding social media trends.</w:t>
       </w:r>
     </w:p>
     <w:p>
@@ -467,6 +842,14 @@
     <w:abstractNumId w:val="0"/>
   </w:num>
 </w:numbering>
+</file>
+
+<file path=word/people.xml><?xml version="1.0" encoding="utf-8"?>
+<w15:people xmlns:wpc="http://schemas.microsoft.com/office/word/2010/wordprocessingCanvas" xmlns:cx="http://schemas.microsoft.com/office/drawing/2014/chartex" xmlns:cx1="http://schemas.microsoft.com/office/drawing/2015/9/8/chartex" xmlns:cx2="http://schemas.microsoft.com/office/drawing/2015/10/21/chartex" xmlns:cx3="http://schemas.microsoft.com/office/drawing/2016/5/9/chartex" xmlns:cx4="http://schemas.microsoft.com/office/drawing/2016/5/10/chartex" xmlns:cx5="http://schemas.microsoft.com/office/drawing/2016/5/11/chartex" xmlns:cx6="http://schemas.microsoft.com/office/drawing/2016/5/12/chartex" xmlns:cx7="http://schemas.microsoft.com/office/drawing/2016/5/13/chartex" xmlns:cx8="http://schemas.microsoft.com/office/drawing/2016/5/14/chartex" xmlns:mc="http://schemas.openxmlformats.org/markup-compatibility/2006" xmlns:aink="http://schemas.microsoft.com/office/drawing/2016/ink" xmlns:am3d="http://schemas.microsoft.com/office/drawing/2017/model3d" xmlns:o="urn:schemas-microsoft-com:office:office" xmlns:oel="http://schemas.microsoft.com/office/2019/extlst" xmlns:r="http://schemas.openxmlformats.org/officeDocument/2006/relationships" xmlns:m="http://schemas.openxmlformats.org/officeDocument/2006/math" xmlns:v="urn:schemas-microsoft-com:vml" xmlns:wp14="http://schemas.microsoft.com/office/word/2010/wordprocessingDrawing" xmlns:wp="http://schemas.openxmlformats.org/drawingml/2006/wordprocessingDrawing" xmlns:w10="urn:schemas-microsoft-com:office:word" xmlns:w="http://schemas.openxmlformats.org/wordprocessingml/2006/main" xmlns:w14="http://schemas.microsoft.com/office/word/2010/wordml" xmlns:w15="http://schemas.microsoft.com/office/word/2012/wordml" xmlns:w16cex="http://schemas.microsoft.com/office/word/2018/wordml/cex" xmlns:w16cid="http://schemas.microsoft.com/office/word/2016/wordml/cid" xmlns:w16="http://schemas.microsoft.com/office/word/2018/wordml" xmlns:w16du="http://schemas.microsoft.com/office/word/2023/wordml/word16du" xmlns:w16sdtdh="http://schemas.microsoft.com/office/word/2020/wordml/sdtdatahash" xmlns:w16sdtfl="http://schemas.microsoft.com/office/word/2024/wordml/sdtformatlock" xmlns:w16se="http://schemas.microsoft.com/office/word/2015/wordml/symex" xmlns:wpg="http://schemas.microsoft.com/office/word/2010/wordprocessingGroup" xmlns:wpi="http://schemas.microsoft.com/office/word/2010/wordprocessingInk" xmlns:wne="http://schemas.microsoft.com/office/word/2006/wordml" xmlns:wps="http://schemas.microsoft.com/office/word/2010/wordprocessingShape" mc:Ignorable="w14 w15 w16se w16cid w16 w16cex w16sdtdh w16sdtfl w16du wp14">
+  <w15:person w15:author="Hieu Nguyen">
+    <w15:presenceInfo w15:providerId="Windows Live" w15:userId="6ffae857f14ce83c"/>
+  </w15:person>
+</w15:people>
 </file>
 
 <file path=word/styles.xml><?xml version="1.0" encoding="utf-8"?>

</xml_diff>

<commit_message>
20260518 literature review v0.1/edit section 3/round 1
</commit_message>
<xml_diff>
--- a/literature.review/20260518 literature review v0.1.docx
+++ b/literature.review/20260518 literature review v0.1.docx
@@ -15,10 +15,7 @@
         <w:t xml:space="preserve">Social media platforms have become </w:t>
       </w:r>
       <w:r>
-        <w:t>important</w:t>
-      </w:r>
-      <w:r>
-        <w:t xml:space="preserve"> </w:t>
+        <w:t xml:space="preserve">important </w:t>
       </w:r>
       <w:r>
         <w:t xml:space="preserve">environments for the rapid spread of information, opinion, and public discussion. </w:t>
@@ -308,419 +305,263 @@
       </w:r>
     </w:p>
     <w:p>
-      <w:pPr>
-        <w:rPr>
-          <w:lang w:val="en-001"/>
-        </w:rPr>
-      </w:pPr>
-      <w:r>
-        <w:rPr>
-          <w:lang w:val="en-001"/>
-        </w:rPr>
+      <w:r>
         <w:t xml:space="preserve">These limitations are especially important in a domain such as </w:t>
       </w:r>
       <w:r>
         <w:rPr>
           <w:b/>
           <w:bCs/>
-          <w:lang w:val="en-001"/>
         </w:rPr>
         <w:t>finance</w:t>
       </w:r>
       <w:r>
-        <w:rPr>
-          <w:lang w:val="en-001"/>
-        </w:rPr>
         <w:t xml:space="preserve">, where timing, public reaction, and emotional tone may all contribute to whether online discussion becomes practically significant. Foundational studies therefore support the feasibility of early prediction, but they do not fully address the challenges of </w:t>
       </w:r>
       <w:r>
         <w:rPr>
           <w:b/>
           <w:bCs/>
-          <w:lang w:val="en-001"/>
         </w:rPr>
         <w:t>early-stage, domain-focused trend detection</w:t>
       </w:r>
       <w:r>
-        <w:rPr>
-          <w:lang w:val="en-001"/>
-        </w:rPr>
         <w:t>. This creates the need for later approaches that integrate a broader set of predictive signals, including temporal, engagement, and sentiment features, which is the direction taken by the current project.</w:t>
       </w:r>
     </w:p>
     <w:p>
       <w:pPr>
         <w:pStyle w:val="Heading2"/>
-        <w:rPr>
-          <w:lang w:val="en-001"/>
-        </w:rPr>
       </w:pPr>
       <w:r>
-        <w:rPr>
-          <w:lang w:val="en-001"/>
-        </w:rPr>
         <w:t>3. Machine Learning and Content-Based Prediction</w:t>
       </w:r>
     </w:p>
     <w:p>
-      <w:pPr>
-        <w:rPr>
-          <w:lang w:val="en-001"/>
-        </w:rPr>
-      </w:pPr>
-      <w:r>
-        <w:rPr>
-          <w:lang w:val="en-001"/>
-        </w:rPr>
-        <w:t xml:space="preserve">As research in social media prediction developed, researchers began moving </w:t>
+      <w:r>
+        <w:t xml:space="preserve">As research </w:t>
+      </w:r>
+      <w:r>
+        <w:t>o</w:t>
+      </w:r>
+      <w:r>
+        <w:t xml:space="preserve">n social media prediction developed, </w:t>
+      </w:r>
+      <w:r>
+        <w:t>methods</w:t>
+      </w:r>
+      <w:r>
+        <w:t xml:space="preserve"> </w:t>
+      </w:r>
+      <w:r>
+        <w:t xml:space="preserve">began moving </w:t>
       </w:r>
       <w:r>
         <w:rPr>
           <w:highlight w:val="yellow"/>
-          <w:lang w:val="en-001"/>
-          <w:rPrChange w:id="0" w:author="Hieu Nguyen" w:date="2026-05-18T16:53:00Z" w16du:dateUtc="2026-05-18T09:53:00Z">
-            <w:rPr>
-              <w:lang w:val="en-001"/>
-            </w:rPr>
-          </w:rPrChange>
         </w:rPr>
         <w:t>beyond simple temporal popularity measurements</w:t>
       </w:r>
       <w:r>
-        <w:rPr>
-          <w:lang w:val="en-001"/>
-        </w:rPr>
         <w:t xml:space="preserve"> toward </w:t>
       </w:r>
       <w:r>
         <w:rPr>
           <w:highlight w:val="yellow"/>
-          <w:lang w:val="en-001"/>
-          <w:rPrChange w:id="1" w:author="Hieu Nguyen" w:date="2026-05-18T16:53:00Z" w16du:dateUtc="2026-05-18T09:53:00Z">
-            <w:rPr>
-              <w:lang w:val="en-001"/>
-            </w:rPr>
-          </w:rPrChange>
         </w:rPr>
         <w:t>machine learning</w:t>
       </w:r>
       <w:r>
-        <w:rPr>
-          <w:lang w:val="en-001"/>
-        </w:rPr>
         <w:t xml:space="preserve"> approaches that incorporated </w:t>
+      </w:r>
+      <w:r>
+        <w:t xml:space="preserve">a wider range of </w:t>
       </w:r>
       <w:r>
         <w:rPr>
           <w:highlight w:val="yellow"/>
-          <w:lang w:val="en-001"/>
-          <w:rPrChange w:id="2" w:author="Hieu Nguyen" w:date="2026-05-18T16:53:00Z" w16du:dateUtc="2026-05-18T09:53:00Z">
-            <w:rPr>
-              <w:lang w:val="en-001"/>
-            </w:rPr>
-          </w:rPrChange>
         </w:rPr>
-        <w:t>multiple feature categories</w:t>
-      </w:r>
-      <w:r>
-        <w:rPr>
-          <w:lang w:val="en-001"/>
-        </w:rPr>
-        <w:t xml:space="preserve">. These approaches aimed to </w:t>
+        <w:t>predictive</w:t>
       </w:r>
       <w:r>
         <w:rPr>
           <w:highlight w:val="yellow"/>
-          <w:lang w:val="en-001"/>
-          <w:rPrChange w:id="3" w:author="Hieu Nguyen" w:date="2026-05-18T16:53:00Z" w16du:dateUtc="2026-05-18T09:53:00Z">
-            <w:rPr>
-              <w:lang w:val="en-001"/>
-            </w:rPr>
-          </w:rPrChange>
         </w:rPr>
-        <w:t>improve predictive performance</w:t>
-      </w:r>
-      <w:r>
-        <w:rPr>
-          <w:lang w:val="en-001"/>
-        </w:rPr>
-        <w:t xml:space="preserve"> by analysing not only how users interact with content, but also the </w:t>
+        <w:t xml:space="preserve"> </w:t>
       </w:r>
       <w:r>
         <w:rPr>
           <w:highlight w:val="yellow"/>
-          <w:lang w:val="en-001"/>
-          <w:rPrChange w:id="4" w:author="Hieu Nguyen" w:date="2026-05-18T16:53:00Z" w16du:dateUtc="2026-05-18T09:53:00Z">
-            <w:rPr>
-              <w:lang w:val="en-001"/>
-            </w:rPr>
-          </w:rPrChange>
         </w:rPr>
-        <w:t>characteristics of the content</w:t>
-      </w:r>
-      <w:r>
-        <w:rPr>
-          <w:lang w:val="en-001"/>
-        </w:rPr>
-        <w:t xml:space="preserve"> itself. This shift was important because popularity and trend emergence are influenced by a </w:t>
+        <w:t>feature</w:t>
       </w:r>
       <w:r>
         <w:rPr>
           <w:highlight w:val="yellow"/>
-          <w:lang w:val="en-001"/>
-          <w:rPrChange w:id="5" w:author="Hieu Nguyen" w:date="2026-05-18T17:04:00Z" w16du:dateUtc="2026-05-18T10:04:00Z">
-            <w:rPr>
-              <w:lang w:val="en-001"/>
-            </w:rPr>
-          </w:rPrChange>
         </w:rPr>
-        <w:t>combination of</w:t>
-      </w:r>
-      <w:r>
-        <w:rPr>
-          <w:lang w:val="en-001"/>
-        </w:rPr>
-        <w:t xml:space="preserve"> </w:t>
-      </w:r>
-      <w:r>
-        <w:rPr>
-          <w:highlight w:val="yellow"/>
-          <w:lang w:val="en-001"/>
-          <w:rPrChange w:id="6" w:author="Hieu Nguyen" w:date="2026-05-18T17:04:00Z" w16du:dateUtc="2026-05-18T10:04:00Z">
-            <w:rPr>
-              <w:lang w:val="en-001"/>
-            </w:rPr>
-          </w:rPrChange>
-        </w:rPr>
-        <w:t>temporal behaviour, textual information, source credibility, and audience engagement patterns</w:t>
-      </w:r>
-      <w:r>
-        <w:rPr>
-          <w:lang w:val="en-001"/>
-        </w:rPr>
-        <w:t xml:space="preserve"> rather than by a single factor alone.</w:t>
+        <w:t>s</w:t>
+      </w:r>
+      <w:r>
+        <w:t xml:space="preserve">. </w:t>
+      </w:r>
+      <w:r>
+        <w:t>This</w:t>
+      </w:r>
+      <w:r>
+        <w:t xml:space="preserve"> marked an important methodological shift. </w:t>
+      </w:r>
+      <w:proofErr w:type="spellStart"/>
+      <w:r>
+        <w:t>Earkyer</w:t>
+      </w:r>
+      <w:proofErr w:type="spellEnd"/>
+      <w:r>
+        <w:t xml:space="preserve"> studies had shown that early attention levels could help forecast later popularity, but newer work suggest that prediction could be improved by analysing not only how users interact with content, but also the characteristics of the content itself.  This development was significant because both popularity and trend emergence are shaped by multiple influences, including temporal </w:t>
+      </w:r>
+      <w:proofErr w:type="spellStart"/>
+      <w:r>
+        <w:t>behavior</w:t>
+      </w:r>
+      <w:proofErr w:type="spellEnd"/>
+      <w:r>
+        <w:t>, source attributes, linguistic form, and audience response, rather than by any single factor alone.</w:t>
       </w:r>
     </w:p>
     <w:p>
-      <w:pPr>
-        <w:rPr>
-          <w:lang w:val="en-001"/>
-        </w:rPr>
-      </w:pPr>
-      <w:r>
-        <w:rPr>
-          <w:lang w:val="en-001"/>
-        </w:rPr>
-        <w:t xml:space="preserve">An influential study in this area is </w:t>
+      <w:r>
+        <w:t xml:space="preserve">A central theme in this stage of the literature is the rise of feature engineering. Instead of relying solely on early counts of views, shares, or interactions, researchers began constructing models that used structured information such as headline form, publication source, topic category, and textual characteristics. </w:t>
       </w:r>
       <w:r>
         <w:rPr>
           <w:b/>
           <w:bCs/>
-          <w:lang w:val="en-001"/>
-          <w:rPrChange w:id="7" w:author="Hieu Nguyen" w:date="2026-05-18T17:05:00Z" w16du:dateUtc="2026-05-18T10:05:00Z">
-            <w:rPr>
-              <w:lang w:val="en-001"/>
-            </w:rPr>
-          </w:rPrChange>
         </w:rPr>
         <w:t>Bandari et al. (2012)</w:t>
       </w:r>
       <w:r>
-        <w:rPr>
-          <w:lang w:val="en-001"/>
-        </w:rPr>
-        <w:t xml:space="preserve">, </w:t>
-      </w:r>
-      <w:ins w:id="8" w:author="Hieu Nguyen" w:date="2026-05-18T17:05:00Z" w16du:dateUtc="2026-05-18T10:05:00Z">
-        <w:r>
-          <w:rPr>
-            <w:lang w:val="en-001"/>
-          </w:rPr>
-          <w:t>“</w:t>
-        </w:r>
-      </w:ins>
-      <w:del w:id="9" w:author="Hieu Nguyen" w:date="2026-05-18T17:05:00Z" w16du:dateUtc="2026-05-18T10:05:00Z">
-        <w:r>
-          <w:rPr>
-            <w:lang w:val="en-001"/>
-          </w:rPr>
-          <w:delText>*</w:delText>
-        </w:r>
-      </w:del>
-      <w:r>
-        <w:rPr>
-          <w:lang w:val="en-001"/>
-        </w:rPr>
-        <w:t>Pulse of News in Social Media: Forecasting Popularity</w:t>
-      </w:r>
-      <w:ins w:id="10" w:author="Hieu Nguyen" w:date="2026-05-18T17:05:00Z" w16du:dateUtc="2026-05-18T10:05:00Z">
-        <w:r>
-          <w:rPr>
-            <w:lang w:val="en-001"/>
-          </w:rPr>
-          <w:t>”</w:t>
-        </w:r>
-      </w:ins>
-      <w:del w:id="11" w:author="Hieu Nguyen" w:date="2026-05-18T17:05:00Z" w16du:dateUtc="2026-05-18T10:05:00Z">
-        <w:r>
-          <w:rPr>
-            <w:lang w:val="en-001"/>
-          </w:rPr>
-          <w:delText>*</w:delText>
-        </w:r>
-      </w:del>
-      <w:r>
-        <w:rPr>
-          <w:lang w:val="en-001"/>
-        </w:rPr>
-        <w:t xml:space="preserve">. The authors investigated whether the popularity of news articles on social media platforms could be predicted before large-scale user interaction occurred. Instead of relying entirely on early popularity measurements, the study examined several content-related and metadata-based features, including headline structure, publication source, category information, and linguistic </w:t>
-      </w:r>
-      <w:r>
-        <w:rPr>
-          <w:lang w:val="en-001"/>
-        </w:rPr>
+        <w:t>,</w:t>
+      </w:r>
+      <w:r>
+        <w:t xml:space="preserve"> is </w:t>
+      </w:r>
+      <w:r>
         <w:lastRenderedPageBreak/>
-        <w:t xml:space="preserve">characteristics. Machine learning models were then used to </w:t>
-      </w:r>
-      <w:r>
-        <w:rPr>
-          <w:highlight w:val="yellow"/>
-          <w:lang w:val="en-001"/>
-          <w:rPrChange w:id="12" w:author="Hieu Nguyen" w:date="2026-05-18T17:10:00Z" w16du:dateUtc="2026-05-18T10:10:00Z">
-            <w:rPr>
-              <w:lang w:val="en-001"/>
-            </w:rPr>
-          </w:rPrChange>
-        </w:rPr>
-        <w:t>estimate the likelihood</w:t>
-      </w:r>
-      <w:r>
-        <w:rPr>
-          <w:lang w:val="en-001"/>
-        </w:rPr>
-        <w:t xml:space="preserve"> that a news story would become popular in social media environments.</w:t>
+        <w:t>an important example of this transition</w:t>
+      </w:r>
+      <w:r>
+        <w:t xml:space="preserve">. </w:t>
+      </w:r>
+      <w:r>
+        <w:t xml:space="preserve">Their study examined whether the popularity of news stories on social media could be predicted before substantial user engagement had occurred, using machine learning models trained on content and metadata features. This was an important step because it showed that predictive signals may exist not only in early interaction data, but also in the properties of the content before strong diffusion begins. This shift broadened the understanding of what might drive online attention. It suggested that user behaviour </w:t>
+      </w:r>
+      <w:proofErr w:type="spellStart"/>
+      <w:r>
+        <w:t>ispartly</w:t>
+      </w:r>
+      <w:proofErr w:type="spellEnd"/>
+      <w:r>
+        <w:t xml:space="preserve"> shaped by how information is presented, where it originates, and how it is framed linguistically</w:t>
+      </w:r>
+      <w:r>
+        <w:t>. In methodological terms, this represented a move from relatively simple correlation-</w:t>
+      </w:r>
+      <w:proofErr w:type="spellStart"/>
+      <w:r>
+        <w:t>baased</w:t>
+      </w:r>
+      <w:proofErr w:type="spellEnd"/>
+      <w:r>
+        <w:t xml:space="preserve"> forecasting toward more flexible predictive </w:t>
+      </w:r>
+      <w:proofErr w:type="spellStart"/>
+      <w:r>
+        <w:t>piplines</w:t>
+      </w:r>
+      <w:proofErr w:type="spellEnd"/>
+      <w:r>
+        <w:t xml:space="preserve"> built around classification, feature extraction, and model training. It also opened the way for later work to consider richer textual and semantic information as part of social media prediction.</w:t>
       </w:r>
     </w:p>
     <w:p>
-      <w:pPr>
-        <w:rPr>
-          <w:lang w:val="en-001"/>
-        </w:rPr>
-      </w:pPr>
-      <w:r>
-        <w:rPr>
-          <w:lang w:val="en-001"/>
-        </w:rPr>
-        <w:t xml:space="preserve">This work is significant because it demonstrated that predictive modelling could benefit from </w:t>
-      </w:r>
-      <w:r>
-        <w:rPr>
-          <w:highlight w:val="yellow"/>
-          <w:lang w:val="en-001"/>
-          <w:rPrChange w:id="13" w:author="Hieu Nguyen" w:date="2026-05-18T17:11:00Z" w16du:dateUtc="2026-05-18T10:11:00Z">
-            <w:rPr>
-              <w:lang w:val="en-001"/>
-            </w:rPr>
-          </w:rPrChange>
-        </w:rPr>
-        <w:t>integrating multiple feature</w:t>
-      </w:r>
-      <w:r>
-        <w:rPr>
-          <w:lang w:val="en-001"/>
-        </w:rPr>
-        <w:t xml:space="preserve"> types rather than </w:t>
-      </w:r>
-      <w:r>
-        <w:rPr>
-          <w:highlight w:val="yellow"/>
-          <w:lang w:val="en-001"/>
-          <w:rPrChange w:id="14" w:author="Hieu Nguyen" w:date="2026-05-18T17:11:00Z" w16du:dateUtc="2026-05-18T10:11:00Z">
-            <w:rPr>
-              <w:lang w:val="en-001"/>
-            </w:rPr>
-          </w:rPrChange>
-        </w:rPr>
-        <w:t>relying solely on temporal popularity</w:t>
-      </w:r>
-      <w:r>
-        <w:rPr>
-          <w:lang w:val="en-001"/>
-        </w:rPr>
-        <w:t xml:space="preserve"> curves. In particular, the paper showed that content characteristics themselves may influence whether users decide to engage with or share information online. This represented an important development compared to earlier popularity prediction research, which focused more heavily on early engagement counts and temporal growth behaviour. By introducing feature engineering and machine learning classification approaches, the study helped establish a more flexible predictive modelling framework for social media analysis.</w:t>
+      <w:r>
+        <w:t>However, the</w:t>
+      </w:r>
+      <w:r>
+        <w:t>se approaches</w:t>
+      </w:r>
+      <w:r>
+        <w:t xml:space="preserve"> also </w:t>
+      </w:r>
+      <w:r>
+        <w:t xml:space="preserve">retained </w:t>
+      </w:r>
+      <w:r>
+        <w:t xml:space="preserve">several limitations. </w:t>
+      </w:r>
+      <w:r>
+        <w:t>Although</w:t>
+      </w:r>
+      <w:r>
+        <w:t xml:space="preserve"> machine learning </w:t>
+      </w:r>
+      <w:r>
+        <w:t>and feature engineering expanded the feature space, they still often focused on predicting popularity outcomes rather than detecting the earliest stages of trend emergence</w:t>
+      </w:r>
+      <w:r>
+        <w:t>. The</w:t>
+      </w:r>
+      <w:r>
+        <w:t xml:space="preserve">se are related </w:t>
+      </w:r>
+      <w:proofErr w:type="spellStart"/>
+      <w:r>
+        <w:t>bu</w:t>
+      </w:r>
+      <w:proofErr w:type="spellEnd"/>
+      <w:r>
+        <w:t xml:space="preserve"> distinct tasks.</w:t>
+      </w:r>
+      <w:r>
+        <w:t>.</w:t>
+      </w:r>
+      <w:r>
+        <w:t xml:space="preserve"> Apiece of content may achieve moderate </w:t>
+      </w:r>
+      <w:proofErr w:type="spellStart"/>
+      <w:r>
+        <w:t>upopularity</w:t>
+      </w:r>
+      <w:proofErr w:type="spellEnd"/>
+      <w:r>
+        <w:t xml:space="preserve"> without signalling a broader emerging trend, while some important trends are characterised more by rapid acceleration, engagement patterns, and spreading discussion than by final popularity alone.</w:t>
+      </w:r>
+      <w:r>
+        <w:t xml:space="preserve"> </w:t>
+      </w:r>
+      <w:r>
+        <w:t>In addition</w:t>
+      </w:r>
+      <w:r>
+        <w:t xml:space="preserve">, </w:t>
+      </w:r>
+      <w:r>
+        <w:t>early machine learning approaches often relied on manually engineered features and relatively simple models, limiting their ability to capture more complex temporal relationships, evolving engagement behaviour, or deeper contextual meaning.</w:t>
       </w:r>
     </w:p>
     <w:p>
-      <w:pPr>
-        <w:rPr>
-          <w:lang w:val="en-001"/>
-        </w:rPr>
-      </w:pPr>
-      <w:r>
-        <w:rPr>
-          <w:lang w:val="en-001"/>
-        </w:rPr>
-        <w:t>Another important contribution of the paper is its emphasis on structured feature extraction. The authors demonstrated that useful predictive information can be derived from textual and metadata attributes even before substantial user engagement occurs. This idea is highly relevant to the current project because trend emergence detection may also require identifying signals before trends become fully visible through large-scale interaction counts. The study therefore supports the use of multiple feature categories, including temporal, engagement, and content-based features, within a unified predictive framework.</w:t>
-      </w:r>
-    </w:p>
-    <w:p>
-      <w:pPr>
-        <w:rPr>
-          <w:lang w:val="en-001"/>
-        </w:rPr>
-      </w:pPr>
-      <w:r>
-        <w:rPr>
-          <w:lang w:val="en-001"/>
-        </w:rPr>
-        <w:t>However, the study also has several limitations. First, the machine learning techniques used were relatively simple compared to modern predictive approaches. The paper mainly focused on traditional machine learning models and manually engineered features, which may limit the ability to capture more complex temporal or contextual relationships within social media data. Second, while the study considered content characteristics, it gave relatively limited attention to sequential temporal dynamics and information diffusion behaviour. As a result, the approach provides useful feature-level insights but less understanding of how trends evolve over time.</w:t>
-      </w:r>
-    </w:p>
-    <w:p>
-      <w:pPr>
-        <w:rPr>
-          <w:lang w:val="en-001"/>
-        </w:rPr>
-      </w:pPr>
-      <w:r>
-        <w:rPr>
-          <w:lang w:val="en-001"/>
-        </w:rPr>
-        <w:t>Another limitation is that the research focused primarily on predicting news popularity rather than explicitly modelling trend emergence. Popularity prediction and trend emergence detection are related problems, but they are not identical. A piece of content may become moderately popular without triggering a broader trend, while some emerging trends are characterised more by rapid acceleration and diffusion patterns than by final popularity magnitude alone. This distinction is important for the current project, which focuses specifically on identifying early-stage trend emergence within financial discussions on social media.</w:t>
-      </w:r>
-    </w:p>
-    <w:p>
-      <w:pPr>
-        <w:rPr>
-          <w:lang w:val="en-001"/>
-        </w:rPr>
-      </w:pPr>
-      <w:r>
-        <w:rPr>
-          <w:lang w:val="en-001"/>
-        </w:rPr>
-        <w:t xml:space="preserve">Despite these limitations, Bandari et al. (2012) remains highly relevant because it demonstrates the value of combining different feature categories within a machine learning pipeline. The study provides strong justification for feature engineering </w:t>
-      </w:r>
-      <w:r>
-        <w:rPr>
-          <w:lang w:val="en-001"/>
-        </w:rPr>
-        <w:lastRenderedPageBreak/>
-        <w:t>approaches that integrate content characteristics alongside engagement and temporal signals. It also supports the broader idea that predictive performance can improve when models capture multiple dimensions of online behaviour rather than relying on a single predictive indicator.</w:t>
-      </w:r>
-    </w:p>
-    <w:p>
-      <w:pPr>
-        <w:rPr>
-          <w:lang w:val="en-001"/>
-        </w:rPr>
-      </w:pPr>
-      <w:r>
-        <w:rPr>
-          <w:lang w:val="en-001"/>
-        </w:rPr>
-        <w:t>Overall, this research represents an important transition from early popularity prediction studies toward more sophisticated predictive modelling approaches. While earlier work mainly demonstrated that early engagement patterns correlate with later popularity, machine learning approaches such as Bandari et al. (2012) introduced the idea that content structure, metadata, and linguistic information can also contribute valuable predictive signals. This development laid the groundwork for later research incorporating sentiment analysis, natural language processing, and more advanced multi-feature predictive models for understanding social media trends.</w:t>
+      <w:r>
+        <w:t xml:space="preserve">Another limitation is that </w:t>
+      </w:r>
+      <w:r>
+        <w:t xml:space="preserve">content-based prediction did not necessarily amount to full sentiment-aware or domain-aware </w:t>
+      </w:r>
+      <w:proofErr w:type="spellStart"/>
+      <w:r>
+        <w:t>modeeling</w:t>
+      </w:r>
+      <w:proofErr w:type="spellEnd"/>
+      <w:r>
+        <w:t>. While textual and metadata features improved predictive flexibility, they did not always capture emotional tone or practical significance in specific settings. This is particularly important in the finance domain, where the meaning and sentiment of online discussion may strongly influence whether a topic develops into a meaningful trend.  As a result, machine learning and content-based prediction represented an important advance beyond early popularity studies, but they still left clear gaps in early-stage detection, multi-feature integration, and practical domain-focused application.</w:t>
       </w:r>
     </w:p>
     <w:p>
@@ -730,6 +571,9 @@
           <w:tab w:val="right" w:pos="9026"/>
         </w:tabs>
       </w:pPr>
+      <w:r>
+        <w:t>Overall, this stage of the literature is important because it demonstrates that social media prediction benefits from combining multiple types of signals rather than relying on a single indicator. At the same time, it also shows that early machine learning approaches were only a partial solution. Their strengths lie in expanding the range of usable features, while their limitations help justify later work that integrates temporal, engagement, and sentiment features more directly, which is the direction taken by the current project.</w:t>
+      </w:r>
       <w:r>
         <w:tab/>
       </w:r>
@@ -842,14 +686,6 @@
     <w:abstractNumId w:val="0"/>
   </w:num>
 </w:numbering>
-</file>
-
-<file path=word/people.xml><?xml version="1.0" encoding="utf-8"?>
-<w15:people xmlns:wpc="http://schemas.microsoft.com/office/word/2010/wordprocessingCanvas" xmlns:cx="http://schemas.microsoft.com/office/drawing/2014/chartex" xmlns:cx1="http://schemas.microsoft.com/office/drawing/2015/9/8/chartex" xmlns:cx2="http://schemas.microsoft.com/office/drawing/2015/10/21/chartex" xmlns:cx3="http://schemas.microsoft.com/office/drawing/2016/5/9/chartex" xmlns:cx4="http://schemas.microsoft.com/office/drawing/2016/5/10/chartex" xmlns:cx5="http://schemas.microsoft.com/office/drawing/2016/5/11/chartex" xmlns:cx6="http://schemas.microsoft.com/office/drawing/2016/5/12/chartex" xmlns:cx7="http://schemas.microsoft.com/office/drawing/2016/5/13/chartex" xmlns:cx8="http://schemas.microsoft.com/office/drawing/2016/5/14/chartex" xmlns:mc="http://schemas.openxmlformats.org/markup-compatibility/2006" xmlns:aink="http://schemas.microsoft.com/office/drawing/2016/ink" xmlns:am3d="http://schemas.microsoft.com/office/drawing/2017/model3d" xmlns:o="urn:schemas-microsoft-com:office:office" xmlns:oel="http://schemas.microsoft.com/office/2019/extlst" xmlns:r="http://schemas.openxmlformats.org/officeDocument/2006/relationships" xmlns:m="http://schemas.openxmlformats.org/officeDocument/2006/math" xmlns:v="urn:schemas-microsoft-com:vml" xmlns:wp14="http://schemas.microsoft.com/office/word/2010/wordprocessingDrawing" xmlns:wp="http://schemas.openxmlformats.org/drawingml/2006/wordprocessingDrawing" xmlns:w10="urn:schemas-microsoft-com:office:word" xmlns:w="http://schemas.openxmlformats.org/wordprocessingml/2006/main" xmlns:w14="http://schemas.microsoft.com/office/word/2010/wordml" xmlns:w15="http://schemas.microsoft.com/office/word/2012/wordml" xmlns:w16cex="http://schemas.microsoft.com/office/word/2018/wordml/cex" xmlns:w16cid="http://schemas.microsoft.com/office/word/2016/wordml/cid" xmlns:w16="http://schemas.microsoft.com/office/word/2018/wordml" xmlns:w16du="http://schemas.microsoft.com/office/word/2023/wordml/word16du" xmlns:w16sdtdh="http://schemas.microsoft.com/office/word/2020/wordml/sdtdatahash" xmlns:w16sdtfl="http://schemas.microsoft.com/office/word/2024/wordml/sdtformatlock" xmlns:w16se="http://schemas.microsoft.com/office/word/2015/wordml/symex" xmlns:wpg="http://schemas.microsoft.com/office/word/2010/wordprocessingGroup" xmlns:wpi="http://schemas.microsoft.com/office/word/2010/wordprocessingInk" xmlns:wne="http://schemas.microsoft.com/office/word/2006/wordml" xmlns:wps="http://schemas.microsoft.com/office/word/2010/wordprocessingShape" mc:Ignorable="w14 w15 w16se w16cid w16 w16cex w16sdtdh w16sdtfl w16du wp14">
-  <w15:person w15:author="Hieu Nguyen">
-    <w15:presenceInfo w15:providerId="Windows Live" w15:userId="6ffae857f14ce83c"/>
-  </w15:person>
-</w15:people>
 </file>
 
 <file path=word/styles.xml><?xml version="1.0" encoding="utf-8"?>
@@ -1454,6 +1290,7 @@
   <w:style w:type="character" w:default="1" w:styleId="DefaultParagraphFont">
     <w:name w:val="Default Paragraph Font"/>
     <w:uiPriority w:val="1"/>
+    <w:semiHidden/>
     <w:unhideWhenUsed/>
   </w:style>
   <w:style w:type="table" w:default="1" w:styleId="TableNormal">

</xml_diff>

<commit_message>
20260518 literature review v0.1/add section 4
</commit_message>
<xml_diff>
--- a/literature.review/20260518 literature review v0.1.docx
+++ b/literature.review/20260518 literature review v0.1.docx
@@ -431,6 +431,7 @@
       <w:r>
         <w:t xml:space="preserve">A central theme in this stage of the literature is the rise of feature engineering. Instead of relying solely on early counts of views, shares, or interactions, researchers began constructing models that used structured information such as headline form, publication source, topic category, and textual characteristics. </w:t>
       </w:r>
+      <w:proofErr w:type="gramStart"/>
       <w:r>
         <w:rPr>
           <w:b/>
@@ -441,6 +442,7 @@
       <w:r>
         <w:t>,</w:t>
       </w:r>
+      <w:proofErr w:type="gramEnd"/>
       <w:r>
         <w:t xml:space="preserve"> is </w:t>
       </w:r>
@@ -519,11 +521,16 @@
       </w:r>
       <w:proofErr w:type="spellEnd"/>
       <w:r>
-        <w:t xml:space="preserve"> distinct tasks.</w:t>
+        <w:t xml:space="preserve"> distinct </w:t>
+      </w:r>
+      <w:proofErr w:type="gramStart"/>
+      <w:r>
+        <w:t>tasks.</w:t>
       </w:r>
       <w:r>
         <w:t>.</w:t>
       </w:r>
+      <w:proofErr w:type="gramEnd"/>
       <w:r>
         <w:t xml:space="preserve"> Apiece of content may achieve moderate </w:t>
       </w:r>
@@ -570,10 +577,332 @@
           <w:tab w:val="left" w:pos="7128"/>
           <w:tab w:val="right" w:pos="9026"/>
         </w:tabs>
+        <w:rPr>
+          <w:ins w:id="0" w:author="Hieu Nguyen" w:date="2026-05-22T19:51:00Z" w16du:dateUtc="2026-05-22T12:51:00Z"/>
+        </w:rPr>
       </w:pPr>
       <w:r>
         <w:t>Overall, this stage of the literature is important because it demonstrates that social media prediction benefits from combining multiple types of signals rather than relying on a single indicator. At the same time, it also shows that early machine learning approaches were only a partial solution. Their strengths lie in expanding the range of usable features, while their limitations help justify later work that integrates temporal, engagement, and sentiment features more directly, which is the direction taken by the current project.</w:t>
       </w:r>
+    </w:p>
+    <w:p>
+      <w:pPr>
+        <w:pStyle w:val="Heading2"/>
+        <w:rPr>
+          <w:ins w:id="1" w:author="Hieu Nguyen" w:date="2026-05-22T19:51:00Z"/>
+          <w:lang w:val="en-US"/>
+        </w:rPr>
+        <w:pPrChange w:id="2" w:author="Hieu Nguyen" w:date="2026-05-22T19:52:00Z" w16du:dateUtc="2026-05-22T12:52:00Z">
+          <w:pPr>
+            <w:tabs>
+              <w:tab w:val="left" w:pos="7128"/>
+              <w:tab w:val="right" w:pos="9026"/>
+            </w:tabs>
+          </w:pPr>
+        </w:pPrChange>
+      </w:pPr>
+      <w:ins w:id="3" w:author="Hieu Nguyen" w:date="2026-05-22T19:51:00Z">
+        <w:r>
+          <w:rPr>
+            <w:lang w:val="en-US"/>
+          </w:rPr>
+          <w:lastRenderedPageBreak/>
+          <w:t>4. NLP and Sentiment Analysis in Social Media Prediction</w:t>
+        </w:r>
+      </w:ins>
+    </w:p>
+    <w:p>
+      <w:pPr>
+        <w:tabs>
+          <w:tab w:val="left" w:pos="7128"/>
+          <w:tab w:val="right" w:pos="9026"/>
+        </w:tabs>
+        <w:rPr>
+          <w:ins w:id="4" w:author="Hieu Nguyen" w:date="2026-05-22T19:51:00Z"/>
+          <w:lang w:val="en-US"/>
+        </w:rPr>
+      </w:pPr>
+      <w:ins w:id="5" w:author="Hieu Nguyen" w:date="2026-05-22T19:51:00Z">
+        <w:r>
+          <w:rPr>
+            <w:lang w:val="en-US"/>
+          </w:rPr>
+          <w:t xml:space="preserve">As social media platforms evolved into major spaces for public discussion and opinion sharing, researchers began exploring whether the emotional and linguistic content of online posts could provide predictive information about real-world events and collective behaviour. This led to the growing use of natural language processing (NLP) and sentiment analysis within predictive modelling research. Unlike earlier popularity prediction approaches that focused mainly on engagement counts or temporal growth patterns, sentiment-based approaches attempt to </w:t>
+        </w:r>
+        <w:proofErr w:type="spellStart"/>
+        <w:r>
+          <w:rPr>
+            <w:lang w:val="en-US"/>
+          </w:rPr>
+          <w:t>analyse</w:t>
+        </w:r>
+        <w:proofErr w:type="spellEnd"/>
+        <w:r>
+          <w:rPr>
+            <w:lang w:val="en-US"/>
+          </w:rPr>
+          <w:t xml:space="preserve"> the meaning, tone, and emotional characteristics of user-generated content.</w:t>
+        </w:r>
+      </w:ins>
+    </w:p>
+    <w:p>
+      <w:pPr>
+        <w:tabs>
+          <w:tab w:val="left" w:pos="7128"/>
+          <w:tab w:val="right" w:pos="9026"/>
+        </w:tabs>
+        <w:rPr>
+          <w:ins w:id="6" w:author="Hieu Nguyen" w:date="2026-05-22T19:51:00Z"/>
+          <w:lang w:val="en-US"/>
+        </w:rPr>
+      </w:pPr>
+      <w:ins w:id="7" w:author="Hieu Nguyen" w:date="2026-05-22T19:51:00Z">
+        <w:r>
+          <w:rPr>
+            <w:lang w:val="en-US"/>
+          </w:rPr>
+          <w:t xml:space="preserve">One of the most influential studies in this area is Bollen et al. (2011), </w:t>
+        </w:r>
+        <w:r>
+          <w:rPr>
+            <w:i/>
+            <w:iCs/>
+            <w:lang w:val="en-US"/>
+          </w:rPr>
+          <w:t>Twitter Mood Predicts the Stock Market</w:t>
+        </w:r>
+        <w:r>
+          <w:rPr>
+            <w:lang w:val="en-US"/>
+          </w:rPr>
+          <w:t>. The study investigated whether collective mood states extracted from Twitter posts could predict movements in the Dow Jones Industrial Average (DJIA). Using sentiment analysis techniques, the authors measured emotional dimensions from large volumes of tweets and examined whether changes in public mood correlated with later stock market behaviour. Their findings suggested that certain mood indicators, particularly calmness-related measures, showed predictive relationships with market changes several days in advance.</w:t>
+        </w:r>
+      </w:ins>
+    </w:p>
+    <w:p>
+      <w:pPr>
+        <w:tabs>
+          <w:tab w:val="left" w:pos="7128"/>
+          <w:tab w:val="right" w:pos="9026"/>
+        </w:tabs>
+        <w:rPr>
+          <w:ins w:id="8" w:author="Hieu Nguyen" w:date="2026-05-22T19:51:00Z"/>
+          <w:lang w:val="en-US"/>
+        </w:rPr>
+      </w:pPr>
+      <w:ins w:id="9" w:author="Hieu Nguyen" w:date="2026-05-22T19:51:00Z">
+        <w:r>
+          <w:rPr>
+            <w:lang w:val="en-US"/>
+          </w:rPr>
+          <w:t xml:space="preserve">This study is significant because it demonstrated that social media content may contain useful </w:t>
+        </w:r>
+        <w:proofErr w:type="spellStart"/>
+        <w:r>
+          <w:rPr>
+            <w:lang w:val="en-US"/>
+          </w:rPr>
+          <w:t>behavioural</w:t>
+        </w:r>
+        <w:proofErr w:type="spellEnd"/>
+        <w:r>
+          <w:rPr>
+            <w:lang w:val="en-US"/>
+          </w:rPr>
+          <w:t xml:space="preserve"> and emotional signals beyond simple popularity measurements. The research helped establish sentiment analysis as an important area within social media prediction and showed that online discussions can reflect broader public reactions, expectations, and collective attention patterns. In contrast to earlier popularity-focused research, Bollen et al. (2011) highlighted the potential value of </w:t>
+        </w:r>
+        <w:proofErr w:type="spellStart"/>
+        <w:r>
+          <w:rPr>
+            <w:lang w:val="en-US"/>
+          </w:rPr>
+          <w:t>analysing</w:t>
+        </w:r>
+        <w:proofErr w:type="spellEnd"/>
+        <w:r>
+          <w:rPr>
+            <w:lang w:val="en-US"/>
+          </w:rPr>
+          <w:t xml:space="preserve"> textual meaning rather than relying only on engagement statistics such as views, reposts, or comment counts.</w:t>
+        </w:r>
+      </w:ins>
+    </w:p>
+    <w:p>
+      <w:pPr>
+        <w:tabs>
+          <w:tab w:val="left" w:pos="7128"/>
+          <w:tab w:val="right" w:pos="9026"/>
+        </w:tabs>
+        <w:rPr>
+          <w:ins w:id="10" w:author="Hieu Nguyen" w:date="2026-05-22T19:51:00Z"/>
+          <w:lang w:val="en-US"/>
+        </w:rPr>
+      </w:pPr>
+      <w:ins w:id="11" w:author="Hieu Nguyen" w:date="2026-05-22T19:51:00Z">
+        <w:r>
+          <w:rPr>
+            <w:lang w:val="en-US"/>
+          </w:rPr>
+          <w:t xml:space="preserve">A major strength of the study is its interdisciplinary perspective, combining computational analysis with </w:t>
+        </w:r>
+        <w:proofErr w:type="spellStart"/>
+        <w:r>
+          <w:rPr>
+            <w:lang w:val="en-US"/>
+          </w:rPr>
+          <w:t>behavioural</w:t>
+        </w:r>
+        <w:proofErr w:type="spellEnd"/>
+        <w:r>
+          <w:rPr>
+            <w:lang w:val="en-US"/>
+          </w:rPr>
+          <w:t xml:space="preserve"> and financial interpretation. The work showed that social media sentiment could potentially act as an early indicator of collective </w:t>
+        </w:r>
+        <w:proofErr w:type="spellStart"/>
+        <w:r>
+          <w:rPr>
+            <w:lang w:val="en-US"/>
+          </w:rPr>
+          <w:t>behavioural</w:t>
+        </w:r>
+        <w:proofErr w:type="spellEnd"/>
+        <w:r>
+          <w:rPr>
+            <w:lang w:val="en-US"/>
+          </w:rPr>
+          <w:t xml:space="preserve"> shifts, which is particularly relevant in finance-related environments where public attention and emotional reactions can influence discussion dynamics and investment behaviour. This idea strongly supports the inclusion of sentiment-based features within the current project, especially because financial social media discussions often involve speculation, optimism, fear, or uncertainty that may contribute to trend emergence.</w:t>
+        </w:r>
+      </w:ins>
+    </w:p>
+    <w:p>
+      <w:pPr>
+        <w:tabs>
+          <w:tab w:val="left" w:pos="7128"/>
+          <w:tab w:val="right" w:pos="9026"/>
+        </w:tabs>
+        <w:rPr>
+          <w:ins w:id="12" w:author="Hieu Nguyen" w:date="2026-05-22T19:51:00Z"/>
+          <w:lang w:val="en-US"/>
+        </w:rPr>
+      </w:pPr>
+      <w:ins w:id="13" w:author="Hieu Nguyen" w:date="2026-05-22T19:51:00Z">
+        <w:r>
+          <w:rPr>
+            <w:lang w:val="en-US"/>
+          </w:rPr>
+          <w:t xml:space="preserve">Another important contribution of the paper is that it expanded the scope of predictive modelling from purely structural or engagement-based analysis toward semantic understanding of user-generated content. This development is important because social media trends are not driven only by interaction volume, but also by the meaning </w:t>
+        </w:r>
+        <w:r>
+          <w:rPr>
+            <w:lang w:val="en-US"/>
+          </w:rPr>
+          <w:lastRenderedPageBreak/>
+          <w:t>and emotional intensity of discussions. As a result, sentiment analysis provides an additional layer of information that may improve the ability to detect emerging trends during their early stages.</w:t>
+        </w:r>
+      </w:ins>
+    </w:p>
+    <w:p>
+      <w:pPr>
+        <w:tabs>
+          <w:tab w:val="left" w:pos="7128"/>
+          <w:tab w:val="right" w:pos="9026"/>
+        </w:tabs>
+        <w:rPr>
+          <w:ins w:id="14" w:author="Hieu Nguyen" w:date="2026-05-22T19:51:00Z"/>
+          <w:lang w:val="en-US"/>
+        </w:rPr>
+      </w:pPr>
+      <w:ins w:id="15" w:author="Hieu Nguyen" w:date="2026-05-22T19:51:00Z">
+        <w:r>
+          <w:rPr>
+            <w:lang w:val="en-US"/>
+          </w:rPr>
+          <w:t>Despite its influence, the study also has several limitations. One important concern is the difficulty of distinguishing correlation from causation. Although the paper identified statistical relationships between Twitter mood and stock market behaviour, this does not necessarily prove that social media sentiment directly causes market changes. External factors such as news events, economic conditions, or political developments may influence both social media discussions and financial markets simultaneously. This makes interpretation more complex and highlights the challenges of drawing strong causal conclusions from observational social media data.</w:t>
+        </w:r>
+      </w:ins>
+    </w:p>
+    <w:p>
+      <w:pPr>
+        <w:tabs>
+          <w:tab w:val="left" w:pos="7128"/>
+          <w:tab w:val="right" w:pos="9026"/>
+        </w:tabs>
+        <w:rPr>
+          <w:ins w:id="16" w:author="Hieu Nguyen" w:date="2026-05-22T19:51:00Z"/>
+          <w:lang w:val="en-US"/>
+        </w:rPr>
+      </w:pPr>
+      <w:ins w:id="17" w:author="Hieu Nguyen" w:date="2026-05-22T19:51:00Z">
+        <w:r>
+          <w:rPr>
+            <w:lang w:val="en-US"/>
+          </w:rPr>
+          <w:t xml:space="preserve">Another limitation is that the sentiment analysis techniques used in the study were relatively simple compared to modern NLP approaches. The work relied largely on lexicon-based sentiment measurements, which may struggle to capture sarcasm, financial terminology, contextual meaning, or complex emotional expression commonly found in social media discussions. In addition, Twitter users do not necessarily represent the broader population, creating potential sampling bias that may affect </w:t>
+        </w:r>
+        <w:proofErr w:type="spellStart"/>
+        <w:r>
+          <w:rPr>
+            <w:lang w:val="en-US"/>
+          </w:rPr>
+          <w:t>generalisability</w:t>
+        </w:r>
+        <w:proofErr w:type="spellEnd"/>
+        <w:r>
+          <w:rPr>
+            <w:lang w:val="en-US"/>
+          </w:rPr>
+          <w:t>.</w:t>
+        </w:r>
+      </w:ins>
+    </w:p>
+    <w:p>
+      <w:pPr>
+        <w:tabs>
+          <w:tab w:val="left" w:pos="7128"/>
+          <w:tab w:val="right" w:pos="9026"/>
+        </w:tabs>
+        <w:rPr>
+          <w:ins w:id="18" w:author="Hieu Nguyen" w:date="2026-05-22T19:51:00Z"/>
+          <w:lang w:val="en-US"/>
+        </w:rPr>
+      </w:pPr>
+      <w:ins w:id="19" w:author="Hieu Nguyen" w:date="2026-05-22T19:51:00Z">
+        <w:r>
+          <w:rPr>
+            <w:lang w:val="en-US"/>
+          </w:rPr>
+          <w:t>The study is also not directly focused on trend emergence prediction. Its primary objective was market prediction rather than detecting the formation and spread of social media trends. Nevertheless, the research remains highly relevant because it demonstrates that textual sentiment and collective mood can provide predictive signals within finance-related social media environments. For the current project, this supports the use of sentiment-based features as one component within a broader predictive modelling framework rather than as a standalone predictor.</w:t>
+        </w:r>
+      </w:ins>
+    </w:p>
+    <w:p>
+      <w:pPr>
+        <w:tabs>
+          <w:tab w:val="left" w:pos="7128"/>
+          <w:tab w:val="right" w:pos="9026"/>
+        </w:tabs>
+        <w:rPr>
+          <w:ins w:id="20" w:author="Hieu Nguyen" w:date="2026-05-22T19:51:00Z"/>
+          <w:lang w:val="en-US"/>
+        </w:rPr>
+      </w:pPr>
+      <w:ins w:id="21" w:author="Hieu Nguyen" w:date="2026-05-22T19:51:00Z">
+        <w:r>
+          <w:rPr>
+            <w:lang w:val="en-US"/>
+          </w:rPr>
+          <w:t>Overall, Bollen et al. (2011) represents an important step in the evolution of predictive modelling research by introducing NLP and sentiment analysis into social media forecasting. The study expanded predictive approaches beyond temporal popularity and engagement measurements, showing that emotional and semantic information may also contribute valuable predictive insights. This development helped motivate later research that integrates textual analysis, sentiment features, and machine learning techniques to better understand how discussions evolve and how emerging trends can be identified from large-scale social media activity.</w:t>
+        </w:r>
+      </w:ins>
+    </w:p>
+    <w:p>
+      <w:pPr>
+        <w:tabs>
+          <w:tab w:val="left" w:pos="7128"/>
+          <w:tab w:val="right" w:pos="9026"/>
+        </w:tabs>
+      </w:pPr>
       <w:r>
         <w:tab/>
       </w:r>
@@ -686,6 +1015,14 @@
     <w:abstractNumId w:val="0"/>
   </w:num>
 </w:numbering>
+</file>
+
+<file path=word/people.xml><?xml version="1.0" encoding="utf-8"?>
+<w15:people xmlns:wpc="http://schemas.microsoft.com/office/word/2010/wordprocessingCanvas" xmlns:cx="http://schemas.microsoft.com/office/drawing/2014/chartex" xmlns:cx1="http://schemas.microsoft.com/office/drawing/2015/9/8/chartex" xmlns:cx2="http://schemas.microsoft.com/office/drawing/2015/10/21/chartex" xmlns:cx3="http://schemas.microsoft.com/office/drawing/2016/5/9/chartex" xmlns:cx4="http://schemas.microsoft.com/office/drawing/2016/5/10/chartex" xmlns:cx5="http://schemas.microsoft.com/office/drawing/2016/5/11/chartex" xmlns:cx6="http://schemas.microsoft.com/office/drawing/2016/5/12/chartex" xmlns:cx7="http://schemas.microsoft.com/office/drawing/2016/5/13/chartex" xmlns:cx8="http://schemas.microsoft.com/office/drawing/2016/5/14/chartex" xmlns:mc="http://schemas.openxmlformats.org/markup-compatibility/2006" xmlns:aink="http://schemas.microsoft.com/office/drawing/2016/ink" xmlns:am3d="http://schemas.microsoft.com/office/drawing/2017/model3d" xmlns:o="urn:schemas-microsoft-com:office:office" xmlns:oel="http://schemas.microsoft.com/office/2019/extlst" xmlns:r="http://schemas.openxmlformats.org/officeDocument/2006/relationships" xmlns:m="http://schemas.openxmlformats.org/officeDocument/2006/math" xmlns:v="urn:schemas-microsoft-com:vml" xmlns:wp14="http://schemas.microsoft.com/office/word/2010/wordprocessingDrawing" xmlns:wp="http://schemas.openxmlformats.org/drawingml/2006/wordprocessingDrawing" xmlns:w10="urn:schemas-microsoft-com:office:word" xmlns:w="http://schemas.openxmlformats.org/wordprocessingml/2006/main" xmlns:w14="http://schemas.microsoft.com/office/word/2010/wordml" xmlns:w15="http://schemas.microsoft.com/office/word/2012/wordml" xmlns:w16cex="http://schemas.microsoft.com/office/word/2018/wordml/cex" xmlns:w16cid="http://schemas.microsoft.com/office/word/2016/wordml/cid" xmlns:w16="http://schemas.microsoft.com/office/word/2018/wordml" xmlns:w16du="http://schemas.microsoft.com/office/word/2023/wordml/word16du" xmlns:w16sdtdh="http://schemas.microsoft.com/office/word/2020/wordml/sdtdatahash" xmlns:w16sdtfl="http://schemas.microsoft.com/office/word/2024/wordml/sdtformatlock" xmlns:w16se="http://schemas.microsoft.com/office/word/2015/wordml/symex" xmlns:wpg="http://schemas.microsoft.com/office/word/2010/wordprocessingGroup" xmlns:wpi="http://schemas.microsoft.com/office/word/2010/wordprocessingInk" xmlns:wne="http://schemas.microsoft.com/office/word/2006/wordml" xmlns:wps="http://schemas.microsoft.com/office/word/2010/wordprocessingShape" mc:Ignorable="w14 w15 w16se w16cid w16 w16cex w16sdtdh w16sdtfl w16du wp14">
+  <w15:person w15:author="Hieu Nguyen">
+    <w15:presenceInfo w15:providerId="Windows Live" w15:userId="6ffae857f14ce83c"/>
+  </w15:person>
+</w15:people>
 </file>
 
 <file path=word/styles.xml><?xml version="1.0" encoding="utf-8"?>
@@ -1290,7 +1627,6 @@
   <w:style w:type="character" w:default="1" w:styleId="DefaultParagraphFont">
     <w:name w:val="Default Paragraph Font"/>
     <w:uiPriority w:val="1"/>
-    <w:semiHidden/>
     <w:unhideWhenUsed/>
   </w:style>
   <w:style w:type="table" w:default="1" w:styleId="TableNormal">

</xml_diff>

<commit_message>
20260518 literature review v0.1/add section 5
</commit_message>
<xml_diff>
--- a/literature.review/20260518 literature review v0.1.docx
+++ b/literature.review/20260518 literature review v0.1.docx
@@ -577,9 +577,6 @@
           <w:tab w:val="left" w:pos="7128"/>
           <w:tab w:val="right" w:pos="9026"/>
         </w:tabs>
-        <w:rPr>
-          <w:ins w:id="0" w:author="Hieu Nguyen" w:date="2026-05-22T19:51:00Z" w16du:dateUtc="2026-05-22T12:51:00Z"/>
-        </w:rPr>
       </w:pPr>
       <w:r>
         <w:t>Overall, this stage of the literature is important because it demonstrates that social media prediction benefits from combining multiple types of signals rather than relying on a single indicator. At the same time, it also shows that early machine learning approaches were only a partial solution. Their strengths lie in expanding the range of usable features, while their limitations help justify later work that integrates temporal, engagement, and sentiment features more directly, which is the direction taken by the current project.</w:t>
@@ -589,10 +586,9 @@
       <w:pPr>
         <w:pStyle w:val="Heading2"/>
         <w:rPr>
-          <w:ins w:id="1" w:author="Hieu Nguyen" w:date="2026-05-22T19:51:00Z"/>
-          <w:lang w:val="en-US"/>
-        </w:rPr>
-        <w:pPrChange w:id="2" w:author="Hieu Nguyen" w:date="2026-05-22T19:52:00Z" w16du:dateUtc="2026-05-22T12:52:00Z">
+          <w:lang w:val="en-US"/>
+        </w:rPr>
+        <w:pPrChange w:id="0" w:author="Hieu Nguyen" w:date="2026-05-22T19:52:00Z" w16du:dateUtc="2026-05-22T12:52:00Z">
           <w:pPr>
             <w:tabs>
               <w:tab w:val="left" w:pos="7128"/>
@@ -601,15 +597,13 @@
           </w:pPr>
         </w:pPrChange>
       </w:pPr>
-      <w:ins w:id="3" w:author="Hieu Nguyen" w:date="2026-05-22T19:51:00Z">
-        <w:r>
-          <w:rPr>
-            <w:lang w:val="en-US"/>
-          </w:rPr>
-          <w:lastRenderedPageBreak/>
-          <w:t>4. NLP and Sentiment Analysis in Social Media Prediction</w:t>
-        </w:r>
-      </w:ins>
+      <w:r>
+        <w:rPr>
+          <w:lang w:val="en-US"/>
+        </w:rPr>
+        <w:lastRenderedPageBreak/>
+        <w:t>4. NLP and Sentiment Analysis in Social Media Prediction</w:t>
+      </w:r>
     </w:p>
     <w:p>
       <w:pPr>
@@ -618,32 +612,29 @@
           <w:tab w:val="right" w:pos="9026"/>
         </w:tabs>
         <w:rPr>
-          <w:ins w:id="4" w:author="Hieu Nguyen" w:date="2026-05-22T19:51:00Z"/>
-          <w:lang w:val="en-US"/>
-        </w:rPr>
-      </w:pPr>
-      <w:ins w:id="5" w:author="Hieu Nguyen" w:date="2026-05-22T19:51:00Z">
-        <w:r>
-          <w:rPr>
-            <w:lang w:val="en-US"/>
-          </w:rPr>
-          <w:t xml:space="preserve">As social media platforms evolved into major spaces for public discussion and opinion sharing, researchers began exploring whether the emotional and linguistic content of online posts could provide predictive information about real-world events and collective behaviour. This led to the growing use of natural language processing (NLP) and sentiment analysis within predictive modelling research. Unlike earlier popularity prediction approaches that focused mainly on engagement counts or temporal growth patterns, sentiment-based approaches attempt to </w:t>
-        </w:r>
-        <w:proofErr w:type="spellStart"/>
-        <w:r>
-          <w:rPr>
-            <w:lang w:val="en-US"/>
-          </w:rPr>
-          <w:t>analyse</w:t>
-        </w:r>
-        <w:proofErr w:type="spellEnd"/>
-        <w:r>
-          <w:rPr>
-            <w:lang w:val="en-US"/>
-          </w:rPr>
-          <w:t xml:space="preserve"> the meaning, tone, and emotional characteristics of user-generated content.</w:t>
-        </w:r>
-      </w:ins>
+          <w:lang w:val="en-US"/>
+        </w:rPr>
+      </w:pPr>
+      <w:r>
+        <w:rPr>
+          <w:lang w:val="en-US"/>
+        </w:rPr>
+        <w:t xml:space="preserve">As social media platforms evolved into major spaces for public discussion and opinion sharing, researchers began exploring whether the emotional and linguistic content of online posts could provide predictive information about real-world events and collective behaviour. This led to the growing use of natural language processing (NLP) and sentiment analysis within predictive modelling research. Unlike earlier popularity prediction approaches that focused mainly on engagement counts or temporal growth patterns, sentiment-based approaches attempt to </w:t>
+      </w:r>
+      <w:proofErr w:type="spellStart"/>
+      <w:r>
+        <w:rPr>
+          <w:lang w:val="en-US"/>
+        </w:rPr>
+        <w:t>analyse</w:t>
+      </w:r>
+      <w:proofErr w:type="spellEnd"/>
+      <w:r>
+        <w:rPr>
+          <w:lang w:val="en-US"/>
+        </w:rPr>
+        <w:t xml:space="preserve"> the meaning, tone, and emotional characteristics of user-generated content.</w:t>
+      </w:r>
     </w:p>
     <w:p>
       <w:pPr>
@@ -652,32 +643,29 @@
           <w:tab w:val="right" w:pos="9026"/>
         </w:tabs>
         <w:rPr>
-          <w:ins w:id="6" w:author="Hieu Nguyen" w:date="2026-05-22T19:51:00Z"/>
-          <w:lang w:val="en-US"/>
-        </w:rPr>
-      </w:pPr>
-      <w:ins w:id="7" w:author="Hieu Nguyen" w:date="2026-05-22T19:51:00Z">
-        <w:r>
-          <w:rPr>
-            <w:lang w:val="en-US"/>
-          </w:rPr>
-          <w:t xml:space="preserve">One of the most influential studies in this area is Bollen et al. (2011), </w:t>
-        </w:r>
-        <w:r>
-          <w:rPr>
-            <w:i/>
-            <w:iCs/>
-            <w:lang w:val="en-US"/>
-          </w:rPr>
-          <w:t>Twitter Mood Predicts the Stock Market</w:t>
-        </w:r>
-        <w:r>
-          <w:rPr>
-            <w:lang w:val="en-US"/>
-          </w:rPr>
-          <w:t>. The study investigated whether collective mood states extracted from Twitter posts could predict movements in the Dow Jones Industrial Average (DJIA). Using sentiment analysis techniques, the authors measured emotional dimensions from large volumes of tweets and examined whether changes in public mood correlated with later stock market behaviour. Their findings suggested that certain mood indicators, particularly calmness-related measures, showed predictive relationships with market changes several days in advance.</w:t>
-        </w:r>
-      </w:ins>
+          <w:lang w:val="en-US"/>
+        </w:rPr>
+      </w:pPr>
+      <w:r>
+        <w:rPr>
+          <w:lang w:val="en-US"/>
+        </w:rPr>
+        <w:t xml:space="preserve">One of the most influential studies in this area is Bollen et al. (2011), </w:t>
+      </w:r>
+      <w:r>
+        <w:rPr>
+          <w:i/>
+          <w:iCs/>
+          <w:lang w:val="en-US"/>
+        </w:rPr>
+        <w:t>Twitter Mood Predicts the Stock Market</w:t>
+      </w:r>
+      <w:r>
+        <w:rPr>
+          <w:lang w:val="en-US"/>
+        </w:rPr>
+        <w:t>. The study investigated whether collective mood states extracted from Twitter posts could predict movements in the Dow Jones Industrial Average (DJIA). Using sentiment analysis techniques, the authors measured emotional dimensions from large volumes of tweets and examined whether changes in public mood correlated with later stock market behaviour. Their findings suggested that certain mood indicators, particularly calmness-related measures, showed predictive relationships with market changes several days in advance.</w:t>
+      </w:r>
     </w:p>
     <w:p>
       <w:pPr>
@@ -686,46 +674,43 @@
           <w:tab w:val="right" w:pos="9026"/>
         </w:tabs>
         <w:rPr>
-          <w:ins w:id="8" w:author="Hieu Nguyen" w:date="2026-05-22T19:51:00Z"/>
-          <w:lang w:val="en-US"/>
-        </w:rPr>
-      </w:pPr>
-      <w:ins w:id="9" w:author="Hieu Nguyen" w:date="2026-05-22T19:51:00Z">
-        <w:r>
-          <w:rPr>
-            <w:lang w:val="en-US"/>
-          </w:rPr>
-          <w:t xml:space="preserve">This study is significant because it demonstrated that social media content may contain useful </w:t>
-        </w:r>
-        <w:proofErr w:type="spellStart"/>
-        <w:r>
-          <w:rPr>
-            <w:lang w:val="en-US"/>
-          </w:rPr>
-          <w:t>behavioural</w:t>
-        </w:r>
-        <w:proofErr w:type="spellEnd"/>
-        <w:r>
-          <w:rPr>
-            <w:lang w:val="en-US"/>
-          </w:rPr>
-          <w:t xml:space="preserve"> and emotional signals beyond simple popularity measurements. The research helped establish sentiment analysis as an important area within social media prediction and showed that online discussions can reflect broader public reactions, expectations, and collective attention patterns. In contrast to earlier popularity-focused research, Bollen et al. (2011) highlighted the potential value of </w:t>
-        </w:r>
-        <w:proofErr w:type="spellStart"/>
-        <w:r>
-          <w:rPr>
-            <w:lang w:val="en-US"/>
-          </w:rPr>
-          <w:t>analysing</w:t>
-        </w:r>
-        <w:proofErr w:type="spellEnd"/>
-        <w:r>
-          <w:rPr>
-            <w:lang w:val="en-US"/>
-          </w:rPr>
-          <w:t xml:space="preserve"> textual meaning rather than relying only on engagement statistics such as views, reposts, or comment counts.</w:t>
-        </w:r>
-      </w:ins>
+          <w:lang w:val="en-US"/>
+        </w:rPr>
+      </w:pPr>
+      <w:r>
+        <w:rPr>
+          <w:lang w:val="en-US"/>
+        </w:rPr>
+        <w:t xml:space="preserve">This study is significant because it demonstrated that social media content may contain useful </w:t>
+      </w:r>
+      <w:proofErr w:type="spellStart"/>
+      <w:r>
+        <w:rPr>
+          <w:lang w:val="en-US"/>
+        </w:rPr>
+        <w:t>behavioural</w:t>
+      </w:r>
+      <w:proofErr w:type="spellEnd"/>
+      <w:r>
+        <w:rPr>
+          <w:lang w:val="en-US"/>
+        </w:rPr>
+        <w:t xml:space="preserve"> and emotional signals beyond simple popularity measurements. The research helped establish sentiment analysis as an important area within social media prediction and showed that online discussions can reflect broader public reactions, expectations, and collective attention patterns. In contrast to earlier popularity-focused research, Bollen et al. (2011) highlighted the potential value of </w:t>
+      </w:r>
+      <w:proofErr w:type="spellStart"/>
+      <w:r>
+        <w:rPr>
+          <w:lang w:val="en-US"/>
+        </w:rPr>
+        <w:t>analysing</w:t>
+      </w:r>
+      <w:proofErr w:type="spellEnd"/>
+      <w:r>
+        <w:rPr>
+          <w:lang w:val="en-US"/>
+        </w:rPr>
+        <w:t xml:space="preserve"> textual meaning rather than relying only on engagement statistics such as views, reposts, or comment counts.</w:t>
+      </w:r>
     </w:p>
     <w:p>
       <w:pPr>
@@ -734,46 +719,43 @@
           <w:tab w:val="right" w:pos="9026"/>
         </w:tabs>
         <w:rPr>
-          <w:ins w:id="10" w:author="Hieu Nguyen" w:date="2026-05-22T19:51:00Z"/>
-          <w:lang w:val="en-US"/>
-        </w:rPr>
-      </w:pPr>
-      <w:ins w:id="11" w:author="Hieu Nguyen" w:date="2026-05-22T19:51:00Z">
-        <w:r>
-          <w:rPr>
-            <w:lang w:val="en-US"/>
-          </w:rPr>
-          <w:t xml:space="preserve">A major strength of the study is its interdisciplinary perspective, combining computational analysis with </w:t>
-        </w:r>
-        <w:proofErr w:type="spellStart"/>
-        <w:r>
-          <w:rPr>
-            <w:lang w:val="en-US"/>
-          </w:rPr>
-          <w:t>behavioural</w:t>
-        </w:r>
-        <w:proofErr w:type="spellEnd"/>
-        <w:r>
-          <w:rPr>
-            <w:lang w:val="en-US"/>
-          </w:rPr>
-          <w:t xml:space="preserve"> and financial interpretation. The work showed that social media sentiment could potentially act as an early indicator of collective </w:t>
-        </w:r>
-        <w:proofErr w:type="spellStart"/>
-        <w:r>
-          <w:rPr>
-            <w:lang w:val="en-US"/>
-          </w:rPr>
-          <w:t>behavioural</w:t>
-        </w:r>
-        <w:proofErr w:type="spellEnd"/>
-        <w:r>
-          <w:rPr>
-            <w:lang w:val="en-US"/>
-          </w:rPr>
-          <w:t xml:space="preserve"> shifts, which is particularly relevant in finance-related environments where public attention and emotional reactions can influence discussion dynamics and investment behaviour. This idea strongly supports the inclusion of sentiment-based features within the current project, especially because financial social media discussions often involve speculation, optimism, fear, or uncertainty that may contribute to trend emergence.</w:t>
-        </w:r>
-      </w:ins>
+          <w:lang w:val="en-US"/>
+        </w:rPr>
+      </w:pPr>
+      <w:r>
+        <w:rPr>
+          <w:lang w:val="en-US"/>
+        </w:rPr>
+        <w:t xml:space="preserve">A major strength of the study is its interdisciplinary perspective, combining computational analysis with </w:t>
+      </w:r>
+      <w:proofErr w:type="spellStart"/>
+      <w:r>
+        <w:rPr>
+          <w:lang w:val="en-US"/>
+        </w:rPr>
+        <w:t>behavioural</w:t>
+      </w:r>
+      <w:proofErr w:type="spellEnd"/>
+      <w:r>
+        <w:rPr>
+          <w:lang w:val="en-US"/>
+        </w:rPr>
+        <w:t xml:space="preserve"> and financial interpretation. The work showed that social media sentiment could potentially act as an early indicator of collective </w:t>
+      </w:r>
+      <w:proofErr w:type="spellStart"/>
+      <w:r>
+        <w:rPr>
+          <w:lang w:val="en-US"/>
+        </w:rPr>
+        <w:t>behavioural</w:t>
+      </w:r>
+      <w:proofErr w:type="spellEnd"/>
+      <w:r>
+        <w:rPr>
+          <w:lang w:val="en-US"/>
+        </w:rPr>
+        <w:t xml:space="preserve"> shifts, which is particularly relevant in finance-related environments where public attention and emotional reactions can influence discussion dynamics and investment behaviour. This idea strongly supports the inclusion of sentiment-based features within the current project, especially because financial social media discussions often involve speculation, optimism, fear, or uncertainty that may contribute to trend emergence.</w:t>
+      </w:r>
     </w:p>
     <w:p>
       <w:pPr>
@@ -782,25 +764,22 @@
           <w:tab w:val="right" w:pos="9026"/>
         </w:tabs>
         <w:rPr>
-          <w:ins w:id="12" w:author="Hieu Nguyen" w:date="2026-05-22T19:51:00Z"/>
-          <w:lang w:val="en-US"/>
-        </w:rPr>
-      </w:pPr>
-      <w:ins w:id="13" w:author="Hieu Nguyen" w:date="2026-05-22T19:51:00Z">
-        <w:r>
-          <w:rPr>
-            <w:lang w:val="en-US"/>
-          </w:rPr>
-          <w:t xml:space="preserve">Another important contribution of the paper is that it expanded the scope of predictive modelling from purely structural or engagement-based analysis toward semantic understanding of user-generated content. This development is important because social media trends are not driven only by interaction volume, but also by the meaning </w:t>
-        </w:r>
-        <w:r>
-          <w:rPr>
-            <w:lang w:val="en-US"/>
-          </w:rPr>
-          <w:lastRenderedPageBreak/>
-          <w:t>and emotional intensity of discussions. As a result, sentiment analysis provides an additional layer of information that may improve the ability to detect emerging trends during their early stages.</w:t>
-        </w:r>
-      </w:ins>
+          <w:lang w:val="en-US"/>
+        </w:rPr>
+      </w:pPr>
+      <w:r>
+        <w:rPr>
+          <w:lang w:val="en-US"/>
+        </w:rPr>
+        <w:t xml:space="preserve">Another important contribution of the paper is that it expanded the scope of predictive modelling from purely structural or engagement-based analysis toward semantic understanding of user-generated content. This development is important because social media trends are not driven only by interaction volume, but also by the meaning </w:t>
+      </w:r>
+      <w:r>
+        <w:rPr>
+          <w:lang w:val="en-US"/>
+        </w:rPr>
+        <w:lastRenderedPageBreak/>
+        <w:t>and emotional intensity of discussions. As a result, sentiment analysis provides an additional layer of information that may improve the ability to detect emerging trends during their early stages.</w:t>
+      </w:r>
     </w:p>
     <w:p>
       <w:pPr>
@@ -809,18 +788,15 @@
           <w:tab w:val="right" w:pos="9026"/>
         </w:tabs>
         <w:rPr>
-          <w:ins w:id="14" w:author="Hieu Nguyen" w:date="2026-05-22T19:51:00Z"/>
-          <w:lang w:val="en-US"/>
-        </w:rPr>
-      </w:pPr>
-      <w:ins w:id="15" w:author="Hieu Nguyen" w:date="2026-05-22T19:51:00Z">
-        <w:r>
-          <w:rPr>
-            <w:lang w:val="en-US"/>
-          </w:rPr>
-          <w:t>Despite its influence, the study also has several limitations. One important concern is the difficulty of distinguishing correlation from causation. Although the paper identified statistical relationships between Twitter mood and stock market behaviour, this does not necessarily prove that social media sentiment directly causes market changes. External factors such as news events, economic conditions, or political developments may influence both social media discussions and financial markets simultaneously. This makes interpretation more complex and highlights the challenges of drawing strong causal conclusions from observational social media data.</w:t>
-        </w:r>
-      </w:ins>
+          <w:lang w:val="en-US"/>
+        </w:rPr>
+      </w:pPr>
+      <w:r>
+        <w:rPr>
+          <w:lang w:val="en-US"/>
+        </w:rPr>
+        <w:t>Despite its influence, the study also has several limitations. One important concern is the difficulty of distinguishing correlation from causation. Although the paper identified statistical relationships between Twitter mood and stock market behaviour, this does not necessarily prove that social media sentiment directly causes market changes. External factors such as news events, economic conditions, or political developments may influence both social media discussions and financial markets simultaneously. This makes interpretation more complex and highlights the challenges of drawing strong causal conclusions from observational social media data.</w:t>
+      </w:r>
     </w:p>
     <w:p>
       <w:pPr>
@@ -829,32 +805,29 @@
           <w:tab w:val="right" w:pos="9026"/>
         </w:tabs>
         <w:rPr>
-          <w:ins w:id="16" w:author="Hieu Nguyen" w:date="2026-05-22T19:51:00Z"/>
-          <w:lang w:val="en-US"/>
-        </w:rPr>
-      </w:pPr>
-      <w:ins w:id="17" w:author="Hieu Nguyen" w:date="2026-05-22T19:51:00Z">
-        <w:r>
-          <w:rPr>
-            <w:lang w:val="en-US"/>
-          </w:rPr>
-          <w:t xml:space="preserve">Another limitation is that the sentiment analysis techniques used in the study were relatively simple compared to modern NLP approaches. The work relied largely on lexicon-based sentiment measurements, which may struggle to capture sarcasm, financial terminology, contextual meaning, or complex emotional expression commonly found in social media discussions. In addition, Twitter users do not necessarily represent the broader population, creating potential sampling bias that may affect </w:t>
-        </w:r>
-        <w:proofErr w:type="spellStart"/>
-        <w:r>
-          <w:rPr>
-            <w:lang w:val="en-US"/>
-          </w:rPr>
-          <w:t>generalisability</w:t>
-        </w:r>
-        <w:proofErr w:type="spellEnd"/>
-        <w:r>
-          <w:rPr>
-            <w:lang w:val="en-US"/>
-          </w:rPr>
-          <w:t>.</w:t>
-        </w:r>
-      </w:ins>
+          <w:lang w:val="en-US"/>
+        </w:rPr>
+      </w:pPr>
+      <w:r>
+        <w:rPr>
+          <w:lang w:val="en-US"/>
+        </w:rPr>
+        <w:t xml:space="preserve">Another limitation is that the sentiment analysis techniques used in the study were relatively simple compared to modern NLP approaches. The work relied largely on lexicon-based sentiment measurements, which may struggle to capture sarcasm, financial terminology, contextual meaning, or complex emotional expression commonly found in social media discussions. In addition, Twitter users do not necessarily represent the broader population, creating potential sampling bias that may affect </w:t>
+      </w:r>
+      <w:proofErr w:type="spellStart"/>
+      <w:r>
+        <w:rPr>
+          <w:lang w:val="en-US"/>
+        </w:rPr>
+        <w:t>generalisability</w:t>
+      </w:r>
+      <w:proofErr w:type="spellEnd"/>
+      <w:r>
+        <w:rPr>
+          <w:lang w:val="en-US"/>
+        </w:rPr>
+        <w:t>.</w:t>
+      </w:r>
     </w:p>
     <w:p>
       <w:pPr>
@@ -863,18 +836,15 @@
           <w:tab w:val="right" w:pos="9026"/>
         </w:tabs>
         <w:rPr>
-          <w:ins w:id="18" w:author="Hieu Nguyen" w:date="2026-05-22T19:51:00Z"/>
-          <w:lang w:val="en-US"/>
-        </w:rPr>
-      </w:pPr>
-      <w:ins w:id="19" w:author="Hieu Nguyen" w:date="2026-05-22T19:51:00Z">
-        <w:r>
-          <w:rPr>
-            <w:lang w:val="en-US"/>
-          </w:rPr>
-          <w:t>The study is also not directly focused on trend emergence prediction. Its primary objective was market prediction rather than detecting the formation and spread of social media trends. Nevertheless, the research remains highly relevant because it demonstrates that textual sentiment and collective mood can provide predictive signals within finance-related social media environments. For the current project, this supports the use of sentiment-based features as one component within a broader predictive modelling framework rather than as a standalone predictor.</w:t>
-        </w:r>
-      </w:ins>
+          <w:lang w:val="en-US"/>
+        </w:rPr>
+      </w:pPr>
+      <w:r>
+        <w:rPr>
+          <w:lang w:val="en-US"/>
+        </w:rPr>
+        <w:t>The study is also not directly focused on trend emergence prediction. Its primary objective was market prediction rather than detecting the formation and spread of social media trends. Nevertheless, the research remains highly relevant because it demonstrates that textual sentiment and collective mood can provide predictive signals within finance-related social media environments. For the current project, this supports the use of sentiment-based features as one component within a broader predictive modelling framework rather than as a standalone predictor.</w:t>
+      </w:r>
     </w:p>
     <w:p>
       <w:pPr>
@@ -883,16 +853,38 @@
           <w:tab w:val="right" w:pos="9026"/>
         </w:tabs>
         <w:rPr>
-          <w:ins w:id="20" w:author="Hieu Nguyen" w:date="2026-05-22T19:51:00Z"/>
-          <w:lang w:val="en-US"/>
-        </w:rPr>
-      </w:pPr>
-      <w:ins w:id="21" w:author="Hieu Nguyen" w:date="2026-05-22T19:51:00Z">
-        <w:r>
-          <w:rPr>
-            <w:lang w:val="en-US"/>
-          </w:rPr>
-          <w:t>Overall, Bollen et al. (2011) represents an important step in the evolution of predictive modelling research by introducing NLP and sentiment analysis into social media forecasting. The study expanded predictive approaches beyond temporal popularity and engagement measurements, showing that emotional and semantic information may also contribute valuable predictive insights. This development helped motivate later research that integrates textual analysis, sentiment features, and machine learning techniques to better understand how discussions evolve and how emerging trends can be identified from large-scale social media activity.</w:t>
+          <w:lang w:val="en-US"/>
+        </w:rPr>
+      </w:pPr>
+      <w:r>
+        <w:rPr>
+          <w:lang w:val="en-US"/>
+        </w:rPr>
+        <w:t>Overall, Bollen et al. (2011) represents an important step in the evolution of predictive modelling research by introducing NLP and sentiment analysis into social media forecasting. The study expanded predictive approaches beyond temporal popularity and engagement measurements, showing that emotional and semantic information may also contribute valuable predictive insights. This development helped motivate later research that integrates textual analysis, sentiment features, and machine learning techniques to better understand how discussions evolve and how emerging trends can be identified from large-scale social media activity.</w:t>
+      </w:r>
+    </w:p>
+    <w:p>
+      <w:pPr>
+        <w:pStyle w:val="Heading2"/>
+        <w:rPr>
+          <w:ins w:id="1" w:author="Hieu Nguyen" w:date="2026-05-22T19:52:00Z"/>
+          <w:lang w:val="en-US"/>
+        </w:rPr>
+        <w:pPrChange w:id="2" w:author="Hieu Nguyen" w:date="2026-05-22T19:54:00Z" w16du:dateUtc="2026-05-22T12:54:00Z">
+          <w:pPr>
+            <w:tabs>
+              <w:tab w:val="left" w:pos="7128"/>
+              <w:tab w:val="right" w:pos="9026"/>
+            </w:tabs>
+          </w:pPr>
+        </w:pPrChange>
+      </w:pPr>
+      <w:ins w:id="3" w:author="Hieu Nguyen" w:date="2026-05-22T19:52:00Z">
+        <w:r>
+          <w:rPr>
+            <w:lang w:val="en-US"/>
+          </w:rPr>
+          <w:t>5. Information Diffusion and Cascade Prediction</w:t>
         </w:r>
       </w:ins>
     </w:p>
@@ -902,10 +894,366 @@
           <w:tab w:val="left" w:pos="7128"/>
           <w:tab w:val="right" w:pos="9026"/>
         </w:tabs>
-      </w:pPr>
-      <w:r>
-        <w:tab/>
-      </w:r>
+        <w:rPr>
+          <w:ins w:id="4" w:author="Hieu Nguyen" w:date="2026-05-22T19:52:00Z"/>
+          <w:lang w:val="en-US"/>
+        </w:rPr>
+      </w:pPr>
+      <w:ins w:id="5" w:author="Hieu Nguyen" w:date="2026-05-22T19:52:00Z">
+        <w:r>
+          <w:rPr>
+            <w:lang w:val="en-US"/>
+          </w:rPr>
+          <w:t xml:space="preserve">As social media research progressed, researchers increasingly </w:t>
+        </w:r>
+        <w:proofErr w:type="spellStart"/>
+        <w:r>
+          <w:rPr>
+            <w:lang w:val="en-US"/>
+          </w:rPr>
+          <w:t>recognised</w:t>
+        </w:r>
+        <w:proofErr w:type="spellEnd"/>
+        <w:r>
+          <w:rPr>
+            <w:lang w:val="en-US"/>
+          </w:rPr>
+          <w:t xml:space="preserve"> that popularity and trend emergence are not driven only by individual user interactions or content characteristics, but also by how information spreads through networks of users. This led to growing interest in information diffusion and cascade prediction, </w:t>
+        </w:r>
+        <w:r>
+          <w:rPr>
+            <w:lang w:val="en-US"/>
+          </w:rPr>
+          <w:lastRenderedPageBreak/>
+          <w:t>which examine how posts, discussions, or topics propagate across social media platforms over time. These approaches are particularly relevant to trend emergence because trends often develop through rapid sharing behaviour and expanding user participation rather than through isolated popularity events.</w:t>
+        </w:r>
+      </w:ins>
+    </w:p>
+    <w:p>
+      <w:pPr>
+        <w:tabs>
+          <w:tab w:val="left" w:pos="7128"/>
+          <w:tab w:val="right" w:pos="9026"/>
+        </w:tabs>
+        <w:rPr>
+          <w:ins w:id="6" w:author="Hieu Nguyen" w:date="2026-05-22T19:52:00Z"/>
+          <w:lang w:val="en-US"/>
+        </w:rPr>
+      </w:pPr>
+      <w:ins w:id="7" w:author="Hieu Nguyen" w:date="2026-05-22T19:52:00Z">
+        <w:r>
+          <w:rPr>
+            <w:lang w:val="en-US"/>
+          </w:rPr>
+          <w:t xml:space="preserve">An influential study in this area is Cheng et al. (2014), </w:t>
+        </w:r>
+        <w:r>
+          <w:rPr>
+            <w:i/>
+            <w:iCs/>
+            <w:lang w:val="en-US"/>
+          </w:rPr>
+          <w:t>Can Cascades Be Predicted?</w:t>
+        </w:r>
+        <w:r>
+          <w:rPr>
+            <w:lang w:val="en-US"/>
+          </w:rPr>
+          <w:t xml:space="preserve"> The authors investigated whether large information cascades on Facebook could be predicted using early observations of content spread. A cascade in this context refers to the process where information spreads from user to user through reposting or sharing activity, potentially reaching very large audiences. The study </w:t>
+        </w:r>
+        <w:proofErr w:type="spellStart"/>
+        <w:r>
+          <w:rPr>
+            <w:lang w:val="en-US"/>
+          </w:rPr>
+          <w:t>analysed</w:t>
+        </w:r>
+        <w:proofErr w:type="spellEnd"/>
+        <w:r>
+          <w:rPr>
+            <w:lang w:val="en-US"/>
+          </w:rPr>
+          <w:t xml:space="preserve"> millions of cascades and explored whether characteristics observed during the early stages of diffusion could predict whether a cascade would continue growing substantially.</w:t>
+        </w:r>
+      </w:ins>
+    </w:p>
+    <w:p>
+      <w:pPr>
+        <w:tabs>
+          <w:tab w:val="left" w:pos="7128"/>
+          <w:tab w:val="right" w:pos="9026"/>
+        </w:tabs>
+        <w:rPr>
+          <w:ins w:id="8" w:author="Hieu Nguyen" w:date="2026-05-22T19:52:00Z"/>
+          <w:lang w:val="en-US"/>
+        </w:rPr>
+      </w:pPr>
+      <w:ins w:id="9" w:author="Hieu Nguyen" w:date="2026-05-22T19:52:00Z">
+        <w:r>
+          <w:rPr>
+            <w:lang w:val="en-US"/>
+          </w:rPr>
+          <w:t xml:space="preserve">This work is important because it shifted predictive modelling research beyond simple </w:t>
+        </w:r>
+        <w:proofErr w:type="gramStart"/>
+        <w:r>
+          <w:rPr>
+            <w:lang w:val="en-US"/>
+          </w:rPr>
+          <w:t>popularity counts</w:t>
+        </w:r>
+        <w:proofErr w:type="gramEnd"/>
+        <w:r>
+          <w:rPr>
+            <w:lang w:val="en-US"/>
+          </w:rPr>
+          <w:t xml:space="preserve"> toward </w:t>
+        </w:r>
+        <w:proofErr w:type="spellStart"/>
+        <w:r>
+          <w:rPr>
+            <w:lang w:val="en-US"/>
+          </w:rPr>
+          <w:t>analysing</w:t>
+        </w:r>
+        <w:proofErr w:type="spellEnd"/>
+        <w:r>
+          <w:rPr>
+            <w:lang w:val="en-US"/>
+          </w:rPr>
+          <w:t xml:space="preserve"> the structural dynamics of information spread. Earlier studies such as Szabo and Huberman (2010) mainly focused on correlations between early and later popularity measurements, whereas Cheng et al. (2014) examined how content propagates through social networks and how diffusion behaviour influences large-scale spread. This perspective is highly relevant to trend emergence research because emerging trends are often </w:t>
+        </w:r>
+        <w:proofErr w:type="spellStart"/>
+        <w:r>
+          <w:rPr>
+            <w:lang w:val="en-US"/>
+          </w:rPr>
+          <w:t>characterised</w:t>
+        </w:r>
+        <w:proofErr w:type="spellEnd"/>
+        <w:r>
+          <w:rPr>
+            <w:lang w:val="en-US"/>
+          </w:rPr>
+          <w:t xml:space="preserve"> by accelerating diffusion patterns and increasing participation across connected user groups.</w:t>
+        </w:r>
+      </w:ins>
+    </w:p>
+    <w:p>
+      <w:pPr>
+        <w:tabs>
+          <w:tab w:val="left" w:pos="7128"/>
+          <w:tab w:val="right" w:pos="9026"/>
+        </w:tabs>
+        <w:rPr>
+          <w:ins w:id="10" w:author="Hieu Nguyen" w:date="2026-05-22T19:52:00Z"/>
+          <w:lang w:val="en-US"/>
+        </w:rPr>
+      </w:pPr>
+      <w:ins w:id="11" w:author="Hieu Nguyen" w:date="2026-05-22T19:52:00Z">
+        <w:r>
+          <w:rPr>
+            <w:lang w:val="en-US"/>
+          </w:rPr>
+          <w:t xml:space="preserve">A major strength of the study is its large-scale empirical analysis. By </w:t>
+        </w:r>
+        <w:proofErr w:type="spellStart"/>
+        <w:r>
+          <w:rPr>
+            <w:lang w:val="en-US"/>
+          </w:rPr>
+          <w:t>analysing</w:t>
+        </w:r>
+        <w:proofErr w:type="spellEnd"/>
+        <w:r>
+          <w:rPr>
+            <w:lang w:val="en-US"/>
+          </w:rPr>
+          <w:t xml:space="preserve"> millions of cascades, the authors were able to identify common diffusion </w:t>
+        </w:r>
+        <w:proofErr w:type="spellStart"/>
+        <w:r>
+          <w:rPr>
+            <w:lang w:val="en-US"/>
+          </w:rPr>
+          <w:t>behaviours</w:t>
+        </w:r>
+        <w:proofErr w:type="spellEnd"/>
+        <w:r>
+          <w:rPr>
+            <w:lang w:val="en-US"/>
+          </w:rPr>
+          <w:t xml:space="preserve"> and demonstrate that certain early structural signals can improve predictive performance. The paper also showed that predictive accuracy increases significantly when models observe the first stages of cascade growth, supporting the broader idea that early-stage behaviour contains meaningful predictive information. This finding aligns strongly with the current project’s focus on identifying early signals of trend emergence before trends become fully established.</w:t>
+        </w:r>
+      </w:ins>
+    </w:p>
+    <w:p>
+      <w:pPr>
+        <w:tabs>
+          <w:tab w:val="left" w:pos="7128"/>
+          <w:tab w:val="right" w:pos="9026"/>
+        </w:tabs>
+        <w:rPr>
+          <w:ins w:id="12" w:author="Hieu Nguyen" w:date="2026-05-22T19:52:00Z"/>
+          <w:lang w:val="en-US"/>
+        </w:rPr>
+      </w:pPr>
+      <w:ins w:id="13" w:author="Hieu Nguyen" w:date="2026-05-22T19:52:00Z">
+        <w:r>
+          <w:rPr>
+            <w:lang w:val="en-US"/>
+          </w:rPr>
+          <w:t>Another important contribution of the paper is its focus on multiple feature categories related to diffusion behaviour. The study considered not only content characteristics, but also temporal growth patterns, network structure, and user interaction behaviour. This supports the broader research direction that predictive models benefit from integrating multiple dimensions of social media activity rather than relying on a single predictive factor. In particular, the work demonstrates that trend formation is influenced not only by content popularity, but also by how information spreads socially between users.</w:t>
+        </w:r>
+      </w:ins>
+    </w:p>
+    <w:p>
+      <w:pPr>
+        <w:tabs>
+          <w:tab w:val="left" w:pos="7128"/>
+          <w:tab w:val="right" w:pos="9026"/>
+        </w:tabs>
+        <w:rPr>
+          <w:ins w:id="14" w:author="Hieu Nguyen" w:date="2026-05-22T19:52:00Z"/>
+          <w:lang w:val="en-US"/>
+        </w:rPr>
+      </w:pPr>
+      <w:ins w:id="15" w:author="Hieu Nguyen" w:date="2026-05-22T19:52:00Z">
+        <w:r>
+          <w:rPr>
+            <w:lang w:val="en-US"/>
+          </w:rPr>
+          <w:t xml:space="preserve">However, the study also has several limitations when considered from the perspective of a practical student project. One major limitation is the heavy dependence on large-scale platform data and complex network structures. Cascade prediction often requires </w:t>
+        </w:r>
+        <w:r>
+          <w:rPr>
+            <w:lang w:val="en-US"/>
+          </w:rPr>
+          <w:lastRenderedPageBreak/>
+          <w:t>detailed information about user relationships, resharing paths, and network connectivity, which may be difficult to obtain from publicly available datasets or APIs due to privacy restrictions and platform limitations. This creates practical challenges for reproducing full diffusion-based approaches outside large industrial research environments.</w:t>
+        </w:r>
+      </w:ins>
+    </w:p>
+    <w:p>
+      <w:pPr>
+        <w:tabs>
+          <w:tab w:val="left" w:pos="7128"/>
+          <w:tab w:val="right" w:pos="9026"/>
+        </w:tabs>
+        <w:rPr>
+          <w:ins w:id="16" w:author="Hieu Nguyen" w:date="2026-05-22T19:52:00Z"/>
+          <w:lang w:val="en-US"/>
+        </w:rPr>
+      </w:pPr>
+      <w:ins w:id="17" w:author="Hieu Nguyen" w:date="2026-05-22T19:52:00Z">
+        <w:r>
+          <w:rPr>
+            <w:lang w:val="en-US"/>
+          </w:rPr>
+          <w:t>Another limitation is that cascade prediction models can become computationally complex, especially when graph-based network analysis is involved. While these methods may produce strong predictive performance, they may also require infrastructure, processing power, and data access beyond the scope of smaller academic projects. Additionally, the study focuses mainly on predicting whether cascades become large rather than understanding the semantic meaning or sentiment associated with the content being shared. As a result, diffusion-based approaches alone may not fully explain why certain trends emerge or how public sentiment contributes to their growth.</w:t>
+        </w:r>
+      </w:ins>
+    </w:p>
+    <w:p>
+      <w:pPr>
+        <w:tabs>
+          <w:tab w:val="left" w:pos="7128"/>
+          <w:tab w:val="right" w:pos="9026"/>
+        </w:tabs>
+        <w:rPr>
+          <w:ins w:id="18" w:author="Hieu Nguyen" w:date="2026-05-22T19:52:00Z"/>
+          <w:lang w:val="en-US"/>
+        </w:rPr>
+      </w:pPr>
+      <w:ins w:id="19" w:author="Hieu Nguyen" w:date="2026-05-22T19:52:00Z">
+        <w:r>
+          <w:rPr>
+            <w:lang w:val="en-US"/>
+          </w:rPr>
+          <w:t xml:space="preserve">The paper is also focused on Facebook sharing cascades, meaning that some findings may not </w:t>
+        </w:r>
+        <w:proofErr w:type="spellStart"/>
+        <w:r>
+          <w:rPr>
+            <w:lang w:val="en-US"/>
+          </w:rPr>
+          <w:t>generalise</w:t>
+        </w:r>
+        <w:proofErr w:type="spellEnd"/>
+        <w:r>
+          <w:rPr>
+            <w:lang w:val="en-US"/>
+          </w:rPr>
+          <w:t xml:space="preserve"> perfectly to other social media platforms where user behaviour, interaction mechanisms, and content formats differ. Financial discussions on platforms such as Twitter or Reddit may exhibit different diffusion dynamics compared to Facebook sharing behaviour. This highlights the broader challenge of </w:t>
+        </w:r>
+        <w:proofErr w:type="spellStart"/>
+        <w:r>
+          <w:rPr>
+            <w:lang w:val="en-US"/>
+          </w:rPr>
+          <w:t>generalising</w:t>
+        </w:r>
+        <w:proofErr w:type="spellEnd"/>
+        <w:r>
+          <w:rPr>
+            <w:lang w:val="en-US"/>
+          </w:rPr>
+          <w:t xml:space="preserve"> predictive models across multiple online environments.</w:t>
+        </w:r>
+      </w:ins>
+    </w:p>
+    <w:p>
+      <w:pPr>
+        <w:tabs>
+          <w:tab w:val="left" w:pos="7128"/>
+          <w:tab w:val="right" w:pos="9026"/>
+        </w:tabs>
+        <w:rPr>
+          <w:ins w:id="20" w:author="Hieu Nguyen" w:date="2026-05-22T19:52:00Z"/>
+          <w:lang w:val="en-US"/>
+        </w:rPr>
+      </w:pPr>
+      <w:ins w:id="21" w:author="Hieu Nguyen" w:date="2026-05-22T19:52:00Z">
+        <w:r>
+          <w:rPr>
+            <w:lang w:val="en-US"/>
+          </w:rPr>
+          <w:t>Despite these limitations, Cheng et al. (2014) provides important conceptual support for the current project. The study reinforces the idea that trend emergence involves dynamic spread behaviour rather than isolated popularity measurements. It also supports the use of temporal growth and engagement acceleration features within predictive modelling systems. At the same time, the practical challenges associated with large-scale network analysis help justify the scope of the proposed project, which focuses on a more manageable machine learning pipeline using temporal, engagement, and sentiment-based features rather than attempting full-scale graph reconstruction or industrial cascade modelling.</w:t>
+        </w:r>
+      </w:ins>
+    </w:p>
+    <w:p>
+      <w:pPr>
+        <w:tabs>
+          <w:tab w:val="left" w:pos="7128"/>
+          <w:tab w:val="right" w:pos="9026"/>
+        </w:tabs>
+        <w:rPr>
+          <w:ins w:id="22" w:author="Hieu Nguyen" w:date="2026-05-22T19:52:00Z"/>
+          <w:lang w:val="en-US"/>
+        </w:rPr>
+      </w:pPr>
+      <w:ins w:id="23" w:author="Hieu Nguyen" w:date="2026-05-22T19:52:00Z">
+        <w:r>
+          <w:rPr>
+            <w:lang w:val="en-US"/>
+          </w:rPr>
+          <w:t>Overall, diffusion and cascade prediction research expanded the understanding of social media trends by showing that the structure and dynamics of information spread play a critical role in determining whether online discussions grow into large-scale phenomena. These studies demonstrated that predictive modelling benefits from considering not only popularity and content features, but also the social propagation mechanisms that influence how trends evolve over time. This research area therefore provides an important theoretical foundation for understanding trend emergence as a dynamic and socially distributed process.</w:t>
+        </w:r>
+      </w:ins>
+    </w:p>
+    <w:p>
+      <w:pPr>
+        <w:tabs>
+          <w:tab w:val="left" w:pos="7128"/>
+          <w:tab w:val="right" w:pos="9026"/>
+        </w:tabs>
+      </w:pPr>
+      <w:del w:id="24" w:author="Hieu Nguyen" w:date="2026-05-22T19:52:00Z" w16du:dateUtc="2026-05-22T12:52:00Z">
+        <w:r>
+          <w:tab/>
+        </w:r>
+      </w:del>
       <w:r>
         <w:tab/>
       </w:r>

</xml_diff>

<commit_message>
20260518 literature review v0.1/add section 6
</commit_message>
<xml_diff>
--- a/literature.review/20260518 literature review v0.1.docx
+++ b/literature.review/20260518 literature review v0.1.docx
@@ -867,7 +867,352 @@
       <w:pPr>
         <w:pStyle w:val="Heading2"/>
         <w:rPr>
-          <w:ins w:id="1" w:author="Hieu Nguyen" w:date="2026-05-22T19:52:00Z"/>
+          <w:lang w:val="en-US"/>
+        </w:rPr>
+        <w:pPrChange w:id="1" w:author="Hieu Nguyen" w:date="2026-05-22T19:54:00Z" w16du:dateUtc="2026-05-22T12:54:00Z">
+          <w:pPr>
+            <w:tabs>
+              <w:tab w:val="left" w:pos="7128"/>
+              <w:tab w:val="right" w:pos="9026"/>
+            </w:tabs>
+          </w:pPr>
+        </w:pPrChange>
+      </w:pPr>
+      <w:r>
+        <w:rPr>
+          <w:lang w:val="en-US"/>
+        </w:rPr>
+        <w:t>5. Information Diffusion and Cascade Prediction</w:t>
+      </w:r>
+    </w:p>
+    <w:p>
+      <w:pPr>
+        <w:tabs>
+          <w:tab w:val="left" w:pos="7128"/>
+          <w:tab w:val="right" w:pos="9026"/>
+        </w:tabs>
+        <w:rPr>
+          <w:lang w:val="en-US"/>
+        </w:rPr>
+      </w:pPr>
+      <w:r>
+        <w:rPr>
+          <w:lang w:val="en-US"/>
+        </w:rPr>
+        <w:t xml:space="preserve">As social media research progressed, researchers increasingly </w:t>
+      </w:r>
+      <w:proofErr w:type="spellStart"/>
+      <w:r>
+        <w:rPr>
+          <w:lang w:val="en-US"/>
+        </w:rPr>
+        <w:t>recognised</w:t>
+      </w:r>
+      <w:proofErr w:type="spellEnd"/>
+      <w:r>
+        <w:rPr>
+          <w:lang w:val="en-US"/>
+        </w:rPr>
+        <w:t xml:space="preserve"> that popularity and trend emergence are not driven only by individual user interactions or content characteristics, but also by how information spreads through networks of users. This led to growing interest in information diffusion and cascade prediction, </w:t>
+      </w:r>
+      <w:r>
+        <w:rPr>
+          <w:lang w:val="en-US"/>
+        </w:rPr>
+        <w:lastRenderedPageBreak/>
+        <w:t>which examine how posts, discussions, or topics propagate across social media platforms over time. These approaches are particularly relevant to trend emergence because trends often develop through rapid sharing behaviour and expanding user participation rather than through isolated popularity events.</w:t>
+      </w:r>
+    </w:p>
+    <w:p>
+      <w:pPr>
+        <w:tabs>
+          <w:tab w:val="left" w:pos="7128"/>
+          <w:tab w:val="right" w:pos="9026"/>
+        </w:tabs>
+        <w:rPr>
+          <w:lang w:val="en-US"/>
+        </w:rPr>
+      </w:pPr>
+      <w:r>
+        <w:rPr>
+          <w:lang w:val="en-US"/>
+        </w:rPr>
+        <w:t xml:space="preserve">An influential study in this area is Cheng et al. (2014), </w:t>
+      </w:r>
+      <w:r>
+        <w:rPr>
+          <w:i/>
+          <w:iCs/>
+          <w:lang w:val="en-US"/>
+        </w:rPr>
+        <w:t>Can Cascades Be Predicted?</w:t>
+      </w:r>
+      <w:r>
+        <w:rPr>
+          <w:lang w:val="en-US"/>
+        </w:rPr>
+        <w:t xml:space="preserve"> The authors investigated whether large information cascades on Facebook could be predicted using early observations of content spread. A cascade in this context refers to the process where information spreads from user to user through reposting or sharing activity, potentially reaching very large audiences. The study </w:t>
+      </w:r>
+      <w:proofErr w:type="spellStart"/>
+      <w:r>
+        <w:rPr>
+          <w:lang w:val="en-US"/>
+        </w:rPr>
+        <w:t>analysed</w:t>
+      </w:r>
+      <w:proofErr w:type="spellEnd"/>
+      <w:r>
+        <w:rPr>
+          <w:lang w:val="en-US"/>
+        </w:rPr>
+        <w:t xml:space="preserve"> millions of cascades and explored whether characteristics observed during the early stages of diffusion could predict whether a cascade would continue growing substantially.</w:t>
+      </w:r>
+    </w:p>
+    <w:p>
+      <w:pPr>
+        <w:tabs>
+          <w:tab w:val="left" w:pos="7128"/>
+          <w:tab w:val="right" w:pos="9026"/>
+        </w:tabs>
+        <w:rPr>
+          <w:lang w:val="en-US"/>
+        </w:rPr>
+      </w:pPr>
+      <w:r>
+        <w:rPr>
+          <w:lang w:val="en-US"/>
+        </w:rPr>
+        <w:t xml:space="preserve">This work is important because it shifted predictive modelling research beyond simple </w:t>
+      </w:r>
+      <w:proofErr w:type="gramStart"/>
+      <w:r>
+        <w:rPr>
+          <w:lang w:val="en-US"/>
+        </w:rPr>
+        <w:t>popularity counts</w:t>
+      </w:r>
+      <w:proofErr w:type="gramEnd"/>
+      <w:r>
+        <w:rPr>
+          <w:lang w:val="en-US"/>
+        </w:rPr>
+        <w:t xml:space="preserve"> toward </w:t>
+      </w:r>
+      <w:proofErr w:type="spellStart"/>
+      <w:r>
+        <w:rPr>
+          <w:lang w:val="en-US"/>
+        </w:rPr>
+        <w:t>analysing</w:t>
+      </w:r>
+      <w:proofErr w:type="spellEnd"/>
+      <w:r>
+        <w:rPr>
+          <w:lang w:val="en-US"/>
+        </w:rPr>
+        <w:t xml:space="preserve"> the structural dynamics of information spread. Earlier studies such as Szabo and Huberman (2010) mainly focused on correlations between early and later popularity measurements, whereas Cheng et al. (2014) examined how content propagates through social networks and how diffusion behaviour influences large-scale spread. This perspective is highly relevant to trend emergence research because emerging trends are often </w:t>
+      </w:r>
+      <w:proofErr w:type="spellStart"/>
+      <w:r>
+        <w:rPr>
+          <w:lang w:val="en-US"/>
+        </w:rPr>
+        <w:t>characterised</w:t>
+      </w:r>
+      <w:proofErr w:type="spellEnd"/>
+      <w:r>
+        <w:rPr>
+          <w:lang w:val="en-US"/>
+        </w:rPr>
+        <w:t xml:space="preserve"> by accelerating diffusion patterns and increasing participation across connected user groups.</w:t>
+      </w:r>
+    </w:p>
+    <w:p>
+      <w:pPr>
+        <w:tabs>
+          <w:tab w:val="left" w:pos="7128"/>
+          <w:tab w:val="right" w:pos="9026"/>
+        </w:tabs>
+        <w:rPr>
+          <w:lang w:val="en-US"/>
+        </w:rPr>
+      </w:pPr>
+      <w:r>
+        <w:rPr>
+          <w:lang w:val="en-US"/>
+        </w:rPr>
+        <w:t xml:space="preserve">A major strength of the study is its large-scale empirical analysis. By </w:t>
+      </w:r>
+      <w:proofErr w:type="spellStart"/>
+      <w:r>
+        <w:rPr>
+          <w:lang w:val="en-US"/>
+        </w:rPr>
+        <w:t>analysing</w:t>
+      </w:r>
+      <w:proofErr w:type="spellEnd"/>
+      <w:r>
+        <w:rPr>
+          <w:lang w:val="en-US"/>
+        </w:rPr>
+        <w:t xml:space="preserve"> millions of cascades, the authors were able to identify common diffusion </w:t>
+      </w:r>
+      <w:proofErr w:type="spellStart"/>
+      <w:r>
+        <w:rPr>
+          <w:lang w:val="en-US"/>
+        </w:rPr>
+        <w:t>behaviours</w:t>
+      </w:r>
+      <w:proofErr w:type="spellEnd"/>
+      <w:r>
+        <w:rPr>
+          <w:lang w:val="en-US"/>
+        </w:rPr>
+        <w:t xml:space="preserve"> and demonstrate that certain early structural signals can improve predictive performance. The paper also showed that predictive accuracy increases significantly when models observe the first stages of cascade growth, supporting the broader idea that early-stage behaviour contains meaningful predictive information. This finding aligns strongly with the current project’s focus on identifying early signals of trend emergence before trends become fully established.</w:t>
+      </w:r>
+    </w:p>
+    <w:p>
+      <w:pPr>
+        <w:tabs>
+          <w:tab w:val="left" w:pos="7128"/>
+          <w:tab w:val="right" w:pos="9026"/>
+        </w:tabs>
+        <w:rPr>
+          <w:lang w:val="en-US"/>
+        </w:rPr>
+      </w:pPr>
+      <w:r>
+        <w:rPr>
+          <w:lang w:val="en-US"/>
+        </w:rPr>
+        <w:t>Another important contribution of the paper is its focus on multiple feature categories related to diffusion behaviour. The study considered not only content characteristics, but also temporal growth patterns, network structure, and user interaction behaviour. This supports the broader research direction that predictive models benefit from integrating multiple dimensions of social media activity rather than relying on a single predictive factor. In particular, the work demonstrates that trend formation is influenced not only by content popularity, but also by how information spreads socially between users.</w:t>
+      </w:r>
+    </w:p>
+    <w:p>
+      <w:pPr>
+        <w:tabs>
+          <w:tab w:val="left" w:pos="7128"/>
+          <w:tab w:val="right" w:pos="9026"/>
+        </w:tabs>
+        <w:rPr>
+          <w:lang w:val="en-US"/>
+        </w:rPr>
+      </w:pPr>
+      <w:r>
+        <w:rPr>
+          <w:lang w:val="en-US"/>
+        </w:rPr>
+        <w:t xml:space="preserve">However, the study also has several limitations when considered from the perspective of a practical student project. One major limitation is the heavy dependence on large-scale platform data and complex network structures. Cascade prediction often requires </w:t>
+      </w:r>
+      <w:r>
+        <w:rPr>
+          <w:lang w:val="en-US"/>
+        </w:rPr>
+        <w:lastRenderedPageBreak/>
+        <w:t>detailed information about user relationships, resharing paths, and network connectivity, which may be difficult to obtain from publicly available datasets or APIs due to privacy restrictions and platform limitations. This creates practical challenges for reproducing full diffusion-based approaches outside large industrial research environments.</w:t>
+      </w:r>
+    </w:p>
+    <w:p>
+      <w:pPr>
+        <w:tabs>
+          <w:tab w:val="left" w:pos="7128"/>
+          <w:tab w:val="right" w:pos="9026"/>
+        </w:tabs>
+        <w:rPr>
+          <w:lang w:val="en-US"/>
+        </w:rPr>
+      </w:pPr>
+      <w:r>
+        <w:rPr>
+          <w:lang w:val="en-US"/>
+        </w:rPr>
+        <w:t>Another limitation is that cascade prediction models can become computationally complex, especially when graph-based network analysis is involved. While these methods may produce strong predictive performance, they may also require infrastructure, processing power, and data access beyond the scope of smaller academic projects. Additionally, the study focuses mainly on predicting whether cascades become large rather than understanding the semantic meaning or sentiment associated with the content being shared. As a result, diffusion-based approaches alone may not fully explain why certain trends emerge or how public sentiment contributes to their growth.</w:t>
+      </w:r>
+    </w:p>
+    <w:p>
+      <w:pPr>
+        <w:tabs>
+          <w:tab w:val="left" w:pos="7128"/>
+          <w:tab w:val="right" w:pos="9026"/>
+        </w:tabs>
+        <w:rPr>
+          <w:lang w:val="en-US"/>
+        </w:rPr>
+      </w:pPr>
+      <w:r>
+        <w:rPr>
+          <w:lang w:val="en-US"/>
+        </w:rPr>
+        <w:t xml:space="preserve">The paper is also focused on Facebook sharing cascades, meaning that some findings may not </w:t>
+      </w:r>
+      <w:proofErr w:type="spellStart"/>
+      <w:r>
+        <w:rPr>
+          <w:lang w:val="en-US"/>
+        </w:rPr>
+        <w:t>generalise</w:t>
+      </w:r>
+      <w:proofErr w:type="spellEnd"/>
+      <w:r>
+        <w:rPr>
+          <w:lang w:val="en-US"/>
+        </w:rPr>
+        <w:t xml:space="preserve"> perfectly to other social media platforms where user behaviour, interaction mechanisms, and content formats differ. Financial discussions on platforms such as Twitter or Reddit may exhibit different diffusion dynamics compared to Facebook sharing behaviour. This highlights the broader challenge of </w:t>
+      </w:r>
+      <w:proofErr w:type="spellStart"/>
+      <w:r>
+        <w:rPr>
+          <w:lang w:val="en-US"/>
+        </w:rPr>
+        <w:t>generalising</w:t>
+      </w:r>
+      <w:proofErr w:type="spellEnd"/>
+      <w:r>
+        <w:rPr>
+          <w:lang w:val="en-US"/>
+        </w:rPr>
+        <w:t xml:space="preserve"> predictive models across multiple online environments.</w:t>
+      </w:r>
+    </w:p>
+    <w:p>
+      <w:pPr>
+        <w:tabs>
+          <w:tab w:val="left" w:pos="7128"/>
+          <w:tab w:val="right" w:pos="9026"/>
+        </w:tabs>
+        <w:rPr>
+          <w:lang w:val="en-US"/>
+        </w:rPr>
+      </w:pPr>
+      <w:r>
+        <w:rPr>
+          <w:lang w:val="en-US"/>
+        </w:rPr>
+        <w:t>Despite these limitations, Cheng et al. (2014) provides important conceptual support for the current project. The study reinforces the idea that trend emergence involves dynamic spread behaviour rather than isolated popularity measurements. It also supports the use of temporal growth and engagement acceleration features within predictive modelling systems. At the same time, the practical challenges associated with large-scale network analysis help justify the scope of the proposed project, which focuses on a more manageable machine learning pipeline using temporal, engagement, and sentiment-based features rather than attempting full-scale graph reconstruction or industrial cascade modelling.</w:t>
+      </w:r>
+    </w:p>
+    <w:p>
+      <w:pPr>
+        <w:tabs>
+          <w:tab w:val="left" w:pos="7128"/>
+          <w:tab w:val="right" w:pos="9026"/>
+        </w:tabs>
+        <w:rPr>
+          <w:lang w:val="en-US"/>
+        </w:rPr>
+      </w:pPr>
+      <w:r>
+        <w:rPr>
+          <w:lang w:val="en-US"/>
+        </w:rPr>
+        <w:t>Overall, diffusion and cascade prediction research expanded the understanding of social media trends by showing that the structure and dynamics of information spread play a critical role in determining whether online discussions grow into large-scale phenomena. These studies demonstrated that predictive modelling benefits from considering not only popularity and content features, but also the social propagation mechanisms that influence how trends evolve over time. This research area therefore provides an important theoretical foundation for understanding trend emergence as a dynamic and socially distributed process.</w:t>
+      </w:r>
+    </w:p>
+    <w:p>
+      <w:pPr>
+        <w:pStyle w:val="Heading2"/>
+        <w:rPr>
           <w:lang w:val="en-US"/>
         </w:rPr>
         <w:pPrChange w:id="2" w:author="Hieu Nguyen" w:date="2026-05-22T19:54:00Z" w16du:dateUtc="2026-05-22T12:54:00Z">
@@ -879,377 +1224,371 @@
           </w:pPr>
         </w:pPrChange>
       </w:pPr>
-      <w:ins w:id="3" w:author="Hieu Nguyen" w:date="2026-05-22T19:52:00Z">
-        <w:r>
-          <w:rPr>
-            <w:lang w:val="en-US"/>
-          </w:rPr>
-          <w:t>5. Information Diffusion and Cascade Prediction</w:t>
-        </w:r>
-      </w:ins>
-    </w:p>
-    <w:p>
-      <w:pPr>
-        <w:tabs>
-          <w:tab w:val="left" w:pos="7128"/>
-          <w:tab w:val="right" w:pos="9026"/>
-        </w:tabs>
-        <w:rPr>
-          <w:ins w:id="4" w:author="Hieu Nguyen" w:date="2026-05-22T19:52:00Z"/>
-          <w:lang w:val="en-US"/>
-        </w:rPr>
-      </w:pPr>
-      <w:ins w:id="5" w:author="Hieu Nguyen" w:date="2026-05-22T19:52:00Z">
-        <w:r>
-          <w:rPr>
-            <w:lang w:val="en-US"/>
-          </w:rPr>
-          <w:t xml:space="preserve">As social media research progressed, researchers increasingly </w:t>
-        </w:r>
-        <w:proofErr w:type="spellStart"/>
-        <w:r>
-          <w:rPr>
-            <w:lang w:val="en-US"/>
-          </w:rPr>
-          <w:t>recognised</w:t>
-        </w:r>
-        <w:proofErr w:type="spellEnd"/>
-        <w:r>
-          <w:rPr>
-            <w:lang w:val="en-US"/>
-          </w:rPr>
-          <w:t xml:space="preserve"> that popularity and trend emergence are not driven only by individual user interactions or content characteristics, but also by how information spreads through networks of users. This led to growing interest in information diffusion and cascade prediction, </w:t>
-        </w:r>
-        <w:r>
-          <w:rPr>
-            <w:lang w:val="en-US"/>
-          </w:rPr>
-          <w:lastRenderedPageBreak/>
-          <w:t>which examine how posts, discussions, or topics propagate across social media platforms over time. These approaches are particularly relevant to trend emergence because trends often develop through rapid sharing behaviour and expanding user participation rather than through isolated popularity events.</w:t>
-        </w:r>
-      </w:ins>
-    </w:p>
-    <w:p>
-      <w:pPr>
-        <w:tabs>
-          <w:tab w:val="left" w:pos="7128"/>
-          <w:tab w:val="right" w:pos="9026"/>
-        </w:tabs>
-        <w:rPr>
-          <w:ins w:id="6" w:author="Hieu Nguyen" w:date="2026-05-22T19:52:00Z"/>
-          <w:lang w:val="en-US"/>
-        </w:rPr>
-      </w:pPr>
-      <w:ins w:id="7" w:author="Hieu Nguyen" w:date="2026-05-22T19:52:00Z">
-        <w:r>
-          <w:rPr>
-            <w:lang w:val="en-US"/>
-          </w:rPr>
-          <w:t xml:space="preserve">An influential study in this area is Cheng et al. (2014), </w:t>
-        </w:r>
-        <w:r>
-          <w:rPr>
-            <w:i/>
-            <w:iCs/>
-            <w:lang w:val="en-US"/>
-          </w:rPr>
-          <w:t>Can Cascades Be Predicted?</w:t>
-        </w:r>
-        <w:r>
-          <w:rPr>
-            <w:lang w:val="en-US"/>
-          </w:rPr>
-          <w:t xml:space="preserve"> The authors investigated whether large information cascades on Facebook could be predicted using early observations of content spread. A cascade in this context refers to the process where information spreads from user to user through reposting or sharing activity, potentially reaching very large audiences. The study </w:t>
-        </w:r>
-        <w:proofErr w:type="spellStart"/>
-        <w:r>
-          <w:rPr>
-            <w:lang w:val="en-US"/>
-          </w:rPr>
-          <w:t>analysed</w:t>
-        </w:r>
-        <w:proofErr w:type="spellEnd"/>
-        <w:r>
-          <w:rPr>
-            <w:lang w:val="en-US"/>
-          </w:rPr>
-          <w:t xml:space="preserve"> millions of cascades and explored whether characteristics observed during the early stages of diffusion could predict whether a cascade would continue growing substantially.</w:t>
-        </w:r>
-      </w:ins>
-    </w:p>
-    <w:p>
-      <w:pPr>
-        <w:tabs>
-          <w:tab w:val="left" w:pos="7128"/>
-          <w:tab w:val="right" w:pos="9026"/>
-        </w:tabs>
-        <w:rPr>
-          <w:ins w:id="8" w:author="Hieu Nguyen" w:date="2026-05-22T19:52:00Z"/>
-          <w:lang w:val="en-US"/>
-        </w:rPr>
-      </w:pPr>
-      <w:ins w:id="9" w:author="Hieu Nguyen" w:date="2026-05-22T19:52:00Z">
-        <w:r>
-          <w:rPr>
-            <w:lang w:val="en-US"/>
-          </w:rPr>
-          <w:t xml:space="preserve">This work is important because it shifted predictive modelling research beyond simple </w:t>
-        </w:r>
-        <w:proofErr w:type="gramStart"/>
-        <w:r>
-          <w:rPr>
-            <w:lang w:val="en-US"/>
-          </w:rPr>
-          <w:t>popularity counts</w:t>
-        </w:r>
-        <w:proofErr w:type="gramEnd"/>
-        <w:r>
-          <w:rPr>
-            <w:lang w:val="en-US"/>
-          </w:rPr>
-          <w:t xml:space="preserve"> toward </w:t>
-        </w:r>
-        <w:proofErr w:type="spellStart"/>
-        <w:r>
-          <w:rPr>
-            <w:lang w:val="en-US"/>
-          </w:rPr>
-          <w:t>analysing</w:t>
-        </w:r>
-        <w:proofErr w:type="spellEnd"/>
-        <w:r>
-          <w:rPr>
-            <w:lang w:val="en-US"/>
-          </w:rPr>
-          <w:t xml:space="preserve"> the structural dynamics of information spread. Earlier studies such as Szabo and Huberman (2010) mainly focused on correlations between early and later popularity measurements, whereas Cheng et al. (2014) examined how content propagates through social networks and how diffusion behaviour influences large-scale spread. This perspective is highly relevant to trend emergence research because emerging trends are often </w:t>
-        </w:r>
-        <w:proofErr w:type="spellStart"/>
-        <w:r>
-          <w:rPr>
-            <w:lang w:val="en-US"/>
-          </w:rPr>
-          <w:t>characterised</w:t>
-        </w:r>
-        <w:proofErr w:type="spellEnd"/>
-        <w:r>
-          <w:rPr>
-            <w:lang w:val="en-US"/>
-          </w:rPr>
-          <w:t xml:space="preserve"> by accelerating diffusion patterns and increasing participation across connected user groups.</w:t>
-        </w:r>
-      </w:ins>
-    </w:p>
-    <w:p>
-      <w:pPr>
-        <w:tabs>
-          <w:tab w:val="left" w:pos="7128"/>
-          <w:tab w:val="right" w:pos="9026"/>
-        </w:tabs>
-        <w:rPr>
-          <w:ins w:id="10" w:author="Hieu Nguyen" w:date="2026-05-22T19:52:00Z"/>
-          <w:lang w:val="en-US"/>
-        </w:rPr>
-      </w:pPr>
-      <w:ins w:id="11" w:author="Hieu Nguyen" w:date="2026-05-22T19:52:00Z">
-        <w:r>
-          <w:rPr>
-            <w:lang w:val="en-US"/>
-          </w:rPr>
-          <w:t xml:space="preserve">A major strength of the study is its large-scale empirical analysis. By </w:t>
-        </w:r>
-        <w:proofErr w:type="spellStart"/>
-        <w:r>
-          <w:rPr>
-            <w:lang w:val="en-US"/>
-          </w:rPr>
-          <w:t>analysing</w:t>
-        </w:r>
-        <w:proofErr w:type="spellEnd"/>
-        <w:r>
-          <w:rPr>
-            <w:lang w:val="en-US"/>
-          </w:rPr>
-          <w:t xml:space="preserve"> millions of cascades, the authors were able to identify common diffusion </w:t>
-        </w:r>
-        <w:proofErr w:type="spellStart"/>
-        <w:r>
-          <w:rPr>
-            <w:lang w:val="en-US"/>
-          </w:rPr>
-          <w:t>behaviours</w:t>
-        </w:r>
-        <w:proofErr w:type="spellEnd"/>
-        <w:r>
-          <w:rPr>
-            <w:lang w:val="en-US"/>
-          </w:rPr>
-          <w:t xml:space="preserve"> and demonstrate that certain early structural signals can improve predictive performance. The paper also showed that predictive accuracy increases significantly when models observe the first stages of cascade growth, supporting the broader idea that early-stage behaviour contains meaningful predictive information. This finding aligns strongly with the current project’s focus on identifying early signals of trend emergence before trends become fully established.</w:t>
-        </w:r>
-      </w:ins>
-    </w:p>
-    <w:p>
-      <w:pPr>
-        <w:tabs>
-          <w:tab w:val="left" w:pos="7128"/>
-          <w:tab w:val="right" w:pos="9026"/>
-        </w:tabs>
-        <w:rPr>
-          <w:ins w:id="12" w:author="Hieu Nguyen" w:date="2026-05-22T19:52:00Z"/>
-          <w:lang w:val="en-US"/>
-        </w:rPr>
-      </w:pPr>
-      <w:ins w:id="13" w:author="Hieu Nguyen" w:date="2026-05-22T19:52:00Z">
-        <w:r>
-          <w:rPr>
-            <w:lang w:val="en-US"/>
-          </w:rPr>
-          <w:t>Another important contribution of the paper is its focus on multiple feature categories related to diffusion behaviour. The study considered not only content characteristics, but also temporal growth patterns, network structure, and user interaction behaviour. This supports the broader research direction that predictive models benefit from integrating multiple dimensions of social media activity rather than relying on a single predictive factor. In particular, the work demonstrates that trend formation is influenced not only by content popularity, but also by how information spreads socially between users.</w:t>
-        </w:r>
-      </w:ins>
-    </w:p>
-    <w:p>
-      <w:pPr>
-        <w:tabs>
-          <w:tab w:val="left" w:pos="7128"/>
-          <w:tab w:val="right" w:pos="9026"/>
-        </w:tabs>
-        <w:rPr>
-          <w:ins w:id="14" w:author="Hieu Nguyen" w:date="2026-05-22T19:52:00Z"/>
-          <w:lang w:val="en-US"/>
-        </w:rPr>
-      </w:pPr>
-      <w:ins w:id="15" w:author="Hieu Nguyen" w:date="2026-05-22T19:52:00Z">
-        <w:r>
-          <w:rPr>
-            <w:lang w:val="en-US"/>
-          </w:rPr>
-          <w:t xml:space="preserve">However, the study also has several limitations when considered from the perspective of a practical student project. One major limitation is the heavy dependence on large-scale platform data and complex network structures. Cascade prediction often requires </w:t>
-        </w:r>
-        <w:r>
-          <w:rPr>
-            <w:lang w:val="en-US"/>
-          </w:rPr>
-          <w:lastRenderedPageBreak/>
-          <w:t>detailed information about user relationships, resharing paths, and network connectivity, which may be difficult to obtain from publicly available datasets or APIs due to privacy restrictions and platform limitations. This creates practical challenges for reproducing full diffusion-based approaches outside large industrial research environments.</w:t>
-        </w:r>
-      </w:ins>
-    </w:p>
-    <w:p>
-      <w:pPr>
-        <w:tabs>
-          <w:tab w:val="left" w:pos="7128"/>
-          <w:tab w:val="right" w:pos="9026"/>
-        </w:tabs>
-        <w:rPr>
-          <w:ins w:id="16" w:author="Hieu Nguyen" w:date="2026-05-22T19:52:00Z"/>
-          <w:lang w:val="en-US"/>
-        </w:rPr>
-      </w:pPr>
-      <w:ins w:id="17" w:author="Hieu Nguyen" w:date="2026-05-22T19:52:00Z">
-        <w:r>
-          <w:rPr>
-            <w:lang w:val="en-US"/>
-          </w:rPr>
-          <w:t>Another limitation is that cascade prediction models can become computationally complex, especially when graph-based network analysis is involved. While these methods may produce strong predictive performance, they may also require infrastructure, processing power, and data access beyond the scope of smaller academic projects. Additionally, the study focuses mainly on predicting whether cascades become large rather than understanding the semantic meaning or sentiment associated with the content being shared. As a result, diffusion-based approaches alone may not fully explain why certain trends emerge or how public sentiment contributes to their growth.</w:t>
-        </w:r>
-      </w:ins>
-    </w:p>
-    <w:p>
-      <w:pPr>
-        <w:tabs>
-          <w:tab w:val="left" w:pos="7128"/>
-          <w:tab w:val="right" w:pos="9026"/>
-        </w:tabs>
-        <w:rPr>
-          <w:ins w:id="18" w:author="Hieu Nguyen" w:date="2026-05-22T19:52:00Z"/>
-          <w:lang w:val="en-US"/>
-        </w:rPr>
-      </w:pPr>
-      <w:ins w:id="19" w:author="Hieu Nguyen" w:date="2026-05-22T19:52:00Z">
-        <w:r>
-          <w:rPr>
-            <w:lang w:val="en-US"/>
-          </w:rPr>
-          <w:t xml:space="preserve">The paper is also focused on Facebook sharing cascades, meaning that some findings may not </w:t>
-        </w:r>
-        <w:proofErr w:type="spellStart"/>
-        <w:r>
-          <w:rPr>
-            <w:lang w:val="en-US"/>
-          </w:rPr>
-          <w:t>generalise</w:t>
-        </w:r>
-        <w:proofErr w:type="spellEnd"/>
-        <w:r>
-          <w:rPr>
-            <w:lang w:val="en-US"/>
-          </w:rPr>
-          <w:t xml:space="preserve"> perfectly to other social media platforms where user behaviour, interaction mechanisms, and content formats differ. Financial discussions on platforms such as Twitter or Reddit may exhibit different diffusion dynamics compared to Facebook sharing behaviour. This highlights the broader challenge of </w:t>
-        </w:r>
-        <w:proofErr w:type="spellStart"/>
-        <w:r>
-          <w:rPr>
-            <w:lang w:val="en-US"/>
-          </w:rPr>
-          <w:t>generalising</w:t>
-        </w:r>
-        <w:proofErr w:type="spellEnd"/>
-        <w:r>
-          <w:rPr>
-            <w:lang w:val="en-US"/>
-          </w:rPr>
-          <w:t xml:space="preserve"> predictive models across multiple online environments.</w:t>
-        </w:r>
-      </w:ins>
-    </w:p>
-    <w:p>
-      <w:pPr>
-        <w:tabs>
-          <w:tab w:val="left" w:pos="7128"/>
-          <w:tab w:val="right" w:pos="9026"/>
-        </w:tabs>
-        <w:rPr>
-          <w:ins w:id="20" w:author="Hieu Nguyen" w:date="2026-05-22T19:52:00Z"/>
-          <w:lang w:val="en-US"/>
-        </w:rPr>
-      </w:pPr>
-      <w:ins w:id="21" w:author="Hieu Nguyen" w:date="2026-05-22T19:52:00Z">
-        <w:r>
-          <w:rPr>
-            <w:lang w:val="en-US"/>
-          </w:rPr>
-          <w:t>Despite these limitations, Cheng et al. (2014) provides important conceptual support for the current project. The study reinforces the idea that trend emergence involves dynamic spread behaviour rather than isolated popularity measurements. It also supports the use of temporal growth and engagement acceleration features within predictive modelling systems. At the same time, the practical challenges associated with large-scale network analysis help justify the scope of the proposed project, which focuses on a more manageable machine learning pipeline using temporal, engagement, and sentiment-based features rather than attempting full-scale graph reconstruction or industrial cascade modelling.</w:t>
-        </w:r>
-      </w:ins>
-    </w:p>
-    <w:p>
-      <w:pPr>
-        <w:tabs>
-          <w:tab w:val="left" w:pos="7128"/>
-          <w:tab w:val="right" w:pos="9026"/>
-        </w:tabs>
-        <w:rPr>
-          <w:ins w:id="22" w:author="Hieu Nguyen" w:date="2026-05-22T19:52:00Z"/>
-          <w:lang w:val="en-US"/>
-        </w:rPr>
-      </w:pPr>
-      <w:ins w:id="23" w:author="Hieu Nguyen" w:date="2026-05-22T19:52:00Z">
-        <w:r>
-          <w:rPr>
-            <w:lang w:val="en-US"/>
-          </w:rPr>
-          <w:t>Overall, diffusion and cascade prediction research expanded the understanding of social media trends by showing that the structure and dynamics of information spread play a critical role in determining whether online discussions grow into large-scale phenomena. These studies demonstrated that predictive modelling benefits from considering not only popularity and content features, but also the social propagation mechanisms that influence how trends evolve over time. This research area therefore provides an important theoretical foundation for understanding trend emergence as a dynamic and socially distributed process.</w:t>
-        </w:r>
-      </w:ins>
-    </w:p>
-    <w:p>
-      <w:pPr>
-        <w:tabs>
-          <w:tab w:val="left" w:pos="7128"/>
-          <w:tab w:val="right" w:pos="9026"/>
-        </w:tabs>
-      </w:pPr>
-      <w:del w:id="24" w:author="Hieu Nguyen" w:date="2026-05-22T19:52:00Z" w16du:dateUtc="2026-05-22T12:52:00Z">
+      <w:r>
+        <w:rPr>
+          <w:lang w:val="en-US"/>
+        </w:rPr>
+        <w:lastRenderedPageBreak/>
+        <w:t>6. Comparative Analysis and Research Gap</w:t>
+      </w:r>
+    </w:p>
+    <w:p>
+      <w:pPr>
+        <w:tabs>
+          <w:tab w:val="left" w:pos="7128"/>
+          <w:tab w:val="right" w:pos="9026"/>
+        </w:tabs>
+        <w:rPr>
+          <w:lang w:val="en-US"/>
+        </w:rPr>
+      </w:pPr>
+      <w:r>
+        <w:rPr>
+          <w:lang w:val="en-US"/>
+        </w:rPr>
+        <w:t>The literature reviewed demonstrates that predicting social media behaviour is a well-established research area, with previous studies approaching the problem from several different perspectives. Early popularity prediction research focused primarily on temporal engagement patterns, later machine learning studies introduced content-based and metadata features, sentiment analysis research explored emotional and textual signals, and diffusion studies examined how information spreads through social networks. Together, these studies provide important theoretical and methodological foundations for understanding how online trends develop and how predictive models can be constructed.</w:t>
+      </w:r>
+    </w:p>
+    <w:p>
+      <w:pPr>
+        <w:tabs>
+          <w:tab w:val="left" w:pos="7128"/>
+          <w:tab w:val="right" w:pos="9026"/>
+        </w:tabs>
+        <w:rPr>
+          <w:lang w:val="en-US"/>
+        </w:rPr>
+      </w:pPr>
+      <w:r>
+        <w:rPr>
+          <w:lang w:val="en-US"/>
+        </w:rPr>
+        <w:t xml:space="preserve">One clear pattern across the literature is the growing complexity of predictive approaches over time. Early studies such as Szabo and Huberman (2010) and Lerman (2010) mainly relied on temporal engagement behaviour and early interaction measurements. These studies demonstrated that early popularity signals can strongly correlate with later outcomes, establishing the idea that online attention follows partially predictable growth patterns. However, these approaches treated prediction largely as a popularity estimation problem and relied heavily on engagement counts without deeply </w:t>
+      </w:r>
+      <w:proofErr w:type="spellStart"/>
+      <w:r>
+        <w:rPr>
+          <w:lang w:val="en-US"/>
+        </w:rPr>
+        <w:t>analysing</w:t>
+      </w:r>
+      <w:proofErr w:type="spellEnd"/>
+      <w:r>
+        <w:rPr>
+          <w:lang w:val="en-US"/>
+        </w:rPr>
+        <w:t xml:space="preserve"> the semantic meaning or contextual characteristics of online discussions.</w:t>
+      </w:r>
+    </w:p>
+    <w:p>
+      <w:pPr>
+        <w:tabs>
+          <w:tab w:val="left" w:pos="7128"/>
+          <w:tab w:val="right" w:pos="9026"/>
+        </w:tabs>
+        <w:rPr>
+          <w:lang w:val="en-US"/>
+        </w:rPr>
+      </w:pPr>
+      <w:r>
+        <w:rPr>
+          <w:lang w:val="en-US"/>
+        </w:rPr>
+        <w:t>Later research introduced machine learning and feature engineering approaches that expanded prediction beyond simple temporal measurements. Bandari et al. (2012), for example, demonstrated that content features and metadata characteristics can contribute valuable predictive information alongside interaction behaviour. This represented an important transition because it showed that trend-related behaviour may be influenced not only by how users interact with content, but also by the structure, topic, and linguistic properties of the content itself. Compared to earlier popularity prediction studies, machine learning approaches therefore provided more flexible predictive frameworks capable of integrating multiple feature categories.</w:t>
+      </w:r>
+    </w:p>
+    <w:p>
+      <w:pPr>
+        <w:tabs>
+          <w:tab w:val="left" w:pos="7128"/>
+          <w:tab w:val="right" w:pos="9026"/>
+        </w:tabs>
+        <w:rPr>
+          <w:lang w:val="en-US"/>
+        </w:rPr>
+      </w:pPr>
+      <w:r>
+        <w:rPr>
+          <w:lang w:val="en-US"/>
+        </w:rPr>
+        <w:t xml:space="preserve">Research involving sentiment analysis further expanded predictive modelling by introducing semantic and emotional understanding of social media discussions. Bollen et al. (2011) showed that collective mood extracted from Twitter data may contain predictive </w:t>
+      </w:r>
+      <w:proofErr w:type="spellStart"/>
+      <w:r>
+        <w:rPr>
+          <w:lang w:val="en-US"/>
+        </w:rPr>
+        <w:t>behavioural</w:t>
+      </w:r>
+      <w:proofErr w:type="spellEnd"/>
+      <w:r>
+        <w:rPr>
+          <w:lang w:val="en-US"/>
+        </w:rPr>
+        <w:t xml:space="preserve"> signals related to financial activity. This work highlighted the importance of textual meaning and emotional dynamics within social media environments, suggesting that public sentiment can influence or reflect emerging collective behaviour. This represents a major difference from purely engagement-based prediction because it considers not only how much users interact, but also what users are expressing emotionally and semantically.</w:t>
+      </w:r>
+    </w:p>
+    <w:p>
+      <w:pPr>
+        <w:tabs>
+          <w:tab w:val="left" w:pos="7128"/>
+          <w:tab w:val="right" w:pos="9026"/>
+        </w:tabs>
+        <w:rPr>
+          <w:lang w:val="en-US"/>
+        </w:rPr>
+      </w:pPr>
+      <w:r>
+        <w:rPr>
+          <w:lang w:val="en-US"/>
+        </w:rPr>
+        <w:lastRenderedPageBreak/>
+        <w:t xml:space="preserve">At the same time, diffusion and cascade prediction studies such as Cheng et al. (2014) demonstrated that trend formation is also influenced by how information spreads through networks of users. These approaches focused on structural propagation dynamics rather than only individual engagement measurements or textual content. By </w:t>
+      </w:r>
+      <w:proofErr w:type="spellStart"/>
+      <w:r>
+        <w:rPr>
+          <w:lang w:val="en-US"/>
+        </w:rPr>
+        <w:t>analysing</w:t>
+      </w:r>
+      <w:proofErr w:type="spellEnd"/>
+      <w:r>
+        <w:rPr>
+          <w:lang w:val="en-US"/>
+        </w:rPr>
+        <w:t xml:space="preserve"> resharing patterns and cascade growth behaviour, diffusion research provided deeper understanding of how discussions expand into large-scale social phenomena. This introduced a network-oriented perspective that complements temporal, engagement-based, and sentiment-based approaches.</w:t>
+      </w:r>
+    </w:p>
+    <w:p>
+      <w:pPr>
+        <w:tabs>
+          <w:tab w:val="left" w:pos="7128"/>
+          <w:tab w:val="right" w:pos="9026"/>
+        </w:tabs>
+        <w:rPr>
+          <w:lang w:val="en-US"/>
+        </w:rPr>
+      </w:pPr>
+      <w:r>
+        <w:rPr>
+          <w:lang w:val="en-US"/>
+        </w:rPr>
+        <w:t xml:space="preserve">Although these studies provide valuable insights, several important limitations and research gaps remain. One major limitation is that many previous studies focus primarily on predicting eventual popularity rather than detecting trend emergence during its earliest stages. Predicting whether content will become highly popular is related to, but not identical to, identifying whether a discussion is beginning to emerge as a trend. Trend emergence detection requires identifying subtle acceleration patterns and </w:t>
+      </w:r>
+      <w:proofErr w:type="spellStart"/>
+      <w:r>
+        <w:rPr>
+          <w:lang w:val="en-US"/>
+        </w:rPr>
+        <w:t>behavioural</w:t>
+      </w:r>
+      <w:proofErr w:type="spellEnd"/>
+      <w:r>
+        <w:rPr>
+          <w:lang w:val="en-US"/>
+        </w:rPr>
+        <w:t xml:space="preserve"> shifts before large-scale popularity has fully developed. Existing literature often focuses more strongly on final popularity outcomes than on this earlier prediction stage.</w:t>
+      </w:r>
+    </w:p>
+    <w:p>
+      <w:pPr>
+        <w:tabs>
+          <w:tab w:val="left" w:pos="7128"/>
+          <w:tab w:val="right" w:pos="9026"/>
+        </w:tabs>
+        <w:rPr>
+          <w:lang w:val="en-US"/>
+        </w:rPr>
+      </w:pPr>
+      <w:r>
+        <w:rPr>
+          <w:lang w:val="en-US"/>
+        </w:rPr>
+        <w:t>Another important limitation is that many studies rely heavily on a single category of predictive features. Early popularity prediction research focused mainly on temporal engagement signals, sentiment studies focused primarily on textual mood analysis, and diffusion research concentrated on network propagation behaviour. While these approaches individually provide useful insights, real-world social media trends are likely influenced by the interaction of multiple factors simultaneously. Temporal growth, engagement behaviour, sentiment shifts, and diffusion dynamics may all contribute to trend emergence together rather than independently. This creates a need for more integrated predictive modelling approaches.</w:t>
+      </w:r>
+    </w:p>
+    <w:p>
+      <w:pPr>
+        <w:tabs>
+          <w:tab w:val="left" w:pos="7128"/>
+          <w:tab w:val="right" w:pos="9026"/>
+        </w:tabs>
+        <w:rPr>
+          <w:lang w:val="en-US"/>
+        </w:rPr>
+      </w:pPr>
+      <w:r>
+        <w:rPr>
+          <w:lang w:val="en-US"/>
+        </w:rPr>
+        <w:t xml:space="preserve">Practical implementation challenges also appear repeatedly throughout </w:t>
+      </w:r>
+      <w:proofErr w:type="gramStart"/>
+      <w:r>
+        <w:rPr>
+          <w:lang w:val="en-US"/>
+        </w:rPr>
+        <w:t>the literature</w:t>
+      </w:r>
+      <w:proofErr w:type="gramEnd"/>
+      <w:r>
+        <w:rPr>
+          <w:lang w:val="en-US"/>
+        </w:rPr>
+        <w:t>. Several advanced approaches, particularly large-scale diffusion and industrial recommendation systems, depend on extensive datasets, detailed network structures, or computational resources that may be difficult to reproduce within smaller academic projects. For example, cascade prediction methods often require detailed graph-based user relationship data that may not be publicly accessible due to privacy and platform restrictions. Similarly, industrial-scale systems such as those developed by large technology companies may involve infrastructure and datasets beyond the scope of student-level research. These limitations highlight the importance of designing predictive systems that remain both academically meaningful and practically achievable.</w:t>
+      </w:r>
+    </w:p>
+    <w:p>
+      <w:pPr>
+        <w:tabs>
+          <w:tab w:val="left" w:pos="7128"/>
+          <w:tab w:val="right" w:pos="9026"/>
+        </w:tabs>
+        <w:rPr>
+          <w:lang w:val="en-US"/>
+        </w:rPr>
+      </w:pPr>
+      <w:r>
+        <w:rPr>
+          <w:lang w:val="en-US"/>
+        </w:rPr>
+        <w:t xml:space="preserve">Another gap in </w:t>
+      </w:r>
+      <w:proofErr w:type="gramStart"/>
+      <w:r>
+        <w:rPr>
+          <w:lang w:val="en-US"/>
+        </w:rPr>
+        <w:t>the literature</w:t>
+      </w:r>
+      <w:proofErr w:type="gramEnd"/>
+      <w:r>
+        <w:rPr>
+          <w:lang w:val="en-US"/>
+        </w:rPr>
+        <w:t xml:space="preserve"> is the relatively limited focus on finance-related </w:t>
+      </w:r>
+      <w:proofErr w:type="gramStart"/>
+      <w:r>
+        <w:rPr>
+          <w:lang w:val="en-US"/>
+        </w:rPr>
+        <w:t>trend</w:t>
+      </w:r>
+      <w:proofErr w:type="gramEnd"/>
+      <w:r>
+        <w:rPr>
+          <w:lang w:val="en-US"/>
+        </w:rPr>
+        <w:t xml:space="preserve"> emergence specifically. While Bollen et al. (2011) examined social media mood in </w:t>
+      </w:r>
+      <w:r>
+        <w:rPr>
+          <w:lang w:val="en-US"/>
+        </w:rPr>
+        <w:lastRenderedPageBreak/>
+        <w:t xml:space="preserve">relation to financial markets, much of the broader literature studies general popularity or information diffusion without concentrating specifically on financial discussion trends. Financial social media environments may behave differently from general entertainment or news-sharing platforms because they are strongly influenced by speculation, public sentiment, rapid reactions to events, and collective </w:t>
+      </w:r>
+      <w:proofErr w:type="spellStart"/>
+      <w:r>
+        <w:rPr>
+          <w:lang w:val="en-US"/>
+        </w:rPr>
+        <w:t>behavioural</w:t>
+      </w:r>
+      <w:proofErr w:type="spellEnd"/>
+      <w:r>
+        <w:rPr>
+          <w:lang w:val="en-US"/>
+        </w:rPr>
+        <w:t xml:space="preserve"> dynamics. This creates opportunities for more focused predictive modelling research within finance-related online discussions.</w:t>
+      </w:r>
+    </w:p>
+    <w:p>
+      <w:pPr>
+        <w:tabs>
+          <w:tab w:val="left" w:pos="7128"/>
+          <w:tab w:val="right" w:pos="9026"/>
+        </w:tabs>
+        <w:rPr>
+          <w:lang w:val="en-US"/>
+        </w:rPr>
+      </w:pPr>
+      <w:r>
+        <w:rPr>
+          <w:lang w:val="en-US"/>
+        </w:rPr>
+        <w:t xml:space="preserve">The literature therefore supports the direction of the proposed project in several ways. First, previous studies justify the use of temporal and engagement-based features for identifying early </w:t>
+      </w:r>
+      <w:proofErr w:type="spellStart"/>
+      <w:r>
+        <w:rPr>
+          <w:lang w:val="en-US"/>
+        </w:rPr>
+        <w:t>behavioural</w:t>
+      </w:r>
+      <w:proofErr w:type="spellEnd"/>
+      <w:r>
+        <w:rPr>
+          <w:lang w:val="en-US"/>
+        </w:rPr>
+        <w:t xml:space="preserve"> signals. Second, machine learning and sentiment analysis research support integrating textual and semantic information into predictive models. Third, diffusion research demonstrates the importance of </w:t>
+      </w:r>
+      <w:proofErr w:type="spellStart"/>
+      <w:r>
+        <w:rPr>
+          <w:lang w:val="en-US"/>
+        </w:rPr>
+        <w:t>analysing</w:t>
+      </w:r>
+      <w:proofErr w:type="spellEnd"/>
+      <w:r>
+        <w:rPr>
+          <w:lang w:val="en-US"/>
+        </w:rPr>
+        <w:t xml:space="preserve"> how discussions spread dynamically across online environments. However, the limitations identified across the literature also suggest the need for a more practical and integrated predictive modelling approach.</w:t>
+      </w:r>
+    </w:p>
+    <w:p>
+      <w:pPr>
+        <w:tabs>
+          <w:tab w:val="left" w:pos="7128"/>
+          <w:tab w:val="right" w:pos="9026"/>
+        </w:tabs>
+        <w:rPr>
+          <w:lang w:val="en-US"/>
+        </w:rPr>
+      </w:pPr>
+      <w:r>
+        <w:rPr>
+          <w:lang w:val="en-US"/>
+        </w:rPr>
+        <w:t xml:space="preserve">The proposed project aims to address these gaps by developing a predictive model focused specifically on early-stage social media trend emergence within the finance domain. Rather than relying on only one predictive dimension, the project intends to combine temporal, engagement, and sentiment-based features within a manageable machine learning framework. In contrast to large-scale industrial systems or highly complex graph-based diffusion models, the project also </w:t>
+      </w:r>
+      <w:proofErr w:type="spellStart"/>
+      <w:r>
+        <w:rPr>
+          <w:lang w:val="en-US"/>
+        </w:rPr>
+        <w:t>prioritises</w:t>
+      </w:r>
+      <w:proofErr w:type="spellEnd"/>
+      <w:r>
+        <w:rPr>
+          <w:lang w:val="en-US"/>
+        </w:rPr>
+        <w:t xml:space="preserve"> practical feasibility while still incorporating concepts established in previous research. Through this approach, the project seeks to build upon the strengths of earlier studies while addressing some of their limitations regarding feature integration, early-stage prediction, and practical implementation scope.</w:t>
+      </w:r>
+    </w:p>
+    <w:p>
+      <w:pPr>
+        <w:tabs>
+          <w:tab w:val="left" w:pos="7128"/>
+          <w:tab w:val="right" w:pos="9026"/>
+        </w:tabs>
+      </w:pPr>
+      <w:del w:id="3" w:author="Hieu Nguyen" w:date="2026-05-22T19:52:00Z" w16du:dateUtc="2026-05-22T12:52:00Z">
         <w:r>
           <w:tab/>
         </w:r>

</xml_diff>

<commit_message>
20260518 literature review v0.1/add section 7
</commit_message>
<xml_diff>
--- a/literature.review/20260518 literature review v0.1.docx
+++ b/literature.review/20260518 literature review v0.1.docx
@@ -6,6 +6,11 @@
       <w:pPr>
         <w:pStyle w:val="Heading2"/>
       </w:pPr>
+      <w:ins w:id="0" w:author="Hieu Nguyen" w:date="2026-05-22T20:01:00Z" w16du:dateUtc="2026-05-22T13:01:00Z">
+        <w:r>
+          <w:t xml:space="preserve">1. </w:t>
+        </w:r>
+      </w:ins>
       <w:r>
         <w:t>Intro</w:t>
       </w:r>
@@ -112,6 +117,11 @@
       <w:pPr>
         <w:pStyle w:val="Heading2"/>
       </w:pPr>
+      <w:ins w:id="1" w:author="Hieu Nguyen" w:date="2026-05-22T20:01:00Z" w16du:dateUtc="2026-05-22T13:01:00Z">
+        <w:r>
+          <w:t xml:space="preserve">2. </w:t>
+        </w:r>
+      </w:ins>
       <w:r>
         <w:t>The F</w:t>
       </w:r>
@@ -588,7 +598,7 @@
         <w:rPr>
           <w:lang w:val="en-US"/>
         </w:rPr>
-        <w:pPrChange w:id="0" w:author="Hieu Nguyen" w:date="2026-05-22T19:52:00Z" w16du:dateUtc="2026-05-22T12:52:00Z">
+        <w:pPrChange w:id="2" w:author="Hieu Nguyen" w:date="2026-05-22T19:52:00Z" w16du:dateUtc="2026-05-22T12:52:00Z">
           <w:pPr>
             <w:tabs>
               <w:tab w:val="left" w:pos="7128"/>
@@ -869,7 +879,7 @@
         <w:rPr>
           <w:lang w:val="en-US"/>
         </w:rPr>
-        <w:pPrChange w:id="1" w:author="Hieu Nguyen" w:date="2026-05-22T19:54:00Z" w16du:dateUtc="2026-05-22T12:54:00Z">
+        <w:pPrChange w:id="3" w:author="Hieu Nguyen" w:date="2026-05-22T19:54:00Z" w16du:dateUtc="2026-05-22T12:54:00Z">
           <w:pPr>
             <w:tabs>
               <w:tab w:val="left" w:pos="7128"/>
@@ -1215,7 +1225,7 @@
         <w:rPr>
           <w:lang w:val="en-US"/>
         </w:rPr>
-        <w:pPrChange w:id="2" w:author="Hieu Nguyen" w:date="2026-05-22T19:54:00Z" w16du:dateUtc="2026-05-22T12:54:00Z">
+        <w:pPrChange w:id="4" w:author="Hieu Nguyen" w:date="2026-05-22T19:54:00Z" w16du:dateUtc="2026-05-22T12:54:00Z">
           <w:pPr>
             <w:tabs>
               <w:tab w:val="left" w:pos="7128"/>
@@ -1583,16 +1593,236 @@
     </w:p>
     <w:p>
       <w:pPr>
-        <w:tabs>
-          <w:tab w:val="left" w:pos="7128"/>
-          <w:tab w:val="right" w:pos="9026"/>
-        </w:tabs>
-      </w:pPr>
-      <w:del w:id="3" w:author="Hieu Nguyen" w:date="2026-05-22T19:52:00Z" w16du:dateUtc="2026-05-22T12:52:00Z">
-        <w:r>
-          <w:tab/>
-        </w:r>
-      </w:del>
+        <w:pStyle w:val="Heading2"/>
+        <w:rPr>
+          <w:lang w:val="en-US"/>
+        </w:rPr>
+        <w:pPrChange w:id="5" w:author="Hieu Nguyen" w:date="2026-05-22T20:01:00Z" w16du:dateUtc="2026-05-22T13:01:00Z">
+          <w:pPr>
+            <w:tabs>
+              <w:tab w:val="left" w:pos="7128"/>
+              <w:tab w:val="right" w:pos="9026"/>
+            </w:tabs>
+          </w:pPr>
+        </w:pPrChange>
+      </w:pPr>
+      <w:r>
+        <w:rPr>
+          <w:lang w:val="en-US"/>
+        </w:rPr>
+        <w:t>7. Conclusion</w:t>
+      </w:r>
+    </w:p>
+    <w:p>
+      <w:pPr>
+        <w:tabs>
+          <w:tab w:val="left" w:pos="7128"/>
+          <w:tab w:val="right" w:pos="9026"/>
+        </w:tabs>
+        <w:rPr>
+          <w:lang w:val="en-US"/>
+        </w:rPr>
+      </w:pPr>
+      <w:r>
+        <w:rPr>
+          <w:lang w:val="en-US"/>
+        </w:rPr>
+        <w:t>The literature reviewed in this survey demonstrates that social media prediction has evolved through several important stages, beginning with early popularity prediction research and later expanding into machine learning, sentiment analysis, and diffusion modelling approaches. Together, these studies provide a strong theoretical and methodological foundation for understanding how online discussions develop, spread, and potentially evolve into large-scale trends.</w:t>
+      </w:r>
+    </w:p>
+    <w:p>
+      <w:pPr>
+        <w:tabs>
+          <w:tab w:val="left" w:pos="7128"/>
+          <w:tab w:val="right" w:pos="9026"/>
+        </w:tabs>
+        <w:rPr>
+          <w:lang w:val="en-US"/>
+        </w:rPr>
+      </w:pPr>
+      <w:r>
+        <w:rPr>
+          <w:lang w:val="en-US"/>
+        </w:rPr>
+        <w:t xml:space="preserve">Early popularity prediction research, particularly the work of Szabo and Huberman (2010) and Lerman (2010), established that early engagement behaviour and temporal growth patterns contain valuable predictive information. These studies showed that online attention is not entirely random and that early user interaction measurements can help estimate future popularity outcomes. However, these approaches mainly focused on popularity magnitude and relied heavily on engagement-based indicators </w:t>
+      </w:r>
+      <w:r>
+        <w:rPr>
+          <w:lang w:val="en-US"/>
+        </w:rPr>
+        <w:lastRenderedPageBreak/>
+        <w:t>without incorporating deeper semantic understanding or multi-dimensional feature integration.</w:t>
+      </w:r>
+    </w:p>
+    <w:p>
+      <w:pPr>
+        <w:tabs>
+          <w:tab w:val="left" w:pos="7128"/>
+          <w:tab w:val="right" w:pos="9026"/>
+        </w:tabs>
+        <w:rPr>
+          <w:lang w:val="en-US"/>
+        </w:rPr>
+      </w:pPr>
+      <w:r>
+        <w:rPr>
+          <w:lang w:val="en-US"/>
+        </w:rPr>
+        <w:t xml:space="preserve">Machine learning and content-based prediction research, represented by Bandari et al. (2012), expanded predictive modelling beyond simple temporal analysis by introducing feature engineering approaches using content and metadata characteristics. This demonstrated that predictive systems </w:t>
+      </w:r>
+      <w:proofErr w:type="gramStart"/>
+      <w:r>
+        <w:rPr>
+          <w:lang w:val="en-US"/>
+        </w:rPr>
+        <w:t>can</w:t>
+      </w:r>
+      <w:proofErr w:type="gramEnd"/>
+      <w:r>
+        <w:rPr>
+          <w:lang w:val="en-US"/>
+        </w:rPr>
+        <w:t xml:space="preserve"> benefit from combining multiple types of information rather than relying on a single predictive signal. Meanwhile, sentiment analysis research such as Bollen et al. (2011) introduced the importance of emotional and semantic information within social media discussions, showing that collective mood and textual sentiment may also provide predictive insights, particularly within finance-related environments.</w:t>
+      </w:r>
+    </w:p>
+    <w:p>
+      <w:pPr>
+        <w:tabs>
+          <w:tab w:val="left" w:pos="7128"/>
+          <w:tab w:val="right" w:pos="9026"/>
+        </w:tabs>
+        <w:rPr>
+          <w:lang w:val="en-US"/>
+        </w:rPr>
+      </w:pPr>
+      <w:r>
+        <w:rPr>
+          <w:lang w:val="en-US"/>
+        </w:rPr>
+        <w:t xml:space="preserve">Diffusion and cascade prediction studies, including Cheng et al. (2014), further extended this understanding by examining how information spreads through social networks. These studies demonstrated that trend formation is influenced not only by content popularity or sentiment, but also by dynamic </w:t>
+      </w:r>
+      <w:proofErr w:type="gramStart"/>
+      <w:r>
+        <w:rPr>
+          <w:lang w:val="en-US"/>
+        </w:rPr>
+        <w:t>propagation behaviour</w:t>
+      </w:r>
+      <w:proofErr w:type="gramEnd"/>
+      <w:r>
+        <w:rPr>
+          <w:lang w:val="en-US"/>
+        </w:rPr>
+        <w:t xml:space="preserve"> </w:t>
+      </w:r>
+      <w:proofErr w:type="gramStart"/>
+      <w:r>
+        <w:rPr>
+          <w:lang w:val="en-US"/>
+        </w:rPr>
+        <w:t>and user</w:t>
+      </w:r>
+      <w:proofErr w:type="gramEnd"/>
+      <w:r>
+        <w:rPr>
+          <w:lang w:val="en-US"/>
+        </w:rPr>
+        <w:t xml:space="preserve"> interaction structures. This research highlighted the importance of considering social diffusion processes when </w:t>
+      </w:r>
+      <w:proofErr w:type="spellStart"/>
+      <w:r>
+        <w:rPr>
+          <w:lang w:val="en-US"/>
+        </w:rPr>
+        <w:t>analysing</w:t>
+      </w:r>
+      <w:proofErr w:type="spellEnd"/>
+      <w:r>
+        <w:rPr>
+          <w:lang w:val="en-US"/>
+        </w:rPr>
+        <w:t xml:space="preserve"> how online trends emerge and expand.</w:t>
+      </w:r>
+    </w:p>
+    <w:p>
+      <w:pPr>
+        <w:tabs>
+          <w:tab w:val="left" w:pos="7128"/>
+          <w:tab w:val="right" w:pos="9026"/>
+        </w:tabs>
+        <w:rPr>
+          <w:lang w:val="en-US"/>
+        </w:rPr>
+      </w:pPr>
+      <w:r>
+        <w:rPr>
+          <w:lang w:val="en-US"/>
+        </w:rPr>
+        <w:t xml:space="preserve">Despite these advances, </w:t>
+      </w:r>
+      <w:proofErr w:type="gramStart"/>
+      <w:r>
+        <w:rPr>
+          <w:lang w:val="en-US"/>
+        </w:rPr>
+        <w:t>the literature</w:t>
+      </w:r>
+      <w:proofErr w:type="gramEnd"/>
+      <w:r>
+        <w:rPr>
+          <w:lang w:val="en-US"/>
+        </w:rPr>
+        <w:t xml:space="preserve"> also reveals several important limitations. Many previous studies focus primarily on predicting eventual popularity rather than detecting early-stage trend emergence. In addition, many approaches depend heavily on a single category of features, such as temporal engagement, sentiment, or diffusion structure, rather than integrating multiple predictive dimensions together. Some advanced methods also require large-scale industrial datasets, extensive network information, or computational resources that may not be practical for smaller academic projects.</w:t>
+      </w:r>
+    </w:p>
+    <w:p>
+      <w:pPr>
+        <w:tabs>
+          <w:tab w:val="left" w:pos="7128"/>
+          <w:tab w:val="right" w:pos="9026"/>
+        </w:tabs>
+        <w:rPr>
+          <w:lang w:val="en-US"/>
+        </w:rPr>
+      </w:pPr>
+      <w:r>
+        <w:rPr>
+          <w:lang w:val="en-US"/>
+        </w:rPr>
+        <w:t>These gaps justify the direction of the proposed project. The project aims to build upon previous research by developing a predictive modelling approach focused specifically on the early detection of finance-related social media trend emergence. Rather than relying on only one predictive perspective, the project intends to combine temporal, engagement, and sentiment-based features within a manageable machine learning framework. This approach attempts to balance academic relevance, practical feasibility, and methodological integration while remaining achievable within the scope of a student project.</w:t>
+      </w:r>
+    </w:p>
+    <w:p>
+      <w:pPr>
+        <w:tabs>
+          <w:tab w:val="left" w:pos="7128"/>
+          <w:tab w:val="right" w:pos="9026"/>
+        </w:tabs>
+        <w:rPr>
+          <w:lang w:val="en-US"/>
+        </w:rPr>
+      </w:pPr>
+      <w:r>
+        <w:rPr>
+          <w:lang w:val="en-US"/>
+        </w:rPr>
+        <w:t xml:space="preserve">Overall, the literature suggests that early trend detection is a realistic and meaningful research problem, but also one that remains challenging due to the dynamic and multi-dimensional nature of social media behaviour. By combining insights from early popularity prediction, machine learning, sentiment analysis, and diffusion research, the proposed project aims to contribute a practical predictive modelling approach for </w:t>
+      </w:r>
+      <w:r>
+        <w:rPr>
+          <w:lang w:val="en-US"/>
+        </w:rPr>
+        <w:lastRenderedPageBreak/>
+        <w:t>understanding and identifying emerging financial discussions on social media platforms.</w:t>
+      </w:r>
+    </w:p>
+    <w:p>
+      <w:pPr>
+        <w:tabs>
+          <w:tab w:val="left" w:pos="7128"/>
+          <w:tab w:val="right" w:pos="9026"/>
+        </w:tabs>
+      </w:pPr>
       <w:r>
         <w:tab/>
       </w:r>

</xml_diff>

<commit_message>
20260518 literature review v0.1/edit section 4 + section 5
</commit_message>
<xml_diff>
--- a/literature.review/20260518 literature review v0.1.docx
+++ b/literature.review/20260518 literature review v0.1.docx
@@ -6,11 +6,9 @@
       <w:pPr>
         <w:pStyle w:val="Heading2"/>
       </w:pPr>
-      <w:ins w:id="0" w:author="Hieu Nguyen" w:date="2026-05-22T20:01:00Z" w16du:dateUtc="2026-05-22T13:01:00Z">
-        <w:r>
-          <w:t xml:space="preserve">1. </w:t>
-        </w:r>
-      </w:ins>
+      <w:r>
+        <w:t xml:space="preserve">1. </w:t>
+      </w:r>
       <w:r>
         <w:t>Intro</w:t>
       </w:r>
@@ -38,7 +36,15 @@
         <w:t>has</w:t>
       </w:r>
       <w:r>
-        <w:t xml:space="preserve"> practical value across many </w:t>
+        <w:t xml:space="preserve"> practical value across </w:t>
+      </w:r>
+      <w:proofErr w:type="gramStart"/>
+      <w:r>
+        <w:t>many</w:t>
+      </w:r>
+      <w:proofErr w:type="gramEnd"/>
+      <w:r>
+        <w:t xml:space="preserve"> </w:t>
       </w:r>
       <w:r>
         <w:t>domains</w:t>
@@ -73,23 +79,71 @@
     </w:p>
     <w:p>
       <w:r>
-        <w:t>However, detecting trend emergence at an early stage is a difficult task. Social media activity is highly dynamic, noisy, and often short-lived. Some topics experience brief spikes in attention and quickly disappear, while others develop into sustained trends with wider influence. This creates an important research challenge: distinguishing between ordinary fluctuations in activity and meaningful early signals that indicate genuine trend formation.</w:t>
-      </w:r>
-    </w:p>
-    <w:p>
-      <w:r>
-        <w:t>Previous research suggests that early prediction is possible, but it approaches the problem from different perspectives. Some studies emphasis temporal patterns, showing that early activity levels can be informative about future popularity. Other focus on engagement behaviour, such as reposts, comments, and interaction growth, as indicators of collective attention. More recent work has also examined sentiment and textual signals, arguing that the emotional tone and semantic content of discussions may provide additional predictive value. Alongside these approaches, diffusion-based research has explored how information spreads through social networks and whether early cascade behaviour can signal large future impact.</w:t>
-      </w:r>
-    </w:p>
-    <w:p>
-      <w:r>
-        <w:t xml:space="preserve">Although these approaches provide valuable foundations, they also reveal important limitations. Much of the </w:t>
+        <w:t xml:space="preserve">However, detecting trend emergence at an early stage is </w:t>
+      </w:r>
+      <w:proofErr w:type="gramStart"/>
+      <w:r>
+        <w:t>a difficult task</w:t>
+      </w:r>
+      <w:proofErr w:type="gramEnd"/>
+      <w:r>
+        <w:t xml:space="preserve">. Social media activity is highly dynamic, noisy, and often short-lived. </w:t>
+      </w:r>
+      <w:proofErr w:type="gramStart"/>
+      <w:r>
+        <w:t>Some</w:t>
+      </w:r>
+      <w:proofErr w:type="gramEnd"/>
+      <w:r>
+        <w:t xml:space="preserve"> topics experience brief spikes in attention and quickly disappear, while others develop into sustained trends with wider influence. This creates an important research challenge: distinguishing between ordinary fluctuations in activity and meaningful early signals that indicate genuine trend formation.</w:t>
+      </w:r>
+    </w:p>
+    <w:p>
+      <w:r>
+        <w:t xml:space="preserve">Previous research suggests that early prediction is possible, but it approaches the problem from different perspectives. </w:t>
+      </w:r>
+      <w:proofErr w:type="gramStart"/>
+      <w:r>
+        <w:t>Some</w:t>
+      </w:r>
+      <w:proofErr w:type="gramEnd"/>
+      <w:r>
+        <w:t xml:space="preserve"> studies emphasis temporal patterns, showing that early activity levels can be informative about future popularity. Other focus on engagement behaviour, such as reposts, comments, and interaction growth, as indicators of collective attention. More recent work has also examined sentiment and textual signals, arguing that the emotional tone and semantic content of discussions may provide additional predictive value. Alongside these approaches, diffusion-based research has explored how information spreads through social networks and whether early cascade behaviour can signal large future impact.</w:t>
+      </w:r>
+    </w:p>
+    <w:p>
+      <w:r>
+        <w:t xml:space="preserve">Although these approaches provide valuable foundations, they also reveal important limitations. </w:t>
+      </w:r>
+      <w:proofErr w:type="gramStart"/>
+      <w:r>
+        <w:t>Much</w:t>
+      </w:r>
+      <w:proofErr w:type="gramEnd"/>
+      <w:r>
+        <w:t xml:space="preserve"> of the </w:t>
       </w:r>
       <w:r>
         <w:t xml:space="preserve">literature focuses </w:t>
       </w:r>
       <w:r>
-        <w:t>on predicting eventual popularity rather than identifying trend emergence during its earliest stages. Many studies rely primarily on a single category of features, which can limit their ability to capture the multi-dimensional nature of social media behaviour. In addition, a substantial proportion of prior work is developed in broad or platform-general contexts rather than in specific practical domains such as finance, where both sentiment and timing may be especially important.</w:t>
+        <w:t xml:space="preserve">on predicting eventual popularity rather than identifying trend emergence during its earliest stages. </w:t>
+      </w:r>
+      <w:proofErr w:type="gramStart"/>
+      <w:r>
+        <w:t>Many</w:t>
+      </w:r>
+      <w:proofErr w:type="gramEnd"/>
+      <w:r>
+        <w:t xml:space="preserve"> studies rely primarily on a single category of features, which can limit their ability to capture the multi-dimensional nature of social media behaviour. In addition, a substantial proportion of prior work </w:t>
+      </w:r>
+      <w:proofErr w:type="gramStart"/>
+      <w:r>
+        <w:t>is developed</w:t>
+      </w:r>
+      <w:proofErr w:type="gramEnd"/>
+      <w:r>
+        <w:t xml:space="preserve"> in broad or platform-general contexts rather than in specific practical domains such as finance, where both sentiment and timing may be especially important.</w:t>
       </w:r>
       <w:r>
         <w:t xml:space="preserve"> </w:t>
@@ -117,11 +171,9 @@
       <w:pPr>
         <w:pStyle w:val="Heading2"/>
       </w:pPr>
-      <w:ins w:id="1" w:author="Hieu Nguyen" w:date="2026-05-22T20:01:00Z" w16du:dateUtc="2026-05-22T13:01:00Z">
-        <w:r>
-          <w:t xml:space="preserve">2. </w:t>
-        </w:r>
-      </w:ins>
+      <w:r>
+        <w:t xml:space="preserve">2. </w:t>
+      </w:r>
       <w:r>
         <w:t>The F</w:t>
       </w:r>
@@ -146,7 +198,15 @@
         <w:t xml:space="preserve"> </w:t>
       </w:r>
       <w:r>
-        <w:t xml:space="preserve">Although early popularity prediction is not identical to trend emergence detection, it provides a useful starting point for understanding how early-stage online activity can be analysed to anticipate later growth. In this sense, foundation studies in popularity prediction support the broader argument that early trend prediction is possible. </w:t>
+        <w:t xml:space="preserve">Although early popularity prediction is not identical to trend emergence detection, it provides a useful starting point for understanding how early-stage online activity can </w:t>
+      </w:r>
+      <w:proofErr w:type="gramStart"/>
+      <w:r>
+        <w:t>be analysed</w:t>
+      </w:r>
+      <w:proofErr w:type="gramEnd"/>
+      <w:r>
+        <w:t xml:space="preserve"> to anticipate later growth. In this sense, foundation studies in popularity prediction support the broader argument that early trend prediction is possible. </w:t>
       </w:r>
     </w:p>
     <w:p>
@@ -173,7 +233,23 @@
         <w:t xml:space="preserve">between early and later </w:t>
       </w:r>
       <w:r>
-        <w:t>attention levels across platforms such as YouTube and Digg, suggesting that online popularity growth is not entirely random. This was an important contribution because it showed that relatively simple and interpretable measures, such as early views or interactions, could provide meaningful predictive value without requiring highly complex modelling techniques.</w:t>
+        <w:t xml:space="preserve">attention levels across platforms such as YouTube and Digg, suggesting that online popularity growth is not entirely random. This was an important contribution because it showed that </w:t>
+      </w:r>
+      <w:proofErr w:type="gramStart"/>
+      <w:r>
+        <w:t>relatively simple</w:t>
+      </w:r>
+      <w:proofErr w:type="gramEnd"/>
+      <w:r>
+        <w:t xml:space="preserve"> and interpretable measures, such as early views or interactions, could provide meaningful predictive value without requiring </w:t>
+      </w:r>
+      <w:proofErr w:type="gramStart"/>
+      <w:r>
+        <w:t>highly complex</w:t>
+      </w:r>
+      <w:proofErr w:type="gramEnd"/>
+      <w:r>
+        <w:t xml:space="preserve"> modelling techniques.</w:t>
       </w:r>
       <w:r>
         <w:t xml:space="preserve"> </w:t>
@@ -206,7 +282,15 @@
         <w:t>Lerman (2010)</w:t>
       </w:r>
       <w:r>
-        <w:t xml:space="preserve"> expanded the discussion by examining how users discover, share, and engage with content within online communities. This work suggested that popularity is shaped not only by </w:t>
+        <w:t xml:space="preserve"> expanded the discussion by examining how users discover, share, and engage with content within online communities. This work suggested that popularity </w:t>
+      </w:r>
+      <w:proofErr w:type="gramStart"/>
+      <w:r>
+        <w:t>is shaped</w:t>
+      </w:r>
+      <w:proofErr w:type="gramEnd"/>
+      <w:r>
+        <w:t xml:space="preserve"> not only by </w:t>
       </w:r>
       <w:r>
         <w:rPr>
@@ -215,13 +299,29 @@
         <w:t>the passage of time</w:t>
       </w:r>
       <w:r>
-        <w:t xml:space="preserve"> or by raw activity counts, but also by the ways in which users interact collectively. Such insights are particularly relevant to trend emergence research, where engagement behaviour often reflects whether a topic is beginning to attract wider attention. These studies therefore helped establish engagement-based indicators as an important component of later predictive models.</w:t>
+        <w:t xml:space="preserve"> or by raw activity counts, but also by the ways in which users interact collectively. Such insights are particularly relevant to trend emergence research, where engagement behaviour often reflects whether a topic is beginning to attract wider attention. These studies therefore helped establish engagement-based indicators as </w:t>
+      </w:r>
+      <w:proofErr w:type="gramStart"/>
+      <w:r>
+        <w:t>an important component</w:t>
+      </w:r>
+      <w:proofErr w:type="gramEnd"/>
+      <w:r>
+        <w:t xml:space="preserve"> of later predictive models.</w:t>
       </w:r>
     </w:p>
     <w:p>
       <w:r>
         <w:lastRenderedPageBreak/>
-        <w:t>Taken together, these foundational studies made two major contributions. First, they demonstrated that early online behaviour could contain measurable predictive signals. Second, they provided the methodological basis for later research by showing that social media growth patterns could be studied systematically rather than treated as entirely unpredictable phenomena. In this way, early popularity prediction research marked an important shift from descriptive observation toward predictive modelling.</w:t>
+        <w:t xml:space="preserve">Taken together, these foundational studies made two major contributions. First, they demonstrated that early online behaviour could contain measurable predictive signals. Second, they provided the methodological basis for later research by showing that social media growth patterns could </w:t>
+      </w:r>
+      <w:proofErr w:type="gramStart"/>
+      <w:r>
+        <w:t>be studied</w:t>
+      </w:r>
+      <w:proofErr w:type="gramEnd"/>
+      <w:r>
+        <w:t xml:space="preserve"> systematically rather than treated as entirely unpredictable phenomena. In this way, early popularity prediction research marked an important shift from descriptive observation toward predictive modelling.</w:t>
       </w:r>
     </w:p>
     <w:p>
@@ -295,7 +395,23 @@
         <w:t xml:space="preserve">. </w:t>
       </w:r>
       <w:r>
-        <w:t xml:space="preserve">There are related but distinct problems: predicting whether content will become large-scale popular is not the same as identifying, whether a meaningful trend is beginning to form. In addition, these studies relied mainly on </w:t>
+        <w:t xml:space="preserve">There are related but distinct problems: predicting whether content will become large-scale popular is </w:t>
+      </w:r>
+      <w:proofErr w:type="gramStart"/>
+      <w:r>
+        <w:t>not the same as</w:t>
+      </w:r>
+      <w:proofErr w:type="gramEnd"/>
+      <w:r>
+        <w:t xml:space="preserve"> identifying, whether a meaningful trend is beginning to form. In addition, these studies relied </w:t>
+      </w:r>
+      <w:proofErr w:type="gramStart"/>
+      <w:r>
+        <w:t>mainly on</w:t>
+      </w:r>
+      <w:proofErr w:type="gramEnd"/>
+      <w:r>
+        <w:t xml:space="preserve"> </w:t>
       </w:r>
       <w:r>
         <w:rPr>
@@ -326,7 +442,15 @@
         <w:t>finance</w:t>
       </w:r>
       <w:r>
-        <w:t xml:space="preserve">, where timing, public reaction, and emotional tone may all contribute to whether online discussion becomes practically significant. Foundational studies therefore support the feasibility of early prediction, but they do not fully address the challenges of </w:t>
+        <w:t xml:space="preserve">, where timing, public reaction, and emotional tone may all contribute to whether online discussion becomes </w:t>
+      </w:r>
+      <w:proofErr w:type="gramStart"/>
+      <w:r>
+        <w:t>practically significant</w:t>
+      </w:r>
+      <w:proofErr w:type="gramEnd"/>
+      <w:r>
+        <w:t xml:space="preserve">. Foundational studies therefore support the feasibility of early prediction, but they do not fully address the challenges of </w:t>
       </w:r>
       <w:r>
         <w:rPr>
@@ -420,19 +544,48 @@
       <w:r>
         <w:t xml:space="preserve"> marked an important methodological shift. </w:t>
       </w:r>
-      <w:proofErr w:type="spellStart"/>
-      <w:r>
-        <w:t>Earkyer</w:t>
-      </w:r>
-      <w:proofErr w:type="spellEnd"/>
-      <w:r>
-        <w:t xml:space="preserve"> studies had shown that early attention levels could help forecast later popularity, but newer work suggest that prediction could be improved by analysing not only how users interact with content, but also the characteristics of the content itself.  This development was significant because both popularity and trend emergence are shaped by multiple influences, including temporal </w:t>
-      </w:r>
-      <w:proofErr w:type="spellStart"/>
-      <w:r>
-        <w:t>behavior</w:t>
-      </w:r>
-      <w:proofErr w:type="spellEnd"/>
+      <w:r>
+        <w:t>Earlier</w:t>
+      </w:r>
+      <w:r>
+        <w:t xml:space="preserve"> </w:t>
+      </w:r>
+      <w:r>
+        <w:t xml:space="preserve">studies had shown that </w:t>
+      </w:r>
+      <w:r>
+        <w:t>initial attention</w:t>
+      </w:r>
+      <w:r>
+        <w:t xml:space="preserve"> levels could help forecast later popularity, but newer work suggest that prediction could </w:t>
+      </w:r>
+      <w:proofErr w:type="gramStart"/>
+      <w:r>
+        <w:t>be improved</w:t>
+      </w:r>
+      <w:proofErr w:type="gramEnd"/>
+      <w:r>
+        <w:t xml:space="preserve"> by analysing not only how users interact with content, but also the characteristics of the content itself</w:t>
+      </w:r>
+      <w:proofErr w:type="gramStart"/>
+      <w:r>
+        <w:t xml:space="preserve">.  </w:t>
+      </w:r>
+      <w:proofErr w:type="gramEnd"/>
+      <w:r>
+        <w:t xml:space="preserve">This development was significant because both popularity and trend emergence </w:t>
+      </w:r>
+      <w:proofErr w:type="gramStart"/>
+      <w:r>
+        <w:t>are shaped</w:t>
+      </w:r>
+      <w:proofErr w:type="gramEnd"/>
+      <w:r>
+        <w:t xml:space="preserve"> by multiple influences, including temporal </w:t>
+      </w:r>
+      <w:r>
+        <w:t>behaviour</w:t>
+      </w:r>
       <w:r>
         <w:t>, source attributes, linguistic form, and audience response, rather than by any single factor alone.</w:t>
       </w:r>
@@ -441,7 +594,6 @@
       <w:r>
         <w:t xml:space="preserve">A central theme in this stage of the literature is the rise of feature engineering. Instead of relying solely on early counts of views, shares, or interactions, researchers began constructing models that used structured information such as headline form, publication source, topic category, and textual characteristics. </w:t>
       </w:r>
-      <w:proofErr w:type="gramStart"/>
       <w:r>
         <w:rPr>
           <w:b/>
@@ -450,10 +602,6 @@
         <w:t>Bandari et al. (2012)</w:t>
       </w:r>
       <w:r>
-        <w:t>,</w:t>
-      </w:r>
-      <w:proofErr w:type="gramEnd"/>
-      <w:r>
         <w:t xml:space="preserve"> is </w:t>
       </w:r>
       <w:r>
@@ -464,32 +612,71 @@
         <w:t xml:space="preserve">. </w:t>
       </w:r>
       <w:r>
-        <w:t xml:space="preserve">Their study examined whether the popularity of news stories on social media could be predicted before substantial user engagement had occurred, using machine learning models trained on content and metadata features. This was an important step because it showed that predictive signals may exist not only in early interaction data, but also in the properties of the content before strong diffusion begins. This shift broadened the understanding of what might drive online attention. It suggested that user behaviour </w:t>
-      </w:r>
-      <w:proofErr w:type="spellStart"/>
-      <w:r>
-        <w:t>ispartly</w:t>
-      </w:r>
-      <w:proofErr w:type="spellEnd"/>
-      <w:r>
-        <w:t xml:space="preserve"> shaped by how information is presented, where it originates, and how it is framed linguistically</w:t>
-      </w:r>
-      <w:r>
-        <w:t>. In methodological terms, this represented a move from relatively simple correlation-</w:t>
-      </w:r>
-      <w:proofErr w:type="spellStart"/>
-      <w:r>
-        <w:t>baased</w:t>
-      </w:r>
-      <w:proofErr w:type="spellEnd"/>
+        <w:t xml:space="preserve">Their study examined whether the popularity of news stories on social media could </w:t>
+      </w:r>
+      <w:proofErr w:type="gramStart"/>
+      <w:r>
+        <w:t>be predicted</w:t>
+      </w:r>
+      <w:proofErr w:type="gramEnd"/>
+      <w:r>
+        <w:t xml:space="preserve"> before substantial user engagement had occurred, using machine learning models trained on content and metadata features. This was </w:t>
+      </w:r>
+      <w:proofErr w:type="gramStart"/>
+      <w:r>
+        <w:t>an important step</w:t>
+      </w:r>
+      <w:proofErr w:type="gramEnd"/>
+      <w:r>
+        <w:t xml:space="preserve"> because it showed that predictive signals may exist not only in early interaction data, but also in the properties of the content before strong diffusion begins. This shift broadened the understanding of what might drive online attention. It suggested that user behaviour </w:t>
+      </w:r>
+      <w:proofErr w:type="gramStart"/>
+      <w:r>
+        <w:t>is partly</w:t>
+      </w:r>
+      <w:r>
+        <w:t xml:space="preserve"> shaped</w:t>
+      </w:r>
+      <w:proofErr w:type="gramEnd"/>
+      <w:r>
+        <w:t xml:space="preserve"> by how information </w:t>
+      </w:r>
+      <w:proofErr w:type="gramStart"/>
+      <w:r>
+        <w:t>is presented</w:t>
+      </w:r>
+      <w:proofErr w:type="gramEnd"/>
+      <w:r>
+        <w:t xml:space="preserve">, where it originates, and how it </w:t>
+      </w:r>
+      <w:proofErr w:type="gramStart"/>
+      <w:r>
+        <w:t>is framed</w:t>
+      </w:r>
+      <w:proofErr w:type="gramEnd"/>
+      <w:r>
+        <w:t xml:space="preserve"> linguistically</w:t>
+      </w:r>
+      <w:r>
+        <w:t xml:space="preserve">. In methodological terms, this represented a move from </w:t>
+      </w:r>
+      <w:proofErr w:type="gramStart"/>
+      <w:r>
+        <w:t>relatively simple</w:t>
+      </w:r>
+      <w:proofErr w:type="gramEnd"/>
+      <w:r>
+        <w:t xml:space="preserve"> correlation-</w:t>
+      </w:r>
+      <w:r>
+        <w:t>based</w:t>
+      </w:r>
       <w:r>
         <w:t xml:space="preserve"> forecasting toward more flexible predictive </w:t>
       </w:r>
-      <w:proofErr w:type="spellStart"/>
-      <w:r>
-        <w:t>piplines</w:t>
-      </w:r>
-      <w:proofErr w:type="spellEnd"/>
+      <w:r>
+        <w:t>pipelines</w:t>
+      </w:r>
       <w:r>
         <w:t xml:space="preserve"> built around classification, feature extraction, and model training. It also opened the way for later work to consider richer textual and semantic information as part of social media prediction.</w:t>
       </w:r>
@@ -507,8 +694,13 @@
       <w:r>
         <w:t xml:space="preserve">retained </w:t>
       </w:r>
-      <w:r>
-        <w:t xml:space="preserve">several limitations. </w:t>
+      <w:proofErr w:type="gramStart"/>
+      <w:r>
+        <w:t>several</w:t>
+      </w:r>
+      <w:proofErr w:type="gramEnd"/>
+      <w:r>
+        <w:t xml:space="preserve"> limitations. </w:t>
       </w:r>
       <w:r>
         <w:t>Although</w:t>
@@ -525,32 +717,31 @@
       <w:r>
         <w:t xml:space="preserve">se are related </w:t>
       </w:r>
-      <w:proofErr w:type="spellStart"/>
-      <w:r>
-        <w:t>bu</w:t>
-      </w:r>
-      <w:proofErr w:type="spellEnd"/>
+      <w:r>
+        <w:t>but</w:t>
+      </w:r>
       <w:r>
         <w:t xml:space="preserve"> distinct </w:t>
       </w:r>
+      <w:r>
+        <w:t>tasks.</w:t>
+      </w:r>
+      <w:r>
+        <w:t xml:space="preserve"> Apiece of content may achieve moderate </w:t>
+      </w:r>
+      <w:r>
+        <w:t>unpopularity</w:t>
+      </w:r>
+      <w:r>
+        <w:t xml:space="preserve"> without signalling a broader emerging trend, while </w:t>
+      </w:r>
       <w:proofErr w:type="gramStart"/>
       <w:r>
-        <w:t>tasks.</w:t>
-      </w:r>
-      <w:r>
-        <w:t>.</w:t>
+        <w:t>some</w:t>
       </w:r>
       <w:proofErr w:type="gramEnd"/>
       <w:r>
-        <w:t xml:space="preserve"> Apiece of content may achieve moderate </w:t>
-      </w:r>
-      <w:proofErr w:type="spellStart"/>
-      <w:r>
-        <w:t>upopularity</w:t>
-      </w:r>
-      <w:proofErr w:type="spellEnd"/>
-      <w:r>
-        <w:t xml:space="preserve"> without signalling a broader emerging trend, while some important trends are characterised more by rapid acceleration, engagement patterns, and spreading discussion than by final popularity alone.</w:t>
+        <w:t xml:space="preserve"> important trends are characterised more by rapid acceleration, engagement patterns, and spreading discussion than by final popularity alone.</w:t>
       </w:r>
       <w:r>
         <w:t xml:space="preserve"> </w:t>
@@ -562,7 +753,15 @@
         <w:t xml:space="preserve">, </w:t>
       </w:r>
       <w:r>
-        <w:t>early machine learning approaches often relied on manually engineered features and relatively simple models, limiting their ability to capture more complex temporal relationships, evolving engagement behaviour, or deeper contextual meaning.</w:t>
+        <w:t xml:space="preserve">early machine learning approaches often relied on manually engineered features and </w:t>
+      </w:r>
+      <w:proofErr w:type="gramStart"/>
+      <w:r>
+        <w:t>relatively simple</w:t>
+      </w:r>
+      <w:proofErr w:type="gramEnd"/>
+      <w:r>
+        <w:t xml:space="preserve"> models, limiting their ability to capture more complex temporal relationships, evolving engagement behaviour, or deeper contextual meaning.</w:t>
       </w:r>
     </w:p>
     <w:p>
@@ -572,13 +771,19 @@
       <w:r>
         <w:t xml:space="preserve">content-based prediction did not necessarily amount to full sentiment-aware or domain-aware </w:t>
       </w:r>
-      <w:proofErr w:type="spellStart"/>
-      <w:r>
-        <w:t>modeeling</w:t>
-      </w:r>
-      <w:proofErr w:type="spellEnd"/>
-      <w:r>
-        <w:t>. While textual and metadata features improved predictive flexibility, they did not always capture emotional tone or practical significance in specific settings. This is particularly important in the finance domain, where the meaning and sentiment of online discussion may strongly influence whether a topic develops into a meaningful trend.  As a result, machine learning and content-based prediction represented an important advance beyond early popularity studies, but they still left clear gaps in early-stage detection, multi-feature integration, and practical domain-focused application.</w:t>
+      <w:r>
+        <w:t>modelling</w:t>
+      </w:r>
+      <w:r>
+        <w:t>. While textual and metadata features improved predictive flexibility, they did not always capture emotional tone or practical significance in specific settings. This is particularly important in the finance domain, where the meaning and sentiment of online discussion may strongly influence whether a topic develops into a meaningful trend</w:t>
+      </w:r>
+      <w:proofErr w:type="gramStart"/>
+      <w:r>
+        <w:t xml:space="preserve">.  </w:t>
+      </w:r>
+      <w:proofErr w:type="gramEnd"/>
+      <w:r>
+        <w:t>As a result, machine learning and content-based prediction represented an important advance beyond early popularity studies, but they still left clear gaps in early-stage detection, multi-feature integration, and practical domain-focused application.</w:t>
       </w:r>
     </w:p>
     <w:p>
@@ -598,14 +803,6 @@
         <w:rPr>
           <w:lang w:val="en-US"/>
         </w:rPr>
-        <w:pPrChange w:id="2" w:author="Hieu Nguyen" w:date="2026-05-22T19:52:00Z" w16du:dateUtc="2026-05-22T12:52:00Z">
-          <w:pPr>
-            <w:tabs>
-              <w:tab w:val="left" w:pos="7128"/>
-              <w:tab w:val="right" w:pos="9026"/>
-            </w:tabs>
-          </w:pPr>
-        </w:pPrChange>
       </w:pPr>
       <w:r>
         <w:rPr>
@@ -629,41 +826,207 @@
         <w:rPr>
           <w:lang w:val="en-US"/>
         </w:rPr>
-        <w:t xml:space="preserve">As social media platforms evolved into major spaces for public discussion and opinion sharing, researchers began exploring whether the emotional and linguistic content of online posts could provide predictive information about real-world events and collective behaviour. This led to the growing use of natural language processing (NLP) and sentiment analysis within predictive modelling research. Unlike earlier popularity prediction approaches that focused mainly on engagement counts or temporal growth patterns, sentiment-based approaches attempt to </w:t>
-      </w:r>
-      <w:proofErr w:type="spellStart"/>
-      <w:r>
-        <w:rPr>
-          <w:lang w:val="en-US"/>
-        </w:rPr>
-        <w:t>analyse</w:t>
-      </w:r>
-      <w:proofErr w:type="spellEnd"/>
-      <w:r>
-        <w:rPr>
-          <w:lang w:val="en-US"/>
-        </w:rPr>
-        <w:t xml:space="preserve"> the meaning, tone, and emotional characteristics of user-generated content.</w:t>
-      </w:r>
-    </w:p>
-    <w:p>
-      <w:pPr>
-        <w:tabs>
-          <w:tab w:val="left" w:pos="7128"/>
-          <w:tab w:val="right" w:pos="9026"/>
-        </w:tabs>
-        <w:rPr>
-          <w:lang w:val="en-US"/>
-        </w:rPr>
-      </w:pPr>
-      <w:r>
-        <w:rPr>
-          <w:lang w:val="en-US"/>
-        </w:rPr>
-        <w:t xml:space="preserve">One of the most influential studies in this area is Bollen et al. (2011), </w:t>
-      </w:r>
-      <w:r>
-        <w:rPr>
+        <w:t xml:space="preserve">As social media platforms </w:t>
+      </w:r>
+      <w:r>
+        <w:rPr>
+          <w:lang w:val="en-US"/>
+        </w:rPr>
+        <w:t>d</w:t>
+      </w:r>
+      <w:r>
+        <w:rPr>
+          <w:lang w:val="en-US"/>
+        </w:rPr>
+        <w:t>ev</w:t>
+      </w:r>
+      <w:r>
+        <w:rPr>
+          <w:lang w:val="en-US"/>
+        </w:rPr>
+        <w:t>elop</w:t>
+      </w:r>
+      <w:r>
+        <w:rPr>
+          <w:lang w:val="en-US"/>
+        </w:rPr>
+        <w:t xml:space="preserve">ed into major spaces for public discussion and opinion </w:t>
+      </w:r>
+      <w:r>
+        <w:rPr>
+          <w:lang w:val="en-US"/>
+        </w:rPr>
+        <w:t>expression</w:t>
+      </w:r>
+      <w:r>
+        <w:rPr>
+          <w:lang w:val="en-US"/>
+        </w:rPr>
+        <w:t xml:space="preserve">, researchers </w:t>
+      </w:r>
+      <w:r>
+        <w:rPr>
+          <w:lang w:val="en-US"/>
+        </w:rPr>
+        <w:t xml:space="preserve">increasingly </w:t>
+      </w:r>
+      <w:r>
+        <w:rPr>
+          <w:lang w:val="en-US"/>
+        </w:rPr>
+        <w:t>explor</w:t>
+      </w:r>
+      <w:r>
+        <w:rPr>
+          <w:lang w:val="en-US"/>
+        </w:rPr>
+        <w:t>ed</w:t>
+      </w:r>
+      <w:r>
+        <w:rPr>
+          <w:lang w:val="en-US"/>
+        </w:rPr>
+        <w:t xml:space="preserve"> whether the </w:t>
+      </w:r>
+      <w:r>
+        <w:rPr>
+          <w:lang w:val="en-US"/>
+        </w:rPr>
+        <w:t xml:space="preserve">linguistic </w:t>
+      </w:r>
+      <w:r>
+        <w:rPr>
+          <w:lang w:val="en-US"/>
+        </w:rPr>
+        <w:t xml:space="preserve">and </w:t>
+      </w:r>
+      <w:r>
+        <w:rPr>
+          <w:lang w:val="en-US"/>
+        </w:rPr>
+        <w:t>emotional content of posts could provide predictive information about collective behaviour</w:t>
+      </w:r>
+      <w:r>
+        <w:rPr>
+          <w:lang w:val="en-US"/>
+        </w:rPr>
+        <w:t xml:space="preserve"> and </w:t>
+      </w:r>
+      <w:r>
+        <w:rPr>
+          <w:lang w:val="en-US"/>
+        </w:rPr>
+        <w:t>real-world events</w:t>
+      </w:r>
+      <w:r>
+        <w:rPr>
+          <w:lang w:val="en-US"/>
+        </w:rPr>
+        <w:t xml:space="preserve">. </w:t>
+      </w:r>
+      <w:r>
+        <w:rPr>
+          <w:b/>
+          <w:bCs/>
+          <w:lang w:val="en-US"/>
+        </w:rPr>
+        <w:t xml:space="preserve">This led to the growing use of natural language processing (NLP) and sentiment analysis </w:t>
+      </w:r>
+      <w:r>
+        <w:rPr>
+          <w:lang w:val="en-US"/>
+        </w:rPr>
+        <w:t>in</w:t>
+      </w:r>
+      <w:r>
+        <w:rPr>
+          <w:lang w:val="en-US"/>
+        </w:rPr>
+        <w:t xml:space="preserve"> </w:t>
+      </w:r>
+      <w:r>
+        <w:rPr>
+          <w:lang w:val="en-US"/>
+        </w:rPr>
+        <w:t xml:space="preserve">predictive modelling research. Unlike earlier approaches that </w:t>
+      </w:r>
+      <w:r>
+        <w:rPr>
+          <w:lang w:val="en-US"/>
+        </w:rPr>
+        <w:t xml:space="preserve">relied </w:t>
+      </w:r>
+      <w:r>
+        <w:rPr>
+          <w:lang w:val="en-US"/>
+        </w:rPr>
+        <w:t xml:space="preserve">mainly on engagement counts or temporal growth patterns, sentiment-based approaches </w:t>
+      </w:r>
+      <w:r>
+        <w:rPr>
+          <w:lang w:val="en-US"/>
+        </w:rPr>
+        <w:t xml:space="preserve">aim </w:t>
+      </w:r>
+      <w:r>
+        <w:rPr>
+          <w:lang w:val="en-US"/>
+        </w:rPr>
+        <w:t xml:space="preserve">to </w:t>
+      </w:r>
+      <w:r>
+        <w:rPr>
+          <w:lang w:val="en-US"/>
+        </w:rPr>
+        <w:t xml:space="preserve">capture </w:t>
+      </w:r>
+      <w:r>
+        <w:rPr>
+          <w:lang w:val="en-US"/>
+        </w:rPr>
+        <w:t xml:space="preserve">the meaning, tone, and emotional </w:t>
+      </w:r>
+      <w:r>
+        <w:rPr>
+          <w:lang w:val="en-US"/>
+        </w:rPr>
+        <w:t xml:space="preserve">dynamics </w:t>
+      </w:r>
+      <w:r>
+        <w:rPr>
+          <w:lang w:val="en-US"/>
+        </w:rPr>
+        <w:t>of user-generated content.</w:t>
+      </w:r>
+    </w:p>
+    <w:p>
+      <w:pPr>
+        <w:tabs>
+          <w:tab w:val="left" w:pos="7128"/>
+          <w:tab w:val="right" w:pos="9026"/>
+        </w:tabs>
+        <w:rPr>
+          <w:lang w:val="en-US"/>
+        </w:rPr>
+      </w:pPr>
+      <w:r>
+        <w:rPr>
+          <w:lang w:val="en-US"/>
+        </w:rPr>
+        <w:t xml:space="preserve">One of the most influential studies in this area is </w:t>
+      </w:r>
+      <w:r>
+        <w:rPr>
+          <w:b/>
+          <w:bCs/>
+          <w:lang w:val="en-US"/>
+        </w:rPr>
+        <w:t xml:space="preserve">Bollen et al. (2011), </w:t>
+      </w:r>
+      <w:r>
+        <w:rPr>
+          <w:b/>
+          <w:bCs/>
           <w:i/>
           <w:iCs/>
           <w:lang w:val="en-US"/>
@@ -674,24 +1037,116 @@
         <w:rPr>
           <w:lang w:val="en-US"/>
         </w:rPr>
-        <w:t>. The study investigated whether collective mood states extracted from Twitter posts could predict movements in the Dow Jones Industrial Average (DJIA). Using sentiment analysis techniques, the authors measured emotional dimensions from large volumes of tweets and examined whether changes in public mood correlated with later stock market behaviour. Their findings suggested that certain mood indicators, particularly calmness-related measures, showed predictive relationships with market changes several days in advance.</w:t>
-      </w:r>
-    </w:p>
-    <w:p>
-      <w:pPr>
-        <w:tabs>
-          <w:tab w:val="left" w:pos="7128"/>
-          <w:tab w:val="right" w:pos="9026"/>
-        </w:tabs>
-        <w:rPr>
-          <w:lang w:val="en-US"/>
-        </w:rPr>
-      </w:pPr>
-      <w:r>
-        <w:rPr>
-          <w:lang w:val="en-US"/>
-        </w:rPr>
-        <w:t xml:space="preserve">This study is significant because it demonstrated that social media content may contain useful </w:t>
+        <w:t xml:space="preserve">. The study </w:t>
+      </w:r>
+      <w:r>
+        <w:rPr>
+          <w:lang w:val="en-US"/>
+        </w:rPr>
+        <w:t xml:space="preserve">examined </w:t>
+      </w:r>
+      <w:r>
+        <w:rPr>
+          <w:lang w:val="en-US"/>
+        </w:rPr>
+        <w:t xml:space="preserve">whether collective mood states extracted from Twitter posts could predict movements in the Dow Jones Industrial Average (DJIA). Using sentiment analysis techniques, the authors measured emotional dimensions from large volumes of tweets and </w:t>
+      </w:r>
+      <w:r>
+        <w:rPr>
+          <w:lang w:val="en-US"/>
+        </w:rPr>
+        <w:t xml:space="preserve">tested </w:t>
+      </w:r>
+      <w:r>
+        <w:rPr>
+          <w:lang w:val="en-US"/>
+        </w:rPr>
+        <w:t xml:space="preserve">whether changes in public mood correlated with later market behaviour. Their findings suggested that </w:t>
+      </w:r>
+      <w:r>
+        <w:rPr>
+          <w:lang w:val="en-US"/>
+        </w:rPr>
+        <w:t xml:space="preserve">some </w:t>
+      </w:r>
+      <w:proofErr w:type="gramStart"/>
+      <w:r>
+        <w:rPr>
+          <w:lang w:val="en-US"/>
+        </w:rPr>
+        <w:t xml:space="preserve">dimensions, </w:t>
+      </w:r>
+      <w:r>
+        <w:rPr>
+          <w:lang w:val="en-US"/>
+        </w:rPr>
+        <w:t xml:space="preserve"> particularly</w:t>
+      </w:r>
+      <w:proofErr w:type="gramEnd"/>
+      <w:r>
+        <w:rPr>
+          <w:lang w:val="en-US"/>
+        </w:rPr>
+        <w:t xml:space="preserve"> </w:t>
+      </w:r>
+      <w:r>
+        <w:rPr>
+          <w:lang w:val="en-US"/>
+        </w:rPr>
+        <w:t xml:space="preserve">those related to </w:t>
+      </w:r>
+      <w:r>
+        <w:rPr>
+          <w:lang w:val="en-US"/>
+        </w:rPr>
+        <w:t xml:space="preserve">calmness, showed predictive relationships with </w:t>
+      </w:r>
+      <w:r>
+        <w:rPr>
+          <w:lang w:val="en-US"/>
+        </w:rPr>
+        <w:t xml:space="preserve">stock </w:t>
+      </w:r>
+      <w:r>
+        <w:rPr>
+          <w:lang w:val="en-US"/>
+        </w:rPr>
+        <w:t>market changes several days in advance.</w:t>
+      </w:r>
+    </w:p>
+    <w:p>
+      <w:pPr>
+        <w:tabs>
+          <w:tab w:val="left" w:pos="7128"/>
+          <w:tab w:val="right" w:pos="9026"/>
+        </w:tabs>
+        <w:rPr>
+          <w:lang w:val="en-US"/>
+        </w:rPr>
+      </w:pPr>
+      <w:r>
+        <w:rPr>
+          <w:lang w:val="en-US"/>
+        </w:rPr>
+        <w:t xml:space="preserve">This study is significant because it </w:t>
+      </w:r>
+      <w:r>
+        <w:rPr>
+          <w:lang w:val="en-US"/>
+        </w:rPr>
+        <w:t xml:space="preserve">marked an important shift in </w:t>
+      </w:r>
+      <w:r>
+        <w:rPr>
+          <w:lang w:val="en-US"/>
+        </w:rPr>
+        <w:t xml:space="preserve">social media </w:t>
+      </w:r>
+      <w:r>
+        <w:rPr>
+          <w:lang w:val="en-US"/>
+        </w:rPr>
+        <w:t xml:space="preserve">prediction research from purely </w:t>
       </w:r>
       <w:proofErr w:type="spellStart"/>
       <w:r>
@@ -705,7 +1160,693 @@
         <w:rPr>
           <w:lang w:val="en-US"/>
         </w:rPr>
-        <w:t xml:space="preserve"> and emotional signals beyond simple popularity measurements. The research helped establish sentiment analysis as an important area within social media prediction and showed that online discussions can reflect broader public reactions, expectations, and collective attention patterns. In contrast to earlier popularity-focused research, Bollen et al. (2011) highlighted the potential value of </w:t>
+        <w:t xml:space="preserve"> indicators toward the analysis of textual meaning and emotional content.</w:t>
+      </w:r>
+      <w:r>
+        <w:t xml:space="preserve"> </w:t>
+      </w:r>
+      <w:r>
+        <w:rPr>
+          <w:lang w:val="en-US"/>
+        </w:rPr>
+        <w:t>Earlier work had demonstrated that early engagement activity could help forecast later popularity, but Bollen et al. showed that social media posts may also reflect broader public reactions, expectations, and collective psychological states. This expanded the scope of predictive modelling by suggesting that online discussions contain signals that are not visible through interaction counts alone.</w:t>
+      </w:r>
+    </w:p>
+    <w:p>
+      <w:pPr>
+        <w:tabs>
+          <w:tab w:val="left" w:pos="7128"/>
+          <w:tab w:val="right" w:pos="9026"/>
+        </w:tabs>
+        <w:rPr>
+          <w:ins w:id="0" w:author="Hieu Nguyen" w:date="2026-05-22T20:42:00Z" w16du:dateUtc="2026-05-22T13:42:00Z"/>
+          <w:lang w:val="en-US"/>
+        </w:rPr>
+      </w:pPr>
+      <w:ins w:id="1" w:author="Hieu Nguyen" w:date="2026-05-22T20:42:00Z" w16du:dateUtc="2026-05-22T13:42:00Z">
+        <w:r>
+          <w:rPr>
+            <w:lang w:val="en-US"/>
+          </w:rPr>
+          <w:t xml:space="preserve">A key strength of the study lies in its interdisciplinary contribution. By linking computational sentiment analysis with </w:t>
+        </w:r>
+        <w:proofErr w:type="spellStart"/>
+        <w:r>
+          <w:rPr>
+            <w:lang w:val="en-US"/>
+          </w:rPr>
+          <w:t>behavioural</w:t>
+        </w:r>
+        <w:proofErr w:type="spellEnd"/>
+        <w:r>
+          <w:rPr>
+            <w:lang w:val="en-US"/>
+          </w:rPr>
+          <w:t xml:space="preserve"> and financial interpretation, the paper demonstrated how social media data might be used to identify early changes in collective attention and mood. This is especially relevant in finance-related environments, where speculation, uncertainty, optimism, and fear can shape both online discussion and investor behaviour. In this sense, the study provides strong support for including sentiment-based features in predictive models designed for finance-related social media analysis.</w:t>
+        </w:r>
+      </w:ins>
+    </w:p>
+    <w:p>
+      <w:pPr>
+        <w:tabs>
+          <w:tab w:val="left" w:pos="7128"/>
+          <w:tab w:val="right" w:pos="9026"/>
+        </w:tabs>
+        <w:rPr>
+          <w:ins w:id="2" w:author="Hieu Nguyen" w:date="2026-05-22T20:42:00Z" w16du:dateUtc="2026-05-22T13:42:00Z"/>
+          <w:lang w:val="en-US"/>
+        </w:rPr>
+      </w:pPr>
+      <w:ins w:id="3" w:author="Hieu Nguyen" w:date="2026-05-22T20:42:00Z" w16du:dateUtc="2026-05-22T13:42:00Z">
+        <w:r>
+          <w:rPr>
+            <w:lang w:val="en-US"/>
+          </w:rPr>
+          <w:t xml:space="preserve">The paper is also important because it helped establish semantic analysis as a meaningful complement to structural and engagement-based approaches. Social media trends are not driven only by how often users interact with content, but also by what users are expressing and how intensely they express it. Sentiment analysis therefore adds an additional interpretive layer that may improve the detection of </w:t>
+        </w:r>
+        <w:r>
+          <w:rPr>
+            <w:lang w:val="en-US"/>
+          </w:rPr>
+          <w:lastRenderedPageBreak/>
+          <w:t>emerging trends, particularly when early discussions show strong emotional signals before interaction volumes become very large.</w:t>
+        </w:r>
+      </w:ins>
+    </w:p>
+    <w:p>
+      <w:pPr>
+        <w:tabs>
+          <w:tab w:val="left" w:pos="7128"/>
+          <w:tab w:val="right" w:pos="9026"/>
+        </w:tabs>
+        <w:rPr>
+          <w:ins w:id="4" w:author="Hieu Nguyen" w:date="2026-05-22T20:42:00Z" w16du:dateUtc="2026-05-22T13:42:00Z"/>
+          <w:lang w:val="en-US"/>
+        </w:rPr>
+      </w:pPr>
+      <w:ins w:id="5" w:author="Hieu Nguyen" w:date="2026-05-22T20:42:00Z" w16du:dateUtc="2026-05-22T13:42:00Z">
+        <w:r>
+          <w:rPr>
+            <w:lang w:val="en-US"/>
+          </w:rPr>
+          <w:t>However</w:t>
+        </w:r>
+        <w:proofErr w:type="gramStart"/>
+        <w:r>
+          <w:rPr>
+            <w:lang w:val="en-US"/>
+          </w:rPr>
+          <w:t>, the study</w:t>
+        </w:r>
+        <w:proofErr w:type="gramEnd"/>
+        <w:r>
+          <w:rPr>
+            <w:lang w:val="en-US"/>
+          </w:rPr>
+          <w:t xml:space="preserve"> also has important limitations. First, it is difficult to separate correlation from causation. Although the paper identified statistical relationships between Twitter mood and stock market behaviour, this does not demonstrate that social media sentiment directly causes market changes. External influences such as major news events, economic developments, or political uncertainty may affect both market activity and online sentiment at the same time. As a result, the findings should be interpreted as evidence of predictive association rather than direct causal influence.</w:t>
+        </w:r>
+      </w:ins>
+    </w:p>
+    <w:p>
+      <w:pPr>
+        <w:tabs>
+          <w:tab w:val="left" w:pos="7128"/>
+          <w:tab w:val="right" w:pos="9026"/>
+        </w:tabs>
+        <w:rPr>
+          <w:ins w:id="6" w:author="Hieu Nguyen" w:date="2026-05-22T20:42:00Z" w16du:dateUtc="2026-05-22T13:42:00Z"/>
+          <w:lang w:val="en-US"/>
+        </w:rPr>
+      </w:pPr>
+      <w:ins w:id="7" w:author="Hieu Nguyen" w:date="2026-05-22T20:42:00Z" w16du:dateUtc="2026-05-22T13:42:00Z">
+        <w:r>
+          <w:rPr>
+            <w:lang w:val="en-US"/>
+          </w:rPr>
+          <w:t xml:space="preserve">A second limitation concerns methodology. The sentiment analysis techniques used in the study were relatively simple compared with modern NLP methods. The analysis relied largely on lexicon-based sentiment measures, which can struggle with sarcasm, ambiguous phrasing, informal language, domain-specific vocabulary, and contextual meaning. These weaknesses are especially important in financial social media, where discussions often contain technical terminology, irony, and highly context-dependent interpretations. In addition, Twitter users do not necessarily represent the broader population, which creates potential sampling bias and limits </w:t>
+        </w:r>
+        <w:proofErr w:type="spellStart"/>
+        <w:r>
+          <w:rPr>
+            <w:lang w:val="en-US"/>
+          </w:rPr>
+          <w:t>generalisability</w:t>
+        </w:r>
+        <w:proofErr w:type="spellEnd"/>
+        <w:r>
+          <w:rPr>
+            <w:lang w:val="en-US"/>
+          </w:rPr>
+          <w:t>.</w:t>
+        </w:r>
+      </w:ins>
+    </w:p>
+    <w:p>
+      <w:pPr>
+        <w:tabs>
+          <w:tab w:val="left" w:pos="7128"/>
+          <w:tab w:val="right" w:pos="9026"/>
+        </w:tabs>
+        <w:rPr>
+          <w:ins w:id="8" w:author="Hieu Nguyen" w:date="2026-05-22T20:42:00Z" w16du:dateUtc="2026-05-22T13:42:00Z"/>
+          <w:lang w:val="en-US"/>
+        </w:rPr>
+      </w:pPr>
+      <w:ins w:id="9" w:author="Hieu Nguyen" w:date="2026-05-22T20:42:00Z" w16du:dateUtc="2026-05-22T13:42:00Z">
+        <w:r>
+          <w:rPr>
+            <w:lang w:val="en-US"/>
+          </w:rPr>
+          <w:t>Another important limitation is that the study does not directly address trend emergence prediction. Its primary focus was financial market forecasting rather than identifying when a topic begins to develop into a social media trend. Nevertheless, the paper remains highly relevant because it demonstrates that collective mood and textual sentiment can function as predictive signals in finance-related online environments. For the current project, this suggests that sentiment should not be treated as a standalone predictor, but rather as one valuable feature category within a broader early detection framework.</w:t>
+        </w:r>
+      </w:ins>
+    </w:p>
+    <w:p>
+      <w:pPr>
+        <w:tabs>
+          <w:tab w:val="left" w:pos="7128"/>
+          <w:tab w:val="right" w:pos="9026"/>
+        </w:tabs>
+        <w:rPr>
+          <w:del w:id="10" w:author="Hieu Nguyen" w:date="2026-05-22T20:42:00Z" w16du:dateUtc="2026-05-22T13:42:00Z"/>
+          <w:lang w:val="en-US"/>
+        </w:rPr>
+      </w:pPr>
+      <w:ins w:id="11" w:author="Hieu Nguyen" w:date="2026-05-22T20:42:00Z" w16du:dateUtc="2026-05-22T13:42:00Z">
+        <w:r>
+          <w:rPr>
+            <w:lang w:val="en-US"/>
+          </w:rPr>
+          <w:t>Overall, Bollen et al. (2011) represents an important stage in the development of social media prediction research. It expanded predictive modelling beyond temporal and engagement-based measurements by showing that emotional and semantic information may also provide useful signals. At the same time, its limitations highlight the need for more robust, context-sensitive, and integrated approaches. For this reason, sentiment analysis is best understood not as a complete solution on its own, but as an essential component of a multi-feature model for early-stage social media trend detection in the finance domain.</w:t>
+        </w:r>
+      </w:ins>
+      <w:del w:id="12" w:author="Hieu Nguyen" w:date="2026-05-22T20:42:00Z" w16du:dateUtc="2026-05-22T13:42:00Z">
+        <w:r>
+          <w:rPr>
+            <w:lang w:val="en-US"/>
+          </w:rPr>
+          <w:delText xml:space="preserve">A major strength of the study is its interdisciplinary perspective, combining computational analysis with behavioural and financial interpretation. The work showed that social media sentiment could potentially act as an early indicator of collective behavioural shifts, which is particularly relevant in finance-related environments where public attention and emotional reactions can influence discussion dynamics and investment behaviour. This idea strongly supports the inclusion of sentiment-based features within the current project, especially because </w:delText>
+        </w:r>
+        <w:r>
+          <w:rPr>
+            <w:lang w:val="en-US"/>
+          </w:rPr>
+          <w:lastRenderedPageBreak/>
+          <w:delText>financial social media discussions often involve speculation, optimism, fear, or uncertainty that may contribute to trend emergence.</w:delText>
+        </w:r>
+      </w:del>
+    </w:p>
+    <w:p>
+      <w:pPr>
+        <w:tabs>
+          <w:tab w:val="left" w:pos="7128"/>
+          <w:tab w:val="right" w:pos="9026"/>
+        </w:tabs>
+        <w:rPr>
+          <w:del w:id="13" w:author="Hieu Nguyen" w:date="2026-05-22T20:42:00Z" w16du:dateUtc="2026-05-22T13:42:00Z"/>
+          <w:lang w:val="en-US"/>
+        </w:rPr>
+      </w:pPr>
+      <w:del w:id="14" w:author="Hieu Nguyen" w:date="2026-05-22T20:42:00Z" w16du:dateUtc="2026-05-22T13:42:00Z">
+        <w:r>
+          <w:rPr>
+            <w:lang w:val="en-US"/>
+          </w:rPr>
+          <w:delText>Another important contribution of the paper is that it expanded the scope of predictive modelling from purely structural or engagement-based analysis toward semantic understanding of user-generated content. This development is important because social media trends are not driven only by interaction volume, but also by the meaning and emotional intensity of discussions. As a result, sentiment analysis provides an additional layer of information that may improve the ability to detect emerging trends during their early stages.</w:delText>
+        </w:r>
+      </w:del>
+    </w:p>
+    <w:p>
+      <w:pPr>
+        <w:tabs>
+          <w:tab w:val="left" w:pos="7128"/>
+          <w:tab w:val="right" w:pos="9026"/>
+        </w:tabs>
+        <w:rPr>
+          <w:del w:id="15" w:author="Hieu Nguyen" w:date="2026-05-22T20:42:00Z" w16du:dateUtc="2026-05-22T13:42:00Z"/>
+          <w:lang w:val="en-US"/>
+        </w:rPr>
+      </w:pPr>
+      <w:del w:id="16" w:author="Hieu Nguyen" w:date="2026-05-22T20:42:00Z" w16du:dateUtc="2026-05-22T13:42:00Z">
+        <w:r>
+          <w:rPr>
+            <w:lang w:val="en-US"/>
+          </w:rPr>
+          <w:delText>Despite its influence, the study also has several limitations. One important concern is the difficulty of distinguishing correlation from causation. Although the paper identified statistical relationships between Twitter mood and stock market behaviour, this does not necessarily prove that social media sentiment directly causes market changes. External factors such as news events, economic conditions, or political developments may influence both social media discussions and financial markets simultaneously. This makes interpretation more complex and highlights the challenges of drawing strong causal conclusions from observational social media data.</w:delText>
+        </w:r>
+      </w:del>
+    </w:p>
+    <w:p>
+      <w:pPr>
+        <w:tabs>
+          <w:tab w:val="left" w:pos="7128"/>
+          <w:tab w:val="right" w:pos="9026"/>
+        </w:tabs>
+        <w:rPr>
+          <w:del w:id="17" w:author="Hieu Nguyen" w:date="2026-05-22T20:42:00Z" w16du:dateUtc="2026-05-22T13:42:00Z"/>
+          <w:lang w:val="en-US"/>
+        </w:rPr>
+      </w:pPr>
+      <w:del w:id="18" w:author="Hieu Nguyen" w:date="2026-05-22T20:42:00Z" w16du:dateUtc="2026-05-22T13:42:00Z">
+        <w:r>
+          <w:rPr>
+            <w:lang w:val="en-US"/>
+          </w:rPr>
+          <w:delText>Another limitation is that the sentiment analysis techniques used in the study were relatively simple compared to modern NLP approaches. The work relied largely on lexicon-based sentiment measurements, which may struggle to capture sarcasm, financial terminology, contextual meaning, or complex emotional expression commonly found in social media discussions. In addition, Twitter users do not necessarily represent the broader population, creating potential sampling bias that may affect generalisability.</w:delText>
+        </w:r>
+      </w:del>
+    </w:p>
+    <w:p>
+      <w:pPr>
+        <w:tabs>
+          <w:tab w:val="left" w:pos="7128"/>
+          <w:tab w:val="right" w:pos="9026"/>
+        </w:tabs>
+        <w:rPr>
+          <w:del w:id="19" w:author="Hieu Nguyen" w:date="2026-05-22T20:42:00Z" w16du:dateUtc="2026-05-22T13:42:00Z"/>
+          <w:lang w:val="en-US"/>
+        </w:rPr>
+      </w:pPr>
+      <w:del w:id="20" w:author="Hieu Nguyen" w:date="2026-05-22T20:42:00Z" w16du:dateUtc="2026-05-22T13:42:00Z">
+        <w:r>
+          <w:rPr>
+            <w:lang w:val="en-US"/>
+          </w:rPr>
+          <w:delText>The study is also not directly focused on trend emergence prediction. Its primary objective was market prediction rather than detecting the formation and spread of social media trends. Nevertheless, the research remains highly relevant because it demonstrates that textual sentiment and collective mood can provide predictive signals within finance-related social media environments. For the current project, this supports the use of sentiment-based features as one component within a broader predictive modelling framework rather than as a standalone predictor.</w:delText>
+        </w:r>
+      </w:del>
+    </w:p>
+    <w:p>
+      <w:pPr>
+        <w:tabs>
+          <w:tab w:val="left" w:pos="7128"/>
+          <w:tab w:val="right" w:pos="9026"/>
+        </w:tabs>
+        <w:rPr>
+          <w:lang w:val="en-US"/>
+        </w:rPr>
+      </w:pPr>
+      <w:del w:id="21" w:author="Hieu Nguyen" w:date="2026-05-22T20:42:00Z" w16du:dateUtc="2026-05-22T13:42:00Z">
+        <w:r>
+          <w:rPr>
+            <w:lang w:val="en-US"/>
+          </w:rPr>
+          <w:delText xml:space="preserve">Overall, Bollen et al. (2011) represents an important step in the evolution of predictive modelling research by introducing NLP and sentiment analysis into social media forecasting. The study expanded predictive approaches beyond temporal popularity and engagement measurements, showing that emotional and semantic information may also contribute valuable predictive insights. This development helped motivate later research that integrates textual analysis, sentiment features, and machine learning </w:delText>
+        </w:r>
+        <w:r>
+          <w:rPr>
+            <w:lang w:val="en-US"/>
+          </w:rPr>
+          <w:lastRenderedPageBreak/>
+          <w:delText>techniques to better understand how discussions evolve and how emerging trends can be identified from large-scale social media activity.</w:delText>
+        </w:r>
+      </w:del>
+    </w:p>
+    <w:p>
+      <w:pPr>
+        <w:pStyle w:val="Heading2"/>
+        <w:rPr>
+          <w:lang w:val="en-US"/>
+        </w:rPr>
+      </w:pPr>
+      <w:r>
+        <w:rPr>
+          <w:lang w:val="en-US"/>
+        </w:rPr>
+        <w:t>5. Information Diffusion and Cascade Prediction</w:t>
+      </w:r>
+    </w:p>
+    <w:p>
+      <w:pPr>
+        <w:tabs>
+          <w:tab w:val="left" w:pos="7128"/>
+          <w:tab w:val="right" w:pos="9026"/>
+        </w:tabs>
+        <w:rPr>
+          <w:ins w:id="22" w:author="Hieu Nguyen" w:date="2026-05-22T20:45:00Z" w16du:dateUtc="2026-05-22T13:45:00Z"/>
+          <w:lang w:val="en-US"/>
+        </w:rPr>
+      </w:pPr>
+      <w:ins w:id="23" w:author="Hieu Nguyen" w:date="2026-05-22T20:45:00Z" w16du:dateUtc="2026-05-22T13:45:00Z">
+        <w:r>
+          <w:rPr>
+            <w:lang w:val="en-US"/>
+          </w:rPr>
+          <w:t xml:space="preserve">As social media research developed, scholars increasingly </w:t>
+        </w:r>
+        <w:proofErr w:type="spellStart"/>
+        <w:r>
+          <w:rPr>
+            <w:lang w:val="en-US"/>
+          </w:rPr>
+          <w:t>recognised</w:t>
+        </w:r>
+        <w:proofErr w:type="spellEnd"/>
+        <w:r>
+          <w:rPr>
+            <w:lang w:val="en-US"/>
+          </w:rPr>
+          <w:t xml:space="preserve"> that popularity and trend emergence are shaped not only by individual interactions or content characteristics, but also by the ways in which information spreads through networks of users. This led to growing interest in information diffusion and cascade prediction, which examine how posts, discussions, or topics propagate across social media platforms over time. These approaches are especially relevant to trend emergence because trends often develop through expanding patterns of sharing and participation rather than through isolated popularity events.</w:t>
+        </w:r>
+      </w:ins>
+    </w:p>
+    <w:p>
+      <w:pPr>
+        <w:tabs>
+          <w:tab w:val="left" w:pos="7128"/>
+          <w:tab w:val="right" w:pos="9026"/>
+        </w:tabs>
+        <w:rPr>
+          <w:ins w:id="24" w:author="Hieu Nguyen" w:date="2026-05-22T20:45:00Z" w16du:dateUtc="2026-05-22T13:45:00Z"/>
+          <w:lang w:val="en-US"/>
+        </w:rPr>
+      </w:pPr>
+      <w:ins w:id="25" w:author="Hieu Nguyen" w:date="2026-05-22T20:45:00Z" w16du:dateUtc="2026-05-22T13:45:00Z">
+        <w:r>
+          <w:rPr>
+            <w:lang w:val="en-US"/>
+          </w:rPr>
+          <w:t xml:space="preserve">An influential study in this area is Cheng et al. (2014), Can Cascades Be Predicted? The authors investigated whether large information cascades on Facebook could be predicted from early observations of diffusion behaviour. In this context, a cascade refers to the process by which information spreads from user to user through reposting or sharing, sometimes reaching very large audiences. By </w:t>
+        </w:r>
+        <w:proofErr w:type="spellStart"/>
+        <w:r>
+          <w:rPr>
+            <w:lang w:val="en-US"/>
+          </w:rPr>
+          <w:t>analysing</w:t>
+        </w:r>
+        <w:proofErr w:type="spellEnd"/>
+        <w:r>
+          <w:rPr>
+            <w:lang w:val="en-US"/>
+          </w:rPr>
+          <w:t xml:space="preserve"> millions of cascades, the study examined whether signals observed in the early stages of spread could predict whether a cascade would continue to grow substantially.</w:t>
+        </w:r>
+      </w:ins>
+    </w:p>
+    <w:p>
+      <w:pPr>
+        <w:tabs>
+          <w:tab w:val="left" w:pos="7128"/>
+          <w:tab w:val="right" w:pos="9026"/>
+        </w:tabs>
+        <w:rPr>
+          <w:ins w:id="26" w:author="Hieu Nguyen" w:date="2026-05-22T20:45:00Z" w16du:dateUtc="2026-05-22T13:45:00Z"/>
+          <w:lang w:val="en-US"/>
+        </w:rPr>
+      </w:pPr>
+      <w:ins w:id="27" w:author="Hieu Nguyen" w:date="2026-05-22T20:45:00Z" w16du:dateUtc="2026-05-22T13:45:00Z">
+        <w:r>
+          <w:rPr>
+            <w:lang w:val="en-US"/>
+          </w:rPr>
+          <w:t xml:space="preserve">This work is important because it extended predictive modelling beyond simple popularity estimation toward the structural dynamics of information spread. Earlier studies such as Szabo and Huberman (2010) focused mainly on correlations between early and later popularity levels, whereas Cheng et al. </w:t>
+        </w:r>
+        <w:proofErr w:type="spellStart"/>
+        <w:r>
+          <w:rPr>
+            <w:lang w:val="en-US"/>
+          </w:rPr>
+          <w:t>emphasised</w:t>
+        </w:r>
+        <w:proofErr w:type="spellEnd"/>
+        <w:r>
+          <w:rPr>
+            <w:lang w:val="en-US"/>
+          </w:rPr>
+          <w:t xml:space="preserve"> how content moves through social networks and how diffusion behaviour influences large-scale spread. This perspective is highly relevant to trend emergence research because emerging trends are often </w:t>
+        </w:r>
+        <w:proofErr w:type="spellStart"/>
+        <w:r>
+          <w:rPr>
+            <w:lang w:val="en-US"/>
+          </w:rPr>
+          <w:t>characterised</w:t>
+        </w:r>
+        <w:proofErr w:type="spellEnd"/>
+        <w:r>
+          <w:rPr>
+            <w:lang w:val="en-US"/>
+          </w:rPr>
+          <w:t xml:space="preserve"> not only by increasing attention, but also by accelerating propagation across connected groups of users.</w:t>
+        </w:r>
+      </w:ins>
+    </w:p>
+    <w:p>
+      <w:pPr>
+        <w:tabs>
+          <w:tab w:val="left" w:pos="7128"/>
+          <w:tab w:val="right" w:pos="9026"/>
+        </w:tabs>
+        <w:rPr>
+          <w:ins w:id="28" w:author="Hieu Nguyen" w:date="2026-05-22T20:45:00Z" w16du:dateUtc="2026-05-22T13:45:00Z"/>
+          <w:lang w:val="en-US"/>
+        </w:rPr>
+      </w:pPr>
+      <w:ins w:id="29" w:author="Hieu Nguyen" w:date="2026-05-22T20:45:00Z" w16du:dateUtc="2026-05-22T13:45:00Z">
+        <w:r>
+          <w:rPr>
+            <w:lang w:val="en-US"/>
+          </w:rPr>
+          <w:t>A major strength of the study is its large-scale empirical foundation. By examining millions of cascades, the authors were able to identify recurring diffusion patterns and demonstrate that early structural signals can improve predictive performance. The paper also showed that predictive accuracy increases substantially once models observe the first stages of cascade growth. This supports the broader idea that early diffusion behaviour contains meaningful predictive information, which aligns closely with the current project’s interest in identifying signals before trends become fully established.</w:t>
+        </w:r>
+      </w:ins>
+    </w:p>
+    <w:p>
+      <w:pPr>
+        <w:tabs>
+          <w:tab w:val="left" w:pos="7128"/>
+          <w:tab w:val="right" w:pos="9026"/>
+        </w:tabs>
+        <w:rPr>
+          <w:ins w:id="30" w:author="Hieu Nguyen" w:date="2026-05-22T20:45:00Z" w16du:dateUtc="2026-05-22T13:45:00Z"/>
+          <w:lang w:val="en-US"/>
+        </w:rPr>
+      </w:pPr>
+      <w:ins w:id="31" w:author="Hieu Nguyen" w:date="2026-05-22T20:45:00Z" w16du:dateUtc="2026-05-22T13:45:00Z">
+        <w:r>
+          <w:rPr>
+            <w:lang w:val="en-US"/>
+          </w:rPr>
+          <w:t xml:space="preserve">Another important contribution is the study’s emphasis on multiple feature categories related to diffusion. Rather than relying only on content characteristics, the analysis considered temporal growth patterns, network structure, and user interaction behaviour. This strengthens the broader argument that predictive models benefit from </w:t>
+        </w:r>
+        <w:r>
+          <w:rPr>
+            <w:lang w:val="en-US"/>
+          </w:rPr>
+          <w:lastRenderedPageBreak/>
+          <w:t>integrating several dimensions of social media activity rather than depending on a single feature type. In particular, the study shows that trend formation is influenced not only by how popular content appears, but also by how it spreads socially between users.</w:t>
+        </w:r>
+      </w:ins>
+    </w:p>
+    <w:p>
+      <w:pPr>
+        <w:tabs>
+          <w:tab w:val="left" w:pos="7128"/>
+          <w:tab w:val="right" w:pos="9026"/>
+        </w:tabs>
+        <w:rPr>
+          <w:ins w:id="32" w:author="Hieu Nguyen" w:date="2026-05-22T20:45:00Z" w16du:dateUtc="2026-05-22T13:45:00Z"/>
+          <w:lang w:val="en-US"/>
+        </w:rPr>
+      </w:pPr>
+      <w:ins w:id="33" w:author="Hieu Nguyen" w:date="2026-05-22T20:45:00Z" w16du:dateUtc="2026-05-22T13:45:00Z">
+        <w:r>
+          <w:rPr>
+            <w:lang w:val="en-US"/>
+          </w:rPr>
+          <w:t>However, the study also has several limitations when considered in relation to a practical student project. One major limitation is its dependence on large-scale platform data and detailed network structure. Cascade prediction often requires access to user relationships, resharing paths, and network connectivity, which may be difficult or impossible to obtain from publicly available datasets or APIs because of privacy restrictions and platform limitations. This makes full diffusion-based modelling difficult to reproduce outside large industrial research settings.</w:t>
+        </w:r>
+      </w:ins>
+    </w:p>
+    <w:p>
+      <w:pPr>
+        <w:tabs>
+          <w:tab w:val="left" w:pos="7128"/>
+          <w:tab w:val="right" w:pos="9026"/>
+        </w:tabs>
+        <w:rPr>
+          <w:ins w:id="34" w:author="Hieu Nguyen" w:date="2026-05-22T20:45:00Z" w16du:dateUtc="2026-05-22T13:45:00Z"/>
+          <w:lang w:val="en-US"/>
+        </w:rPr>
+      </w:pPr>
+      <w:ins w:id="35" w:author="Hieu Nguyen" w:date="2026-05-22T20:45:00Z" w16du:dateUtc="2026-05-22T13:45:00Z">
+        <w:r>
+          <w:rPr>
+            <w:lang w:val="en-US"/>
+          </w:rPr>
+          <w:t xml:space="preserve">A second limitation concerns computational complexity. Graph-based diffusion models may offer strong predictive performance, but they can also require substantial infrastructure, processing power, and </w:t>
+        </w:r>
+        <w:proofErr w:type="spellStart"/>
+        <w:r>
+          <w:rPr>
+            <w:lang w:val="en-US"/>
+          </w:rPr>
+          <w:t>specialised</w:t>
+        </w:r>
+        <w:proofErr w:type="spellEnd"/>
+        <w:r>
+          <w:rPr>
+            <w:lang w:val="en-US"/>
+          </w:rPr>
+          <w:t xml:space="preserve"> data pipelines. These demands may exceed the scope of smaller academic projects. In addition, the study focuses mainly on whether cascades become large, rather than on the semantic meaning or sentiment of the content being shared. As a result, diffusion-based approaches alone may explain how information spreads, but not fully why particular discussions gain momentum or how emotional reactions contribute to their development.</w:t>
+        </w:r>
+      </w:ins>
+    </w:p>
+    <w:p>
+      <w:pPr>
+        <w:tabs>
+          <w:tab w:val="left" w:pos="7128"/>
+          <w:tab w:val="right" w:pos="9026"/>
+        </w:tabs>
+        <w:rPr>
+          <w:ins w:id="36" w:author="Hieu Nguyen" w:date="2026-05-22T20:45:00Z" w16du:dateUtc="2026-05-22T13:45:00Z"/>
+          <w:lang w:val="en-US"/>
+        </w:rPr>
+      </w:pPr>
+      <w:ins w:id="37" w:author="Hieu Nguyen" w:date="2026-05-22T20:45:00Z" w16du:dateUtc="2026-05-22T13:45:00Z">
+        <w:r>
+          <w:rPr>
+            <w:lang w:val="en-US"/>
+          </w:rPr>
+          <w:t xml:space="preserve">The study is also </w:t>
+        </w:r>
+        <w:proofErr w:type="gramStart"/>
+        <w:r>
+          <w:rPr>
+            <w:lang w:val="en-US"/>
+          </w:rPr>
+          <w:t>platform-specific</w:t>
+        </w:r>
+        <w:proofErr w:type="gramEnd"/>
+        <w:r>
+          <w:rPr>
+            <w:lang w:val="en-US"/>
+          </w:rPr>
+          <w:t xml:space="preserve">. Because it focuses on Facebook sharing cascades, its findings may not </w:t>
+        </w:r>
+        <w:proofErr w:type="spellStart"/>
+        <w:r>
+          <w:rPr>
+            <w:lang w:val="en-US"/>
+          </w:rPr>
+          <w:t>generalise</w:t>
+        </w:r>
+        <w:proofErr w:type="spellEnd"/>
+        <w:r>
+          <w:rPr>
+            <w:lang w:val="en-US"/>
+          </w:rPr>
+          <w:t xml:space="preserve"> directly to other environments such as Twitter or Reddit, where user behaviour, interaction mechanisms, and content formats differ. This is particularly important in the finance domain, where online discussion often develops through short posts, rapid reactions, and sentiment-driven commentary rather than through the same sharing patterns observed on Facebook. The study therefore provides useful conceptual insights, but its direct applicability across platforms remains limited.</w:t>
+        </w:r>
+      </w:ins>
+    </w:p>
+    <w:p>
+      <w:pPr>
+        <w:tabs>
+          <w:tab w:val="left" w:pos="7128"/>
+          <w:tab w:val="right" w:pos="9026"/>
+        </w:tabs>
+        <w:rPr>
+          <w:ins w:id="38" w:author="Hieu Nguyen" w:date="2026-05-22T20:45:00Z" w16du:dateUtc="2026-05-22T13:45:00Z"/>
+          <w:lang w:val="en-US"/>
+        </w:rPr>
+      </w:pPr>
+      <w:ins w:id="39" w:author="Hieu Nguyen" w:date="2026-05-22T20:45:00Z" w16du:dateUtc="2026-05-22T13:45:00Z">
+        <w:r>
+          <w:rPr>
+            <w:lang w:val="en-US"/>
+          </w:rPr>
+          <w:t>Despite these limitations, Cheng et al. (2014) offers important support for the current project. The study reinforces the idea that trend emergence involves dynamic spread behaviour rather than isolated popularity measurements alone. It also supports the inclusion of temporal growth and engagement acceleration features within predictive modelling systems. At the same time, the practical constraints of full-scale diffusion modelling help justify a more manageable approach for the present project, which focuses on temporal, engagement, and sentiment-based features rather than attempting full graph reconstruction or industrial-scale cascade analysis.</w:t>
+        </w:r>
+      </w:ins>
+    </w:p>
+    <w:p>
+      <w:pPr>
+        <w:tabs>
+          <w:tab w:val="left" w:pos="7128"/>
+          <w:tab w:val="right" w:pos="9026"/>
+        </w:tabs>
+        <w:rPr>
+          <w:lang w:val="en-US"/>
+        </w:rPr>
+      </w:pPr>
+      <w:ins w:id="40" w:author="Hieu Nguyen" w:date="2026-05-22T20:45:00Z" w16du:dateUtc="2026-05-22T13:45:00Z">
+        <w:r>
+          <w:rPr>
+            <w:lang w:val="en-US"/>
+          </w:rPr>
+          <w:t xml:space="preserve">Overall, diffusion and cascade prediction research expanded the understanding of social media trends by showing that the structure and dynamics of </w:t>
+        </w:r>
+        <w:proofErr w:type="gramStart"/>
+        <w:r>
+          <w:rPr>
+            <w:lang w:val="en-US"/>
+          </w:rPr>
+          <w:t>information spread</w:t>
+        </w:r>
+        <w:proofErr w:type="gramEnd"/>
+        <w:r>
+          <w:rPr>
+            <w:lang w:val="en-US"/>
+          </w:rPr>
+          <w:t xml:space="preserve"> play a central role in determining whether online discussions develop into large-scale phenomena. These studies demonstrate that predictive modelling benefits from considering not only popularity and content, but also the social propagation processes </w:t>
+        </w:r>
+        <w:r>
+          <w:rPr>
+            <w:lang w:val="en-US"/>
+          </w:rPr>
+          <w:lastRenderedPageBreak/>
+          <w:t>that shape how trends evolve. For this reason, diffusion research provides an important theoretical foundation for understanding trend emergence as a dynamic and socially distributed process, even when its full methodological complexity is not adopted directly.</w:t>
+        </w:r>
+      </w:ins>
+    </w:p>
+    <w:p>
+      <w:pPr>
+        <w:pStyle w:val="Heading2"/>
+        <w:rPr>
+          <w:lang w:val="en-US"/>
+        </w:rPr>
+      </w:pPr>
+      <w:r>
+        <w:rPr>
+          <w:lang w:val="en-US"/>
+        </w:rPr>
+        <w:t>6. Comparative Analysis and Research Gap</w:t>
+      </w:r>
+    </w:p>
+    <w:p>
+      <w:pPr>
+        <w:tabs>
+          <w:tab w:val="left" w:pos="7128"/>
+          <w:tab w:val="right" w:pos="9026"/>
+        </w:tabs>
+        <w:rPr>
+          <w:lang w:val="en-US"/>
+        </w:rPr>
+      </w:pPr>
+      <w:r>
+        <w:rPr>
+          <w:lang w:val="en-US"/>
+        </w:rPr>
+        <w:t>The literature reviewed demonstrates that predicting social media behaviour is a well-established research area, with previous studies approaching the problem from several different perspectives. Early popularity prediction research focused primarily on temporal engagement patterns, later machine learning studies introduced content-based and metadata features, sentiment analysis research explored emotional and textual signals, and diffusion studies examined how information spreads through social networks. Together, these studies provide important theoretical and methodological foundations for understanding how online trends develop and how predictive models can be constructed.</w:t>
+      </w:r>
+    </w:p>
+    <w:p>
+      <w:pPr>
+        <w:tabs>
+          <w:tab w:val="left" w:pos="7128"/>
+          <w:tab w:val="right" w:pos="9026"/>
+        </w:tabs>
+        <w:rPr>
+          <w:lang w:val="en-US"/>
+        </w:rPr>
+      </w:pPr>
+      <w:r>
+        <w:rPr>
+          <w:lang w:val="en-US"/>
+        </w:rPr>
+        <w:t xml:space="preserve">One clear pattern across the literature is the growing complexity of predictive approaches over time. Early studies such as Szabo and Huberman (2010) and Lerman (2010) mainly relied on temporal engagement behaviour and early interaction measurements. These studies demonstrated that early popularity signals can strongly correlate with later outcomes, establishing the idea that online attention follows partially predictable growth patterns. However, these approaches treated prediction largely as a popularity estimation problem and relied heavily on engagement counts without deeply </w:t>
       </w:r>
       <w:proofErr w:type="spellStart"/>
       <w:r>
@@ -719,24 +1860,41 @@
         <w:rPr>
           <w:lang w:val="en-US"/>
         </w:rPr>
-        <w:t xml:space="preserve"> textual meaning rather than relying only on engagement statistics such as views, reposts, or comment counts.</w:t>
-      </w:r>
-    </w:p>
-    <w:p>
-      <w:pPr>
-        <w:tabs>
-          <w:tab w:val="left" w:pos="7128"/>
-          <w:tab w:val="right" w:pos="9026"/>
-        </w:tabs>
-        <w:rPr>
-          <w:lang w:val="en-US"/>
-        </w:rPr>
-      </w:pPr>
-      <w:r>
-        <w:rPr>
-          <w:lang w:val="en-US"/>
-        </w:rPr>
-        <w:t xml:space="preserve">A major strength of the study is its interdisciplinary perspective, combining computational analysis with </w:t>
+        <w:t xml:space="preserve"> the semantic meaning or contextual characteristics of online discussions.</w:t>
+      </w:r>
+    </w:p>
+    <w:p>
+      <w:pPr>
+        <w:tabs>
+          <w:tab w:val="left" w:pos="7128"/>
+          <w:tab w:val="right" w:pos="9026"/>
+        </w:tabs>
+        <w:rPr>
+          <w:lang w:val="en-US"/>
+        </w:rPr>
+      </w:pPr>
+      <w:r>
+        <w:rPr>
+          <w:lang w:val="en-US"/>
+        </w:rPr>
+        <w:t>Later research introduced machine learning and feature engineering approaches that expanded prediction beyond simple temporal measurements. Bandari et al. (2012), for example, demonstrated that content features and metadata characteristics can contribute valuable predictive information alongside interaction behaviour. This represented an important transition because it showed that trend-related behaviour may be influenced not only by how users interact with content, but also by the structure, topic, and linguistic properties of the content itself. Compared to earlier popularity prediction studies, machine learning approaches therefore provided more flexible predictive frameworks capable of integrating multiple feature categories.</w:t>
+      </w:r>
+    </w:p>
+    <w:p>
+      <w:pPr>
+        <w:tabs>
+          <w:tab w:val="left" w:pos="7128"/>
+          <w:tab w:val="right" w:pos="9026"/>
+        </w:tabs>
+        <w:rPr>
+          <w:lang w:val="en-US"/>
+        </w:rPr>
+      </w:pPr>
+      <w:r>
+        <w:rPr>
+          <w:lang w:val="en-US"/>
+        </w:rPr>
+        <w:t xml:space="preserve">Research involving sentiment analysis further expanded predictive modelling by introducing semantic and emotional understanding of social media discussions. Bollen et al. (2011) showed that collective mood extracted from Twitter data may contain predictive </w:t>
       </w:r>
       <w:proofErr w:type="spellStart"/>
       <w:r>
@@ -750,13 +1908,68 @@
         <w:rPr>
           <w:lang w:val="en-US"/>
         </w:rPr>
-        <w:t xml:space="preserve"> and financial interpretation. The work showed that social media sentiment could potentially act as an early indicator of collective </w:t>
+        <w:t xml:space="preserve"> signals related to financial activity. This work highlighted the importance of textual meaning and emotional dynamics within social media environments, suggesting that public sentiment can influence or reflect emerging </w:t>
+      </w:r>
+      <w:r>
+        <w:rPr>
+          <w:lang w:val="en-US"/>
+        </w:rPr>
+        <w:lastRenderedPageBreak/>
+        <w:t>collective behaviour. This represents a major difference from purely engagement-based prediction because it considers not only how much users interact, but also what users are expressing emotionally and semantically.</w:t>
+      </w:r>
+    </w:p>
+    <w:p>
+      <w:pPr>
+        <w:tabs>
+          <w:tab w:val="left" w:pos="7128"/>
+          <w:tab w:val="right" w:pos="9026"/>
+        </w:tabs>
+        <w:rPr>
+          <w:lang w:val="en-US"/>
+        </w:rPr>
+      </w:pPr>
+      <w:r>
+        <w:rPr>
+          <w:lang w:val="en-US"/>
+        </w:rPr>
+        <w:t xml:space="preserve">At the same time, diffusion and cascade prediction studies such as Cheng et al. (2014) demonstrated that trend formation is also influenced by how information spreads through networks of users. These approaches focused on structural propagation dynamics rather than only individual engagement measurements or textual content. By </w:t>
       </w:r>
       <w:proofErr w:type="spellStart"/>
       <w:r>
         <w:rPr>
           <w:lang w:val="en-US"/>
         </w:rPr>
+        <w:t>analysing</w:t>
+      </w:r>
+      <w:proofErr w:type="spellEnd"/>
+      <w:r>
+        <w:rPr>
+          <w:lang w:val="en-US"/>
+        </w:rPr>
+        <w:t xml:space="preserve"> resharing patterns and cascade growth behaviour, diffusion research provided deeper understanding of how discussions expand into large-scale social phenomena. This introduced a network-oriented perspective that complements temporal, engagement-based, and sentiment-based approaches.</w:t>
+      </w:r>
+    </w:p>
+    <w:p>
+      <w:pPr>
+        <w:tabs>
+          <w:tab w:val="left" w:pos="7128"/>
+          <w:tab w:val="right" w:pos="9026"/>
+        </w:tabs>
+        <w:rPr>
+          <w:lang w:val="en-US"/>
+        </w:rPr>
+      </w:pPr>
+      <w:r>
+        <w:rPr>
+          <w:lang w:val="en-US"/>
+        </w:rPr>
+        <w:t xml:space="preserve">Although these studies provide valuable insights, several important limitations and research gaps remain. One major limitation is that many previous studies focus primarily on predicting eventual popularity rather than detecting trend emergence during its earliest stages. Predicting whether content will become highly popular is related to, but not identical to, identifying whether a discussion is beginning to emerge as a trend. Trend emergence detection requires identifying subtle acceleration patterns and </w:t>
+      </w:r>
+      <w:proofErr w:type="spellStart"/>
+      <w:r>
+        <w:rPr>
+          <w:lang w:val="en-US"/>
+        </w:rPr>
         <w:t>behavioural</w:t>
       </w:r>
       <w:proofErr w:type="spellEnd"/>
@@ -764,113 +1977,179 @@
         <w:rPr>
           <w:lang w:val="en-US"/>
         </w:rPr>
-        <w:t xml:space="preserve"> shifts, which is particularly relevant in finance-related environments where public attention and emotional reactions can influence discussion dynamics and investment behaviour. This idea strongly supports the inclusion of sentiment-based features within the current project, especially because financial social media discussions often involve speculation, optimism, fear, or uncertainty that may contribute to trend emergence.</w:t>
-      </w:r>
-    </w:p>
-    <w:p>
-      <w:pPr>
-        <w:tabs>
-          <w:tab w:val="left" w:pos="7128"/>
-          <w:tab w:val="right" w:pos="9026"/>
-        </w:tabs>
-        <w:rPr>
-          <w:lang w:val="en-US"/>
-        </w:rPr>
-      </w:pPr>
-      <w:r>
-        <w:rPr>
-          <w:lang w:val="en-US"/>
-        </w:rPr>
-        <w:t xml:space="preserve">Another important contribution of the paper is that it expanded the scope of predictive modelling from purely structural or engagement-based analysis toward semantic understanding of user-generated content. This development is important because social media trends are not driven only by interaction volume, but also by the meaning </w:t>
+        <w:t xml:space="preserve"> shifts before large-scale popularity has fully developed. Existing literature often focuses more strongly on final popularity outcomes than on this earlier prediction stage.</w:t>
+      </w:r>
+    </w:p>
+    <w:p>
+      <w:pPr>
+        <w:tabs>
+          <w:tab w:val="left" w:pos="7128"/>
+          <w:tab w:val="right" w:pos="9026"/>
+        </w:tabs>
+        <w:rPr>
+          <w:lang w:val="en-US"/>
+        </w:rPr>
+      </w:pPr>
+      <w:r>
+        <w:rPr>
+          <w:lang w:val="en-US"/>
+        </w:rPr>
+        <w:t>Another important limitation is that many studies rely heavily on a single category of predictive features. Early popularity prediction research focused mainly on temporal engagement signals, sentiment studies focused primarily on textual mood analysis, and diffusion research concentrated on network propagation behaviour. While these approaches individually provide useful insights, real-world social media trends are likely influenced by the interaction of multiple factors simultaneously. Temporal growth, engagement behaviour, sentiment shifts, and diffusion dynamics may all contribute to trend emergence together rather than independently. This creates a need for more integrated predictive modelling approaches.</w:t>
+      </w:r>
+    </w:p>
+    <w:p>
+      <w:pPr>
+        <w:tabs>
+          <w:tab w:val="left" w:pos="7128"/>
+          <w:tab w:val="right" w:pos="9026"/>
+        </w:tabs>
+        <w:rPr>
+          <w:lang w:val="en-US"/>
+        </w:rPr>
+      </w:pPr>
+      <w:r>
+        <w:rPr>
+          <w:lang w:val="en-US"/>
+        </w:rPr>
+        <w:t xml:space="preserve">Practical implementation challenges also appear repeatedly throughout </w:t>
+      </w:r>
+      <w:r>
+        <w:rPr>
+          <w:lang w:val="en-US"/>
+        </w:rPr>
+        <w:t>literature</w:t>
+      </w:r>
+      <w:r>
+        <w:rPr>
+          <w:lang w:val="en-US"/>
+        </w:rPr>
+        <w:t xml:space="preserve">. Several advanced approaches, particularly large-scale diffusion and industrial recommendation systems, depend on extensive datasets, detailed network structures, or computational resources that may be difficult to reproduce within smaller academic projects. For example, cascade prediction methods often require detailed graph-based user relationship data that may not be publicly accessible due to privacy and platform restrictions. Similarly, industrial-scale systems such as those developed by large technology companies may involve infrastructure and datasets beyond the scope of student-level research. These limitations highlight the importance of designing </w:t>
       </w:r>
       <w:r>
         <w:rPr>
           <w:lang w:val="en-US"/>
         </w:rPr>
         <w:lastRenderedPageBreak/>
-        <w:t>and emotional intensity of discussions. As a result, sentiment analysis provides an additional layer of information that may improve the ability to detect emerging trends during their early stages.</w:t>
-      </w:r>
-    </w:p>
-    <w:p>
-      <w:pPr>
-        <w:tabs>
-          <w:tab w:val="left" w:pos="7128"/>
-          <w:tab w:val="right" w:pos="9026"/>
-        </w:tabs>
-        <w:rPr>
-          <w:lang w:val="en-US"/>
-        </w:rPr>
-      </w:pPr>
-      <w:r>
-        <w:rPr>
-          <w:lang w:val="en-US"/>
-        </w:rPr>
-        <w:t>Despite its influence, the study also has several limitations. One important concern is the difficulty of distinguishing correlation from causation. Although the paper identified statistical relationships between Twitter mood and stock market behaviour, this does not necessarily prove that social media sentiment directly causes market changes. External factors such as news events, economic conditions, or political developments may influence both social media discussions and financial markets simultaneously. This makes interpretation more complex and highlights the challenges of drawing strong causal conclusions from observational social media data.</w:t>
-      </w:r>
-    </w:p>
-    <w:p>
-      <w:pPr>
-        <w:tabs>
-          <w:tab w:val="left" w:pos="7128"/>
-          <w:tab w:val="right" w:pos="9026"/>
-        </w:tabs>
-        <w:rPr>
-          <w:lang w:val="en-US"/>
-        </w:rPr>
-      </w:pPr>
-      <w:r>
-        <w:rPr>
-          <w:lang w:val="en-US"/>
-        </w:rPr>
-        <w:t xml:space="preserve">Another limitation is that the sentiment analysis techniques used in the study were relatively simple compared to modern NLP approaches. The work relied largely on lexicon-based sentiment measurements, which may struggle to capture sarcasm, financial terminology, contextual meaning, or complex emotional expression commonly found in social media discussions. In addition, Twitter users do not necessarily represent the broader population, creating potential sampling bias that may affect </w:t>
+        <w:t>predictive systems that remain both academically meaningful and practically achievable.</w:t>
+      </w:r>
+    </w:p>
+    <w:p>
+      <w:pPr>
+        <w:tabs>
+          <w:tab w:val="left" w:pos="7128"/>
+          <w:tab w:val="right" w:pos="9026"/>
+        </w:tabs>
+        <w:rPr>
+          <w:lang w:val="en-US"/>
+        </w:rPr>
+      </w:pPr>
+      <w:r>
+        <w:rPr>
+          <w:lang w:val="en-US"/>
+        </w:rPr>
+        <w:t xml:space="preserve">Another gap in the literature is the relatively limited focus on finance-related </w:t>
+      </w:r>
+      <w:r>
+        <w:rPr>
+          <w:lang w:val="en-US"/>
+        </w:rPr>
+        <w:t>trends</w:t>
+      </w:r>
+      <w:r>
+        <w:rPr>
+          <w:lang w:val="en-US"/>
+        </w:rPr>
+        <w:t xml:space="preserve"> emergence specifically. While Bollen et al. (2011) examined social media mood in relation to financial markets, much of the broader literature studies general popularity or information diffusion without concentrating specifically on financial discussion trends. Financial social media environments may behave differently from general entertainment or news-sharing platforms because they are strongly influenced by speculation, public sentiment, rapid reactions to events, and collective </w:t>
       </w:r>
       <w:proofErr w:type="spellStart"/>
       <w:r>
         <w:rPr>
           <w:lang w:val="en-US"/>
         </w:rPr>
-        <w:t>generalisability</w:t>
+        <w:t>behavioural</w:t>
       </w:r>
       <w:proofErr w:type="spellEnd"/>
       <w:r>
         <w:rPr>
           <w:lang w:val="en-US"/>
         </w:rPr>
-        <w:t>.</w:t>
-      </w:r>
-    </w:p>
-    <w:p>
-      <w:pPr>
-        <w:tabs>
-          <w:tab w:val="left" w:pos="7128"/>
-          <w:tab w:val="right" w:pos="9026"/>
-        </w:tabs>
-        <w:rPr>
-          <w:lang w:val="en-US"/>
-        </w:rPr>
-      </w:pPr>
-      <w:r>
-        <w:rPr>
-          <w:lang w:val="en-US"/>
-        </w:rPr>
-        <w:t>The study is also not directly focused on trend emergence prediction. Its primary objective was market prediction rather than detecting the formation and spread of social media trends. Nevertheless, the research remains highly relevant because it demonstrates that textual sentiment and collective mood can provide predictive signals within finance-related social media environments. For the current project, this supports the use of sentiment-based features as one component within a broader predictive modelling framework rather than as a standalone predictor.</w:t>
-      </w:r>
-    </w:p>
-    <w:p>
-      <w:pPr>
-        <w:tabs>
-          <w:tab w:val="left" w:pos="7128"/>
-          <w:tab w:val="right" w:pos="9026"/>
-        </w:tabs>
-        <w:rPr>
-          <w:lang w:val="en-US"/>
-        </w:rPr>
-      </w:pPr>
-      <w:r>
-        <w:rPr>
-          <w:lang w:val="en-US"/>
-        </w:rPr>
-        <w:t>Overall, Bollen et al. (2011) represents an important step in the evolution of predictive modelling research by introducing NLP and sentiment analysis into social media forecasting. The study expanded predictive approaches beyond temporal popularity and engagement measurements, showing that emotional and semantic information may also contribute valuable predictive insights. This development helped motivate later research that integrates textual analysis, sentiment features, and machine learning techniques to better understand how discussions evolve and how emerging trends can be identified from large-scale social media activity.</w:t>
+        <w:t xml:space="preserve"> dynamics. This creates opportunities for more focused predictive modelling research within finance-related online discussions.</w:t>
+      </w:r>
+    </w:p>
+    <w:p>
+      <w:pPr>
+        <w:tabs>
+          <w:tab w:val="left" w:pos="7128"/>
+          <w:tab w:val="right" w:pos="9026"/>
+        </w:tabs>
+        <w:rPr>
+          <w:lang w:val="en-US"/>
+        </w:rPr>
+      </w:pPr>
+      <w:r>
+        <w:rPr>
+          <w:lang w:val="en-US"/>
+        </w:rPr>
+        <w:t xml:space="preserve">The literature therefore supports the direction of the proposed project in several ways. First, previous studies justify the use of temporal and engagement-based features for identifying early </w:t>
+      </w:r>
+      <w:proofErr w:type="spellStart"/>
+      <w:r>
+        <w:rPr>
+          <w:lang w:val="en-US"/>
+        </w:rPr>
+        <w:t>behavioural</w:t>
+      </w:r>
+      <w:proofErr w:type="spellEnd"/>
+      <w:r>
+        <w:rPr>
+          <w:lang w:val="en-US"/>
+        </w:rPr>
+        <w:t xml:space="preserve"> signals. Second, machine learning and sentiment analysis research support integrating textual and semantic information into predictive models. Third, diffusion research demonstrates the importance of </w:t>
+      </w:r>
+      <w:proofErr w:type="spellStart"/>
+      <w:r>
+        <w:rPr>
+          <w:lang w:val="en-US"/>
+        </w:rPr>
+        <w:t>analysing</w:t>
+      </w:r>
+      <w:proofErr w:type="spellEnd"/>
+      <w:r>
+        <w:rPr>
+          <w:lang w:val="en-US"/>
+        </w:rPr>
+        <w:t xml:space="preserve"> how discussions spread dynamically across online environments. However, the limitations identified across the literature also suggest the need for a more practical and integrated predictive modelling approach.</w:t>
+      </w:r>
+    </w:p>
+    <w:p>
+      <w:pPr>
+        <w:tabs>
+          <w:tab w:val="left" w:pos="7128"/>
+          <w:tab w:val="right" w:pos="9026"/>
+        </w:tabs>
+        <w:rPr>
+          <w:lang w:val="en-US"/>
+        </w:rPr>
+      </w:pPr>
+      <w:r>
+        <w:rPr>
+          <w:lang w:val="en-US"/>
+        </w:rPr>
+        <w:t xml:space="preserve">The proposed project aims to address these gaps by developing a predictive model focused specifically on early-stage social media trend emergence within the finance domain. Rather than relying on only one predictive dimension, the project intends to combine temporal, engagement, and sentiment-based features within a manageable machine learning framework. In contrast to large-scale industrial systems or highly complex graph-based diffusion models, the project also </w:t>
+      </w:r>
+      <w:proofErr w:type="spellStart"/>
+      <w:r>
+        <w:rPr>
+          <w:lang w:val="en-US"/>
+        </w:rPr>
+        <w:t>prioritises</w:t>
+      </w:r>
+      <w:proofErr w:type="spellEnd"/>
+      <w:r>
+        <w:rPr>
+          <w:lang w:val="en-US"/>
+        </w:rPr>
+        <w:t xml:space="preserve"> practical feasibility while still incorporating concepts established in previous research. Through this approach, the project seeks to build upon the strengths of earlier studies while addressing some of their limitations regarding feature integration, early-stage prediction, and practical implementation scope.</w:t>
       </w:r>
     </w:p>
     <w:p>
@@ -879,941 +2158,213 @@
         <w:rPr>
           <w:lang w:val="en-US"/>
         </w:rPr>
-        <w:pPrChange w:id="3" w:author="Hieu Nguyen" w:date="2026-05-22T19:54:00Z" w16du:dateUtc="2026-05-22T12:54:00Z">
-          <w:pPr>
-            <w:tabs>
-              <w:tab w:val="left" w:pos="7128"/>
-              <w:tab w:val="right" w:pos="9026"/>
-            </w:tabs>
-          </w:pPr>
-        </w:pPrChange>
-      </w:pPr>
-      <w:r>
-        <w:rPr>
-          <w:lang w:val="en-US"/>
-        </w:rPr>
-        <w:t>5. Information Diffusion and Cascade Prediction</w:t>
-      </w:r>
-    </w:p>
-    <w:p>
-      <w:pPr>
-        <w:tabs>
-          <w:tab w:val="left" w:pos="7128"/>
-          <w:tab w:val="right" w:pos="9026"/>
-        </w:tabs>
-        <w:rPr>
-          <w:lang w:val="en-US"/>
-        </w:rPr>
-      </w:pPr>
-      <w:r>
-        <w:rPr>
-          <w:lang w:val="en-US"/>
-        </w:rPr>
-        <w:t xml:space="preserve">As social media research progressed, researchers increasingly </w:t>
+      </w:pPr>
+      <w:r>
+        <w:rPr>
+          <w:lang w:val="en-US"/>
+        </w:rPr>
+        <w:t>7. Conclusion</w:t>
+      </w:r>
+    </w:p>
+    <w:p>
+      <w:pPr>
+        <w:tabs>
+          <w:tab w:val="left" w:pos="7128"/>
+          <w:tab w:val="right" w:pos="9026"/>
+        </w:tabs>
+        <w:rPr>
+          <w:lang w:val="en-US"/>
+        </w:rPr>
+      </w:pPr>
+      <w:r>
+        <w:rPr>
+          <w:lang w:val="en-US"/>
+        </w:rPr>
+        <w:t>The literature reviewed in this survey demonstrates that social media prediction has evolved through several important stages, beginning with early popularity prediction research and later expanding into machine learning, sentiment analysis, and diffusion modelling approaches. Together, these studies provide a strong theoretical and methodological foundation for understanding how online discussions develop, spread, and potentially evolve into large-scale trends.</w:t>
+      </w:r>
+    </w:p>
+    <w:p>
+      <w:pPr>
+        <w:tabs>
+          <w:tab w:val="left" w:pos="7128"/>
+          <w:tab w:val="right" w:pos="9026"/>
+        </w:tabs>
+        <w:rPr>
+          <w:lang w:val="en-US"/>
+        </w:rPr>
+      </w:pPr>
+      <w:r>
+        <w:rPr>
+          <w:lang w:val="en-US"/>
+        </w:rPr>
+        <w:t xml:space="preserve">Early popularity prediction research, particularly the work of Szabo and Huberman (2010) and Lerman (2010), established that early engagement behaviour and temporal </w:t>
+      </w:r>
+      <w:r>
+        <w:rPr>
+          <w:lang w:val="en-US"/>
+        </w:rPr>
+        <w:lastRenderedPageBreak/>
+        <w:t>growth patterns contain valuable predictive information. These studies showed that online attention is not entirely random and that early user interaction measurements can help estimate future popularity outcomes. However, these approaches mainly focused on popularity magnitude and relied heavily on engagement-based indicators without incorporating deeper semantic understanding or multi-dimensional feature integration.</w:t>
+      </w:r>
+    </w:p>
+    <w:p>
+      <w:pPr>
+        <w:tabs>
+          <w:tab w:val="left" w:pos="7128"/>
+          <w:tab w:val="right" w:pos="9026"/>
+        </w:tabs>
+        <w:rPr>
+          <w:lang w:val="en-US"/>
+        </w:rPr>
+      </w:pPr>
+      <w:r>
+        <w:rPr>
+          <w:lang w:val="en-US"/>
+        </w:rPr>
+        <w:t xml:space="preserve">Machine learning and content-based prediction research, represented by Bandari et al. (2012), expanded predictive modelling beyond simple temporal analysis by introducing feature engineering approaches using content and metadata characteristics. This demonstrated that predictive systems </w:t>
+      </w:r>
+      <w:r>
+        <w:rPr>
+          <w:lang w:val="en-US"/>
+        </w:rPr>
+        <w:t>could</w:t>
+      </w:r>
+      <w:r>
+        <w:rPr>
+          <w:lang w:val="en-US"/>
+        </w:rPr>
+        <w:t xml:space="preserve"> benefit from combining multiple types of information rather than relying on a single predictive signal. Meanwhile, sentiment analysis research such as Bollen et al. (2011) introduced the importance of emotional and semantic information within social media discussions, showing that collective mood and textual sentiment may also provide predictive insights, particularly within finance-related environments.</w:t>
+      </w:r>
+    </w:p>
+    <w:p>
+      <w:pPr>
+        <w:tabs>
+          <w:tab w:val="left" w:pos="7128"/>
+          <w:tab w:val="right" w:pos="9026"/>
+        </w:tabs>
+        <w:rPr>
+          <w:lang w:val="en-US"/>
+        </w:rPr>
+      </w:pPr>
+      <w:r>
+        <w:rPr>
+          <w:lang w:val="en-US"/>
+        </w:rPr>
+        <w:t xml:space="preserve">Diffusion and cascade prediction studies, including Cheng et al. (2014), further extended this understanding by examining how information spreads through social networks. These studies demonstrated that trend formation is influenced not only by content popularity or sentiment, but also by dynamic </w:t>
+      </w:r>
+      <w:proofErr w:type="gramStart"/>
+      <w:r>
+        <w:rPr>
+          <w:lang w:val="en-US"/>
+        </w:rPr>
+        <w:t>propagation behaviour</w:t>
+      </w:r>
+      <w:proofErr w:type="gramEnd"/>
+      <w:r>
+        <w:rPr>
+          <w:lang w:val="en-US"/>
+        </w:rPr>
+        <w:t xml:space="preserve"> </w:t>
+      </w:r>
+      <w:proofErr w:type="gramStart"/>
+      <w:r>
+        <w:rPr>
+          <w:lang w:val="en-US"/>
+        </w:rPr>
+        <w:t>and user</w:t>
+      </w:r>
+      <w:proofErr w:type="gramEnd"/>
+      <w:r>
+        <w:rPr>
+          <w:lang w:val="en-US"/>
+        </w:rPr>
+        <w:t xml:space="preserve"> interaction structures. This research highlighted the importance of considering social diffusion processes when </w:t>
       </w:r>
       <w:proofErr w:type="spellStart"/>
       <w:r>
         <w:rPr>
           <w:lang w:val="en-US"/>
         </w:rPr>
-        <w:t>recognised</w:t>
+        <w:t>analysing</w:t>
       </w:r>
       <w:proofErr w:type="spellEnd"/>
       <w:r>
         <w:rPr>
           <w:lang w:val="en-US"/>
         </w:rPr>
-        <w:t xml:space="preserve"> that popularity and trend emergence are not driven only by individual user interactions or content characteristics, but also by how information spreads through networks of users. This led to growing interest in information diffusion and cascade prediction, </w:t>
+        <w:t xml:space="preserve"> how online trends emerge and expand.</w:t>
+      </w:r>
+    </w:p>
+    <w:p>
+      <w:pPr>
+        <w:tabs>
+          <w:tab w:val="left" w:pos="7128"/>
+          <w:tab w:val="right" w:pos="9026"/>
+        </w:tabs>
+        <w:rPr>
+          <w:lang w:val="en-US"/>
+        </w:rPr>
+      </w:pPr>
+      <w:r>
+        <w:rPr>
+          <w:lang w:val="en-US"/>
+        </w:rPr>
+        <w:t xml:space="preserve">Despite these advances, </w:t>
+      </w:r>
+      <w:proofErr w:type="gramStart"/>
+      <w:r>
+        <w:rPr>
+          <w:lang w:val="en-US"/>
+        </w:rPr>
+        <w:t>the literature</w:t>
+      </w:r>
+      <w:proofErr w:type="gramEnd"/>
+      <w:r>
+        <w:rPr>
+          <w:lang w:val="en-US"/>
+        </w:rPr>
+        <w:t xml:space="preserve"> also reveals several important limitations. Many previous studies focus primarily on predicting eventual popularity rather than detecting early-stage trend emergence. In addition, many approaches depend heavily on a single category of features, such as temporal engagement, sentiment, or diffusion structure, rather than integrating multiple predictive dimensions together. Some advanced methods also require large-scale industrial datasets, extensive network information, or computational resources that may not be practical for smaller academic projects.</w:t>
+      </w:r>
+    </w:p>
+    <w:p>
+      <w:pPr>
+        <w:tabs>
+          <w:tab w:val="left" w:pos="7128"/>
+          <w:tab w:val="right" w:pos="9026"/>
+        </w:tabs>
+        <w:rPr>
+          <w:lang w:val="en-US"/>
+        </w:rPr>
+      </w:pPr>
+      <w:r>
+        <w:rPr>
+          <w:lang w:val="en-US"/>
+        </w:rPr>
+        <w:t>These gaps justify the direction of the proposed project. The project aims to build upon previous research by developing a predictive modelling approach focused specifically on the early detection of finance-related social media trend emergence. Rather than relying on only one predictive perspective, the project intends to combine temporal, engagement, and sentiment-based features within a manageable machine learning framework. This approach attempts to balance academic relevance, practical feasibility, and methodological integration while remaining achievable within the scope of a student project.</w:t>
+      </w:r>
+    </w:p>
+    <w:p>
+      <w:pPr>
+        <w:tabs>
+          <w:tab w:val="left" w:pos="7128"/>
+          <w:tab w:val="right" w:pos="9026"/>
+        </w:tabs>
+        <w:rPr>
+          <w:lang w:val="en-US"/>
+        </w:rPr>
+      </w:pPr>
+      <w:r>
+        <w:rPr>
+          <w:lang w:val="en-US"/>
+        </w:rPr>
+        <w:t>Overall, the literature suggests that early trend detection is a realistic and meaningful research problem, but also one that remains challenging due to the dynamic and multi-</w:t>
       </w:r>
       <w:r>
         <w:rPr>
           <w:lang w:val="en-US"/>
         </w:rPr>
         <w:lastRenderedPageBreak/>
-        <w:t>which examine how posts, discussions, or topics propagate across social media platforms over time. These approaches are particularly relevant to trend emergence because trends often develop through rapid sharing behaviour and expanding user participation rather than through isolated popularity events.</w:t>
-      </w:r>
-    </w:p>
-    <w:p>
-      <w:pPr>
-        <w:tabs>
-          <w:tab w:val="left" w:pos="7128"/>
-          <w:tab w:val="right" w:pos="9026"/>
-        </w:tabs>
-        <w:rPr>
-          <w:lang w:val="en-US"/>
-        </w:rPr>
-      </w:pPr>
-      <w:r>
-        <w:rPr>
-          <w:lang w:val="en-US"/>
-        </w:rPr>
-        <w:t xml:space="preserve">An influential study in this area is Cheng et al. (2014), </w:t>
-      </w:r>
-      <w:r>
-        <w:rPr>
-          <w:i/>
-          <w:iCs/>
-          <w:lang w:val="en-US"/>
-        </w:rPr>
-        <w:t>Can Cascades Be Predicted?</w:t>
-      </w:r>
-      <w:r>
-        <w:rPr>
-          <w:lang w:val="en-US"/>
-        </w:rPr>
-        <w:t xml:space="preserve"> The authors investigated whether large information cascades on Facebook could be predicted using early observations of content spread. A cascade in this context refers to the process where information spreads from user to user through reposting or sharing activity, potentially reaching very large audiences. The study </w:t>
-      </w:r>
-      <w:proofErr w:type="spellStart"/>
-      <w:r>
-        <w:rPr>
-          <w:lang w:val="en-US"/>
-        </w:rPr>
-        <w:t>analysed</w:t>
-      </w:r>
-      <w:proofErr w:type="spellEnd"/>
-      <w:r>
-        <w:rPr>
-          <w:lang w:val="en-US"/>
-        </w:rPr>
-        <w:t xml:space="preserve"> millions of cascades and explored whether characteristics observed during the early stages of diffusion could predict whether a cascade would continue growing substantially.</w:t>
-      </w:r>
-    </w:p>
-    <w:p>
-      <w:pPr>
-        <w:tabs>
-          <w:tab w:val="left" w:pos="7128"/>
-          <w:tab w:val="right" w:pos="9026"/>
-        </w:tabs>
-        <w:rPr>
-          <w:lang w:val="en-US"/>
-        </w:rPr>
-      </w:pPr>
-      <w:r>
-        <w:rPr>
-          <w:lang w:val="en-US"/>
-        </w:rPr>
-        <w:t xml:space="preserve">This work is important because it shifted predictive modelling research beyond simple </w:t>
-      </w:r>
-      <w:proofErr w:type="gramStart"/>
-      <w:r>
-        <w:rPr>
-          <w:lang w:val="en-US"/>
-        </w:rPr>
-        <w:t>popularity counts</w:t>
-      </w:r>
-      <w:proofErr w:type="gramEnd"/>
-      <w:r>
-        <w:rPr>
-          <w:lang w:val="en-US"/>
-        </w:rPr>
-        <w:t xml:space="preserve"> toward </w:t>
-      </w:r>
-      <w:proofErr w:type="spellStart"/>
-      <w:r>
-        <w:rPr>
-          <w:lang w:val="en-US"/>
-        </w:rPr>
-        <w:t>analysing</w:t>
-      </w:r>
-      <w:proofErr w:type="spellEnd"/>
-      <w:r>
-        <w:rPr>
-          <w:lang w:val="en-US"/>
-        </w:rPr>
-        <w:t xml:space="preserve"> the structural dynamics of information spread. Earlier studies such as Szabo and Huberman (2010) mainly focused on correlations between early and later popularity measurements, whereas Cheng et al. (2014) examined how content propagates through social networks and how diffusion behaviour influences large-scale spread. This perspective is highly relevant to trend emergence research because emerging trends are often </w:t>
-      </w:r>
-      <w:proofErr w:type="spellStart"/>
-      <w:r>
-        <w:rPr>
-          <w:lang w:val="en-US"/>
-        </w:rPr>
-        <w:t>characterised</w:t>
-      </w:r>
-      <w:proofErr w:type="spellEnd"/>
-      <w:r>
-        <w:rPr>
-          <w:lang w:val="en-US"/>
-        </w:rPr>
-        <w:t xml:space="preserve"> by accelerating diffusion patterns and increasing participation across connected user groups.</w:t>
-      </w:r>
-    </w:p>
-    <w:p>
-      <w:pPr>
-        <w:tabs>
-          <w:tab w:val="left" w:pos="7128"/>
-          <w:tab w:val="right" w:pos="9026"/>
-        </w:tabs>
-        <w:rPr>
-          <w:lang w:val="en-US"/>
-        </w:rPr>
-      </w:pPr>
-      <w:r>
-        <w:rPr>
-          <w:lang w:val="en-US"/>
-        </w:rPr>
-        <w:t xml:space="preserve">A major strength of the study is its large-scale empirical analysis. By </w:t>
-      </w:r>
-      <w:proofErr w:type="spellStart"/>
-      <w:r>
-        <w:rPr>
-          <w:lang w:val="en-US"/>
-        </w:rPr>
-        <w:t>analysing</w:t>
-      </w:r>
-      <w:proofErr w:type="spellEnd"/>
-      <w:r>
-        <w:rPr>
-          <w:lang w:val="en-US"/>
-        </w:rPr>
-        <w:t xml:space="preserve"> millions of cascades, the authors were able to identify common diffusion </w:t>
-      </w:r>
-      <w:proofErr w:type="spellStart"/>
-      <w:r>
-        <w:rPr>
-          <w:lang w:val="en-US"/>
-        </w:rPr>
-        <w:t>behaviours</w:t>
-      </w:r>
-      <w:proofErr w:type="spellEnd"/>
-      <w:r>
-        <w:rPr>
-          <w:lang w:val="en-US"/>
-        </w:rPr>
-        <w:t xml:space="preserve"> and demonstrate that certain early structural signals can improve predictive performance. The paper also showed that predictive accuracy increases significantly when models observe the first stages of cascade growth, supporting the broader idea that early-stage behaviour contains meaningful predictive information. This finding aligns strongly with the current project’s focus on identifying early signals of trend emergence before trends become fully established.</w:t>
-      </w:r>
-    </w:p>
-    <w:p>
-      <w:pPr>
-        <w:tabs>
-          <w:tab w:val="left" w:pos="7128"/>
-          <w:tab w:val="right" w:pos="9026"/>
-        </w:tabs>
-        <w:rPr>
-          <w:lang w:val="en-US"/>
-        </w:rPr>
-      </w:pPr>
-      <w:r>
-        <w:rPr>
-          <w:lang w:val="en-US"/>
-        </w:rPr>
-        <w:t>Another important contribution of the paper is its focus on multiple feature categories related to diffusion behaviour. The study considered not only content characteristics, but also temporal growth patterns, network structure, and user interaction behaviour. This supports the broader research direction that predictive models benefit from integrating multiple dimensions of social media activity rather than relying on a single predictive factor. In particular, the work demonstrates that trend formation is influenced not only by content popularity, but also by how information spreads socially between users.</w:t>
-      </w:r>
-    </w:p>
-    <w:p>
-      <w:pPr>
-        <w:tabs>
-          <w:tab w:val="left" w:pos="7128"/>
-          <w:tab w:val="right" w:pos="9026"/>
-        </w:tabs>
-        <w:rPr>
-          <w:lang w:val="en-US"/>
-        </w:rPr>
-      </w:pPr>
-      <w:r>
-        <w:rPr>
-          <w:lang w:val="en-US"/>
-        </w:rPr>
-        <w:t xml:space="preserve">However, the study also has several limitations when considered from the perspective of a practical student project. One major limitation is the heavy dependence on large-scale platform data and complex network structures. Cascade prediction often requires </w:t>
-      </w:r>
-      <w:r>
-        <w:rPr>
-          <w:lang w:val="en-US"/>
-        </w:rPr>
-        <w:lastRenderedPageBreak/>
-        <w:t>detailed information about user relationships, resharing paths, and network connectivity, which may be difficult to obtain from publicly available datasets or APIs due to privacy restrictions and platform limitations. This creates practical challenges for reproducing full diffusion-based approaches outside large industrial research environments.</w:t>
-      </w:r>
-    </w:p>
-    <w:p>
-      <w:pPr>
-        <w:tabs>
-          <w:tab w:val="left" w:pos="7128"/>
-          <w:tab w:val="right" w:pos="9026"/>
-        </w:tabs>
-        <w:rPr>
-          <w:lang w:val="en-US"/>
-        </w:rPr>
-      </w:pPr>
-      <w:r>
-        <w:rPr>
-          <w:lang w:val="en-US"/>
-        </w:rPr>
-        <w:t>Another limitation is that cascade prediction models can become computationally complex, especially when graph-based network analysis is involved. While these methods may produce strong predictive performance, they may also require infrastructure, processing power, and data access beyond the scope of smaller academic projects. Additionally, the study focuses mainly on predicting whether cascades become large rather than understanding the semantic meaning or sentiment associated with the content being shared. As a result, diffusion-based approaches alone may not fully explain why certain trends emerge or how public sentiment contributes to their growth.</w:t>
-      </w:r>
-    </w:p>
-    <w:p>
-      <w:pPr>
-        <w:tabs>
-          <w:tab w:val="left" w:pos="7128"/>
-          <w:tab w:val="right" w:pos="9026"/>
-        </w:tabs>
-        <w:rPr>
-          <w:lang w:val="en-US"/>
-        </w:rPr>
-      </w:pPr>
-      <w:r>
-        <w:rPr>
-          <w:lang w:val="en-US"/>
-        </w:rPr>
-        <w:t xml:space="preserve">The paper is also focused on Facebook sharing cascades, meaning that some findings may not </w:t>
-      </w:r>
-      <w:proofErr w:type="spellStart"/>
-      <w:r>
-        <w:rPr>
-          <w:lang w:val="en-US"/>
-        </w:rPr>
-        <w:t>generalise</w:t>
-      </w:r>
-      <w:proofErr w:type="spellEnd"/>
-      <w:r>
-        <w:rPr>
-          <w:lang w:val="en-US"/>
-        </w:rPr>
-        <w:t xml:space="preserve"> perfectly to other social media platforms where user behaviour, interaction mechanisms, and content formats differ. Financial discussions on platforms such as Twitter or Reddit may exhibit different diffusion dynamics compared to Facebook sharing behaviour. This highlights the broader challenge of </w:t>
-      </w:r>
-      <w:proofErr w:type="spellStart"/>
-      <w:r>
-        <w:rPr>
-          <w:lang w:val="en-US"/>
-        </w:rPr>
-        <w:t>generalising</w:t>
-      </w:r>
-      <w:proofErr w:type="spellEnd"/>
-      <w:r>
-        <w:rPr>
-          <w:lang w:val="en-US"/>
-        </w:rPr>
-        <w:t xml:space="preserve"> predictive models across multiple online environments.</w:t>
-      </w:r>
-    </w:p>
-    <w:p>
-      <w:pPr>
-        <w:tabs>
-          <w:tab w:val="left" w:pos="7128"/>
-          <w:tab w:val="right" w:pos="9026"/>
-        </w:tabs>
-        <w:rPr>
-          <w:lang w:val="en-US"/>
-        </w:rPr>
-      </w:pPr>
-      <w:r>
-        <w:rPr>
-          <w:lang w:val="en-US"/>
-        </w:rPr>
-        <w:t>Despite these limitations, Cheng et al. (2014) provides important conceptual support for the current project. The study reinforces the idea that trend emergence involves dynamic spread behaviour rather than isolated popularity measurements. It also supports the use of temporal growth and engagement acceleration features within predictive modelling systems. At the same time, the practical challenges associated with large-scale network analysis help justify the scope of the proposed project, which focuses on a more manageable machine learning pipeline using temporal, engagement, and sentiment-based features rather than attempting full-scale graph reconstruction or industrial cascade modelling.</w:t>
-      </w:r>
-    </w:p>
-    <w:p>
-      <w:pPr>
-        <w:tabs>
-          <w:tab w:val="left" w:pos="7128"/>
-          <w:tab w:val="right" w:pos="9026"/>
-        </w:tabs>
-        <w:rPr>
-          <w:lang w:val="en-US"/>
-        </w:rPr>
-      </w:pPr>
-      <w:r>
-        <w:rPr>
-          <w:lang w:val="en-US"/>
-        </w:rPr>
-        <w:t>Overall, diffusion and cascade prediction research expanded the understanding of social media trends by showing that the structure and dynamics of information spread play a critical role in determining whether online discussions grow into large-scale phenomena. These studies demonstrated that predictive modelling benefits from considering not only popularity and content features, but also the social propagation mechanisms that influence how trends evolve over time. This research area therefore provides an important theoretical foundation for understanding trend emergence as a dynamic and socially distributed process.</w:t>
-      </w:r>
-    </w:p>
-    <w:p>
-      <w:pPr>
-        <w:pStyle w:val="Heading2"/>
-        <w:rPr>
-          <w:lang w:val="en-US"/>
-        </w:rPr>
-        <w:pPrChange w:id="4" w:author="Hieu Nguyen" w:date="2026-05-22T19:54:00Z" w16du:dateUtc="2026-05-22T12:54:00Z">
-          <w:pPr>
-            <w:tabs>
-              <w:tab w:val="left" w:pos="7128"/>
-              <w:tab w:val="right" w:pos="9026"/>
-            </w:tabs>
-          </w:pPr>
-        </w:pPrChange>
-      </w:pPr>
-      <w:r>
-        <w:rPr>
-          <w:lang w:val="en-US"/>
-        </w:rPr>
-        <w:lastRenderedPageBreak/>
-        <w:t>6. Comparative Analysis and Research Gap</w:t>
-      </w:r>
-    </w:p>
-    <w:p>
-      <w:pPr>
-        <w:tabs>
-          <w:tab w:val="left" w:pos="7128"/>
-          <w:tab w:val="right" w:pos="9026"/>
-        </w:tabs>
-        <w:rPr>
-          <w:lang w:val="en-US"/>
-        </w:rPr>
-      </w:pPr>
-      <w:r>
-        <w:rPr>
-          <w:lang w:val="en-US"/>
-        </w:rPr>
-        <w:t>The literature reviewed demonstrates that predicting social media behaviour is a well-established research area, with previous studies approaching the problem from several different perspectives. Early popularity prediction research focused primarily on temporal engagement patterns, later machine learning studies introduced content-based and metadata features, sentiment analysis research explored emotional and textual signals, and diffusion studies examined how information spreads through social networks. Together, these studies provide important theoretical and methodological foundations for understanding how online trends develop and how predictive models can be constructed.</w:t>
-      </w:r>
-    </w:p>
-    <w:p>
-      <w:pPr>
-        <w:tabs>
-          <w:tab w:val="left" w:pos="7128"/>
-          <w:tab w:val="right" w:pos="9026"/>
-        </w:tabs>
-        <w:rPr>
-          <w:lang w:val="en-US"/>
-        </w:rPr>
-      </w:pPr>
-      <w:r>
-        <w:rPr>
-          <w:lang w:val="en-US"/>
-        </w:rPr>
-        <w:t xml:space="preserve">One clear pattern across the literature is the growing complexity of predictive approaches over time. Early studies such as Szabo and Huberman (2010) and Lerman (2010) mainly relied on temporal engagement behaviour and early interaction measurements. These studies demonstrated that early popularity signals can strongly correlate with later outcomes, establishing the idea that online attention follows partially predictable growth patterns. However, these approaches treated prediction largely as a popularity estimation problem and relied heavily on engagement counts without deeply </w:t>
-      </w:r>
-      <w:proofErr w:type="spellStart"/>
-      <w:r>
-        <w:rPr>
-          <w:lang w:val="en-US"/>
-        </w:rPr>
-        <w:t>analysing</w:t>
-      </w:r>
-      <w:proofErr w:type="spellEnd"/>
-      <w:r>
-        <w:rPr>
-          <w:lang w:val="en-US"/>
-        </w:rPr>
-        <w:t xml:space="preserve"> the semantic meaning or contextual characteristics of online discussions.</w:t>
-      </w:r>
-    </w:p>
-    <w:p>
-      <w:pPr>
-        <w:tabs>
-          <w:tab w:val="left" w:pos="7128"/>
-          <w:tab w:val="right" w:pos="9026"/>
-        </w:tabs>
-        <w:rPr>
-          <w:lang w:val="en-US"/>
-        </w:rPr>
-      </w:pPr>
-      <w:r>
-        <w:rPr>
-          <w:lang w:val="en-US"/>
-        </w:rPr>
-        <w:t>Later research introduced machine learning and feature engineering approaches that expanded prediction beyond simple temporal measurements. Bandari et al. (2012), for example, demonstrated that content features and metadata characteristics can contribute valuable predictive information alongside interaction behaviour. This represented an important transition because it showed that trend-related behaviour may be influenced not only by how users interact with content, but also by the structure, topic, and linguistic properties of the content itself. Compared to earlier popularity prediction studies, machine learning approaches therefore provided more flexible predictive frameworks capable of integrating multiple feature categories.</w:t>
-      </w:r>
-    </w:p>
-    <w:p>
-      <w:pPr>
-        <w:tabs>
-          <w:tab w:val="left" w:pos="7128"/>
-          <w:tab w:val="right" w:pos="9026"/>
-        </w:tabs>
-        <w:rPr>
-          <w:lang w:val="en-US"/>
-        </w:rPr>
-      </w:pPr>
-      <w:r>
-        <w:rPr>
-          <w:lang w:val="en-US"/>
-        </w:rPr>
-        <w:t xml:space="preserve">Research involving sentiment analysis further expanded predictive modelling by introducing semantic and emotional understanding of social media discussions. Bollen et al. (2011) showed that collective mood extracted from Twitter data may contain predictive </w:t>
-      </w:r>
-      <w:proofErr w:type="spellStart"/>
-      <w:r>
-        <w:rPr>
-          <w:lang w:val="en-US"/>
-        </w:rPr>
-        <w:t>behavioural</w:t>
-      </w:r>
-      <w:proofErr w:type="spellEnd"/>
-      <w:r>
-        <w:rPr>
-          <w:lang w:val="en-US"/>
-        </w:rPr>
-        <w:t xml:space="preserve"> signals related to financial activity. This work highlighted the importance of textual meaning and emotional dynamics within social media environments, suggesting that public sentiment can influence or reflect emerging collective behaviour. This represents a major difference from purely engagement-based prediction because it considers not only how much users interact, but also what users are expressing emotionally and semantically.</w:t>
-      </w:r>
-    </w:p>
-    <w:p>
-      <w:pPr>
-        <w:tabs>
-          <w:tab w:val="left" w:pos="7128"/>
-          <w:tab w:val="right" w:pos="9026"/>
-        </w:tabs>
-        <w:rPr>
-          <w:lang w:val="en-US"/>
-        </w:rPr>
-      </w:pPr>
-      <w:r>
-        <w:rPr>
-          <w:lang w:val="en-US"/>
-        </w:rPr>
-        <w:lastRenderedPageBreak/>
-        <w:t xml:space="preserve">At the same time, diffusion and cascade prediction studies such as Cheng et al. (2014) demonstrated that trend formation is also influenced by how information spreads through networks of users. These approaches focused on structural propagation dynamics rather than only individual engagement measurements or textual content. By </w:t>
-      </w:r>
-      <w:proofErr w:type="spellStart"/>
-      <w:r>
-        <w:rPr>
-          <w:lang w:val="en-US"/>
-        </w:rPr>
-        <w:t>analysing</w:t>
-      </w:r>
-      <w:proofErr w:type="spellEnd"/>
-      <w:r>
-        <w:rPr>
-          <w:lang w:val="en-US"/>
-        </w:rPr>
-        <w:t xml:space="preserve"> resharing patterns and cascade growth behaviour, diffusion research provided deeper understanding of how discussions expand into large-scale social phenomena. This introduced a network-oriented perspective that complements temporal, engagement-based, and sentiment-based approaches.</w:t>
-      </w:r>
-    </w:p>
-    <w:p>
-      <w:pPr>
-        <w:tabs>
-          <w:tab w:val="left" w:pos="7128"/>
-          <w:tab w:val="right" w:pos="9026"/>
-        </w:tabs>
-        <w:rPr>
-          <w:lang w:val="en-US"/>
-        </w:rPr>
-      </w:pPr>
-      <w:r>
-        <w:rPr>
-          <w:lang w:val="en-US"/>
-        </w:rPr>
-        <w:t xml:space="preserve">Although these studies provide valuable insights, several important limitations and research gaps remain. One major limitation is that many previous studies focus primarily on predicting eventual popularity rather than detecting trend emergence during its earliest stages. Predicting whether content will become highly popular is related to, but not identical to, identifying whether a discussion is beginning to emerge as a trend. Trend emergence detection requires identifying subtle acceleration patterns and </w:t>
-      </w:r>
-      <w:proofErr w:type="spellStart"/>
-      <w:r>
-        <w:rPr>
-          <w:lang w:val="en-US"/>
-        </w:rPr>
-        <w:t>behavioural</w:t>
-      </w:r>
-      <w:proofErr w:type="spellEnd"/>
-      <w:r>
-        <w:rPr>
-          <w:lang w:val="en-US"/>
-        </w:rPr>
-        <w:t xml:space="preserve"> shifts before large-scale popularity has fully developed. Existing literature often focuses more strongly on final popularity outcomes than on this earlier prediction stage.</w:t>
-      </w:r>
-    </w:p>
-    <w:p>
-      <w:pPr>
-        <w:tabs>
-          <w:tab w:val="left" w:pos="7128"/>
-          <w:tab w:val="right" w:pos="9026"/>
-        </w:tabs>
-        <w:rPr>
-          <w:lang w:val="en-US"/>
-        </w:rPr>
-      </w:pPr>
-      <w:r>
-        <w:rPr>
-          <w:lang w:val="en-US"/>
-        </w:rPr>
-        <w:t>Another important limitation is that many studies rely heavily on a single category of predictive features. Early popularity prediction research focused mainly on temporal engagement signals, sentiment studies focused primarily on textual mood analysis, and diffusion research concentrated on network propagation behaviour. While these approaches individually provide useful insights, real-world social media trends are likely influenced by the interaction of multiple factors simultaneously. Temporal growth, engagement behaviour, sentiment shifts, and diffusion dynamics may all contribute to trend emergence together rather than independently. This creates a need for more integrated predictive modelling approaches.</w:t>
-      </w:r>
-    </w:p>
-    <w:p>
-      <w:pPr>
-        <w:tabs>
-          <w:tab w:val="left" w:pos="7128"/>
-          <w:tab w:val="right" w:pos="9026"/>
-        </w:tabs>
-        <w:rPr>
-          <w:lang w:val="en-US"/>
-        </w:rPr>
-      </w:pPr>
-      <w:r>
-        <w:rPr>
-          <w:lang w:val="en-US"/>
-        </w:rPr>
-        <w:t xml:space="preserve">Practical implementation challenges also appear repeatedly throughout </w:t>
-      </w:r>
-      <w:proofErr w:type="gramStart"/>
-      <w:r>
-        <w:rPr>
-          <w:lang w:val="en-US"/>
-        </w:rPr>
-        <w:t>the literature</w:t>
-      </w:r>
-      <w:proofErr w:type="gramEnd"/>
-      <w:r>
-        <w:rPr>
-          <w:lang w:val="en-US"/>
-        </w:rPr>
-        <w:t>. Several advanced approaches, particularly large-scale diffusion and industrial recommendation systems, depend on extensive datasets, detailed network structures, or computational resources that may be difficult to reproduce within smaller academic projects. For example, cascade prediction methods often require detailed graph-based user relationship data that may not be publicly accessible due to privacy and platform restrictions. Similarly, industrial-scale systems such as those developed by large technology companies may involve infrastructure and datasets beyond the scope of student-level research. These limitations highlight the importance of designing predictive systems that remain both academically meaningful and practically achievable.</w:t>
-      </w:r>
-    </w:p>
-    <w:p>
-      <w:pPr>
-        <w:tabs>
-          <w:tab w:val="left" w:pos="7128"/>
-          <w:tab w:val="right" w:pos="9026"/>
-        </w:tabs>
-        <w:rPr>
-          <w:lang w:val="en-US"/>
-        </w:rPr>
-      </w:pPr>
-      <w:r>
-        <w:rPr>
-          <w:lang w:val="en-US"/>
-        </w:rPr>
-        <w:t xml:space="preserve">Another gap in </w:t>
-      </w:r>
-      <w:proofErr w:type="gramStart"/>
-      <w:r>
-        <w:rPr>
-          <w:lang w:val="en-US"/>
-        </w:rPr>
-        <w:t>the literature</w:t>
-      </w:r>
-      <w:proofErr w:type="gramEnd"/>
-      <w:r>
-        <w:rPr>
-          <w:lang w:val="en-US"/>
-        </w:rPr>
-        <w:t xml:space="preserve"> is the relatively limited focus on finance-related </w:t>
-      </w:r>
-      <w:proofErr w:type="gramStart"/>
-      <w:r>
-        <w:rPr>
-          <w:lang w:val="en-US"/>
-        </w:rPr>
-        <w:t>trend</w:t>
-      </w:r>
-      <w:proofErr w:type="gramEnd"/>
-      <w:r>
-        <w:rPr>
-          <w:lang w:val="en-US"/>
-        </w:rPr>
-        <w:t xml:space="preserve"> emergence specifically. While Bollen et al. (2011) examined social media mood in </w:t>
-      </w:r>
-      <w:r>
-        <w:rPr>
-          <w:lang w:val="en-US"/>
-        </w:rPr>
-        <w:lastRenderedPageBreak/>
-        <w:t xml:space="preserve">relation to financial markets, much of the broader literature studies general popularity or information diffusion without concentrating specifically on financial discussion trends. Financial social media environments may behave differently from general entertainment or news-sharing platforms because they are strongly influenced by speculation, public sentiment, rapid reactions to events, and collective </w:t>
-      </w:r>
-      <w:proofErr w:type="spellStart"/>
-      <w:r>
-        <w:rPr>
-          <w:lang w:val="en-US"/>
-        </w:rPr>
-        <w:t>behavioural</w:t>
-      </w:r>
-      <w:proofErr w:type="spellEnd"/>
-      <w:r>
-        <w:rPr>
-          <w:lang w:val="en-US"/>
-        </w:rPr>
-        <w:t xml:space="preserve"> dynamics. This creates opportunities for more focused predictive modelling research within finance-related online discussions.</w:t>
-      </w:r>
-    </w:p>
-    <w:p>
-      <w:pPr>
-        <w:tabs>
-          <w:tab w:val="left" w:pos="7128"/>
-          <w:tab w:val="right" w:pos="9026"/>
-        </w:tabs>
-        <w:rPr>
-          <w:lang w:val="en-US"/>
-        </w:rPr>
-      </w:pPr>
-      <w:r>
-        <w:rPr>
-          <w:lang w:val="en-US"/>
-        </w:rPr>
-        <w:t xml:space="preserve">The literature therefore supports the direction of the proposed project in several ways. First, previous studies justify the use of temporal and engagement-based features for identifying early </w:t>
-      </w:r>
-      <w:proofErr w:type="spellStart"/>
-      <w:r>
-        <w:rPr>
-          <w:lang w:val="en-US"/>
-        </w:rPr>
-        <w:t>behavioural</w:t>
-      </w:r>
-      <w:proofErr w:type="spellEnd"/>
-      <w:r>
-        <w:rPr>
-          <w:lang w:val="en-US"/>
-        </w:rPr>
-        <w:t xml:space="preserve"> signals. Second, machine learning and sentiment analysis research support integrating textual and semantic information into predictive models. Third, diffusion research demonstrates the importance of </w:t>
-      </w:r>
-      <w:proofErr w:type="spellStart"/>
-      <w:r>
-        <w:rPr>
-          <w:lang w:val="en-US"/>
-        </w:rPr>
-        <w:t>analysing</w:t>
-      </w:r>
-      <w:proofErr w:type="spellEnd"/>
-      <w:r>
-        <w:rPr>
-          <w:lang w:val="en-US"/>
-        </w:rPr>
-        <w:t xml:space="preserve"> how discussions spread dynamically across online environments. However, the limitations identified across the literature also suggest the need for a more practical and integrated predictive modelling approach.</w:t>
-      </w:r>
-    </w:p>
-    <w:p>
-      <w:pPr>
-        <w:tabs>
-          <w:tab w:val="left" w:pos="7128"/>
-          <w:tab w:val="right" w:pos="9026"/>
-        </w:tabs>
-        <w:rPr>
-          <w:lang w:val="en-US"/>
-        </w:rPr>
-      </w:pPr>
-      <w:r>
-        <w:rPr>
-          <w:lang w:val="en-US"/>
-        </w:rPr>
-        <w:t xml:space="preserve">The proposed project aims to address these gaps by developing a predictive model focused specifically on early-stage social media trend emergence within the finance domain. Rather than relying on only one predictive dimension, the project intends to combine temporal, engagement, and sentiment-based features within a manageable machine learning framework. In contrast to large-scale industrial systems or highly complex graph-based diffusion models, the project also </w:t>
-      </w:r>
-      <w:proofErr w:type="spellStart"/>
-      <w:r>
-        <w:rPr>
-          <w:lang w:val="en-US"/>
-        </w:rPr>
-        <w:t>prioritises</w:t>
-      </w:r>
-      <w:proofErr w:type="spellEnd"/>
-      <w:r>
-        <w:rPr>
-          <w:lang w:val="en-US"/>
-        </w:rPr>
-        <w:t xml:space="preserve"> practical feasibility while still incorporating concepts established in previous research. Through this approach, the project seeks to build upon the strengths of earlier studies while addressing some of their limitations regarding feature integration, early-stage prediction, and practical implementation scope.</w:t>
-      </w:r>
-    </w:p>
-    <w:p>
-      <w:pPr>
-        <w:pStyle w:val="Heading2"/>
-        <w:rPr>
-          <w:lang w:val="en-US"/>
-        </w:rPr>
-        <w:pPrChange w:id="5" w:author="Hieu Nguyen" w:date="2026-05-22T20:01:00Z" w16du:dateUtc="2026-05-22T13:01:00Z">
-          <w:pPr>
-            <w:tabs>
-              <w:tab w:val="left" w:pos="7128"/>
-              <w:tab w:val="right" w:pos="9026"/>
-            </w:tabs>
-          </w:pPr>
-        </w:pPrChange>
-      </w:pPr>
-      <w:r>
-        <w:rPr>
-          <w:lang w:val="en-US"/>
-        </w:rPr>
-        <w:t>7. Conclusion</w:t>
-      </w:r>
-    </w:p>
-    <w:p>
-      <w:pPr>
-        <w:tabs>
-          <w:tab w:val="left" w:pos="7128"/>
-          <w:tab w:val="right" w:pos="9026"/>
-        </w:tabs>
-        <w:rPr>
-          <w:lang w:val="en-US"/>
-        </w:rPr>
-      </w:pPr>
-      <w:r>
-        <w:rPr>
-          <w:lang w:val="en-US"/>
-        </w:rPr>
-        <w:t>The literature reviewed in this survey demonstrates that social media prediction has evolved through several important stages, beginning with early popularity prediction research and later expanding into machine learning, sentiment analysis, and diffusion modelling approaches. Together, these studies provide a strong theoretical and methodological foundation for understanding how online discussions develop, spread, and potentially evolve into large-scale trends.</w:t>
-      </w:r>
-    </w:p>
-    <w:p>
-      <w:pPr>
-        <w:tabs>
-          <w:tab w:val="left" w:pos="7128"/>
-          <w:tab w:val="right" w:pos="9026"/>
-        </w:tabs>
-        <w:rPr>
-          <w:lang w:val="en-US"/>
-        </w:rPr>
-      </w:pPr>
-      <w:r>
-        <w:rPr>
-          <w:lang w:val="en-US"/>
-        </w:rPr>
-        <w:t xml:space="preserve">Early popularity prediction research, particularly the work of Szabo and Huberman (2010) and Lerman (2010), established that early engagement behaviour and temporal growth patterns contain valuable predictive information. These studies showed that online attention is not entirely random and that early user interaction measurements can help estimate future popularity outcomes. However, these approaches mainly focused on popularity magnitude and relied heavily on engagement-based indicators </w:t>
-      </w:r>
-      <w:r>
-        <w:rPr>
-          <w:lang w:val="en-US"/>
-        </w:rPr>
-        <w:lastRenderedPageBreak/>
-        <w:t>without incorporating deeper semantic understanding or multi-dimensional feature integration.</w:t>
-      </w:r>
-    </w:p>
-    <w:p>
-      <w:pPr>
-        <w:tabs>
-          <w:tab w:val="left" w:pos="7128"/>
-          <w:tab w:val="right" w:pos="9026"/>
-        </w:tabs>
-        <w:rPr>
-          <w:lang w:val="en-US"/>
-        </w:rPr>
-      </w:pPr>
-      <w:r>
-        <w:rPr>
-          <w:lang w:val="en-US"/>
-        </w:rPr>
-        <w:t xml:space="preserve">Machine learning and content-based prediction research, represented by Bandari et al. (2012), expanded predictive modelling beyond simple temporal analysis by introducing feature engineering approaches using content and metadata characteristics. This demonstrated that predictive systems </w:t>
-      </w:r>
-      <w:proofErr w:type="gramStart"/>
-      <w:r>
-        <w:rPr>
-          <w:lang w:val="en-US"/>
-        </w:rPr>
-        <w:t>can</w:t>
-      </w:r>
-      <w:proofErr w:type="gramEnd"/>
-      <w:r>
-        <w:rPr>
-          <w:lang w:val="en-US"/>
-        </w:rPr>
-        <w:t xml:space="preserve"> benefit from combining multiple types of information rather than relying on a single predictive signal. Meanwhile, sentiment analysis research such as Bollen et al. (2011) introduced the importance of emotional and semantic information within social media discussions, showing that collective mood and textual sentiment may also provide predictive insights, particularly within finance-related environments.</w:t>
-      </w:r>
-    </w:p>
-    <w:p>
-      <w:pPr>
-        <w:tabs>
-          <w:tab w:val="left" w:pos="7128"/>
-          <w:tab w:val="right" w:pos="9026"/>
-        </w:tabs>
-        <w:rPr>
-          <w:lang w:val="en-US"/>
-        </w:rPr>
-      </w:pPr>
-      <w:r>
-        <w:rPr>
-          <w:lang w:val="en-US"/>
-        </w:rPr>
-        <w:t xml:space="preserve">Diffusion and cascade prediction studies, including Cheng et al. (2014), further extended this understanding by examining how information spreads through social networks. These studies demonstrated that trend formation is influenced not only by content popularity or sentiment, but also by dynamic </w:t>
-      </w:r>
-      <w:proofErr w:type="gramStart"/>
-      <w:r>
-        <w:rPr>
-          <w:lang w:val="en-US"/>
-        </w:rPr>
-        <w:t>propagation behaviour</w:t>
-      </w:r>
-      <w:proofErr w:type="gramEnd"/>
-      <w:r>
-        <w:rPr>
-          <w:lang w:val="en-US"/>
-        </w:rPr>
-        <w:t xml:space="preserve"> </w:t>
-      </w:r>
-      <w:proofErr w:type="gramStart"/>
-      <w:r>
-        <w:rPr>
-          <w:lang w:val="en-US"/>
-        </w:rPr>
-        <w:t>and user</w:t>
-      </w:r>
-      <w:proofErr w:type="gramEnd"/>
-      <w:r>
-        <w:rPr>
-          <w:lang w:val="en-US"/>
-        </w:rPr>
-        <w:t xml:space="preserve"> interaction structures. This research highlighted the importance of considering social diffusion processes when </w:t>
-      </w:r>
-      <w:proofErr w:type="spellStart"/>
-      <w:r>
-        <w:rPr>
-          <w:lang w:val="en-US"/>
-        </w:rPr>
-        <w:t>analysing</w:t>
-      </w:r>
-      <w:proofErr w:type="spellEnd"/>
-      <w:r>
-        <w:rPr>
-          <w:lang w:val="en-US"/>
-        </w:rPr>
-        <w:t xml:space="preserve"> how online trends emerge and expand.</w:t>
-      </w:r>
-    </w:p>
-    <w:p>
-      <w:pPr>
-        <w:tabs>
-          <w:tab w:val="left" w:pos="7128"/>
-          <w:tab w:val="right" w:pos="9026"/>
-        </w:tabs>
-        <w:rPr>
-          <w:lang w:val="en-US"/>
-        </w:rPr>
-      </w:pPr>
-      <w:r>
-        <w:rPr>
-          <w:lang w:val="en-US"/>
-        </w:rPr>
-        <w:t xml:space="preserve">Despite these advances, </w:t>
-      </w:r>
-      <w:proofErr w:type="gramStart"/>
-      <w:r>
-        <w:rPr>
-          <w:lang w:val="en-US"/>
-        </w:rPr>
-        <w:t>the literature</w:t>
-      </w:r>
-      <w:proofErr w:type="gramEnd"/>
-      <w:r>
-        <w:rPr>
-          <w:lang w:val="en-US"/>
-        </w:rPr>
-        <w:t xml:space="preserve"> also reveals several important limitations. Many previous studies focus primarily on predicting eventual popularity rather than detecting early-stage trend emergence. In addition, many approaches depend heavily on a single category of features, such as temporal engagement, sentiment, or diffusion structure, rather than integrating multiple predictive dimensions together. Some advanced methods also require large-scale industrial datasets, extensive network information, or computational resources that may not be practical for smaller academic projects.</w:t>
-      </w:r>
-    </w:p>
-    <w:p>
-      <w:pPr>
-        <w:tabs>
-          <w:tab w:val="left" w:pos="7128"/>
-          <w:tab w:val="right" w:pos="9026"/>
-        </w:tabs>
-        <w:rPr>
-          <w:lang w:val="en-US"/>
-        </w:rPr>
-      </w:pPr>
-      <w:r>
-        <w:rPr>
-          <w:lang w:val="en-US"/>
-        </w:rPr>
-        <w:t>These gaps justify the direction of the proposed project. The project aims to build upon previous research by developing a predictive modelling approach focused specifically on the early detection of finance-related social media trend emergence. Rather than relying on only one predictive perspective, the project intends to combine temporal, engagement, and sentiment-based features within a manageable machine learning framework. This approach attempts to balance academic relevance, practical feasibility, and methodological integration while remaining achievable within the scope of a student project.</w:t>
-      </w:r>
-    </w:p>
-    <w:p>
-      <w:pPr>
-        <w:tabs>
-          <w:tab w:val="left" w:pos="7128"/>
-          <w:tab w:val="right" w:pos="9026"/>
-        </w:tabs>
-        <w:rPr>
-          <w:lang w:val="en-US"/>
-        </w:rPr>
-      </w:pPr>
-      <w:r>
-        <w:rPr>
-          <w:lang w:val="en-US"/>
-        </w:rPr>
-        <w:t xml:space="preserve">Overall, the literature suggests that early trend detection is a realistic and meaningful research problem, but also one that remains challenging due to the dynamic and multi-dimensional nature of social media behaviour. By combining insights from early popularity prediction, machine learning, sentiment analysis, and diffusion research, the proposed project aims to contribute a practical predictive modelling approach for </w:t>
-      </w:r>
-      <w:r>
-        <w:rPr>
-          <w:lang w:val="en-US"/>
-        </w:rPr>
-        <w:lastRenderedPageBreak/>
-        <w:t>understanding and identifying emerging financial discussions on social media platforms.</w:t>
+        <w:t>dimensional nature of social media behaviour. By combining insights from early popularity prediction, machine learning, sentiment analysis, and diffusion research, the proposed project aims to contribute a practical predictive modelling approach for understanding and identifying emerging financial discussions on social media platforms.</w:t>
       </w:r>
     </w:p>
     <w:p>
@@ -1828,6 +2379,12 @@
       </w:r>
     </w:p>
     <w:sectPr>
+      <w:headerReference w:type="even" r:id="rId8"/>
+      <w:headerReference w:type="default" r:id="rId9"/>
+      <w:footerReference w:type="even" r:id="rId10"/>
+      <w:footerReference w:type="default" r:id="rId11"/>
+      <w:headerReference w:type="first" r:id="rId12"/>
+      <w:footerReference w:type="first" r:id="rId13"/>
       <w:pgSz w:w="11906" w:h="16838"/>
       <w:pgMar w:top="1440" w:right="1440" w:bottom="1440" w:left="1440" w:header="708" w:footer="708" w:gutter="0"/>
       <w:cols w:space="708"/>
@@ -1835,6 +2392,171 @@
     </w:sectPr>
   </w:body>
 </w:document>
+</file>
+
+<file path=word/endnotes.xml><?xml version="1.0" encoding="utf-8"?>
+<w:endnotes xmlns:wpc="http://schemas.microsoft.com/office/word/2010/wordprocessingCanvas" xmlns:cx="http://schemas.microsoft.com/office/drawing/2014/chartex" xmlns:cx1="http://schemas.microsoft.com/office/drawing/2015/9/8/chartex" xmlns:cx2="http://schemas.microsoft.com/office/drawing/2015/10/21/chartex" xmlns:cx3="http://schemas.microsoft.com/office/drawing/2016/5/9/chartex" xmlns:cx4="http://schemas.microsoft.com/office/drawing/2016/5/10/chartex" xmlns:cx5="http://schemas.microsoft.com/office/drawing/2016/5/11/chartex" xmlns:cx6="http://schemas.microsoft.com/office/drawing/2016/5/12/chartex" xmlns:cx7="http://schemas.microsoft.com/office/drawing/2016/5/13/chartex" xmlns:cx8="http://schemas.microsoft.com/office/drawing/2016/5/14/chartex" xmlns:mc="http://schemas.openxmlformats.org/markup-compatibility/2006" xmlns:aink="http://schemas.microsoft.com/office/drawing/2016/ink" xmlns:am3d="http://schemas.microsoft.com/office/drawing/2017/model3d" xmlns:o="urn:schemas-microsoft-com:office:office" xmlns:oel="http://schemas.microsoft.com/office/2019/extlst" xmlns:r="http://schemas.openxmlformats.org/officeDocument/2006/relationships" xmlns:m="http://schemas.openxmlformats.org/officeDocument/2006/math" xmlns:v="urn:schemas-microsoft-com:vml" xmlns:wp14="http://schemas.microsoft.com/office/word/2010/wordprocessingDrawing" xmlns:wp="http://schemas.openxmlformats.org/drawingml/2006/wordprocessingDrawing" xmlns:w10="urn:schemas-microsoft-com:office:word" xmlns:w="http://schemas.openxmlformats.org/wordprocessingml/2006/main" xmlns:w14="http://schemas.microsoft.com/office/word/2010/wordml" xmlns:w15="http://schemas.microsoft.com/office/word/2012/wordml" xmlns:w16cex="http://schemas.microsoft.com/office/word/2018/wordml/cex" xmlns:w16cid="http://schemas.microsoft.com/office/word/2016/wordml/cid" xmlns:w16="http://schemas.microsoft.com/office/word/2018/wordml" xmlns:w16du="http://schemas.microsoft.com/office/word/2023/wordml/word16du" xmlns:w16sdtdh="http://schemas.microsoft.com/office/word/2020/wordml/sdtdatahash" xmlns:w16sdtfl="http://schemas.microsoft.com/office/word/2024/wordml/sdtformatlock" xmlns:w16se="http://schemas.microsoft.com/office/word/2015/wordml/symex" xmlns:wpg="http://schemas.microsoft.com/office/word/2010/wordprocessingGroup" xmlns:wpi="http://schemas.microsoft.com/office/word/2010/wordprocessingInk" xmlns:wne="http://schemas.microsoft.com/office/word/2006/wordml" xmlns:wps="http://schemas.microsoft.com/office/word/2010/wordprocessingShape" mc:Ignorable="w14 w15 w16se w16cid w16 w16cex w16sdtdh w16sdtfl w16du wp14">
+  <w:endnote w:type="separator" w:id="-1">
+    <w:p>
+      <w:pPr>
+        <w:spacing w:after="0" w:line="240" w:lineRule="auto"/>
+      </w:pPr>
+      <w:r>
+        <w:separator/>
+      </w:r>
+    </w:p>
+  </w:endnote>
+  <w:endnote w:type="continuationSeparator" w:id="0">
+    <w:p>
+      <w:pPr>
+        <w:spacing w:after="0" w:line="240" w:lineRule="auto"/>
+      </w:pPr>
+      <w:r>
+        <w:continuationSeparator/>
+      </w:r>
+    </w:p>
+  </w:endnote>
+</w:endnotes>
+</file>
+
+<file path=word/footer1.xml><?xml version="1.0" encoding="utf-8"?>
+<w:ftr xmlns:wpc="http://schemas.microsoft.com/office/word/2010/wordprocessingCanvas" xmlns:cx="http://schemas.microsoft.com/office/drawing/2014/chartex" xmlns:cx1="http://schemas.microsoft.com/office/drawing/2015/9/8/chartex" xmlns:cx2="http://schemas.microsoft.com/office/drawing/2015/10/21/chartex" xmlns:cx3="http://schemas.microsoft.com/office/drawing/2016/5/9/chartex" xmlns:cx4="http://schemas.microsoft.com/office/drawing/2016/5/10/chartex" xmlns:cx5="http://schemas.microsoft.com/office/drawing/2016/5/11/chartex" xmlns:cx6="http://schemas.microsoft.com/office/drawing/2016/5/12/chartex" xmlns:cx7="http://schemas.microsoft.com/office/drawing/2016/5/13/chartex" xmlns:cx8="http://schemas.microsoft.com/office/drawing/2016/5/14/chartex" xmlns:mc="http://schemas.openxmlformats.org/markup-compatibility/2006" xmlns:aink="http://schemas.microsoft.com/office/drawing/2016/ink" xmlns:am3d="http://schemas.microsoft.com/office/drawing/2017/model3d" xmlns:o="urn:schemas-microsoft-com:office:office" xmlns:oel="http://schemas.microsoft.com/office/2019/extlst" xmlns:r="http://schemas.openxmlformats.org/officeDocument/2006/relationships" xmlns:m="http://schemas.openxmlformats.org/officeDocument/2006/math" xmlns:v="urn:schemas-microsoft-com:vml" xmlns:wp14="http://schemas.microsoft.com/office/word/2010/wordprocessingDrawing" xmlns:wp="http://schemas.openxmlformats.org/drawingml/2006/wordprocessingDrawing" xmlns:w10="urn:schemas-microsoft-com:office:word" xmlns:w="http://schemas.openxmlformats.org/wordprocessingml/2006/main" xmlns:w14="http://schemas.microsoft.com/office/word/2010/wordml" xmlns:w15="http://schemas.microsoft.com/office/word/2012/wordml" xmlns:w16cex="http://schemas.microsoft.com/office/word/2018/wordml/cex" xmlns:w16cid="http://schemas.microsoft.com/office/word/2016/wordml/cid" xmlns:w16="http://schemas.microsoft.com/office/word/2018/wordml" xmlns:w16du="http://schemas.microsoft.com/office/word/2023/wordml/word16du" xmlns:w16sdtdh="http://schemas.microsoft.com/office/word/2020/wordml/sdtdatahash" xmlns:w16sdtfl="http://schemas.microsoft.com/office/word/2024/wordml/sdtformatlock" xmlns:w16se="http://schemas.microsoft.com/office/word/2015/wordml/symex" xmlns:wpg="http://schemas.microsoft.com/office/word/2010/wordprocessingGroup" xmlns:wpi="http://schemas.microsoft.com/office/word/2010/wordprocessingInk" xmlns:wne="http://schemas.microsoft.com/office/word/2006/wordml" xmlns:wps="http://schemas.microsoft.com/office/word/2010/wordprocessingShape" mc:Ignorable="w14 w15 w16se w16cid w16 w16cex w16sdtdh w16sdtfl w16du wp14">
+  <w:p>
+    <w:pPr>
+      <w:pStyle w:val="Footer"/>
+    </w:pPr>
+  </w:p>
+</w:ftr>
+</file>
+
+<file path=word/footer2.xml><?xml version="1.0" encoding="utf-8"?>
+<w:ftr xmlns:wpc="http://schemas.microsoft.com/office/word/2010/wordprocessingCanvas" xmlns:cx="http://schemas.microsoft.com/office/drawing/2014/chartex" xmlns:cx1="http://schemas.microsoft.com/office/drawing/2015/9/8/chartex" xmlns:cx2="http://schemas.microsoft.com/office/drawing/2015/10/21/chartex" xmlns:cx3="http://schemas.microsoft.com/office/drawing/2016/5/9/chartex" xmlns:cx4="http://schemas.microsoft.com/office/drawing/2016/5/10/chartex" xmlns:cx5="http://schemas.microsoft.com/office/drawing/2016/5/11/chartex" xmlns:cx6="http://schemas.microsoft.com/office/drawing/2016/5/12/chartex" xmlns:cx7="http://schemas.microsoft.com/office/drawing/2016/5/13/chartex" xmlns:cx8="http://schemas.microsoft.com/office/drawing/2016/5/14/chartex" xmlns:mc="http://schemas.openxmlformats.org/markup-compatibility/2006" xmlns:aink="http://schemas.microsoft.com/office/drawing/2016/ink" xmlns:am3d="http://schemas.microsoft.com/office/drawing/2017/model3d" xmlns:o="urn:schemas-microsoft-com:office:office" xmlns:oel="http://schemas.microsoft.com/office/2019/extlst" xmlns:r="http://schemas.openxmlformats.org/officeDocument/2006/relationships" xmlns:m="http://schemas.openxmlformats.org/officeDocument/2006/math" xmlns:v="urn:schemas-microsoft-com:vml" xmlns:wp14="http://schemas.microsoft.com/office/word/2010/wordprocessingDrawing" xmlns:wp="http://schemas.openxmlformats.org/drawingml/2006/wordprocessingDrawing" xmlns:w10="urn:schemas-microsoft-com:office:word" xmlns:w="http://schemas.openxmlformats.org/wordprocessingml/2006/main" xmlns:w14="http://schemas.microsoft.com/office/word/2010/wordml" xmlns:w15="http://schemas.microsoft.com/office/word/2012/wordml" xmlns:w16cex="http://schemas.microsoft.com/office/word/2018/wordml/cex" xmlns:w16cid="http://schemas.microsoft.com/office/word/2016/wordml/cid" xmlns:w16="http://schemas.microsoft.com/office/word/2018/wordml" xmlns:w16du="http://schemas.microsoft.com/office/word/2023/wordml/word16du" xmlns:w16sdtdh="http://schemas.microsoft.com/office/word/2020/wordml/sdtdatahash" xmlns:w16sdtfl="http://schemas.microsoft.com/office/word/2024/wordml/sdtformatlock" xmlns:w16se="http://schemas.microsoft.com/office/word/2015/wordml/symex" xmlns:wpg="http://schemas.microsoft.com/office/word/2010/wordprocessingGroup" xmlns:wpi="http://schemas.microsoft.com/office/word/2010/wordprocessingInk" xmlns:wne="http://schemas.microsoft.com/office/word/2006/wordml" xmlns:wps="http://schemas.microsoft.com/office/word/2010/wordprocessingShape" mc:Ignorable="w14 w15 w16se w16cid w16 w16cex w16sdtdh w16sdtfl w16du wp14">
+  <w:p>
+    <w:pPr>
+      <w:pStyle w:val="Footer"/>
+      <w:tabs>
+        <w:tab w:val="clear" w:pos="4680"/>
+        <w:tab w:val="clear" w:pos="9360"/>
+      </w:tabs>
+      <w:jc w:val="center"/>
+      <w:rPr>
+        <w:ins w:id="41" w:author="Hieu Nguyen" w:date="2026-05-22T20:43:00Z" w16du:dateUtc="2026-05-22T13:43:00Z"/>
+        <w:caps/>
+        <w:noProof/>
+        <w:color w:val="156082" w:themeColor="accent1"/>
+      </w:rPr>
+    </w:pPr>
+    <w:ins w:id="42" w:author="Hieu Nguyen" w:date="2026-05-22T20:43:00Z" w16du:dateUtc="2026-05-22T13:43:00Z">
+      <w:r>
+        <w:rPr>
+          <w:caps/>
+          <w:color w:val="156082" w:themeColor="accent1"/>
+        </w:rPr>
+        <w:fldChar w:fldCharType="begin"/>
+      </w:r>
+      <w:r>
+        <w:rPr>
+          <w:caps/>
+          <w:color w:val="156082" w:themeColor="accent1"/>
+        </w:rPr>
+        <w:instrText xml:space="preserve"> PAGE   \* MERGEFORMAT </w:instrText>
+      </w:r>
+      <w:r>
+        <w:rPr>
+          <w:caps/>
+          <w:color w:val="156082" w:themeColor="accent1"/>
+        </w:rPr>
+        <w:fldChar w:fldCharType="separate"/>
+      </w:r>
+      <w:r>
+        <w:rPr>
+          <w:caps/>
+          <w:noProof/>
+          <w:color w:val="156082" w:themeColor="accent1"/>
+        </w:rPr>
+        <w:t>2</w:t>
+      </w:r>
+      <w:r>
+        <w:rPr>
+          <w:caps/>
+          <w:noProof/>
+          <w:color w:val="156082" w:themeColor="accent1"/>
+        </w:rPr>
+        <w:fldChar w:fldCharType="end"/>
+      </w:r>
+    </w:ins>
+  </w:p>
+  <w:p>
+    <w:pPr>
+      <w:pStyle w:val="Footer"/>
+    </w:pPr>
+  </w:p>
+</w:ftr>
+</file>
+
+<file path=word/footer3.xml><?xml version="1.0" encoding="utf-8"?>
+<w:ftr xmlns:wpc="http://schemas.microsoft.com/office/word/2010/wordprocessingCanvas" xmlns:cx="http://schemas.microsoft.com/office/drawing/2014/chartex" xmlns:cx1="http://schemas.microsoft.com/office/drawing/2015/9/8/chartex" xmlns:cx2="http://schemas.microsoft.com/office/drawing/2015/10/21/chartex" xmlns:cx3="http://schemas.microsoft.com/office/drawing/2016/5/9/chartex" xmlns:cx4="http://schemas.microsoft.com/office/drawing/2016/5/10/chartex" xmlns:cx5="http://schemas.microsoft.com/office/drawing/2016/5/11/chartex" xmlns:cx6="http://schemas.microsoft.com/office/drawing/2016/5/12/chartex" xmlns:cx7="http://schemas.microsoft.com/office/drawing/2016/5/13/chartex" xmlns:cx8="http://schemas.microsoft.com/office/drawing/2016/5/14/chartex" xmlns:mc="http://schemas.openxmlformats.org/markup-compatibility/2006" xmlns:aink="http://schemas.microsoft.com/office/drawing/2016/ink" xmlns:am3d="http://schemas.microsoft.com/office/drawing/2017/model3d" xmlns:o="urn:schemas-microsoft-com:office:office" xmlns:oel="http://schemas.microsoft.com/office/2019/extlst" xmlns:r="http://schemas.openxmlformats.org/officeDocument/2006/relationships" xmlns:m="http://schemas.openxmlformats.org/officeDocument/2006/math" xmlns:v="urn:schemas-microsoft-com:vml" xmlns:wp14="http://schemas.microsoft.com/office/word/2010/wordprocessingDrawing" xmlns:wp="http://schemas.openxmlformats.org/drawingml/2006/wordprocessingDrawing" xmlns:w10="urn:schemas-microsoft-com:office:word" xmlns:w="http://schemas.openxmlformats.org/wordprocessingml/2006/main" xmlns:w14="http://schemas.microsoft.com/office/word/2010/wordml" xmlns:w15="http://schemas.microsoft.com/office/word/2012/wordml" xmlns:w16cex="http://schemas.microsoft.com/office/word/2018/wordml/cex" xmlns:w16cid="http://schemas.microsoft.com/office/word/2016/wordml/cid" xmlns:w16="http://schemas.microsoft.com/office/word/2018/wordml" xmlns:w16du="http://schemas.microsoft.com/office/word/2023/wordml/word16du" xmlns:w16sdtdh="http://schemas.microsoft.com/office/word/2020/wordml/sdtdatahash" xmlns:w16sdtfl="http://schemas.microsoft.com/office/word/2024/wordml/sdtformatlock" xmlns:w16se="http://schemas.microsoft.com/office/word/2015/wordml/symex" xmlns:wpg="http://schemas.microsoft.com/office/word/2010/wordprocessingGroup" xmlns:wpi="http://schemas.microsoft.com/office/word/2010/wordprocessingInk" xmlns:wne="http://schemas.microsoft.com/office/word/2006/wordml" xmlns:wps="http://schemas.microsoft.com/office/word/2010/wordprocessingShape" mc:Ignorable="w14 w15 w16se w16cid w16 w16cex w16sdtdh w16sdtfl w16du wp14">
+  <w:p>
+    <w:pPr>
+      <w:pStyle w:val="Footer"/>
+    </w:pPr>
+  </w:p>
+</w:ftr>
+</file>
+
+<file path=word/footnotes.xml><?xml version="1.0" encoding="utf-8"?>
+<w:footnotes xmlns:wpc="http://schemas.microsoft.com/office/word/2010/wordprocessingCanvas" xmlns:cx="http://schemas.microsoft.com/office/drawing/2014/chartex" xmlns:cx1="http://schemas.microsoft.com/office/drawing/2015/9/8/chartex" xmlns:cx2="http://schemas.microsoft.com/office/drawing/2015/10/21/chartex" xmlns:cx3="http://schemas.microsoft.com/office/drawing/2016/5/9/chartex" xmlns:cx4="http://schemas.microsoft.com/office/drawing/2016/5/10/chartex" xmlns:cx5="http://schemas.microsoft.com/office/drawing/2016/5/11/chartex" xmlns:cx6="http://schemas.microsoft.com/office/drawing/2016/5/12/chartex" xmlns:cx7="http://schemas.microsoft.com/office/drawing/2016/5/13/chartex" xmlns:cx8="http://schemas.microsoft.com/office/drawing/2016/5/14/chartex" xmlns:mc="http://schemas.openxmlformats.org/markup-compatibility/2006" xmlns:aink="http://schemas.microsoft.com/office/drawing/2016/ink" xmlns:am3d="http://schemas.microsoft.com/office/drawing/2017/model3d" xmlns:o="urn:schemas-microsoft-com:office:office" xmlns:oel="http://schemas.microsoft.com/office/2019/extlst" xmlns:r="http://schemas.openxmlformats.org/officeDocument/2006/relationships" xmlns:m="http://schemas.openxmlformats.org/officeDocument/2006/math" xmlns:v="urn:schemas-microsoft-com:vml" xmlns:wp14="http://schemas.microsoft.com/office/word/2010/wordprocessingDrawing" xmlns:wp="http://schemas.openxmlformats.org/drawingml/2006/wordprocessingDrawing" xmlns:w10="urn:schemas-microsoft-com:office:word" xmlns:w="http://schemas.openxmlformats.org/wordprocessingml/2006/main" xmlns:w14="http://schemas.microsoft.com/office/word/2010/wordml" xmlns:w15="http://schemas.microsoft.com/office/word/2012/wordml" xmlns:w16cex="http://schemas.microsoft.com/office/word/2018/wordml/cex" xmlns:w16cid="http://schemas.microsoft.com/office/word/2016/wordml/cid" xmlns:w16="http://schemas.microsoft.com/office/word/2018/wordml" xmlns:w16du="http://schemas.microsoft.com/office/word/2023/wordml/word16du" xmlns:w16sdtdh="http://schemas.microsoft.com/office/word/2020/wordml/sdtdatahash" xmlns:w16sdtfl="http://schemas.microsoft.com/office/word/2024/wordml/sdtformatlock" xmlns:w16se="http://schemas.microsoft.com/office/word/2015/wordml/symex" xmlns:wpg="http://schemas.microsoft.com/office/word/2010/wordprocessingGroup" xmlns:wpi="http://schemas.microsoft.com/office/word/2010/wordprocessingInk" xmlns:wne="http://schemas.microsoft.com/office/word/2006/wordml" xmlns:wps="http://schemas.microsoft.com/office/word/2010/wordprocessingShape" mc:Ignorable="w14 w15 w16se w16cid w16 w16cex w16sdtdh w16sdtfl w16du wp14">
+  <w:footnote w:type="separator" w:id="-1">
+    <w:p>
+      <w:pPr>
+        <w:spacing w:after="0" w:line="240" w:lineRule="auto"/>
+      </w:pPr>
+      <w:r>
+        <w:separator/>
+      </w:r>
+    </w:p>
+  </w:footnote>
+  <w:footnote w:type="continuationSeparator" w:id="0">
+    <w:p>
+      <w:pPr>
+        <w:spacing w:after="0" w:line="240" w:lineRule="auto"/>
+      </w:pPr>
+      <w:r>
+        <w:continuationSeparator/>
+      </w:r>
+    </w:p>
+  </w:footnote>
+</w:footnotes>
+</file>
+
+<file path=word/header1.xml><?xml version="1.0" encoding="utf-8"?>
+<w:hdr xmlns:wpc="http://schemas.microsoft.com/office/word/2010/wordprocessingCanvas" xmlns:cx="http://schemas.microsoft.com/office/drawing/2014/chartex" xmlns:cx1="http://schemas.microsoft.com/office/drawing/2015/9/8/chartex" xmlns:cx2="http://schemas.microsoft.com/office/drawing/2015/10/21/chartex" xmlns:cx3="http://schemas.microsoft.com/office/drawing/2016/5/9/chartex" xmlns:cx4="http://schemas.microsoft.com/office/drawing/2016/5/10/chartex" xmlns:cx5="http://schemas.microsoft.com/office/drawing/2016/5/11/chartex" xmlns:cx6="http://schemas.microsoft.com/office/drawing/2016/5/12/chartex" xmlns:cx7="http://schemas.microsoft.com/office/drawing/2016/5/13/chartex" xmlns:cx8="http://schemas.microsoft.com/office/drawing/2016/5/14/chartex" xmlns:mc="http://schemas.openxmlformats.org/markup-compatibility/2006" xmlns:aink="http://schemas.microsoft.com/office/drawing/2016/ink" xmlns:am3d="http://schemas.microsoft.com/office/drawing/2017/model3d" xmlns:o="urn:schemas-microsoft-com:office:office" xmlns:oel="http://schemas.microsoft.com/office/2019/extlst" xmlns:r="http://schemas.openxmlformats.org/officeDocument/2006/relationships" xmlns:m="http://schemas.openxmlformats.org/officeDocument/2006/math" xmlns:v="urn:schemas-microsoft-com:vml" xmlns:wp14="http://schemas.microsoft.com/office/word/2010/wordprocessingDrawing" xmlns:wp="http://schemas.openxmlformats.org/drawingml/2006/wordprocessingDrawing" xmlns:w10="urn:schemas-microsoft-com:office:word" xmlns:w="http://schemas.openxmlformats.org/wordprocessingml/2006/main" xmlns:w14="http://schemas.microsoft.com/office/word/2010/wordml" xmlns:w15="http://schemas.microsoft.com/office/word/2012/wordml" xmlns:w16cex="http://schemas.microsoft.com/office/word/2018/wordml/cex" xmlns:w16cid="http://schemas.microsoft.com/office/word/2016/wordml/cid" xmlns:w16="http://schemas.microsoft.com/office/word/2018/wordml" xmlns:w16du="http://schemas.microsoft.com/office/word/2023/wordml/word16du" xmlns:w16sdtdh="http://schemas.microsoft.com/office/word/2020/wordml/sdtdatahash" xmlns:w16sdtfl="http://schemas.microsoft.com/office/word/2024/wordml/sdtformatlock" xmlns:w16se="http://schemas.microsoft.com/office/word/2015/wordml/symex" xmlns:wpg="http://schemas.microsoft.com/office/word/2010/wordprocessingGroup" xmlns:wpi="http://schemas.microsoft.com/office/word/2010/wordprocessingInk" xmlns:wne="http://schemas.microsoft.com/office/word/2006/wordml" xmlns:wps="http://schemas.microsoft.com/office/word/2010/wordprocessingShape" mc:Ignorable="w14 w15 w16se w16cid w16 w16cex w16sdtdh w16sdtfl w16du wp14">
+  <w:p>
+    <w:pPr>
+      <w:pStyle w:val="Header"/>
+    </w:pPr>
+  </w:p>
+</w:hdr>
+</file>
+
+<file path=word/header2.xml><?xml version="1.0" encoding="utf-8"?>
+<w:hdr xmlns:wpc="http://schemas.microsoft.com/office/word/2010/wordprocessingCanvas" xmlns:cx="http://schemas.microsoft.com/office/drawing/2014/chartex" xmlns:cx1="http://schemas.microsoft.com/office/drawing/2015/9/8/chartex" xmlns:cx2="http://schemas.microsoft.com/office/drawing/2015/10/21/chartex" xmlns:cx3="http://schemas.microsoft.com/office/drawing/2016/5/9/chartex" xmlns:cx4="http://schemas.microsoft.com/office/drawing/2016/5/10/chartex" xmlns:cx5="http://schemas.microsoft.com/office/drawing/2016/5/11/chartex" xmlns:cx6="http://schemas.microsoft.com/office/drawing/2016/5/12/chartex" xmlns:cx7="http://schemas.microsoft.com/office/drawing/2016/5/13/chartex" xmlns:cx8="http://schemas.microsoft.com/office/drawing/2016/5/14/chartex" xmlns:mc="http://schemas.openxmlformats.org/markup-compatibility/2006" xmlns:aink="http://schemas.microsoft.com/office/drawing/2016/ink" xmlns:am3d="http://schemas.microsoft.com/office/drawing/2017/model3d" xmlns:o="urn:schemas-microsoft-com:office:office" xmlns:oel="http://schemas.microsoft.com/office/2019/extlst" xmlns:r="http://schemas.openxmlformats.org/officeDocument/2006/relationships" xmlns:m="http://schemas.openxmlformats.org/officeDocument/2006/math" xmlns:v="urn:schemas-microsoft-com:vml" xmlns:wp14="http://schemas.microsoft.com/office/word/2010/wordprocessingDrawing" xmlns:wp="http://schemas.openxmlformats.org/drawingml/2006/wordprocessingDrawing" xmlns:w10="urn:schemas-microsoft-com:office:word" xmlns:w="http://schemas.openxmlformats.org/wordprocessingml/2006/main" xmlns:w14="http://schemas.microsoft.com/office/word/2010/wordml" xmlns:w15="http://schemas.microsoft.com/office/word/2012/wordml" xmlns:w16cex="http://schemas.microsoft.com/office/word/2018/wordml/cex" xmlns:w16cid="http://schemas.microsoft.com/office/word/2016/wordml/cid" xmlns:w16="http://schemas.microsoft.com/office/word/2018/wordml" xmlns:w16du="http://schemas.microsoft.com/office/word/2023/wordml/word16du" xmlns:w16sdtdh="http://schemas.microsoft.com/office/word/2020/wordml/sdtdatahash" xmlns:w16sdtfl="http://schemas.microsoft.com/office/word/2024/wordml/sdtformatlock" xmlns:w16se="http://schemas.microsoft.com/office/word/2015/wordml/symex" xmlns:wpg="http://schemas.microsoft.com/office/word/2010/wordprocessingGroup" xmlns:wpi="http://schemas.microsoft.com/office/word/2010/wordprocessingInk" xmlns:wne="http://schemas.microsoft.com/office/word/2006/wordml" xmlns:wps="http://schemas.microsoft.com/office/word/2010/wordprocessingShape" mc:Ignorable="w14 w15 w16se w16cid w16 w16cex w16sdtdh w16sdtfl w16du wp14">
+  <w:p>
+    <w:pPr>
+      <w:pStyle w:val="Header"/>
+    </w:pPr>
+  </w:p>
+</w:hdr>
+</file>
+
+<file path=word/header3.xml><?xml version="1.0" encoding="utf-8"?>
+<w:hdr xmlns:wpc="http://schemas.microsoft.com/office/word/2010/wordprocessingCanvas" xmlns:cx="http://schemas.microsoft.com/office/drawing/2014/chartex" xmlns:cx1="http://schemas.microsoft.com/office/drawing/2015/9/8/chartex" xmlns:cx2="http://schemas.microsoft.com/office/drawing/2015/10/21/chartex" xmlns:cx3="http://schemas.microsoft.com/office/drawing/2016/5/9/chartex" xmlns:cx4="http://schemas.microsoft.com/office/drawing/2016/5/10/chartex" xmlns:cx5="http://schemas.microsoft.com/office/drawing/2016/5/11/chartex" xmlns:cx6="http://schemas.microsoft.com/office/drawing/2016/5/12/chartex" xmlns:cx7="http://schemas.microsoft.com/office/drawing/2016/5/13/chartex" xmlns:cx8="http://schemas.microsoft.com/office/drawing/2016/5/14/chartex" xmlns:mc="http://schemas.openxmlformats.org/markup-compatibility/2006" xmlns:aink="http://schemas.microsoft.com/office/drawing/2016/ink" xmlns:am3d="http://schemas.microsoft.com/office/drawing/2017/model3d" xmlns:o="urn:schemas-microsoft-com:office:office" xmlns:oel="http://schemas.microsoft.com/office/2019/extlst" xmlns:r="http://schemas.openxmlformats.org/officeDocument/2006/relationships" xmlns:m="http://schemas.openxmlformats.org/officeDocument/2006/math" xmlns:v="urn:schemas-microsoft-com:vml" xmlns:wp14="http://schemas.microsoft.com/office/word/2010/wordprocessingDrawing" xmlns:wp="http://schemas.openxmlformats.org/drawingml/2006/wordprocessingDrawing" xmlns:w10="urn:schemas-microsoft-com:office:word" xmlns:w="http://schemas.openxmlformats.org/wordprocessingml/2006/main" xmlns:w14="http://schemas.microsoft.com/office/word/2010/wordml" xmlns:w15="http://schemas.microsoft.com/office/word/2012/wordml" xmlns:w16cex="http://schemas.microsoft.com/office/word/2018/wordml/cex" xmlns:w16cid="http://schemas.microsoft.com/office/word/2016/wordml/cid" xmlns:w16="http://schemas.microsoft.com/office/word/2018/wordml" xmlns:w16du="http://schemas.microsoft.com/office/word/2023/wordml/word16du" xmlns:w16sdtdh="http://schemas.microsoft.com/office/word/2020/wordml/sdtdatahash" xmlns:w16sdtfl="http://schemas.microsoft.com/office/word/2024/wordml/sdtformatlock" xmlns:w16se="http://schemas.microsoft.com/office/word/2015/wordml/symex" xmlns:wpg="http://schemas.microsoft.com/office/word/2010/wordprocessingGroup" xmlns:wpi="http://schemas.microsoft.com/office/word/2010/wordprocessingInk" xmlns:wne="http://schemas.microsoft.com/office/word/2006/wordml" xmlns:wps="http://schemas.microsoft.com/office/word/2010/wordprocessingShape" mc:Ignorable="w14 w15 w16se w16cid w16 w16cex w16sdtdh w16sdtfl w16du wp14">
+  <w:p>
+    <w:pPr>
+      <w:pStyle w:val="Header"/>
+    </w:pPr>
+  </w:p>
+</w:hdr>
 </file>
 
 <file path=word/numbering.xml><?xml version="1.0" encoding="utf-8"?>
@@ -2866,6 +3588,50 @@
       <w:spacing w:after="0" w:line="240" w:lineRule="auto"/>
     </w:pPr>
   </w:style>
+  <w:style w:type="paragraph" w:styleId="Header">
+    <w:name w:val="header"/>
+    <w:basedOn w:val="Normal"/>
+    <w:link w:val="HeaderChar"/>
+    <w:uiPriority w:val="99"/>
+    <w:unhideWhenUsed/>
+    <w:rsid w:val="00DB4508"/>
+    <w:pPr>
+      <w:tabs>
+        <w:tab w:val="center" w:pos="4680"/>
+        <w:tab w:val="right" w:pos="9360"/>
+      </w:tabs>
+      <w:spacing w:after="0" w:line="240" w:lineRule="auto"/>
+    </w:pPr>
+  </w:style>
+  <w:style w:type="character" w:customStyle="1" w:styleId="HeaderChar">
+    <w:name w:val="Header Char"/>
+    <w:basedOn w:val="DefaultParagraphFont"/>
+    <w:link w:val="Header"/>
+    <w:uiPriority w:val="99"/>
+    <w:rsid w:val="00DB4508"/>
+  </w:style>
+  <w:style w:type="paragraph" w:styleId="Footer">
+    <w:name w:val="footer"/>
+    <w:basedOn w:val="Normal"/>
+    <w:link w:val="FooterChar"/>
+    <w:uiPriority w:val="99"/>
+    <w:unhideWhenUsed/>
+    <w:rsid w:val="00DB4508"/>
+    <w:pPr>
+      <w:tabs>
+        <w:tab w:val="center" w:pos="4680"/>
+        <w:tab w:val="right" w:pos="9360"/>
+      </w:tabs>
+      <w:spacing w:after="0" w:line="240" w:lineRule="auto"/>
+    </w:pPr>
+  </w:style>
+  <w:style w:type="character" w:customStyle="1" w:styleId="FooterChar">
+    <w:name w:val="Footer Char"/>
+    <w:basedOn w:val="DefaultParagraphFont"/>
+    <w:link w:val="Footer"/>
+    <w:uiPriority w:val="99"/>
+    <w:rsid w:val="00DB4508"/>
+  </w:style>
 </w:styles>
 </file>
 

</xml_diff>